<commit_message>
Updated Doc's at Meeting
</commit_message>
<xml_diff>
--- a/Documents /HRP-503 - TEMPLATE PROTOCOL .docx
+++ b/Documents /HRP-503 - TEMPLATE PROTOCOL .docx
@@ -515,7 +515,33 @@
               <w:sz w:val="22"/>
               <w:szCs w:val="22"/>
             </w:rPr>
-            <w:t>Click or tap here to enter the full protocol title</w:t>
+            <w:t xml:space="preserve">Are bird feeders and backyard poultry impacting behavior and disease dynamics in </w:t>
+          </w:r>
+          <w:r>
+            <w:rPr>
+              <w:rFonts w:ascii="Arial" w:hAnsi="Arial" w:cs="Arial"/>
+              <w:bCs/>
+              <w:sz w:val="22"/>
+              <w:szCs w:val="22"/>
+            </w:rPr>
+            <w:t>wild</w:t>
+          </w:r>
+          <w:r>
+            <w:rPr>
+              <w:rFonts w:ascii="Arial" w:hAnsi="Arial" w:cs="Arial"/>
+              <w:bCs/>
+              <w:sz w:val="22"/>
+              <w:szCs w:val="22"/>
+            </w:rPr>
+            <w:t xml:space="preserve"> birds?</w:t>
+          </w:r>
+          <w:r>
+            <w:rPr>
+              <w:rFonts w:ascii="Arial" w:hAnsi="Arial" w:cs="Arial"/>
+              <w:sz w:val="22"/>
+              <w:szCs w:val="22"/>
+            </w:rPr>
+            <w:t xml:space="preserve"> </w:t>
           </w:r>
         </w:p>
       </w:sdtContent>
@@ -598,9 +624,9 @@
           <w:placeholder>
             <w:docPart w:val="DefaultPlaceholder_-1854013440"/>
           </w:placeholder>
-          <w:showingPlcHdr/>
         </w:sdtPr>
         <w:sdtContent>
+          <w:commentRangeStart w:id="0"/>
           <w:r>
             <w:rPr>
               <w:rStyle w:val="PlaceholderText"/>
@@ -610,6 +636,18 @@
               <w:bdr w:val="single" w:sz="4" w:space="0" w:color="auto"/>
             </w:rPr>
             <w:t>Click or tap here to enter text.</w:t>
+          </w:r>
+          <w:commentRangeEnd w:id="0"/>
+          <w:r>
+            <w:rPr>
+              <w:rStyle w:val="CommentReference"/>
+              <w:rFonts w:ascii="Arial" w:hAnsi="Arial" w:cs="Arial"/>
+              <w:iCs/>
+              <w:color w:val="auto"/>
+              <w:sz w:val="22"/>
+              <w:szCs w:val="22"/>
+            </w:rPr>
+            <w:commentReference w:id="0"/>
           </w:r>
         </w:sdtContent>
       </w:sdt>
@@ -885,7 +923,7 @@
         <w:t>Please complete the following required assurances:</w:t>
       </w:r>
     </w:p>
-    <w:bookmarkStart w:id="0" w:name="_Hlk172979714"/>
+    <w:bookmarkStart w:id="1" w:name="_Hlk172979714"/>
     <w:p>
       <w:pPr>
         <w:rPr>
@@ -908,7 +946,7 @@
             <w:calcOnExit w:val="0"/>
             <w:checkBox>
               <w:sizeAuto/>
-              <w:default w:val="0"/>
+              <w:default w:val="1"/>
             </w:checkBox>
           </w:ffData>
         </w:fldChar>
@@ -976,12 +1014,12 @@
             <w:calcOnExit w:val="0"/>
             <w:checkBox>
               <w:sizeAuto/>
-              <w:default w:val="0"/>
+              <w:default w:val="1"/>
             </w:checkBox>
           </w:ffData>
         </w:fldChar>
       </w:r>
-      <w:bookmarkStart w:id="1" w:name="Check1"/>
+      <w:bookmarkStart w:id="2" w:name="Check1"/>
       <w:r>
         <w:rPr>
           <w:rFonts w:eastAsia="Times New Roman" w:cs="Arial"/>
@@ -1013,7 +1051,7 @@
         </w:rPr>
         <w:fldChar w:fldCharType="end"/>
       </w:r>
-      <w:bookmarkEnd w:id="1"/>
+      <w:bookmarkEnd w:id="2"/>
       <w:r>
         <w:rPr>
           <w:rFonts w:eastAsia="Times New Roman" w:cs="Arial"/>
@@ -1059,7 +1097,7 @@
         </w:rPr>
         <w:t xml:space="preserve">criteria to be a PI on an IRB protocol at AU. </w:t>
       </w:r>
-      <w:bookmarkEnd w:id="0"/>
+      <w:bookmarkEnd w:id="1"/>
     </w:p>
     <w:p>
       <w:pPr>
@@ -1256,7 +1294,7 @@
               <w:sz w:val="22"/>
               <w:szCs w:val="22"/>
             </w:rPr>
-            <w:t>Include the version number and date of this protocol.</w:t>
+            <w:t>Version 1.0 – 06/11/2026</w:t>
           </w:r>
         </w:sdtContent>
       </w:sdt>
@@ -3808,7 +3846,7 @@
         </w:rPr>
         <w:br w:type="page"/>
       </w:r>
-      <w:bookmarkStart w:id="2" w:name="_Toc226630088"/>
+      <w:bookmarkStart w:id="3" w:name="_Toc226630088"/>
       <w:r>
         <w:rPr>
           <w:rFonts w:ascii="Arial" w:hAnsi="Arial" w:cs="Arial"/>
@@ -3816,7 +3854,7 @@
         <w:lastRenderedPageBreak/>
         <w:t>Objectives</w:t>
       </w:r>
-      <w:bookmarkEnd w:id="2"/>
+      <w:bookmarkEnd w:id="3"/>
     </w:p>
     <w:p>
       <w:pPr>
@@ -3991,23 +4029,7 @@
                       <w:color w:val="auto"/>
                       <w:sz w:val="22"/>
                     </w:rPr>
-                    <w:t>This study comprises three specific aims. Aims 1 and 2 concern pathogen prevalence in wild birds and the backyard environment; these are addressed through field and laboratory that are reviewed and approved separately under Auburn University Institutional Animal Care and Use Committee (IACUC) protocol IPROTO202500000090 ("Backyard bird behavior and disease," approved 12 January 2026). They are summarized here only as context for the human-</w:t>
-                  </w:r>
-                  <w:r>
-                    <w:rPr>
-                      <w:rFonts w:ascii="Arial" w:hAnsi="Arial" w:cs="Arial"/>
-                      <w:color w:val="auto"/>
-                      <w:sz w:val="22"/>
-                    </w:rPr>
-                    <w:t>subjects’</w:t>
-                  </w:r>
-                  <w:r>
-                    <w:rPr>
-                      <w:rFonts w:ascii="Arial" w:hAnsi="Arial" w:cs="Arial"/>
-                      <w:color w:val="auto"/>
-                      <w:sz w:val="22"/>
-                    </w:rPr>
-                    <w:t xml:space="preserve"> activities. Aim 3 is the human-subjects component addressed by this protocol</w:t>
+                    <w:t>This study comprises three specific aims. Aims 1 and 2 concern pathogen prevalence in wild birds and the backyard environment; these are addressed through field and laboratory that are reviewed and approved separately under Auburn University Institutional Animal Care and Use Committee (IACUC) protocol IPROTO202500000090 ("Backyard bird behavior and disease," approved 12 January 2026). They are summarized here only as context for the human-subjects’ activities. Aim 3 is the human-subjects component addressed by this protocol</w:t>
                   </w:r>
                   <w:r>
                     <w:rPr>
@@ -4113,15 +4135,7 @@
                       <w:color w:val="000000" w:themeColor="text1"/>
                       <w:sz w:val="22"/>
                     </w:rPr>
-                    <w:t xml:space="preserve"> bird feeder only, backyard poultry only, both, and control sites with </w:t>
-                  </w:r>
-                  <w:r>
-                    <w:rPr>
-                      <w:rFonts w:ascii="Arial" w:hAnsi="Arial" w:cs="Arial"/>
-                      <w:color w:val="000000" w:themeColor="text1"/>
-                      <w:sz w:val="22"/>
-                    </w:rPr>
-                    <w:t>neither</w:t>
+                    <w:t xml:space="preserve"> bird feeder only, backyard poultry only, both, and control sites with neither</w:t>
                   </w:r>
                   <w:r>
                     <w:rPr>
@@ -4137,15 +4151,7 @@
                       <w:color w:val="000000" w:themeColor="text1"/>
                       <w:sz w:val="22"/>
                     </w:rPr>
-                    <w:t>to</w:t>
-                  </w:r>
-                  <w:r>
-                    <w:rPr>
-                      <w:rFonts w:ascii="Arial" w:hAnsi="Arial" w:cs="Arial"/>
-                      <w:color w:val="000000" w:themeColor="text1"/>
-                      <w:sz w:val="22"/>
-                    </w:rPr>
-                    <w:t xml:space="preserve"> determine which backyard components are associated with higher infection rates.</w:t>
+                    <w:t>to determine which backyard components are associated with higher infection rates.</w:t>
                   </w:r>
                 </w:p>
                 <w:p>
@@ -4174,88 +4180,32 @@
                       <w:color w:val="000000" w:themeColor="text1"/>
                       <w:sz w:val="22"/>
                     </w:rPr>
-                    <w:t xml:space="preserve">Aim 3 (this protocol): Characterize disease-risk perception, biosecurity practice engagement, willingness to modify backyard behaviors, place attachment, and pro-conservation attitudes and behaviors among adults who feed backyard birds and/or keep backyard poultry, using a participant survey </w:t>
-                  </w:r>
-                  <w:commentRangeStart w:id="3"/>
-                  <w:r>
-                    <w:rPr>
-                      <w:rFonts w:ascii="Arial" w:hAnsi="Arial" w:cs="Arial"/>
-                      <w:color w:val="000000" w:themeColor="text1"/>
-                      <w:sz w:val="22"/>
-                      <w:highlight w:val="yellow"/>
-                    </w:rPr>
-                    <w:t>and</w:t>
-                  </w:r>
-                  <w:commentRangeEnd w:id="3"/>
-                  <w:r>
-                    <w:rPr>
-                      <w:rStyle w:val="CommentReference"/>
-                      <w:rFonts w:ascii="Arial" w:hAnsi="Arial" w:cs="Arial"/>
-                      <w:color w:val="000000" w:themeColor="text1"/>
-                      <w:sz w:val="22"/>
-                      <w:szCs w:val="22"/>
-                      <w:highlight w:val="yellow"/>
-                    </w:rPr>
-                    <w:commentReference w:id="3"/>
+                    <w:t>Aim 3 (this protocol): Characterize disease-risk perception, biosecurity practice engagement, willingness to modify backyard behaviors, place attachment, and pro-conservation attitudes and behaviors among adults who feed backyard birds and/or keep backyard poultry, using a</w:t>
                   </w:r>
                   <w:r>
                     <w:rPr>
                       <w:rFonts w:ascii="Arial" w:hAnsi="Arial" w:cs="Arial"/>
                       <w:color w:val="000000" w:themeColor="text1"/>
                       <w:sz w:val="22"/>
-                      <w:highlight w:val="yellow"/>
                     </w:rPr>
-                    <w:t xml:space="preserve"> a standardized site questionnaire completed by participating homeowners</w:t>
+                    <w:t>n anonymous</w:t>
                   </w:r>
                   <w:r>
                     <w:rPr>
+                      <w:rFonts w:ascii="Arial" w:hAnsi="Arial" w:cs="Arial"/>
                       <w:color w:val="000000" w:themeColor="text1"/>
-                      <w:highlight w:val="yellow"/>
+                      <w:sz w:val="22"/>
                     </w:rPr>
-                    <w:t>.</w:t>
+                    <w:t xml:space="preserve"> participant survey</w:t>
                   </w:r>
-                </w:p>
-                <w:p>
-                  <w:pPr>
-                    <w:pStyle w:val="BlockText"/>
-                    <w:pBdr>
-                      <w:top w:val="none" w:sz="0" w:space="0" w:color="auto"/>
-                      <w:left w:val="none" w:sz="0" w:space="0" w:color="auto"/>
-                      <w:bottom w:val="none" w:sz="0" w:space="0" w:color="auto"/>
-                      <w:right w:val="none" w:sz="0" w:space="0" w:color="auto"/>
-                    </w:pBdr>
-                    <w:autoSpaceDE/>
-                    <w:autoSpaceDN/>
-                    <w:adjustRightInd/>
-                    <w:spacing w:before="120" w:after="120"/>
-                    <w:ind w:left="720" w:right="720"/>
+                  <w:r>
                     <w:rPr>
                       <w:rFonts w:ascii="Arial" w:hAnsi="Arial" w:cs="Arial"/>
-                      <w:color w:val="auto"/>
+                      <w:color w:val="000000" w:themeColor="text1"/>
                       <w:sz w:val="22"/>
                     </w:rPr>
-                  </w:pPr>
-                </w:p>
-                <w:p>
-                  <w:pPr>
-                    <w:pStyle w:val="BlockText"/>
-                    <w:pBdr>
-                      <w:top w:val="none" w:sz="0" w:space="0" w:color="auto"/>
-                      <w:left w:val="none" w:sz="0" w:space="0" w:color="auto"/>
-                      <w:bottom w:val="none" w:sz="0" w:space="0" w:color="auto"/>
-                      <w:right w:val="none" w:sz="0" w:space="0" w:color="auto"/>
-                    </w:pBdr>
-                    <w:autoSpaceDE/>
-                    <w:autoSpaceDN/>
-                    <w:adjustRightInd/>
-                    <w:spacing w:before="120" w:after="120"/>
-                    <w:ind w:left="720" w:right="720"/>
-                    <w:rPr>
-                      <w:rFonts w:ascii="Arial" w:hAnsi="Arial" w:cs="Arial"/>
-                      <w:color w:val="auto"/>
-                      <w:sz w:val="22"/>
-                    </w:rPr>
-                  </w:pPr>
+                    <w:t xml:space="preserve">. </w:t>
+                  </w:r>
                 </w:p>
               </w:sdtContent>
             </w:sdt>
@@ -4440,7 +4390,6 @@
               <w:sz w:val="22"/>
               <w:szCs w:val="22"/>
             </w:rPr>
-            <w:lastRenderedPageBreak/>
             <w:t>H2: Participants with greater knowledge of zoonotic disease will report more proactive responses to disease risk, including greater willingness to adopt evidence-based biosecurity recommendations.</w:t>
           </w:r>
         </w:p>
@@ -4620,52 +4569,143 @@
         <w:t xml:space="preserve"> add to existing knowledge.</w:t>
       </w:r>
     </w:p>
-    <w:sdt>
-      <w:sdtPr>
-        <w:rPr>
-          <w:rFonts w:ascii="Arial" w:hAnsi="Arial" w:cs="Arial"/>
-          <w:color w:val="auto"/>
-          <w:sz w:val="22"/>
-          <w:highlight w:val="yellow"/>
-        </w:rPr>
-        <w:id w:val="927001459"/>
-        <w:placeholder>
-          <w:docPart w:val="DefaultPlaceholder_-1854013440"/>
-        </w:placeholder>
-      </w:sdtPr>
-      <w:sdtContent>
-        <w:p>
-          <w:pPr>
-            <w:pStyle w:val="BlockText"/>
-            <w:pBdr>
-              <w:top w:val="none" w:sz="0" w:space="0" w:color="auto"/>
-              <w:left w:val="none" w:sz="0" w:space="0" w:color="auto"/>
-              <w:bottom w:val="none" w:sz="0" w:space="0" w:color="auto"/>
-              <w:right w:val="none" w:sz="0" w:space="0" w:color="auto"/>
-            </w:pBdr>
-            <w:autoSpaceDE/>
-            <w:autoSpaceDN/>
-            <w:adjustRightInd/>
-            <w:spacing w:before="120" w:after="120"/>
-            <w:ind w:left="720" w:right="720"/>
-            <w:rPr>
-              <w:rFonts w:ascii="Arial" w:hAnsi="Arial" w:cs="Arial"/>
-              <w:color w:val="auto"/>
-              <w:sz w:val="22"/>
-            </w:rPr>
-          </w:pPr>
-          <w:r>
-            <w:rPr>
-              <w:rFonts w:ascii="Arial" w:hAnsi="Arial" w:cs="Arial"/>
-              <w:color w:val="auto"/>
-              <w:sz w:val="22"/>
-              <w:highlight w:val="yellow"/>
-            </w:rPr>
-            <w:t>Can I reuse my AAV grant material here?</w:t>
-          </w:r>
-        </w:p>
-      </w:sdtContent>
-    </w:sdt>
+    <w:p>
+      <w:pPr>
+        <w:pStyle w:val="BlockText"/>
+        <w:spacing w:before="120" w:after="120"/>
+        <w:ind w:left="720" w:right="720"/>
+        <w:rPr>
+          <w:rFonts w:ascii="Arial" w:hAnsi="Arial" w:cs="Arial"/>
+          <w:color w:val="000000" w:themeColor="text1"/>
+          <w:sz w:val="22"/>
+        </w:rPr>
+      </w:pPr>
+      <w:r>
+        <w:rPr>
+          <w:rFonts w:ascii="Arial" w:hAnsi="Arial" w:cs="Arial"/>
+          <w:color w:val="000000" w:themeColor="text1"/>
+          <w:sz w:val="22"/>
+        </w:rPr>
+        <w:t xml:space="preserve">Zoonotic diseases that spill over between wildlife, domestic animals, and humans represent a growing risk to public health, with over 60% of emerging human infectious diseases originating in wildlife (Jones et al. 2008). These spillover events begin at small-scale interfaces where humans, wildlife, and domestic animals come into close contact, yet most research on emerging infectious disease characterizes prevalence and risk at broad spatial scales rather than at the </w:t>
+      </w:r>
+      <w:r>
+        <w:rPr>
+          <w:rFonts w:ascii="Arial" w:hAnsi="Arial" w:cs="Arial"/>
+          <w:color w:val="000000" w:themeColor="text1"/>
+          <w:sz w:val="22"/>
+        </w:rPr>
+        <w:t>fine, local</w:t>
+      </w:r>
+      <w:r>
+        <w:rPr>
+          <w:rFonts w:ascii="Arial" w:hAnsi="Arial" w:cs="Arial"/>
+          <w:color w:val="000000" w:themeColor="text1"/>
+          <w:sz w:val="22"/>
+        </w:rPr>
+        <w:t xml:space="preserve"> scale</w:t>
+      </w:r>
+      <w:r>
+        <w:rPr>
+          <w:rFonts w:ascii="Arial" w:hAnsi="Arial" w:cs="Arial"/>
+          <w:color w:val="000000" w:themeColor="text1"/>
+          <w:sz w:val="22"/>
+        </w:rPr>
+        <w:t>, focusing on pinpointing the outbreak cause</w:t>
+      </w:r>
+      <w:r>
+        <w:rPr>
+          <w:rFonts w:ascii="Arial" w:hAnsi="Arial" w:cs="Arial"/>
+          <w:color w:val="000000" w:themeColor="text1"/>
+          <w:sz w:val="22"/>
+        </w:rPr>
+        <w:t>.</w:t>
+      </w:r>
+    </w:p>
+    <w:p>
+      <w:pPr>
+        <w:pStyle w:val="BlockText"/>
+        <w:spacing w:before="120" w:after="120"/>
+        <w:ind w:left="720" w:right="720"/>
+        <w:rPr>
+          <w:rFonts w:ascii="Arial" w:hAnsi="Arial" w:cs="Arial"/>
+          <w:color w:val="000000" w:themeColor="text1"/>
+          <w:sz w:val="22"/>
+        </w:rPr>
+      </w:pPr>
+      <w:r>
+        <w:rPr>
+          <w:rFonts w:ascii="Arial" w:hAnsi="Arial" w:cs="Arial"/>
+          <w:color w:val="000000" w:themeColor="text1"/>
+          <w:sz w:val="22"/>
+        </w:rPr>
+        <w:t xml:space="preserve">Backyard bird feeding and small-scale poultry keeping are two widespread and growing activities that concentrate these interactions in residential settings. Backyard bird feeding is well established in the United States, with federal surveys estimating that over 50 million Americans feed wild birds and hundreds of millions of dollars spent on bird seed annually (USFWS 2022). Backyard poultry keeping is </w:t>
+      </w:r>
+      <w:r>
+        <w:rPr>
+          <w:rFonts w:ascii="Arial" w:hAnsi="Arial" w:cs="Arial"/>
+          <w:color w:val="000000" w:themeColor="text1"/>
+          <w:sz w:val="22"/>
+        </w:rPr>
+        <w:t>also</w:t>
+      </w:r>
+      <w:r>
+        <w:rPr>
+          <w:rFonts w:ascii="Arial" w:hAnsi="Arial" w:cs="Arial"/>
+          <w:color w:val="000000" w:themeColor="text1"/>
+          <w:sz w:val="22"/>
+        </w:rPr>
+        <w:t xml:space="preserve"> growing in popularity in urban and suburban areas (USDA 2013). Both activities bring people into closer contact with birds and shared environmental resources. Bird feeders aggregate wild birds at artificially high densities, increasing contact rates and fecal-oral transmission of pathogens (Becker and Hall 2014; Becker et al. 2015), and backyard poultry can act as reservoirs and amplifiers of zoonotic bacteria such as Salmonella enterica (Larsen et al. 2022). The public-health consequences are documented: a 2021 multi-state Salmonella Typhimurium outbreak linked to wild songbirds at residential feeders resulted in human hospitalizations across multiple states (CDC 2021; Patel et al. 2023), and backyard poultry contact has been identified as a growing source of human salmonellosis (CDC 2025).</w:t>
+      </w:r>
+    </w:p>
+    <w:p>
+      <w:pPr>
+        <w:pStyle w:val="BlockText"/>
+        <w:spacing w:before="120" w:after="120"/>
+        <w:ind w:left="720" w:right="720"/>
+        <w:rPr>
+          <w:rFonts w:ascii="Arial" w:hAnsi="Arial" w:cs="Arial"/>
+          <w:color w:val="000000" w:themeColor="text1"/>
+          <w:sz w:val="22"/>
+        </w:rPr>
+      </w:pPr>
+      <w:r>
+        <w:rPr>
+          <w:rFonts w:ascii="Arial" w:hAnsi="Arial" w:cs="Arial"/>
+          <w:color w:val="000000" w:themeColor="text1"/>
+          <w:sz w:val="22"/>
+        </w:rPr>
+        <w:t>Despite the scale of these activities and their documented disease risks, the human dimensions that shape participant behavior at this interface remain poorly understood. Effective biosecurity and conservation outreach depends not only on quantifying pathogen risk but on understanding how participants perceive that risk, what motivates their engagement, how knowledgeable they are about zoonotic disease, and how willing they are to adopt practices that reduce transmission. Prior surveys of backyard poultry and wildlife-feeding populations have examined zoonotic disease awareness and biosecurity knowledge (e.g., Nicholson et al. 2020; Kyle and Sutherland 2016), and research on backyard bird feeding has linked the activity to well-being, nature connectedness, and pro-conservation behavior (Cox and Gaston 2016; Dayer et al. 2019). However, these human dimensions—disease-risk perception, biosecurity engagement, place attachment, and conservation attitudes—have not been examined together in the populations who feed backyard birds and keep backyard poultry, particularly in the Southeastern United States.</w:t>
+      </w:r>
+    </w:p>
+    <w:p>
+      <w:pPr>
+        <w:pStyle w:val="BlockText"/>
+        <w:spacing w:before="120" w:after="120"/>
+        <w:ind w:left="720" w:right="720"/>
+        <w:rPr>
+          <w:rFonts w:ascii="Arial" w:hAnsi="Arial" w:cs="Arial"/>
+          <w:color w:val="000000" w:themeColor="text1"/>
+          <w:sz w:val="22"/>
+        </w:rPr>
+      </w:pPr>
+      <w:r>
+        <w:rPr>
+          <w:rFonts w:ascii="Arial" w:hAnsi="Arial" w:cs="Arial"/>
+          <w:color w:val="000000" w:themeColor="text1"/>
+          <w:sz w:val="22"/>
+        </w:rPr>
+        <w:t xml:space="preserve">This study addresses that gap. It is part of a larger project examining disease dynamics at the backyard human-wildlife interface; the biological components quantifying pathogen prevalence in wild birds and the environment are reviewed </w:t>
+      </w:r>
+      <w:r>
+        <w:rPr>
+          <w:rFonts w:ascii="Arial" w:hAnsi="Arial" w:cs="Arial"/>
+          <w:color w:val="000000" w:themeColor="text1"/>
+          <w:sz w:val="22"/>
+        </w:rPr>
+        <w:lastRenderedPageBreak/>
+        <w:t>separately under IACUC protocol IPROTO202500000090. The present protocol concerns the human-subjects component (Aim 3), which uses an anonymous online survey to characterize disease-risk perception, biosecurity practice engagement, willingness to modify backyard behaviors, place attachment, and pro-conservation attitudes and behaviors among adults who feed backyard birds and/or keep backyard poultry. Understanding these human dimensions is essential for developing accessible, effective biosecurity guidance that reduces disease risk while preserving the well-being and conservation benefits these activities provide.</w:t>
+      </w:r>
+    </w:p>
     <w:p>
       <w:pPr>
         <w:pStyle w:val="BlockText"/>
@@ -5775,54 +5815,6 @@
         <w:t xml:space="preserve">pre-existing activities. </w:t>
       </w:r>
     </w:p>
-    <w:sdt>
-      <w:sdtPr>
-        <w:rPr>
-          <w:rFonts w:ascii="Arial" w:hAnsi="Arial" w:cs="Arial"/>
-          <w:color w:val="auto"/>
-          <w:sz w:val="22"/>
-        </w:rPr>
-        <w:id w:val="-704483867"/>
-        <w:placeholder>
-          <w:docPart w:val="DefaultPlaceholder_-1854013440"/>
-        </w:placeholder>
-        <w:showingPlcHdr/>
-      </w:sdtPr>
-      <w:sdtContent>
-        <w:p>
-          <w:pPr>
-            <w:pStyle w:val="BlockText"/>
-            <w:pBdr>
-              <w:top w:val="none" w:sz="0" w:space="0" w:color="auto"/>
-              <w:left w:val="none" w:sz="0" w:space="0" w:color="auto"/>
-              <w:bottom w:val="none" w:sz="0" w:space="0" w:color="auto"/>
-              <w:right w:val="none" w:sz="0" w:space="0" w:color="auto"/>
-            </w:pBdr>
-            <w:autoSpaceDE/>
-            <w:autoSpaceDN/>
-            <w:adjustRightInd/>
-            <w:spacing w:before="120" w:after="120"/>
-            <w:ind w:left="720" w:right="720"/>
-            <w:rPr>
-              <w:rFonts w:ascii="Arial" w:hAnsi="Arial" w:cs="Arial"/>
-              <w:color w:val="auto"/>
-              <w:sz w:val="22"/>
-            </w:rPr>
-          </w:pPr>
-          <w:r>
-            <w:rPr>
-              <w:rStyle w:val="PlaceholderText"/>
-              <w:rFonts w:ascii="Arial" w:hAnsi="Arial" w:cs="Arial"/>
-              <w:i w:val="0"/>
-              <w:iCs w:val="0"/>
-              <w:color w:val="000000" w:themeColor="text1"/>
-              <w:bdr w:val="single" w:sz="4" w:space="0" w:color="auto"/>
-            </w:rPr>
-            <w:t>Click or tap here to enter text.</w:t>
-          </w:r>
-        </w:p>
-      </w:sdtContent>
-    </w:sdt>
     <w:p>
       <w:pPr>
         <w:pStyle w:val="List"/>
@@ -6004,8 +5996,24 @@
           <w:rFonts w:ascii="Arial" w:hAnsi="Arial" w:cs="Arial"/>
           <w:sz w:val="22"/>
         </w:rPr>
+        <w:lastRenderedPageBreak/>
         <w:t>If genomic data will be collected and submitted to an NIH designated data repository, review HRP-322 - WORKSHEET - NIH GDS Institutional Certification to ensure that you have provided sufficient information.</w:t>
       </w:r>
+    </w:p>
+    <w:p>
+      <w:pPr>
+        <w:pStyle w:val="List"/>
+        <w:numPr>
+          <w:ilvl w:val="0"/>
+          <w:numId w:val="0"/>
+        </w:numPr>
+        <w:spacing w:before="120" w:beforeAutospacing="0" w:after="120" w:afterAutospacing="0"/>
+        <w:ind w:left="1440" w:hanging="360"/>
+        <w:rPr>
+          <w:rFonts w:ascii="Arial" w:hAnsi="Arial" w:cs="Arial"/>
+          <w:sz w:val="22"/>
+        </w:rPr>
+      </w:pPr>
     </w:p>
     <w:p>
       <w:pPr>
@@ -6785,15 +6793,7 @@
           <w:rFonts w:ascii="Arial" w:hAnsi="Arial" w:cs="Arial"/>
           <w:sz w:val="22"/>
         </w:rPr>
-        <w:t xml:space="preserve">If your research involves AU students’ </w:t>
-      </w:r>
-      <w:r>
-        <w:rPr>
-          <w:rFonts w:ascii="Arial" w:hAnsi="Arial" w:cs="Arial"/>
-          <w:sz w:val="22"/>
-        </w:rPr>
-        <w:lastRenderedPageBreak/>
-        <w:t xml:space="preserve">records, the AU Registrar must </w:t>
+        <w:t xml:space="preserve">If your research involves AU students’ records, the AU Registrar must </w:t>
       </w:r>
       <w:r>
         <w:rPr>
@@ -6965,6 +6965,7 @@
           <w:iCs/>
           <w:sz w:val="22"/>
         </w:rPr>
+        <w:lastRenderedPageBreak/>
         <w:t xml:space="preserve">  </w:t>
       </w:r>
       <w:sdt>
@@ -7958,7 +7959,6 @@
           <w:rFonts w:ascii="Arial" w:hAnsi="Arial" w:cs="Arial"/>
           <w:sz w:val="22"/>
         </w:rPr>
-        <w:lastRenderedPageBreak/>
         <w:t>Site-specific regulations or customs affecting the research</w:t>
       </w:r>
       <w:r>
@@ -8060,7 +8060,16 @@
             <w:rFonts w:ascii="Arial" w:hAnsi="Arial" w:cs="Arial"/>
             <w:sz w:val="22"/>
           </w:rPr>
-          <w:t>HRP-504 - TEMPLATE - School Permission to Conduct Research</w:t>
+          <w:t>HRP-</w:t>
+        </w:r>
+        <w:r>
+          <w:rPr>
+            <w:rStyle w:val="Hyperlink"/>
+            <w:rFonts w:ascii="Arial" w:hAnsi="Arial" w:cs="Arial"/>
+            <w:sz w:val="22"/>
+          </w:rPr>
+          <w:lastRenderedPageBreak/>
+          <w:t>504 - TEMPLATE - School Permission to Conduct Research</w:t>
         </w:r>
       </w:hyperlink>
       <w:r>
@@ -8985,7 +8994,6 @@
           <w:color w:val="auto"/>
           <w:sz w:val="22"/>
         </w:rPr>
-        <w:lastRenderedPageBreak/>
         <w:t>Describe</w:t>
       </w:r>
       <w:r>
@@ -10353,7 +10361,6 @@
           <w:color w:val="auto"/>
           <w:sz w:val="22"/>
         </w:rPr>
-        <w:lastRenderedPageBreak/>
         <w:t xml:space="preserve">If the research involves </w:t>
       </w:r>
       <w:r>
@@ -10407,6 +10414,7 @@
           <w:color w:val="auto"/>
           <w:sz w:val="22"/>
         </w:rPr>
+        <w:lastRenderedPageBreak/>
         <w:t xml:space="preserve">If the research involves pregnant women, review </w:t>
       </w:r>
       <w:hyperlink r:id="rId23" w:history="1">
@@ -11386,7 +11394,6 @@
           <w:color w:val="auto"/>
           <w:sz w:val="22"/>
         </w:rPr>
-        <w:lastRenderedPageBreak/>
         <w:t xml:space="preserve">Describe materials that will be used to recruit </w:t>
       </w:r>
       <w:r>
@@ -11493,6 +11500,7 @@
           <w:color w:val="auto"/>
           <w:sz w:val="22"/>
         </w:rPr>
+        <w:lastRenderedPageBreak/>
         <w:t>“</w:t>
       </w:r>
       <w:r>
@@ -12615,16 +12623,7 @@
           <w:color w:val="auto"/>
           <w:sz w:val="22"/>
         </w:rPr>
-        <w:t xml:space="preserve">If legally authorized representatives are consenting on behalf of the Participants (e.g., </w:t>
-      </w:r>
-      <w:r>
-        <w:rPr>
-          <w:rFonts w:ascii="Arial" w:hAnsi="Arial" w:cs="Arial"/>
-          <w:color w:val="auto"/>
-          <w:sz w:val="22"/>
-        </w:rPr>
-        <w:lastRenderedPageBreak/>
-        <w:t>Participants are minors), describe how the Participants themselves may indicate the desire to withdraw from the study.</w:t>
+        <w:t>If legally authorized representatives are consenting on behalf of the Participants (e.g., Participants are minors), describe how the Participants themselves may indicate the desire to withdraw from the study.</w:t>
       </w:r>
     </w:p>
     <w:sdt>
@@ -12710,6 +12709,7 @@
         <w:rPr>
           <w:rFonts w:ascii="Arial" w:hAnsi="Arial" w:cs="Arial"/>
         </w:rPr>
+        <w:lastRenderedPageBreak/>
         <w:t xml:space="preserve">Risks to </w:t>
       </w:r>
       <w:r>
@@ -13796,7 +13796,6 @@
           <w:rFonts w:ascii="Arial" w:hAnsi="Arial" w:cs="Arial"/>
           <w:sz w:val="22"/>
         </w:rPr>
-        <w:lastRenderedPageBreak/>
         <w:t>What data are reviewed, including safety data, untoward events, and efficacy data.</w:t>
       </w:r>
     </w:p>
@@ -13869,6 +13868,7 @@
           <w:rFonts w:ascii="Arial" w:hAnsi="Arial" w:cs="Arial"/>
           <w:sz w:val="22"/>
         </w:rPr>
+        <w:lastRenderedPageBreak/>
         <w:t>Who will review the data.</w:t>
       </w:r>
     </w:p>
@@ -14848,6 +14848,7 @@
           <w:color w:val="auto"/>
           <w:sz w:val="22"/>
         </w:rPr>
+        <w:lastRenderedPageBreak/>
         <w:t>Describe the steps that will be taken to secure the data (e.g., training, authorization of access, password protection, encryption, physical controls, certificates of confidentiality, and separation of identifiers and data) during storage, use, and transmission.</w:t>
       </w:r>
       <w:r>
@@ -15999,6 +16000,7 @@
           <w:color w:val="auto"/>
           <w:sz w:val="22"/>
         </w:rPr>
+        <w:lastRenderedPageBreak/>
         <w:t xml:space="preserve">If the research involves more than </w:t>
       </w:r>
       <w:r>
@@ -17604,8 +17606,15 @@
           <w:rFonts w:ascii="Arial" w:hAnsi="Arial" w:cs="Arial"/>
           <w:sz w:val="22"/>
         </w:rPr>
+        <w:t xml:space="preserve">For research conducted outside of the state, provide information that describes which persons have not attained the legal age for consent to treatments or procedures involved the research, under the applicable law of the jurisdiction in which research will be conducted. One method of obtaining this information is to </w:t>
+      </w:r>
+      <w:r>
+        <w:rPr>
+          <w:rFonts w:ascii="Arial" w:hAnsi="Arial" w:cs="Arial"/>
+          <w:sz w:val="22"/>
+        </w:rPr>
         <w:lastRenderedPageBreak/>
-        <w:t xml:space="preserve">For research conducted outside of the state, provide information that describes which persons have not attained the legal age for consent to treatments or procedures involved the research, under the applicable law of the jurisdiction in which research will be conducted. One method of obtaining this information is to have a legal counsel or authority review your protocol along the definition of “children” in </w:t>
+        <w:t xml:space="preserve">have a legal counsel or authority review your protocol along the definition of “children” in </w:t>
       </w:r>
       <w:hyperlink r:id="rId39" w:history="1">
         <w:r>
@@ -18111,15 +18120,7 @@
           <w:rFonts w:ascii="Arial" w:hAnsi="Arial" w:cs="Arial"/>
           <w:sz w:val="22"/>
         </w:rPr>
-        <w:t xml:space="preserve"> to be aware of which individuals </w:t>
-      </w:r>
-      <w:r>
-        <w:rPr>
-          <w:rFonts w:ascii="Arial" w:hAnsi="Arial" w:cs="Arial"/>
-          <w:sz w:val="22"/>
-        </w:rPr>
-        <w:lastRenderedPageBreak/>
-        <w:t>in the state meet the definition of</w:t>
+        <w:t xml:space="preserve"> to be aware of which individuals in the state meet the definition of</w:t>
       </w:r>
       <w:r>
         <w:rPr>
@@ -18171,7 +18172,15 @@
           <w:rFonts w:ascii="Arial" w:hAnsi="Arial" w:cs="Arial"/>
           <w:sz w:val="22"/>
         </w:rPr>
-        <w:t xml:space="preserve"> to their participation in the procedure(s) involved in this research. One method of obtaining this information is to have a legal counsel or authority review your protocol along </w:t>
+        <w:t xml:space="preserve"> to their </w:t>
+      </w:r>
+      <w:r>
+        <w:rPr>
+          <w:rFonts w:ascii="Arial" w:hAnsi="Arial" w:cs="Arial"/>
+          <w:sz w:val="22"/>
+        </w:rPr>
+        <w:lastRenderedPageBreak/>
+        <w:t xml:space="preserve">participation in the procedure(s) involved in this research. One method of obtaining this information is to have a legal counsel or authority review your protocol along </w:t>
       </w:r>
       <w:r>
         <w:rPr>
@@ -18965,6 +18974,7 @@
           <w:i/>
           <w:sz w:val="22"/>
         </w:rPr>
+        <w:lastRenderedPageBreak/>
         <w:t xml:space="preserve">If collaborators are affiliated with an institution that has a Federalwide Assurance and/or an IRB, the study is considered multi-site research. Please contact the IRB office to determine whether AU’s IRB can serve as the IRB of record for this project. </w:t>
       </w:r>
     </w:p>
@@ -19452,7 +19462,6 @@
           <w:rFonts w:ascii="Arial" w:hAnsi="Arial" w:cs="Arial"/>
           <w:sz w:val="22"/>
         </w:rPr>
-        <w:lastRenderedPageBreak/>
         <w:t>All engaged participating sites will safeguard data, including secure transmission of data, as required by local information security policies.</w:t>
       </w:r>
     </w:p>
@@ -19526,6 +19535,7 @@
           <w:rFonts w:ascii="Arial" w:hAnsi="Arial" w:cs="Arial"/>
           <w:sz w:val="22"/>
         </w:rPr>
+        <w:lastRenderedPageBreak/>
         <w:t>Problems (inclusive of reportable events)</w:t>
       </w:r>
       <w:r>
@@ -19638,7 +19648,7 @@
 
 <file path=word/comments.xml><?xml version="1.0" encoding="utf-8"?>
 <w:comments xmlns:wpc="http://schemas.microsoft.com/office/word/2010/wordprocessingCanvas" xmlns:cx="http://schemas.microsoft.com/office/drawing/2014/chartex" xmlns:cx1="http://schemas.microsoft.com/office/drawing/2015/9/8/chartex" xmlns:cx2="http://schemas.microsoft.com/office/drawing/2015/10/21/chartex" xmlns:cx3="http://schemas.microsoft.com/office/drawing/2016/5/9/chartex" xmlns:cx4="http://schemas.microsoft.com/office/drawing/2016/5/10/chartex" xmlns:cx5="http://schemas.microsoft.com/office/drawing/2016/5/11/chartex" xmlns:cx6="http://schemas.microsoft.com/office/drawing/2016/5/12/chartex" xmlns:cx7="http://schemas.microsoft.com/office/drawing/2016/5/13/chartex" xmlns:cx8="http://schemas.microsoft.com/office/drawing/2016/5/14/chartex" xmlns:mc="http://schemas.openxmlformats.org/markup-compatibility/2006" xmlns:aink="http://schemas.microsoft.com/office/drawing/2016/ink" xmlns:am3d="http://schemas.microsoft.com/office/drawing/2017/model3d" xmlns:o="urn:schemas-microsoft-com:office:office" xmlns:oel="http://schemas.microsoft.com/office/2019/extlst" xmlns:r="http://schemas.openxmlformats.org/officeDocument/2006/relationships" xmlns:m="http://schemas.openxmlformats.org/officeDocument/2006/math" xmlns:v="urn:schemas-microsoft-com:vml" xmlns:wp14="http://schemas.microsoft.com/office/word/2010/wordprocessingDrawing" xmlns:wp="http://schemas.openxmlformats.org/drawingml/2006/wordprocessingDrawing" xmlns:w10="urn:schemas-microsoft-com:office:word" xmlns:w="http://schemas.openxmlformats.org/wordprocessingml/2006/main" xmlns:w14="http://schemas.microsoft.com/office/word/2010/wordml" xmlns:w15="http://schemas.microsoft.com/office/word/2012/wordml" xmlns:w16cex="http://schemas.microsoft.com/office/word/2018/wordml/cex" xmlns:w16cid="http://schemas.microsoft.com/office/word/2016/wordml/cid" xmlns:w16="http://schemas.microsoft.com/office/word/2018/wordml" xmlns:w16du="http://schemas.microsoft.com/office/word/2023/wordml/word16du" xmlns:w16sdtdh="http://schemas.microsoft.com/office/word/2020/wordml/sdtdatahash" xmlns:w16sdtfl="http://schemas.microsoft.com/office/word/2024/wordml/sdtformatlock" xmlns:w16se="http://schemas.microsoft.com/office/word/2015/wordml/symex" xmlns:wpg="http://schemas.microsoft.com/office/word/2010/wordprocessingGroup" xmlns:wpi="http://schemas.microsoft.com/office/word/2010/wordprocessingInk" xmlns:wne="http://schemas.microsoft.com/office/word/2006/wordml" xmlns:wps="http://schemas.microsoft.com/office/word/2010/wordprocessingShape" mc:Ignorable="w14 w15 w16se w16cid w16 w16cex w16sdtdh w16sdtfl w16du wp14">
-  <w:comment w:id="3" w:author="Alex Fisher" w:date="2026-06-08T12:34:00Z" w:initials="AF">
+  <w:comment w:id="0" w:author="Alex Fisher" w:date="2026-06-18T14:08:00Z" w:initials="AF">
     <w:p>
       <w:r>
         <w:rPr>
@@ -19651,7 +19661,7 @@
           <w:sz w:val="20"/>
           <w:szCs w:val="20"/>
         </w:rPr>
-        <w:t>Do I include the entry questionnaire here?</w:t>
+        <w:t>Kelsey or Allie?</w:t>
       </w:r>
     </w:p>
   </w:comment>
@@ -19660,19 +19670,19 @@
 
 <file path=word/commentsExtended.xml><?xml version="1.0" encoding="utf-8"?>
 <w15:commentsEx xmlns:wpc="http://schemas.microsoft.com/office/word/2010/wordprocessingCanvas" xmlns:cx="http://schemas.microsoft.com/office/drawing/2014/chartex" xmlns:cx1="http://schemas.microsoft.com/office/drawing/2015/9/8/chartex" xmlns:cx2="http://schemas.microsoft.com/office/drawing/2015/10/21/chartex" xmlns:cx3="http://schemas.microsoft.com/office/drawing/2016/5/9/chartex" xmlns:cx4="http://schemas.microsoft.com/office/drawing/2016/5/10/chartex" xmlns:cx5="http://schemas.microsoft.com/office/drawing/2016/5/11/chartex" xmlns:cx6="http://schemas.microsoft.com/office/drawing/2016/5/12/chartex" xmlns:cx7="http://schemas.microsoft.com/office/drawing/2016/5/13/chartex" xmlns:cx8="http://schemas.microsoft.com/office/drawing/2016/5/14/chartex" xmlns:mc="http://schemas.openxmlformats.org/markup-compatibility/2006" xmlns:aink="http://schemas.microsoft.com/office/drawing/2016/ink" xmlns:am3d="http://schemas.microsoft.com/office/drawing/2017/model3d" xmlns:o="urn:schemas-microsoft-com:office:office" xmlns:oel="http://schemas.microsoft.com/office/2019/extlst" xmlns:r="http://schemas.openxmlformats.org/officeDocument/2006/relationships" xmlns:m="http://schemas.openxmlformats.org/officeDocument/2006/math" xmlns:v="urn:schemas-microsoft-com:vml" xmlns:wp14="http://schemas.microsoft.com/office/word/2010/wordprocessingDrawing" xmlns:wp="http://schemas.openxmlformats.org/drawingml/2006/wordprocessingDrawing" xmlns:w10="urn:schemas-microsoft-com:office:word" xmlns:w="http://schemas.openxmlformats.org/wordprocessingml/2006/main" xmlns:w14="http://schemas.microsoft.com/office/word/2010/wordml" xmlns:w15="http://schemas.microsoft.com/office/word/2012/wordml" xmlns:w16cex="http://schemas.microsoft.com/office/word/2018/wordml/cex" xmlns:w16cid="http://schemas.microsoft.com/office/word/2016/wordml/cid" xmlns:w16="http://schemas.microsoft.com/office/word/2018/wordml" xmlns:w16du="http://schemas.microsoft.com/office/word/2023/wordml/word16du" xmlns:w16sdtdh="http://schemas.microsoft.com/office/word/2020/wordml/sdtdatahash" xmlns:w16sdtfl="http://schemas.microsoft.com/office/word/2024/wordml/sdtformatlock" xmlns:w16se="http://schemas.microsoft.com/office/word/2015/wordml/symex" xmlns:wpg="http://schemas.microsoft.com/office/word/2010/wordprocessingGroup" xmlns:wpi="http://schemas.microsoft.com/office/word/2010/wordprocessingInk" xmlns:wne="http://schemas.microsoft.com/office/word/2006/wordml" xmlns:wps="http://schemas.microsoft.com/office/word/2010/wordprocessingShape" mc:Ignorable="w14 w15 w16se w16cid w16 w16cex w16sdtdh w16sdtfl w16du wp14">
-  <w15:commentEx w15:paraId="283A1CD5" w15:done="0"/>
+  <w15:commentEx w15:paraId="3A114F62" w15:done="0"/>
 </w15:commentsEx>
 </file>
 
 <file path=word/commentsExtensible.xml><?xml version="1.0" encoding="utf-8"?>
 <w16cex:commentsExtensible xmlns:wpc="http://schemas.microsoft.com/office/word/2010/wordprocessingCanvas" xmlns:cx="http://schemas.microsoft.com/office/drawing/2014/chartex" xmlns:cx1="http://schemas.microsoft.com/office/drawing/2015/9/8/chartex" xmlns:cx2="http://schemas.microsoft.com/office/drawing/2015/10/21/chartex" xmlns:cx3="http://schemas.microsoft.com/office/drawing/2016/5/9/chartex" xmlns:cx4="http://schemas.microsoft.com/office/drawing/2016/5/10/chartex" xmlns:cx5="http://schemas.microsoft.com/office/drawing/2016/5/11/chartex" xmlns:cx6="http://schemas.microsoft.com/office/drawing/2016/5/12/chartex" xmlns:cx7="http://schemas.microsoft.com/office/drawing/2016/5/13/chartex" xmlns:cx8="http://schemas.microsoft.com/office/drawing/2016/5/14/chartex" xmlns:cr="http://schemas.microsoft.com/office/comments/2020/reactions" xmlns:mc="http://schemas.openxmlformats.org/markup-compatibility/2006" xmlns:aink="http://schemas.microsoft.com/office/drawing/2016/ink" xmlns:am3d="http://schemas.microsoft.com/office/drawing/2017/model3d" xmlns:o="urn:schemas-microsoft-com:office:office" xmlns:oel="http://schemas.microsoft.com/office/2019/extlst" xmlns:r="http://schemas.openxmlformats.org/officeDocument/2006/relationships" xmlns:m="http://schemas.openxmlformats.org/officeDocument/2006/math" xmlns:v="urn:schemas-microsoft-com:vml" xmlns:wp14="http://schemas.microsoft.com/office/word/2010/wordprocessingDrawing" xmlns:wp="http://schemas.openxmlformats.org/drawingml/2006/wordprocessingDrawing" xmlns:w10="urn:schemas-microsoft-com:office:word" xmlns:w="http://schemas.openxmlformats.org/wordprocessingml/2006/main" xmlns:w14="http://schemas.microsoft.com/office/word/2010/wordml" xmlns:w15="http://schemas.microsoft.com/office/word/2012/wordml" xmlns:w16cex="http://schemas.microsoft.com/office/word/2018/wordml/cex" xmlns:w16cid="http://schemas.microsoft.com/office/word/2016/wordml/cid" xmlns:w16="http://schemas.microsoft.com/office/word/2018/wordml" xmlns:w16du="http://schemas.microsoft.com/office/word/2023/wordml/word16du" xmlns:w16sdtdh="http://schemas.microsoft.com/office/word/2020/wordml/sdtdatahash" xmlns:w16sdtfl="http://schemas.microsoft.com/office/word/2024/wordml/sdtformatlock" xmlns:w16se="http://schemas.microsoft.com/office/word/2015/wordml/symex" xmlns:wpg="http://schemas.microsoft.com/office/word/2010/wordprocessingGroup" xmlns:wpi="http://schemas.microsoft.com/office/word/2010/wordprocessingInk" xmlns:wne="http://schemas.microsoft.com/office/word/2006/wordml" xmlns:wps="http://schemas.microsoft.com/office/word/2010/wordprocessingShape" mc:Ignorable="w14 w15 w16se w16cid w16 w16cex w16sdtdh w16sdtfl cr w16du wp14">
-  <w16cex:commentExtensible w16cex:durableId="27EE5E1B" w16cex:dateUtc="2026-06-08T17:34:00Z"/>
+  <w16cex:commentExtensible w16cex:durableId="5081449F" w16cex:dateUtc="2026-06-18T19:08:00Z"/>
 </w16cex:commentsExtensible>
 </file>
 
 <file path=word/commentsIds.xml><?xml version="1.0" encoding="utf-8"?>
 <w16cid:commentsIds xmlns:wpc="http://schemas.microsoft.com/office/word/2010/wordprocessingCanvas" xmlns:cx="http://schemas.microsoft.com/office/drawing/2014/chartex" xmlns:cx1="http://schemas.microsoft.com/office/drawing/2015/9/8/chartex" xmlns:cx2="http://schemas.microsoft.com/office/drawing/2015/10/21/chartex" xmlns:cx3="http://schemas.microsoft.com/office/drawing/2016/5/9/chartex" xmlns:cx4="http://schemas.microsoft.com/office/drawing/2016/5/10/chartex" xmlns:cx5="http://schemas.microsoft.com/office/drawing/2016/5/11/chartex" xmlns:cx6="http://schemas.microsoft.com/office/drawing/2016/5/12/chartex" xmlns:cx7="http://schemas.microsoft.com/office/drawing/2016/5/13/chartex" xmlns:cx8="http://schemas.microsoft.com/office/drawing/2016/5/14/chartex" xmlns:mc="http://schemas.openxmlformats.org/markup-compatibility/2006" xmlns:aink="http://schemas.microsoft.com/office/drawing/2016/ink" xmlns:am3d="http://schemas.microsoft.com/office/drawing/2017/model3d" xmlns:o="urn:schemas-microsoft-com:office:office" xmlns:oel="http://schemas.microsoft.com/office/2019/extlst" xmlns:r="http://schemas.openxmlformats.org/officeDocument/2006/relationships" xmlns:m="http://schemas.openxmlformats.org/officeDocument/2006/math" xmlns:v="urn:schemas-microsoft-com:vml" xmlns:wp14="http://schemas.microsoft.com/office/word/2010/wordprocessingDrawing" xmlns:wp="http://schemas.openxmlformats.org/drawingml/2006/wordprocessingDrawing" xmlns:w10="urn:schemas-microsoft-com:office:word" xmlns:w="http://schemas.openxmlformats.org/wordprocessingml/2006/main" xmlns:w14="http://schemas.microsoft.com/office/word/2010/wordml" xmlns:w15="http://schemas.microsoft.com/office/word/2012/wordml" xmlns:w16cex="http://schemas.microsoft.com/office/word/2018/wordml/cex" xmlns:w16cid="http://schemas.microsoft.com/office/word/2016/wordml/cid" xmlns:w16="http://schemas.microsoft.com/office/word/2018/wordml" xmlns:w16du="http://schemas.microsoft.com/office/word/2023/wordml/word16du" xmlns:w16sdtdh="http://schemas.microsoft.com/office/word/2020/wordml/sdtdatahash" xmlns:w16sdtfl="http://schemas.microsoft.com/office/word/2024/wordml/sdtformatlock" xmlns:w16se="http://schemas.microsoft.com/office/word/2015/wordml/symex" xmlns:wpg="http://schemas.microsoft.com/office/word/2010/wordprocessingGroup" xmlns:wpi="http://schemas.microsoft.com/office/word/2010/wordprocessingInk" xmlns:wne="http://schemas.microsoft.com/office/word/2006/wordml" xmlns:wps="http://schemas.microsoft.com/office/word/2010/wordprocessingShape" mc:Ignorable="w14 w15 w16se w16cid w16 w16cex w16sdtdh w16sdtfl w16du wp14">
-  <w16cid:commentId w16cid:paraId="283A1CD5" w16cid:durableId="27EE5E1B"/>
+  <w16cid:commentId w16cid:paraId="3A114F62" w16cid:durableId="5081449F"/>
 </w16cid:commentsIds>
 </file>
 
@@ -21911,7 +21921,7 @@
     <w:charset w:val="00"/>
     <w:family w:val="swiss"/>
     <w:pitch w:val="variable"/>
-    <w:sig w:usb0="E0002AFF" w:usb1="C000247B" w:usb2="00000009" w:usb3="00000000" w:csb0="000001FF" w:csb1="00000000"/>
+    <w:sig w:usb0="E4002EFF" w:usb1="C000247B" w:usb2="00000009" w:usb3="00000000" w:csb0="000001FF" w:csb1="00000000"/>
   </w:font>
   <w:font w:name="Cambria">
     <w:panose1 w:val="02040503050406030204"/>
@@ -21956,7 +21966,7 @@
     <w:charset w:val="00"/>
     <w:family w:val="swiss"/>
     <w:pitch w:val="variable"/>
-    <w:sig w:usb0="E0002AFF" w:usb1="C000247B" w:usb2="00000009" w:usb3="00000000" w:csb0="000001FF" w:csb1="00000000"/>
+    <w:sig w:usb0="E4002EFF" w:usb1="C200247B" w:usb2="00000009" w:usb3="00000000" w:csb0="000001FF" w:csb1="00000000"/>
   </w:font>
   <w:font w:name="Aptos">
     <w:panose1 w:val="020B0004020202020204"/>
@@ -21992,6 +22002,7 @@
   </w:compat>
   <w:rsids>
     <w:rsidRoot w:val="00150782"/>
+    <w:rsid w:val="000937DB"/>
     <w:rsid w:val="000E4347"/>
     <w:rsid w:val="00117353"/>
     <w:rsid w:val="00144843"/>
@@ -22050,6 +22061,8 @@
     <w:rsid w:val="00B27BDD"/>
     <w:rsid w:val="00B30F85"/>
     <w:rsid w:val="00BE4EA2"/>
+    <w:rsid w:val="00C27364"/>
+    <w:rsid w:val="00C37270"/>
     <w:rsid w:val="00C402F1"/>
     <w:rsid w:val="00C417A4"/>
     <w:rsid w:val="00CE14A4"/>
@@ -22577,10 +22590,6 @@
     <w:name w:val="AD713D62F0674671B84ED001C57AB9C7"/>
     <w:rsid w:val="002E162F"/>
   </w:style>
-  <w:style w:type="paragraph" w:customStyle="1" w:styleId="FA77191633DF434EAAD88041D0CA8CAD">
-    <w:name w:val="FA77191633DF434EAAD88041D0CA8CAD"/>
-    <w:rsid w:val="00841044"/>
-  </w:style>
   <w:style w:type="paragraph" w:customStyle="1" w:styleId="960A7F7A0A9CB346B385F322A5846874">
     <w:name w:val="960A7F7A0A9CB346B385F322A5846874"/>
     <w:rsid w:val="00841044"/>
@@ -22891,21 +22900,10 @@
 </file>
 
 <file path=customXml/item1.xml><?xml version="1.0" encoding="utf-8"?>
-<p:properties xmlns:p="http://schemas.microsoft.com/office/2006/metadata/properties" xmlns:xsi="http://www.w3.org/2001/XMLSchema-instance" xmlns:pc="http://schemas.microsoft.com/office/infopath/2007/PartnerControls">
-  <documentManagement/>
-</p:properties>
+<b:Sources xmlns:b="http://schemas.openxmlformats.org/officeDocument/2006/bibliography" xmlns="http://schemas.openxmlformats.org/officeDocument/2006/bibliography" SelectedStyle="\APASixthEditionOfficeOnline.xsl" StyleName="APA" Version="6"/>
 </file>
 
 <file path=customXml/item2.xml><?xml version="1.0" encoding="utf-8"?>
-<?mso-contentType ?>
-<FormTemplates xmlns="http://schemas.microsoft.com/sharepoint/v3/contenttype/forms">
-  <Display>DocumentLibraryForm</Display>
-  <Edit>DocumentLibraryForm</Edit>
-  <New>DocumentLibraryForm</New>
-</FormTemplates>
-</file>
-
-<file path=customXml/item3.xml><?xml version="1.0" encoding="utf-8"?>
 <ct:contentTypeSchema xmlns:ct="http://schemas.microsoft.com/office/2006/metadata/contentType" xmlns:ma="http://schemas.microsoft.com/office/2006/metadata/properties/metaAttributes" ct:_="" ma:_="" ma:contentTypeName="Document" ma:contentTypeID="0x01010071543618D710814CB7A5D363A31D1B96" ma:contentTypeVersion="4" ma:contentTypeDescription="Create a new document." ma:contentTypeScope="" ma:versionID="56f6942f173b961896c388446d456582">
   <xsd:schema xmlns:xsd="http://www.w3.org/2001/XMLSchema" xmlns:xs="http://www.w3.org/2001/XMLSchema" xmlns:p="http://schemas.microsoft.com/office/2006/metadata/properties" xmlns:ns2="880a7bf2-c82d-49e4-b898-1932dfa2e071" targetNamespace="http://schemas.microsoft.com/office/2006/metadata/properties" ma:root="true" ma:fieldsID="a0ff5c3bf694fef035fbd678bebf06c6" ns2:_="">
     <xsd:import namespace="880a7bf2-c82d-49e4-b898-1932dfa2e071"/>
@@ -23049,28 +23047,30 @@
 </ct:contentTypeSchema>
 </file>
 
+<file path=customXml/item3.xml><?xml version="1.0" encoding="utf-8"?>
+<p:properties xmlns:p="http://schemas.microsoft.com/office/2006/metadata/properties" xmlns:xsi="http://www.w3.org/2001/XMLSchema-instance" xmlns:pc="http://schemas.microsoft.com/office/infopath/2007/PartnerControls">
+  <documentManagement/>
+</p:properties>
+</file>
+
 <file path=customXml/item4.xml><?xml version="1.0" encoding="utf-8"?>
-<b:Sources xmlns:b="http://schemas.openxmlformats.org/officeDocument/2006/bibliography" xmlns="http://schemas.openxmlformats.org/officeDocument/2006/bibliography" SelectedStyle="\APASixthEditionOfficeOnline.xsl" StyleName="APA" Version="6"/>
+<?mso-contentType ?>
+<FormTemplates xmlns="http://schemas.microsoft.com/sharepoint/v3/contenttype/forms">
+  <Display>DocumentLibraryForm</Display>
+  <Edit>DocumentLibraryForm</Edit>
+  <New>DocumentLibraryForm</New>
+</FormTemplates>
 </file>
 
 <file path=customXml/itemProps1.xml><?xml version="1.0" encoding="utf-8"?>
-<ds:datastoreItem xmlns:ds="http://schemas.openxmlformats.org/officeDocument/2006/customXml" ds:itemID="{4583F2B3-037C-44DB-B08D-E6F378EEF829}">
+<ds:datastoreItem xmlns:ds="http://schemas.openxmlformats.org/officeDocument/2006/customXml" ds:itemID="{C7DBFB5B-A178-7D45-BBE9-88A65BCF52B8}">
   <ds:schemaRefs>
-    <ds:schemaRef ds:uri="http://schemas.microsoft.com/office/2006/metadata/properties"/>
-    <ds:schemaRef ds:uri="http://schemas.microsoft.com/office/infopath/2007/PartnerControls"/>
+    <ds:schemaRef ds:uri="http://schemas.openxmlformats.org/officeDocument/2006/bibliography"/>
   </ds:schemaRefs>
 </ds:datastoreItem>
 </file>
 
 <file path=customXml/itemProps2.xml><?xml version="1.0" encoding="utf-8"?>
-<ds:datastoreItem xmlns:ds="http://schemas.openxmlformats.org/officeDocument/2006/customXml" ds:itemID="{1DBB1093-F880-422D-86C1-617F7DAEF962}">
-  <ds:schemaRefs>
-    <ds:schemaRef ds:uri="http://schemas.microsoft.com/sharepoint/v3/contenttype/forms"/>
-  </ds:schemaRefs>
-</ds:datastoreItem>
-</file>
-
-<file path=customXml/itemProps3.xml><?xml version="1.0" encoding="utf-8"?>
 <ds:datastoreItem xmlns:ds="http://schemas.openxmlformats.org/officeDocument/2006/customXml" ds:itemID="{C41636AD-22E5-42B9-BEC5-875C4017A51E}">
   <ds:schemaRefs>
     <ds:schemaRef ds:uri="http://schemas.microsoft.com/office/2006/metadata/contentType"/>
@@ -23088,10 +23088,19 @@
 </ds:datastoreItem>
 </file>
 
+<file path=customXml/itemProps3.xml><?xml version="1.0" encoding="utf-8"?>
+<ds:datastoreItem xmlns:ds="http://schemas.openxmlformats.org/officeDocument/2006/customXml" ds:itemID="{4583F2B3-037C-44DB-B08D-E6F378EEF829}">
+  <ds:schemaRefs>
+    <ds:schemaRef ds:uri="http://schemas.microsoft.com/office/2006/metadata/properties"/>
+    <ds:schemaRef ds:uri="http://schemas.microsoft.com/office/infopath/2007/PartnerControls"/>
+  </ds:schemaRefs>
+</ds:datastoreItem>
+</file>
+
 <file path=customXml/itemProps4.xml><?xml version="1.0" encoding="utf-8"?>
-<ds:datastoreItem xmlns:ds="http://schemas.openxmlformats.org/officeDocument/2006/customXml" ds:itemID="{C7DBFB5B-A178-7D45-BBE9-88A65BCF52B8}">
+<ds:datastoreItem xmlns:ds="http://schemas.openxmlformats.org/officeDocument/2006/customXml" ds:itemID="{1DBB1093-F880-422D-86C1-617F7DAEF962}">
   <ds:schemaRefs>
-    <ds:schemaRef ds:uri="http://schemas.openxmlformats.org/officeDocument/2006/bibliography"/>
+    <ds:schemaRef ds:uri="http://schemas.microsoft.com/sharepoint/v3/contenttype/forms"/>
   </ds:schemaRefs>
 </ds:datastoreItem>
 </file>
</xml_diff>

<commit_message>
Update HRP-503 - TEMPLATE PROTOCOL .docx
</commit_message>
<xml_diff>
--- a/Documents /HRP-503 - TEMPLATE PROTOCOL .docx
+++ b/Documents /HRP-503 - TEMPLATE PROTOCOL .docx
@@ -4654,7 +4654,23 @@
           <w:color w:val="000000" w:themeColor="text1"/>
           <w:sz w:val="22"/>
         </w:rPr>
-        <w:t xml:space="preserve"> growing in popularity in urban and suburban areas (USDA 2013). Both activities bring people into closer contact with birds and shared environmental resources. Bird feeders aggregate wild birds at artificially high densities, increasing contact rates and fecal-oral transmission of pathogens (Becker and Hall 2014; Becker et al. 2015), and backyard poultry can act as reservoirs and amplifiers of zoonotic bacteria such as Salmonella enterica (Larsen et al. 2022). The public-health consequences are documented: a 2021 multi-state Salmonella Typhimurium outbreak linked to wild songbirds at residential feeders resulted in human hospitalizations across multiple states (CDC 2021; Patel et al. 2023), and backyard poultry contact has been identified as a growing source of human salmonellosis (CDC 2025).</w:t>
+        <w:t xml:space="preserve"> growing in popularity in urban and suburban areas (USDA 2013). Both activities bring people into closer contact with birds and shared environmental resources. Bird feeders aggregate wild birds at artificially high densities, increasing contact rates and fecal-oral transmission of pathogens (Becker and Hall 2014; Becker et al. 2015), and backyard poultry can act as reservoirs and amplifiers of zoonotic bacteria such as Salmonella enterica (Larsen et al. 2022). The public-health </w:t>
+      </w:r>
+      <w:r>
+        <w:rPr>
+          <w:rFonts w:ascii="Arial" w:hAnsi="Arial" w:cs="Arial"/>
+          <w:color w:val="000000" w:themeColor="text1"/>
+          <w:sz w:val="22"/>
+        </w:rPr>
+        <w:t>outcomes</w:t>
+      </w:r>
+      <w:r>
+        <w:rPr>
+          <w:rFonts w:ascii="Arial" w:hAnsi="Arial" w:cs="Arial"/>
+          <w:color w:val="000000" w:themeColor="text1"/>
+          <w:sz w:val="22"/>
+        </w:rPr>
+        <w:t xml:space="preserve"> are documented: a 2021 multi-state Salmonella Typhimurium outbreak linked to wild songbirds at residential feeders resulted in human hospitalizations across multiple states (CDC 2021; Patel et al. 2023), and backyard poultry contact has been identified as a growing source of human salmonellosis (CDC 2025).</w:t>
       </w:r>
     </w:p>
     <w:p>
@@ -22052,6 +22068,7 @@
     <w:rsid w:val="008A5A4E"/>
     <w:rsid w:val="008C6B84"/>
     <w:rsid w:val="008D1264"/>
+    <w:rsid w:val="008D6715"/>
     <w:rsid w:val="0094332C"/>
     <w:rsid w:val="00987E92"/>
     <w:rsid w:val="009C2914"/>
@@ -22061,7 +22078,6 @@
     <w:rsid w:val="00B27BDD"/>
     <w:rsid w:val="00B30F85"/>
     <w:rsid w:val="00BE4EA2"/>
-    <w:rsid w:val="00C27364"/>
     <w:rsid w:val="00C37270"/>
     <w:rsid w:val="00C402F1"/>
     <w:rsid w:val="00C417A4"/>

</xml_diff>

<commit_message>
KM edits to sections 1 & 2
</commit_message>
<xml_diff>
--- a/Documents /HRP-503 - TEMPLATE PROTOCOL .docx
+++ b/Documents /HRP-503 - TEMPLATE PROTOCOL .docx
@@ -627,6 +627,7 @@
         </w:sdtPr>
         <w:sdtContent>
           <w:commentRangeStart w:id="0"/>
+          <w:commentRangeStart w:id="1"/>
           <w:r>
             <w:rPr>
               <w:rStyle w:val="PlaceholderText"/>
@@ -649,6 +650,15 @@
             </w:rPr>
             <w:commentReference w:id="0"/>
           </w:r>
+          <w:commentRangeEnd w:id="1"/>
+          <w:r>
+            <w:rPr>
+              <w:rStyle w:val="CommentReference"/>
+              <w:rFonts w:ascii="Arial" w:eastAsiaTheme="minorHAnsi" w:hAnsi="Arial" w:cstheme="minorBidi"/>
+              <w:color w:val="auto"/>
+            </w:rPr>
+            <w:commentReference w:id="1"/>
+          </w:r>
         </w:sdtContent>
       </w:sdt>
     </w:p>
@@ -923,7 +933,7 @@
         <w:t>Please complete the following required assurances:</w:t>
       </w:r>
     </w:p>
-    <w:bookmarkStart w:id="1" w:name="_Hlk172979714"/>
+    <w:bookmarkStart w:id="2" w:name="_Hlk172979714"/>
     <w:p>
       <w:pPr>
         <w:rPr>
@@ -1019,7 +1029,7 @@
           </w:ffData>
         </w:fldChar>
       </w:r>
-      <w:bookmarkStart w:id="2" w:name="Check1"/>
+      <w:bookmarkStart w:id="3" w:name="Check1"/>
       <w:r>
         <w:rPr>
           <w:rFonts w:eastAsia="Times New Roman" w:cs="Arial"/>
@@ -1051,7 +1061,7 @@
         </w:rPr>
         <w:fldChar w:fldCharType="end"/>
       </w:r>
-      <w:bookmarkEnd w:id="2"/>
+      <w:bookmarkEnd w:id="3"/>
       <w:r>
         <w:rPr>
           <w:rFonts w:eastAsia="Times New Roman" w:cs="Arial"/>
@@ -1097,7 +1107,7 @@
         </w:rPr>
         <w:t xml:space="preserve">criteria to be a PI on an IRB protocol at AU. </w:t>
       </w:r>
-      <w:bookmarkEnd w:id="1"/>
+      <w:bookmarkEnd w:id="2"/>
     </w:p>
     <w:p>
       <w:pPr>
@@ -1205,16 +1215,17 @@
           <w:placeholder>
             <w:docPart w:val="DefaultPlaceholder_-1854013440"/>
           </w:placeholder>
-          <w:showingPlcHdr/>
         </w:sdtPr>
         <w:sdtContent>
-          <w:r>
-            <w:rPr>
-              <w:rStyle w:val="PlaceholderText"/>
-              <w:bdr w:val="single" w:sz="4" w:space="0" w:color="auto"/>
-            </w:rPr>
-            <w:t>Click or tap here to enter text.</w:t>
-          </w:r>
+          <w:ins w:id="4" w:author="Kelsey McCune" w:date="2026-06-19T07:11:00Z" w16du:dateUtc="2026-06-19T12:11:00Z">
+            <w:r>
+              <w:rPr>
+                <w:rFonts w:eastAsia="Times New Roman" w:cs="Arial"/>
+                <w:szCs w:val="24"/>
+              </w:rPr>
+              <w:t>Dr. Latif Kalin</w:t>
+            </w:r>
+          </w:ins>
         </w:sdtContent>
       </w:sdt>
     </w:p>
@@ -3846,7 +3857,7 @@
         </w:rPr>
         <w:br w:type="page"/>
       </w:r>
-      <w:bookmarkStart w:id="3" w:name="_Toc226630088"/>
+      <w:bookmarkStart w:id="5" w:name="_Toc226630088"/>
       <w:r>
         <w:rPr>
           <w:rFonts w:ascii="Arial" w:hAnsi="Arial" w:cs="Arial"/>
@@ -3854,7 +3865,7 @@
         <w:lastRenderedPageBreak/>
         <w:t>Objectives</w:t>
       </w:r>
-      <w:bookmarkEnd w:id="3"/>
+      <w:bookmarkEnd w:id="5"/>
     </w:p>
     <w:p>
       <w:pPr>
@@ -3968,7 +3979,201 @@
                       <w:color w:val="auto"/>
                       <w:sz w:val="22"/>
                     </w:rPr>
-                    <w:t xml:space="preserve">Zoonotic diseases that spill over between wildlife, domestic animals, and humans represent a growing risk to public health, and the majority of emerging infectious diseases originate at small-scale interfaces where these groups interact. Backyard bird feeding and small-scale poultry keeping are widespread and growing activities that combine these interactions in residential settings, yet the impacts of these practices and the human dimensions that influence participant behavior remain poorly understood. The overarching goal of this study is to quantify the conditions associated with backyard activities that may increase disease risk in wild songbird communities and create potential for spillover to people, and to characterize how participants perceive and respond to that risk, in order to inform conservation and public health </w:t>
+                    <w:t>Zoonotic diseases that spill over between wildlife, domestic animals, and humans represent a growing risk to public health, and the majority of emerging infectious diseases originate at small-scale interfaces where these groups interact. Backyard bird feeding and small-scale poultry keeping are widespread and growing activities that combine</w:t>
+                  </w:r>
+                  <w:del w:id="6" w:author="Kelsey McCune" w:date="2026-06-19T07:12:00Z" w16du:dateUtc="2026-06-19T12:12:00Z">
+                    <w:r>
+                      <w:rPr>
+                        <w:rFonts w:ascii="Arial" w:hAnsi="Arial" w:cs="Arial"/>
+                        <w:color w:val="auto"/>
+                        <w:sz w:val="22"/>
+                      </w:rPr>
+                      <w:delText xml:space="preserve"> these</w:delText>
+                    </w:r>
+                  </w:del>
+                  <w:r>
+                    <w:rPr>
+                      <w:rFonts w:ascii="Arial" w:hAnsi="Arial" w:cs="Arial"/>
+                      <w:color w:val="auto"/>
+                      <w:sz w:val="22"/>
+                    </w:rPr>
+                    <w:t xml:space="preserve"> interactions</w:t>
+                  </w:r>
+                  <w:ins w:id="7" w:author="Kelsey McCune" w:date="2026-06-19T07:12:00Z" w16du:dateUtc="2026-06-19T12:12:00Z">
+                    <w:r>
+                      <w:rPr>
+                        <w:rFonts w:ascii="Arial" w:hAnsi="Arial" w:cs="Arial"/>
+                        <w:color w:val="auto"/>
+                        <w:sz w:val="22"/>
+                      </w:rPr>
+                      <w:t xml:space="preserve"> among wildlife, domestic animals and humans</w:t>
+                    </w:r>
+                  </w:ins>
+                  <w:r>
+                    <w:rPr>
+                      <w:rFonts w:ascii="Arial" w:hAnsi="Arial" w:cs="Arial"/>
+                      <w:color w:val="auto"/>
+                      <w:sz w:val="22"/>
+                    </w:rPr>
+                    <w:t xml:space="preserve"> in residential settings</w:t>
+                  </w:r>
+                  <w:ins w:id="8" w:author="Kelsey McCune" w:date="2026-06-19T07:20:00Z" w16du:dateUtc="2026-06-19T12:20:00Z">
+                    <w:r>
+                      <w:rPr>
+                        <w:rFonts w:ascii="Arial" w:hAnsi="Arial" w:cs="Arial"/>
+                        <w:color w:val="auto"/>
+                        <w:sz w:val="22"/>
+                      </w:rPr>
+                      <w:t>.</w:t>
+                    </w:r>
+                  </w:ins>
+                  <w:ins w:id="9" w:author="Kelsey McCune" w:date="2026-06-19T07:26:00Z" w16du:dateUtc="2026-06-19T12:26:00Z">
+                    <w:r>
+                      <w:rPr>
+                        <w:rFonts w:ascii="Arial" w:hAnsi="Arial" w:cs="Arial"/>
+                        <w:color w:val="auto"/>
+                        <w:sz w:val="22"/>
+                      </w:rPr>
+                      <w:t xml:space="preserve"> Despite the risk, these activities can benefit human wellbeing and feelings of connec</w:t>
+                    </w:r>
+                  </w:ins>
+                  <w:ins w:id="10" w:author="Kelsey McCune" w:date="2026-06-19T07:27:00Z" w16du:dateUtc="2026-06-19T12:27:00Z">
+                    <w:r>
+                      <w:rPr>
+                        <w:rFonts w:ascii="Arial" w:hAnsi="Arial" w:cs="Arial"/>
+                        <w:color w:val="auto"/>
+                        <w:sz w:val="22"/>
+                      </w:rPr>
+                      <w:t>tion to nature.</w:t>
+                    </w:r>
+                  </w:ins>
+                  <w:del w:id="11" w:author="Kelsey McCune" w:date="2026-06-19T07:26:00Z" w16du:dateUtc="2026-06-19T12:26:00Z">
+                    <w:r>
+                      <w:rPr>
+                        <w:rFonts w:ascii="Arial" w:hAnsi="Arial" w:cs="Arial"/>
+                        <w:color w:val="auto"/>
+                        <w:sz w:val="22"/>
+                      </w:rPr>
+                      <w:delText>,</w:delText>
+                    </w:r>
+                  </w:del>
+                  <w:r>
+                    <w:rPr>
+                      <w:rFonts w:ascii="Arial" w:hAnsi="Arial" w:cs="Arial"/>
+                      <w:color w:val="auto"/>
+                      <w:sz w:val="22"/>
+                    </w:rPr>
+                    <w:t xml:space="preserve"> </w:t>
+                  </w:r>
+                  <w:ins w:id="12" w:author="Kelsey McCune" w:date="2026-06-19T07:26:00Z" w16du:dateUtc="2026-06-19T12:26:00Z">
+                    <w:r>
+                      <w:rPr>
+                        <w:rFonts w:ascii="Arial" w:hAnsi="Arial" w:cs="Arial"/>
+                        <w:color w:val="auto"/>
+                        <w:sz w:val="22"/>
+                      </w:rPr>
+                      <w:t>Y</w:t>
+                    </w:r>
+                  </w:ins>
+                  <w:del w:id="13" w:author="Kelsey McCune" w:date="2026-06-19T07:26:00Z" w16du:dateUtc="2026-06-19T12:26:00Z">
+                    <w:r>
+                      <w:rPr>
+                        <w:rFonts w:ascii="Arial" w:hAnsi="Arial" w:cs="Arial"/>
+                        <w:color w:val="auto"/>
+                        <w:sz w:val="22"/>
+                      </w:rPr>
+                      <w:delText>y</w:delText>
+                    </w:r>
+                  </w:del>
+                  <w:r>
+                    <w:rPr>
+                      <w:rFonts w:ascii="Arial" w:hAnsi="Arial" w:cs="Arial"/>
+                      <w:color w:val="auto"/>
+                      <w:sz w:val="22"/>
+                    </w:rPr>
+                    <w:t>et</w:t>
+                  </w:r>
+                  <w:ins w:id="14" w:author="Kelsey McCune" w:date="2026-06-19T07:26:00Z" w16du:dateUtc="2026-06-19T12:26:00Z">
+                    <w:r>
+                      <w:rPr>
+                        <w:rFonts w:ascii="Arial" w:hAnsi="Arial" w:cs="Arial"/>
+                        <w:color w:val="auto"/>
+                        <w:sz w:val="22"/>
+                      </w:rPr>
+                      <w:t>,</w:t>
+                    </w:r>
+                  </w:ins>
+                  <w:r>
+                    <w:rPr>
+                      <w:rFonts w:ascii="Arial" w:hAnsi="Arial" w:cs="Arial"/>
+                      <w:color w:val="auto"/>
+                      <w:sz w:val="22"/>
+                    </w:rPr>
+                    <w:t xml:space="preserve"> the </w:t>
+                  </w:r>
+                  <w:ins w:id="15" w:author="Kelsey McCune" w:date="2026-06-19T07:27:00Z" w16du:dateUtc="2026-06-19T12:27:00Z">
+                    <w:r>
+                      <w:rPr>
+                        <w:rFonts w:ascii="Arial" w:hAnsi="Arial" w:cs="Arial"/>
+                        <w:color w:val="auto"/>
+                        <w:sz w:val="22"/>
+                      </w:rPr>
+                      <w:t xml:space="preserve">homeowner perceptions of the tradeoff between risk and benefit from these activities and the </w:t>
+                    </w:r>
+                  </w:ins>
+                  <w:r>
+                    <w:rPr>
+                      <w:rFonts w:ascii="Arial" w:hAnsi="Arial" w:cs="Arial"/>
+                      <w:color w:val="auto"/>
+                      <w:sz w:val="22"/>
+                    </w:rPr>
+                    <w:t>impact</w:t>
+                  </w:r>
+                  <w:del w:id="16" w:author="Kelsey McCune" w:date="2026-06-19T07:27:00Z" w16du:dateUtc="2026-06-19T12:27:00Z">
+                    <w:r>
+                      <w:rPr>
+                        <w:rFonts w:ascii="Arial" w:hAnsi="Arial" w:cs="Arial"/>
+                        <w:color w:val="auto"/>
+                        <w:sz w:val="22"/>
+                      </w:rPr>
+                      <w:delText>s</w:delText>
+                    </w:r>
+                  </w:del>
+                  <w:r>
+                    <w:rPr>
+                      <w:rFonts w:ascii="Arial" w:hAnsi="Arial" w:cs="Arial"/>
+                      <w:color w:val="auto"/>
+                      <w:sz w:val="22"/>
+                    </w:rPr>
+                    <w:t xml:space="preserve"> </w:t>
+                  </w:r>
+                  <w:del w:id="17" w:author="Kelsey McCune" w:date="2026-06-19T07:27:00Z" w16du:dateUtc="2026-06-19T12:27:00Z">
+                    <w:r>
+                      <w:rPr>
+                        <w:rFonts w:ascii="Arial" w:hAnsi="Arial" w:cs="Arial"/>
+                        <w:color w:val="auto"/>
+                        <w:sz w:val="22"/>
+                      </w:rPr>
+                      <w:delText>of these practices and the human dimensions that influence</w:delText>
+                    </w:r>
+                  </w:del>
+                  <w:ins w:id="18" w:author="Kelsey McCune" w:date="2026-06-19T07:27:00Z" w16du:dateUtc="2026-06-19T12:27:00Z">
+                    <w:r>
+                      <w:rPr>
+                        <w:rFonts w:ascii="Arial" w:hAnsi="Arial" w:cs="Arial"/>
+                        <w:color w:val="auto"/>
+                        <w:sz w:val="22"/>
+                      </w:rPr>
+                      <w:t>it has on</w:t>
+                    </w:r>
+                  </w:ins>
+                  <w:r>
+                    <w:rPr>
+                      <w:rFonts w:ascii="Arial" w:hAnsi="Arial" w:cs="Arial"/>
+                      <w:color w:val="auto"/>
+                      <w:sz w:val="22"/>
+                    </w:rPr>
+                    <w:t xml:space="preserve"> participant behavior remain poorly understood. The overarching goal of this study is to quantify the conditions associated with backyard activities that may increase disease risk in wild songbird communities and create potential for spillover to people, and to characterize how participants perceive and respond to that risk, in order to inform conservation and public health </w:t>
                   </w:r>
                   <w:r>
                     <w:rPr>
@@ -4029,7 +4234,53 @@
                       <w:color w:val="auto"/>
                       <w:sz w:val="22"/>
                     </w:rPr>
-                    <w:t>This study comprises three specific aims. Aims 1 and 2 concern pathogen prevalence in wild birds and the backyard environment; these are addressed through field and laboratory that are reviewed and approved separately under Auburn University Institutional Animal Care and Use Committee (IACUC) protocol IPROTO202500000090 ("Backyard bird behavior and disease," approved 12 January 2026). They are summarized here only as context for the human-subjects’ activities. Aim 3 is the human-subjects component addressed by this protocol</w:t>
+                    <w:t xml:space="preserve">This study comprises three specific aims. Aims 1 and 2 concern pathogen prevalence in wild birds and the backyard environment; these are addressed through field and laboratory </w:t>
+                  </w:r>
+                  <w:ins w:id="19" w:author="Kelsey McCune" w:date="2026-06-19T07:28:00Z" w16du:dateUtc="2026-06-19T12:28:00Z">
+                    <w:r>
+                      <w:rPr>
+                        <w:rFonts w:ascii="Arial" w:hAnsi="Arial" w:cs="Arial"/>
+                        <w:color w:val="auto"/>
+                        <w:sz w:val="22"/>
+                      </w:rPr>
+                      <w:t xml:space="preserve">methods </w:t>
+                    </w:r>
+                  </w:ins>
+                  <w:r>
+                    <w:rPr>
+                      <w:rFonts w:ascii="Arial" w:hAnsi="Arial" w:cs="Arial"/>
+                      <w:color w:val="auto"/>
+                      <w:sz w:val="22"/>
+                    </w:rPr>
+                    <w:t xml:space="preserve">that </w:t>
+                  </w:r>
+                  <w:ins w:id="20" w:author="Kelsey McCune" w:date="2026-06-19T07:28:00Z" w16du:dateUtc="2026-06-19T12:28:00Z">
+                    <w:r>
+                      <w:rPr>
+                        <w:rFonts w:ascii="Arial" w:hAnsi="Arial" w:cs="Arial"/>
+                        <w:color w:val="auto"/>
+                        <w:sz w:val="22"/>
+                      </w:rPr>
+                      <w:t>we</w:t>
+                    </w:r>
+                  </w:ins>
+                  <w:del w:id="21" w:author="Kelsey McCune" w:date="2026-06-19T07:28:00Z" w16du:dateUtc="2026-06-19T12:28:00Z">
+                    <w:r>
+                      <w:rPr>
+                        <w:rFonts w:ascii="Arial" w:hAnsi="Arial" w:cs="Arial"/>
+                        <w:color w:val="auto"/>
+                        <w:sz w:val="22"/>
+                      </w:rPr>
+                      <w:delText>a</w:delText>
+                    </w:r>
+                  </w:del>
+                  <w:r>
+                    <w:rPr>
+                      <w:rFonts w:ascii="Arial" w:hAnsi="Arial" w:cs="Arial"/>
+                      <w:color w:val="auto"/>
+                      <w:sz w:val="22"/>
+                    </w:rPr>
+                    <w:t>re reviewed and approved separately under Auburn University Institutional Animal Care and Use Committee (IACUC) protocol IPROTO202500000090 ("Backyard bird behavior and disease," approved 12 January 2026). They are summarized here only as context for the human-subjects’ activities. Aim 3 is the human-subjects component addressed by this protocol</w:t>
                   </w:r>
                   <w:r>
                     <w:rPr>
@@ -4135,23 +4386,97 @@
                       <w:color w:val="000000" w:themeColor="text1"/>
                       <w:sz w:val="22"/>
                     </w:rPr>
-                    <w:t xml:space="preserve"> bird feeder only, backyard poultry only, both, and control sites with neither</w:t>
+                    <w:t xml:space="preserve"> bird feeder only, backyard poultry only, both</w:t>
                   </w:r>
+                  <w:ins w:id="22" w:author="Kelsey McCune" w:date="2026-06-19T07:29:00Z" w16du:dateUtc="2026-06-19T12:29:00Z">
+                    <w:r>
+                      <w:rPr>
+                        <w:rFonts w:ascii="Arial" w:hAnsi="Arial" w:cs="Arial"/>
+                        <w:color w:val="000000" w:themeColor="text1"/>
+                        <w:sz w:val="22"/>
+                      </w:rPr>
+                      <w:t xml:space="preserve"> feeders and poultry</w:t>
+                    </w:r>
+                  </w:ins>
                   <w:r>
                     <w:rPr>
                       <w:rFonts w:ascii="Arial" w:hAnsi="Arial" w:cs="Arial"/>
                       <w:color w:val="000000" w:themeColor="text1"/>
                       <w:sz w:val="22"/>
                     </w:rPr>
-                    <w:t xml:space="preserve">; </w:t>
+                    <w:t>, and control sites with neither</w:t>
                   </w:r>
+                  <w:ins w:id="23" w:author="Kelsey McCune" w:date="2026-06-19T07:30:00Z" w16du:dateUtc="2026-06-19T12:30:00Z">
+                    <w:r>
+                      <w:rPr>
+                        <w:rFonts w:ascii="Arial" w:hAnsi="Arial" w:cs="Arial"/>
+                        <w:color w:val="000000" w:themeColor="text1"/>
+                        <w:sz w:val="22"/>
+                      </w:rPr>
+                      <w:t>. From this we will</w:t>
+                    </w:r>
+                  </w:ins>
+                  <w:del w:id="24" w:author="Kelsey McCune" w:date="2026-06-19T07:30:00Z" w16du:dateUtc="2026-06-19T12:30:00Z">
+                    <w:r>
+                      <w:rPr>
+                        <w:rFonts w:ascii="Arial" w:hAnsi="Arial" w:cs="Arial"/>
+                        <w:color w:val="000000" w:themeColor="text1"/>
+                        <w:sz w:val="22"/>
+                      </w:rPr>
+                      <w:delText xml:space="preserve">; </w:delText>
+                    </w:r>
+                    <w:r>
+                      <w:rPr>
+                        <w:rFonts w:ascii="Arial" w:hAnsi="Arial" w:cs="Arial"/>
+                        <w:color w:val="000000" w:themeColor="text1"/>
+                        <w:sz w:val="22"/>
+                      </w:rPr>
+                      <w:delText>to</w:delText>
+                    </w:r>
+                  </w:del>
                   <w:r>
                     <w:rPr>
                       <w:rFonts w:ascii="Arial" w:hAnsi="Arial" w:cs="Arial"/>
                       <w:color w:val="000000" w:themeColor="text1"/>
                       <w:sz w:val="22"/>
                     </w:rPr>
-                    <w:t>to determine which backyard components are associated with higher infection rates.</w:t>
+                    <w:t xml:space="preserve"> determine which backyard </w:t>
+                  </w:r>
+                  <w:del w:id="25" w:author="Kelsey McCune" w:date="2026-06-19T07:30:00Z" w16du:dateUtc="2026-06-19T12:30:00Z">
+                    <w:r>
+                      <w:rPr>
+                        <w:rFonts w:ascii="Arial" w:hAnsi="Arial" w:cs="Arial"/>
+                        <w:color w:val="000000" w:themeColor="text1"/>
+                        <w:sz w:val="22"/>
+                      </w:rPr>
+                      <w:delText xml:space="preserve">components </w:delText>
+                    </w:r>
+                  </w:del>
+                  <w:ins w:id="26" w:author="Kelsey McCune" w:date="2026-06-19T07:30:00Z" w16du:dateUtc="2026-06-19T12:30:00Z">
+                    <w:r>
+                      <w:rPr>
+                        <w:rFonts w:ascii="Arial" w:hAnsi="Arial" w:cs="Arial"/>
+                        <w:color w:val="000000" w:themeColor="text1"/>
+                        <w:sz w:val="22"/>
+                      </w:rPr>
+                      <w:t>activitie</w:t>
+                    </w:r>
+                    <w:r>
+                      <w:rPr>
+                        <w:rFonts w:ascii="Arial" w:hAnsi="Arial" w:cs="Arial"/>
+                        <w:color w:val="000000" w:themeColor="text1"/>
+                        <w:sz w:val="22"/>
+                      </w:rPr>
+                      <w:t xml:space="preserve">s </w:t>
+                    </w:r>
+                  </w:ins>
+                  <w:r>
+                    <w:rPr>
+                      <w:rFonts w:ascii="Arial" w:hAnsi="Arial" w:cs="Arial"/>
+                      <w:color w:val="000000" w:themeColor="text1"/>
+                      <w:sz w:val="22"/>
+                    </w:rPr>
+                    <w:t>are associated with higher infection rates.</w:t>
                   </w:r>
                 </w:p>
                 <w:p>
@@ -4408,6 +4733,7 @@
               <w:sz w:val="22"/>
               <w:szCs w:val="22"/>
             </w:rPr>
+            <w:lastRenderedPageBreak/>
             <w:t>H3: Greater engagement in backyard wildlife activities will be associated with stronger pro-conservation attitudes and behaviors.</w:t>
           </w:r>
         </w:p>
@@ -4447,14 +4773,14 @@
           <w:rFonts w:ascii="Arial" w:hAnsi="Arial" w:cs="Arial"/>
         </w:rPr>
       </w:pPr>
-      <w:bookmarkStart w:id="4" w:name="_Toc226630089"/>
+      <w:bookmarkStart w:id="27" w:name="_Toc226630089"/>
       <w:r>
         <w:rPr>
           <w:rFonts w:ascii="Arial" w:hAnsi="Arial" w:cs="Arial"/>
         </w:rPr>
         <w:t>Background</w:t>
       </w:r>
-      <w:bookmarkEnd w:id="4"/>
+      <w:bookmarkEnd w:id="27"/>
     </w:p>
     <w:p>
       <w:pPr>
@@ -4610,7 +4936,53 @@
           <w:color w:val="000000" w:themeColor="text1"/>
           <w:sz w:val="22"/>
         </w:rPr>
-        <w:t>, focusing on pinpointing the outbreak cause</w:t>
+        <w:t xml:space="preserve">, </w:t>
+      </w:r>
+      <w:del w:id="28" w:author="Kelsey McCune" w:date="2026-06-19T07:34:00Z" w16du:dateUtc="2026-06-19T12:34:00Z">
+        <w:r>
+          <w:rPr>
+            <w:rFonts w:ascii="Arial" w:hAnsi="Arial" w:cs="Arial"/>
+            <w:color w:val="000000" w:themeColor="text1"/>
+            <w:sz w:val="22"/>
+          </w:rPr>
+          <w:delText>focusing on</w:delText>
+        </w:r>
+      </w:del>
+      <w:ins w:id="29" w:author="Kelsey McCune" w:date="2026-06-19T07:34:00Z" w16du:dateUtc="2026-06-19T12:34:00Z">
+        <w:r>
+          <w:rPr>
+            <w:rFonts w:ascii="Arial" w:hAnsi="Arial" w:cs="Arial"/>
+            <w:color w:val="000000" w:themeColor="text1"/>
+            <w:sz w:val="22"/>
+          </w:rPr>
+          <w:t>where it is possible to</w:t>
+        </w:r>
+      </w:ins>
+      <w:r>
+        <w:rPr>
+          <w:rFonts w:ascii="Arial" w:hAnsi="Arial" w:cs="Arial"/>
+          <w:color w:val="000000" w:themeColor="text1"/>
+          <w:sz w:val="22"/>
+        </w:rPr>
+        <w:t xml:space="preserve"> pinpoint</w:t>
+      </w:r>
+      <w:del w:id="30" w:author="Kelsey McCune" w:date="2026-06-19T07:34:00Z" w16du:dateUtc="2026-06-19T12:34:00Z">
+        <w:r>
+          <w:rPr>
+            <w:rFonts w:ascii="Arial" w:hAnsi="Arial" w:cs="Arial"/>
+            <w:color w:val="000000" w:themeColor="text1"/>
+            <w:sz w:val="22"/>
+          </w:rPr>
+          <w:delText>ing</w:delText>
+        </w:r>
+      </w:del>
+      <w:r>
+        <w:rPr>
+          <w:rFonts w:ascii="Arial" w:hAnsi="Arial" w:cs="Arial"/>
+          <w:color w:val="000000" w:themeColor="text1"/>
+          <w:sz w:val="22"/>
+        </w:rPr>
+        <w:t xml:space="preserve"> the outbreak cause</w:t>
       </w:r>
       <w:r>
         <w:rPr>
@@ -4638,7 +5010,25 @@
           <w:color w:val="000000" w:themeColor="text1"/>
           <w:sz w:val="22"/>
         </w:rPr>
-        <w:t xml:space="preserve">Backyard bird feeding and small-scale poultry keeping are two widespread and growing activities that concentrate these interactions in residential settings. Backyard bird feeding is well established in the United States, with federal surveys estimating that over 50 million Americans feed wild birds and hundreds of millions of dollars spent on bird seed annually (USFWS 2022). Backyard poultry keeping is </w:t>
+        <w:t xml:space="preserve">Backyard bird feeding and small-scale poultry keeping are two widespread and growing activities that concentrate these interactions in residential settings. Backyard bird feeding is well established in the United States, with federal surveys estimating that over 50 million Americans feed wild birds and hundreds of millions of dollars </w:t>
+      </w:r>
+      <w:ins w:id="31" w:author="Kelsey McCune" w:date="2026-06-19T07:35:00Z" w16du:dateUtc="2026-06-19T12:35:00Z">
+        <w:r>
+          <w:rPr>
+            <w:rFonts w:ascii="Arial" w:hAnsi="Arial" w:cs="Arial"/>
+            <w:color w:val="000000" w:themeColor="text1"/>
+            <w:sz w:val="22"/>
+          </w:rPr>
+          <w:t xml:space="preserve">are </w:t>
+        </w:r>
+      </w:ins>
+      <w:r>
+        <w:rPr>
+          <w:rFonts w:ascii="Arial" w:hAnsi="Arial" w:cs="Arial"/>
+          <w:color w:val="000000" w:themeColor="text1"/>
+          <w:sz w:val="22"/>
+        </w:rPr>
+        <w:t xml:space="preserve">spent on bird seed annually (USFWS 2022). Backyard poultry keeping is </w:t>
       </w:r>
       <w:r>
         <w:rPr>
@@ -4690,7 +5080,116 @@
           <w:color w:val="000000" w:themeColor="text1"/>
           <w:sz w:val="22"/>
         </w:rPr>
-        <w:t>Despite the scale of these activities and their documented disease risks, the human dimensions that shape participant behavior at this interface remain poorly understood. Effective biosecurity and conservation outreach depends not only on quantifying pathogen risk but on understanding how participants perceive that risk, what motivates their engagement, how knowledgeable they are about zoonotic disease, and how willing they are to adopt practices that reduce transmission. Prior surveys of backyard poultry and wildlife-feeding populations have examined zoonotic disease awareness and biosecurity knowledge (e.g., Nicholson et al. 2020; Kyle and Sutherland 2016), and research on backyard bird feeding has linked the activity to well-being, nature connectedness, and pro-conservation behavior (Cox and Gaston 2016; Dayer et al. 2019). However, these human dimensions—disease-risk perception, biosecurity engagement, place attachment, and conservation attitudes—have not been examined together in the populations who feed backyard birds and keep backyard poultry, particularly in the Southeastern United States.</w:t>
+        <w:t xml:space="preserve">Despite the scale of these activities and their documented disease risks, the </w:t>
+      </w:r>
+      <w:del w:id="32" w:author="Kelsey McCune" w:date="2026-06-19T07:37:00Z" w16du:dateUtc="2026-06-19T12:37:00Z">
+        <w:r>
+          <w:rPr>
+            <w:rFonts w:ascii="Arial" w:hAnsi="Arial" w:cs="Arial"/>
+            <w:color w:val="000000" w:themeColor="text1"/>
+            <w:sz w:val="22"/>
+          </w:rPr>
+          <w:delText>human dimensions</w:delText>
+        </w:r>
+      </w:del>
+      <w:ins w:id="33" w:author="Kelsey McCune" w:date="2026-06-19T07:37:00Z" w16du:dateUtc="2026-06-19T12:37:00Z">
+        <w:r>
+          <w:rPr>
+            <w:rFonts w:ascii="Arial" w:hAnsi="Arial" w:cs="Arial"/>
+            <w:color w:val="000000" w:themeColor="text1"/>
+            <w:sz w:val="22"/>
+          </w:rPr>
+          <w:t>perceptions and knowledge</w:t>
+        </w:r>
+      </w:ins>
+      <w:r>
+        <w:rPr>
+          <w:rFonts w:ascii="Arial" w:hAnsi="Arial" w:cs="Arial"/>
+          <w:color w:val="000000" w:themeColor="text1"/>
+          <w:sz w:val="22"/>
+        </w:rPr>
+        <w:t xml:space="preserve"> that shape participant behavior at this interface remain poorly understood. Effective </w:t>
+      </w:r>
+      <w:ins w:id="34" w:author="Kelsey McCune" w:date="2026-06-19T07:38:00Z" w16du:dateUtc="2026-06-19T12:38:00Z">
+        <w:r>
+          <w:rPr>
+            <w:rFonts w:ascii="Arial" w:hAnsi="Arial" w:cs="Arial"/>
+            <w:color w:val="000000" w:themeColor="text1"/>
+            <w:sz w:val="22"/>
+          </w:rPr>
+          <w:t xml:space="preserve">public health </w:t>
+        </w:r>
+      </w:ins>
+      <w:r>
+        <w:rPr>
+          <w:rFonts w:ascii="Arial" w:hAnsi="Arial" w:cs="Arial"/>
+          <w:color w:val="000000" w:themeColor="text1"/>
+          <w:sz w:val="22"/>
+        </w:rPr>
+        <w:t>biosecurity</w:t>
+      </w:r>
+      <w:ins w:id="35" w:author="Kelsey McCune" w:date="2026-06-19T07:38:00Z" w16du:dateUtc="2026-06-19T12:38:00Z">
+        <w:r>
+          <w:rPr>
+            <w:rFonts w:ascii="Arial" w:hAnsi="Arial" w:cs="Arial"/>
+            <w:color w:val="000000" w:themeColor="text1"/>
+            <w:sz w:val="22"/>
+          </w:rPr>
+          <w:t xml:space="preserve"> recommendations</w:t>
+        </w:r>
+      </w:ins>
+      <w:r>
+        <w:rPr>
+          <w:rFonts w:ascii="Arial" w:hAnsi="Arial" w:cs="Arial"/>
+          <w:color w:val="000000" w:themeColor="text1"/>
+          <w:sz w:val="22"/>
+        </w:rPr>
+        <w:t xml:space="preserve"> and</w:t>
+      </w:r>
+      <w:ins w:id="36" w:author="Kelsey McCune" w:date="2026-06-19T07:38:00Z" w16du:dateUtc="2026-06-19T12:38:00Z">
+        <w:r>
+          <w:rPr>
+            <w:rFonts w:ascii="Arial" w:hAnsi="Arial" w:cs="Arial"/>
+            <w:color w:val="000000" w:themeColor="text1"/>
+            <w:sz w:val="22"/>
+          </w:rPr>
+          <w:t xml:space="preserve"> nature</w:t>
+        </w:r>
+      </w:ins>
+      <w:r>
+        <w:rPr>
+          <w:rFonts w:ascii="Arial" w:hAnsi="Arial" w:cs="Arial"/>
+          <w:color w:val="000000" w:themeColor="text1"/>
+          <w:sz w:val="22"/>
+        </w:rPr>
+        <w:t xml:space="preserve"> conservation outreach depends not only on quantifying pathogen risk but on understanding how participants perceive that risk, what motivates their engagement</w:t>
+      </w:r>
+      <w:ins w:id="37" w:author="Kelsey McCune" w:date="2026-06-19T07:39:00Z" w16du:dateUtc="2026-06-19T12:39:00Z">
+        <w:r>
+          <w:rPr>
+            <w:rFonts w:ascii="Arial" w:hAnsi="Arial" w:cs="Arial"/>
+            <w:color w:val="000000" w:themeColor="text1"/>
+            <w:sz w:val="22"/>
+          </w:rPr>
+          <w:t xml:space="preserve"> in the activity</w:t>
+        </w:r>
+      </w:ins>
+      <w:r>
+        <w:rPr>
+          <w:rFonts w:ascii="Arial" w:hAnsi="Arial" w:cs="Arial"/>
+          <w:color w:val="000000" w:themeColor="text1"/>
+          <w:sz w:val="22"/>
+        </w:rPr>
+        <w:t xml:space="preserve">, how knowledgeable they are about zoonotic disease, and how willing they are to adopt practices that reduce transmission. Prior surveys of backyard poultry and wildlife-feeding populations have examined zoonotic disease awareness and biosecurity knowledge (e.g., Nicholson et al. 2020; Kyle and Sutherland 2016), and research on backyard bird feeding has linked the activity to well-being, nature connectedness, and pro-conservation behavior (Cox and Gaston 2016; Dayer et al. 2019). However, these human dimensions—disease-risk perception, biosecurity engagement, place attachment, and conservation attitudes—have not been examined together in the populations </w:t>
+      </w:r>
+      <w:r>
+        <w:rPr>
+          <w:rFonts w:ascii="Arial" w:hAnsi="Arial" w:cs="Arial"/>
+          <w:color w:val="000000" w:themeColor="text1"/>
+          <w:sz w:val="22"/>
+        </w:rPr>
+        <w:lastRenderedPageBreak/>
+        <w:t>who feed backyard birds and keep backyard poultry, particularly in the Southeastern United States.</w:t>
       </w:r>
     </w:p>
     <w:p>
@@ -4710,16 +5209,71 @@
           <w:color w:val="000000" w:themeColor="text1"/>
           <w:sz w:val="22"/>
         </w:rPr>
-        <w:t xml:space="preserve">This study addresses that gap. It is part of a larger project examining disease dynamics at the backyard human-wildlife interface; the biological components quantifying pathogen prevalence in wild birds and the environment are reviewed </w:t>
-      </w:r>
+        <w:t xml:space="preserve">This study addresses that gap. It is part of a larger project examining </w:t>
+      </w:r>
+      <w:ins w:id="38" w:author="Kelsey McCune" w:date="2026-06-19T07:40:00Z" w16du:dateUtc="2026-06-19T12:40:00Z">
+        <w:r>
+          <w:rPr>
+            <w:rFonts w:ascii="Arial" w:hAnsi="Arial" w:cs="Arial"/>
+            <w:color w:val="000000" w:themeColor="text1"/>
+            <w:sz w:val="22"/>
+          </w:rPr>
+          <w:t xml:space="preserve">zoonotic </w:t>
+        </w:r>
+      </w:ins>
       <w:r>
         <w:rPr>
           <w:rFonts w:ascii="Arial" w:hAnsi="Arial" w:cs="Arial"/>
           <w:color w:val="000000" w:themeColor="text1"/>
           <w:sz w:val="22"/>
         </w:rPr>
-        <w:lastRenderedPageBreak/>
-        <w:t>separately under IACUC protocol IPROTO202500000090. The present protocol concerns the human-subjects component (Aim 3), which uses an anonymous online survey to characterize disease-risk perception, biosecurity practice engagement, willingness to modify backyard behaviors, place attachment, and pro-conservation attitudes and behaviors among adults who feed backyard birds and/or keep backyard poultry. Understanding these human dimensions is essential for developing accessible, effective biosecurity guidance that reduces disease risk while preserving the well-being and conservation benefits these activities provide.</w:t>
+        <w:t xml:space="preserve">disease dynamics at the backyard human-wildlife interface; the </w:t>
+      </w:r>
+      <w:del w:id="39" w:author="Kelsey McCune" w:date="2026-06-19T07:41:00Z" w16du:dateUtc="2026-06-19T12:41:00Z">
+        <w:r>
+          <w:rPr>
+            <w:rFonts w:ascii="Arial" w:hAnsi="Arial" w:cs="Arial"/>
+            <w:color w:val="000000" w:themeColor="text1"/>
+            <w:sz w:val="22"/>
+          </w:rPr>
+          <w:delText>biological components</w:delText>
+        </w:r>
+      </w:del>
+      <w:ins w:id="40" w:author="Kelsey McCune" w:date="2026-06-19T07:41:00Z" w16du:dateUtc="2026-06-19T12:41:00Z">
+        <w:r>
+          <w:rPr>
+            <w:rFonts w:ascii="Arial" w:hAnsi="Arial" w:cs="Arial"/>
+            <w:color w:val="000000" w:themeColor="text1"/>
+            <w:sz w:val="22"/>
+          </w:rPr>
+          <w:t>methods</w:t>
+        </w:r>
+      </w:ins>
+      <w:r>
+        <w:rPr>
+          <w:rFonts w:ascii="Arial" w:hAnsi="Arial" w:cs="Arial"/>
+          <w:color w:val="000000" w:themeColor="text1"/>
+          <w:sz w:val="22"/>
+        </w:rPr>
+        <w:t xml:space="preserve"> quantifying pathogen prevalence in wild birds </w:t>
+      </w:r>
+      <w:del w:id="41" w:author="Kelsey McCune" w:date="2026-06-19T07:41:00Z" w16du:dateUtc="2026-06-19T12:41:00Z">
+        <w:r>
+          <w:rPr>
+            <w:rFonts w:ascii="Arial" w:hAnsi="Arial" w:cs="Arial"/>
+            <w:color w:val="000000" w:themeColor="text1"/>
+            <w:sz w:val="22"/>
+          </w:rPr>
+          <w:delText xml:space="preserve">and the environment </w:delText>
+        </w:r>
+      </w:del>
+      <w:r>
+        <w:rPr>
+          <w:rFonts w:ascii="Arial" w:hAnsi="Arial" w:cs="Arial"/>
+          <w:color w:val="000000" w:themeColor="text1"/>
+          <w:sz w:val="22"/>
+        </w:rPr>
+        <w:t>are reviewed separately under IACUC protocol IPROTO202500000090. The present protocol concerns the human-subjects component (Aim 3), which uses an anonymous online survey to characterize disease-risk perception, biosecurity practice engagement, willingness to modify backyard behaviors, place attachment, and pro-conservation attitudes and behaviors among adults who feed backyard birds and/or keep backyard poultry. Understanding these human dimensions is essential for developing accessible, effective biosecurity guidance that reduces disease risk while preserving the well-being and conservation benefits these activities provide.</w:t>
       </w:r>
     </w:p>
     <w:p>
@@ -4752,7 +5306,7 @@
           <w:rFonts w:ascii="Arial" w:hAnsi="Arial" w:cs="Arial"/>
         </w:rPr>
       </w:pPr>
-      <w:bookmarkStart w:id="5" w:name="_Toc226630090"/>
+      <w:bookmarkStart w:id="42" w:name="_Toc226630090"/>
       <w:r>
         <w:rPr>
           <w:rFonts w:ascii="Arial" w:hAnsi="Arial" w:cs="Arial"/>
@@ -4765,7 +5319,7 @@
         </w:rPr>
         <w:t>Outcomes</w:t>
       </w:r>
-      <w:bookmarkEnd w:id="5"/>
+      <w:bookmarkEnd w:id="42"/>
     </w:p>
     <w:p>
       <w:pPr>
@@ -4950,7 +5504,7 @@
           <w:rFonts w:ascii="Arial" w:hAnsi="Arial" w:cs="Arial"/>
         </w:rPr>
       </w:pPr>
-      <w:bookmarkStart w:id="6" w:name="_Toc226630091"/>
+      <w:bookmarkStart w:id="43" w:name="_Toc226630091"/>
       <w:r>
         <w:rPr>
           <w:rFonts w:ascii="Arial" w:hAnsi="Arial" w:cs="Arial"/>
@@ -4977,7 +5531,7 @@
         </w:rPr>
         <w:t>Interaction</w:t>
       </w:r>
-      <w:bookmarkEnd w:id="6"/>
+      <w:bookmarkEnd w:id="43"/>
     </w:p>
     <w:p>
       <w:pPr>
@@ -5031,7 +5585,7 @@
         </w:rPr>
         <w:t xml:space="preserve"> </w:t>
       </w:r>
-      <w:bookmarkStart w:id="7" w:name="_Hlk203555646"/>
+      <w:bookmarkStart w:id="44" w:name="_Hlk203555646"/>
       <w:r>
         <w:rPr>
           <w:rFonts w:ascii="Arial" w:hAnsi="Arial" w:cs="Arial"/>
@@ -5059,7 +5613,7 @@
         </w:rPr>
         <w:t xml:space="preserve"> is not applicable to your research project</w:t>
       </w:r>
-      <w:bookmarkEnd w:id="7"/>
+      <w:bookmarkEnd w:id="44"/>
     </w:p>
     <w:p>
       <w:pPr>
@@ -5215,14 +5769,14 @@
           <w:rFonts w:ascii="Arial" w:hAnsi="Arial" w:cs="Arial"/>
         </w:rPr>
       </w:pPr>
-      <w:bookmarkStart w:id="8" w:name="_Toc226630092"/>
+      <w:bookmarkStart w:id="45" w:name="_Toc226630092"/>
       <w:r>
         <w:rPr>
           <w:rFonts w:ascii="Arial" w:hAnsi="Arial" w:cs="Arial"/>
         </w:rPr>
         <w:t>Procedures Involved</w:t>
       </w:r>
-      <w:bookmarkEnd w:id="8"/>
+      <w:bookmarkEnd w:id="45"/>
     </w:p>
     <w:p>
       <w:pPr>
@@ -5850,6 +6404,7 @@
           <w:rFonts w:ascii="Arial" w:hAnsi="Arial" w:cs="Arial"/>
           <w:sz w:val="22"/>
         </w:rPr>
+        <w:lastRenderedPageBreak/>
         <w:t>Describe all</w:t>
       </w:r>
       <w:r>
@@ -6012,7 +6567,6 @@
           <w:rFonts w:ascii="Arial" w:hAnsi="Arial" w:cs="Arial"/>
           <w:sz w:val="22"/>
         </w:rPr>
-        <w:lastRenderedPageBreak/>
         <w:t>If genomic data will be collected and submitted to an NIH designated data repository, review HRP-322 - WORKSHEET - NIH GDS Institutional Certification to ensure that you have provided sufficient information.</w:t>
       </w:r>
     </w:p>
@@ -6809,7 +7363,15 @@
           <w:rFonts w:ascii="Arial" w:hAnsi="Arial" w:cs="Arial"/>
           <w:sz w:val="22"/>
         </w:rPr>
-        <w:t xml:space="preserve">If your research involves AU students’ records, the AU Registrar must </w:t>
+        <w:t xml:space="preserve">If your research involves AU students’ </w:t>
+      </w:r>
+      <w:r>
+        <w:rPr>
+          <w:rFonts w:ascii="Arial" w:hAnsi="Arial" w:cs="Arial"/>
+          <w:sz w:val="22"/>
+        </w:rPr>
+        <w:lastRenderedPageBreak/>
+        <w:t xml:space="preserve">records, the AU Registrar must </w:t>
       </w:r>
       <w:r>
         <w:rPr>
@@ -6973,7 +7535,7 @@
           <w:sz w:val="22"/>
         </w:rPr>
       </w:pPr>
-      <w:bookmarkStart w:id="9" w:name="OLE_LINK1"/>
+      <w:bookmarkStart w:id="46" w:name="OLE_LINK1"/>
       <w:r>
         <w:rPr>
           <w:rFonts w:ascii="Segoe UI Symbol" w:hAnsi="Segoe UI Symbol" w:cs="Segoe UI Symbol"/>
@@ -6981,7 +7543,6 @@
           <w:iCs/>
           <w:sz w:val="22"/>
         </w:rPr>
-        <w:lastRenderedPageBreak/>
         <w:t xml:space="preserve">  </w:t>
       </w:r>
       <w:sdt>
@@ -7084,7 +7645,7 @@
         <w:t xml:space="preserve"> research project</w:t>
       </w:r>
     </w:p>
-    <w:bookmarkEnd w:id="9"/>
+    <w:bookmarkEnd w:id="46"/>
     <w:p>
       <w:pPr>
         <w:ind w:left="1267"/>
@@ -7274,7 +7835,7 @@
           <w:rFonts w:ascii="Arial" w:hAnsi="Arial" w:cs="Arial"/>
         </w:rPr>
       </w:pPr>
-      <w:bookmarkStart w:id="10" w:name="_Toc226630093"/>
+      <w:bookmarkStart w:id="47" w:name="_Toc226630093"/>
       <w:r>
         <w:rPr>
           <w:rFonts w:ascii="Arial" w:hAnsi="Arial" w:cs="Arial"/>
@@ -7311,7 +7872,7 @@
         </w:rPr>
         <w:t>s</w:t>
       </w:r>
-      <w:bookmarkEnd w:id="10"/>
+      <w:bookmarkEnd w:id="47"/>
       <w:r>
         <w:rPr>
           <w:rFonts w:ascii="Arial" w:hAnsi="Arial" w:cs="Arial"/>
@@ -7767,14 +8328,14 @@
           <w:rFonts w:ascii="Arial" w:hAnsi="Arial" w:cs="Arial"/>
         </w:rPr>
       </w:pPr>
-      <w:bookmarkStart w:id="11" w:name="_Toc226630094"/>
+      <w:bookmarkStart w:id="48" w:name="_Toc226630094"/>
       <w:r>
         <w:rPr>
           <w:rFonts w:ascii="Arial" w:hAnsi="Arial" w:cs="Arial"/>
         </w:rPr>
         <w:t>Setting</w:t>
       </w:r>
-      <w:bookmarkEnd w:id="11"/>
+      <w:bookmarkEnd w:id="48"/>
     </w:p>
     <w:p>
       <w:pPr>
@@ -7975,6 +8536,7 @@
           <w:rFonts w:ascii="Arial" w:hAnsi="Arial" w:cs="Arial"/>
           <w:sz w:val="22"/>
         </w:rPr>
+        <w:lastRenderedPageBreak/>
         <w:t>Site-specific regulations or customs affecting the research</w:t>
       </w:r>
       <w:r>
@@ -8076,16 +8638,7 @@
             <w:rFonts w:ascii="Arial" w:hAnsi="Arial" w:cs="Arial"/>
             <w:sz w:val="22"/>
           </w:rPr>
-          <w:t>HRP-</w:t>
-        </w:r>
-        <w:r>
-          <w:rPr>
-            <w:rStyle w:val="Hyperlink"/>
-            <w:rFonts w:ascii="Arial" w:hAnsi="Arial" w:cs="Arial"/>
-            <w:sz w:val="22"/>
-          </w:rPr>
-          <w:lastRenderedPageBreak/>
-          <w:t>504 - TEMPLATE - School Permission to Conduct Research</w:t>
+          <w:t>HRP-504 - TEMPLATE - School Permission to Conduct Research</w:t>
         </w:r>
       </w:hyperlink>
       <w:r>
@@ -8150,14 +8703,14 @@
           <w:rFonts w:ascii="Arial" w:hAnsi="Arial" w:cs="Arial"/>
         </w:rPr>
       </w:pPr>
-      <w:bookmarkStart w:id="12" w:name="_Toc226630095"/>
+      <w:bookmarkStart w:id="49" w:name="_Toc226630095"/>
       <w:r>
         <w:rPr>
           <w:rFonts w:ascii="Arial" w:hAnsi="Arial" w:cs="Arial"/>
         </w:rPr>
         <w:t>Resources Available</w:t>
       </w:r>
-      <w:bookmarkEnd w:id="12"/>
+      <w:bookmarkEnd w:id="49"/>
     </w:p>
     <w:p>
       <w:pPr>
@@ -8572,7 +9125,7 @@
           <w:rFonts w:ascii="Arial" w:hAnsi="Arial" w:cs="Arial"/>
         </w:rPr>
       </w:pPr>
-      <w:bookmarkStart w:id="13" w:name="_Toc226630096"/>
+      <w:bookmarkStart w:id="50" w:name="_Toc226630096"/>
       <w:r>
         <w:rPr>
           <w:rFonts w:ascii="Arial" w:hAnsi="Arial" w:cs="Arial"/>
@@ -8585,7 +9138,7 @@
         </w:rPr>
         <w:t>Participants</w:t>
       </w:r>
-      <w:bookmarkEnd w:id="13"/>
+      <w:bookmarkEnd w:id="50"/>
     </w:p>
     <w:p>
       <w:pPr>
@@ -8857,14 +9410,14 @@
           <w:rFonts w:ascii="Arial" w:hAnsi="Arial" w:cs="Arial"/>
         </w:rPr>
       </w:pPr>
-      <w:bookmarkStart w:id="14" w:name="_Toc226630097"/>
+      <w:bookmarkStart w:id="51" w:name="_Toc226630097"/>
       <w:r>
         <w:rPr>
           <w:rFonts w:ascii="Arial" w:hAnsi="Arial" w:cs="Arial"/>
         </w:rPr>
         <w:t>Study Timelines</w:t>
       </w:r>
-      <w:bookmarkEnd w:id="14"/>
+      <w:bookmarkEnd w:id="51"/>
     </w:p>
     <w:p>
       <w:pPr>
@@ -9010,6 +9563,7 @@
           <w:color w:val="auto"/>
           <w:sz w:val="22"/>
         </w:rPr>
+        <w:lastRenderedPageBreak/>
         <w:t>Describe</w:t>
       </w:r>
       <w:r>
@@ -9197,15 +9751,15 @@
           <w:bCs/>
         </w:rPr>
       </w:pPr>
-      <w:bookmarkStart w:id="15" w:name="_Toc201314637"/>
-      <w:bookmarkStart w:id="16" w:name="_Toc202779688"/>
-      <w:bookmarkStart w:id="17" w:name="_Toc202780038"/>
-      <w:bookmarkStart w:id="18" w:name="_Toc202780102"/>
-      <w:bookmarkStart w:id="19" w:name="_Toc226630098"/>
-      <w:bookmarkEnd w:id="15"/>
-      <w:bookmarkEnd w:id="16"/>
-      <w:bookmarkEnd w:id="17"/>
-      <w:bookmarkEnd w:id="18"/>
+      <w:bookmarkStart w:id="52" w:name="_Toc201314637"/>
+      <w:bookmarkStart w:id="53" w:name="_Toc202779688"/>
+      <w:bookmarkStart w:id="54" w:name="_Toc202780038"/>
+      <w:bookmarkStart w:id="55" w:name="_Toc202780102"/>
+      <w:bookmarkStart w:id="56" w:name="_Toc226630098"/>
+      <w:bookmarkEnd w:id="52"/>
+      <w:bookmarkEnd w:id="53"/>
+      <w:bookmarkEnd w:id="54"/>
+      <w:bookmarkEnd w:id="55"/>
       <w:r>
         <w:rPr>
           <w:rFonts w:ascii="Arial" w:hAnsi="Arial" w:cs="Arial"/>
@@ -9218,7 +9772,7 @@
         </w:rPr>
         <w:t xml:space="preserve"> Population</w:t>
       </w:r>
-      <w:bookmarkEnd w:id="19"/>
+      <w:bookmarkEnd w:id="56"/>
     </w:p>
     <w:p>
       <w:pPr>
@@ -9723,7 +10277,7 @@
           <w:rFonts w:ascii="Arial" w:hAnsi="Arial" w:cs="Arial"/>
         </w:rPr>
       </w:pPr>
-      <w:bookmarkStart w:id="20" w:name="_Toc226630099"/>
+      <w:bookmarkStart w:id="57" w:name="_Toc226630099"/>
       <w:r>
         <w:rPr>
           <w:rFonts w:ascii="Arial" w:hAnsi="Arial" w:cs="Arial"/>
@@ -9758,7 +10312,7 @@
         </w:rPr>
         <w:t xml:space="preserve"> within Endeavor)</w:t>
       </w:r>
-      <w:bookmarkEnd w:id="20"/>
+      <w:bookmarkEnd w:id="57"/>
     </w:p>
     <w:p>
       <w:pPr>
@@ -9784,7 +10338,7 @@
           <w:sz w:val="22"/>
         </w:rPr>
       </w:pPr>
-      <w:bookmarkStart w:id="21" w:name="_Hlk202455741"/>
+      <w:bookmarkStart w:id="58" w:name="_Hlk202455741"/>
       <w:r>
         <w:rPr>
           <w:rFonts w:ascii="Arial" w:hAnsi="Arial" w:cs="Arial"/>
@@ -10285,7 +10839,7 @@
         <w:t xml:space="preserve"> Excluded</w:t>
       </w:r>
     </w:p>
-    <w:bookmarkEnd w:id="21"/>
+    <w:bookmarkEnd w:id="58"/>
     <w:p>
       <w:pPr>
         <w:pStyle w:val="BlockText"/>
@@ -10377,6 +10931,7 @@
           <w:color w:val="auto"/>
           <w:sz w:val="22"/>
         </w:rPr>
+        <w:lastRenderedPageBreak/>
         <w:t xml:space="preserve">If the research involves </w:t>
       </w:r>
       <w:r>
@@ -10430,7 +10985,6 @@
           <w:color w:val="auto"/>
           <w:sz w:val="22"/>
         </w:rPr>
-        <w:lastRenderedPageBreak/>
         <w:t xml:space="preserve">If the research involves pregnant women, review </w:t>
       </w:r>
       <w:hyperlink r:id="rId23" w:history="1">
@@ -10882,7 +11436,7 @@
           <w:bCs/>
         </w:rPr>
       </w:pPr>
-      <w:bookmarkStart w:id="22" w:name="_Toc226630100"/>
+      <w:bookmarkStart w:id="59" w:name="_Toc226630100"/>
       <w:r>
         <w:rPr>
           <w:rFonts w:ascii="Arial" w:hAnsi="Arial" w:cs="Arial"/>
@@ -10895,7 +11449,7 @@
         </w:rPr>
         <w:t>Participants</w:t>
       </w:r>
-      <w:bookmarkEnd w:id="22"/>
+      <w:bookmarkEnd w:id="59"/>
     </w:p>
     <w:p>
       <w:pPr>
@@ -11048,7 +11602,7 @@
           <w:rFonts w:ascii="Arial" w:hAnsi="Arial" w:cs="Arial"/>
         </w:rPr>
       </w:pPr>
-      <w:bookmarkStart w:id="23" w:name="_Toc226630101"/>
+      <w:bookmarkStart w:id="60" w:name="_Toc226630101"/>
       <w:r>
         <w:rPr>
           <w:rFonts w:ascii="Arial" w:hAnsi="Arial" w:cs="Arial"/>
@@ -11082,7 +11636,7 @@
         </w:rPr>
         <w:t xml:space="preserve"> within Endeavor)</w:t>
       </w:r>
-      <w:bookmarkEnd w:id="23"/>
+      <w:bookmarkEnd w:id="60"/>
     </w:p>
     <w:p>
       <w:pPr>
@@ -11410,6 +11964,7 @@
           <w:color w:val="auto"/>
           <w:sz w:val="22"/>
         </w:rPr>
+        <w:lastRenderedPageBreak/>
         <w:t xml:space="preserve">Describe materials that will be used to recruit </w:t>
       </w:r>
       <w:r>
@@ -11516,7 +12071,6 @@
           <w:color w:val="auto"/>
           <w:sz w:val="22"/>
         </w:rPr>
-        <w:lastRenderedPageBreak/>
         <w:t>“</w:t>
       </w:r>
       <w:r>
@@ -12290,25 +12844,25 @@
           <w:rFonts w:ascii="Arial" w:hAnsi="Arial" w:cs="Arial"/>
         </w:rPr>
       </w:pPr>
-      <w:bookmarkStart w:id="24" w:name="_Toc492992334"/>
-      <w:bookmarkStart w:id="25" w:name="_Toc492992602"/>
-      <w:bookmarkStart w:id="26" w:name="_Toc493022872"/>
-      <w:bookmarkStart w:id="27" w:name="_Toc492992335"/>
-      <w:bookmarkStart w:id="28" w:name="_Toc492992603"/>
-      <w:bookmarkStart w:id="29" w:name="_Toc493022873"/>
-      <w:bookmarkStart w:id="30" w:name="_Toc492992336"/>
-      <w:bookmarkStart w:id="31" w:name="_Toc492992604"/>
-      <w:bookmarkStart w:id="32" w:name="_Toc493022874"/>
-      <w:bookmarkStart w:id="33" w:name="_Toc226630102"/>
-      <w:bookmarkEnd w:id="24"/>
-      <w:bookmarkEnd w:id="25"/>
-      <w:bookmarkEnd w:id="26"/>
-      <w:bookmarkEnd w:id="27"/>
-      <w:bookmarkEnd w:id="28"/>
-      <w:bookmarkEnd w:id="29"/>
-      <w:bookmarkEnd w:id="30"/>
-      <w:bookmarkEnd w:id="31"/>
-      <w:bookmarkEnd w:id="32"/>
+      <w:bookmarkStart w:id="61" w:name="_Toc492992334"/>
+      <w:bookmarkStart w:id="62" w:name="_Toc492992602"/>
+      <w:bookmarkStart w:id="63" w:name="_Toc493022872"/>
+      <w:bookmarkStart w:id="64" w:name="_Toc492992335"/>
+      <w:bookmarkStart w:id="65" w:name="_Toc492992603"/>
+      <w:bookmarkStart w:id="66" w:name="_Toc493022873"/>
+      <w:bookmarkStart w:id="67" w:name="_Toc492992336"/>
+      <w:bookmarkStart w:id="68" w:name="_Toc492992604"/>
+      <w:bookmarkStart w:id="69" w:name="_Toc493022874"/>
+      <w:bookmarkStart w:id="70" w:name="_Toc226630102"/>
+      <w:bookmarkEnd w:id="61"/>
+      <w:bookmarkEnd w:id="62"/>
+      <w:bookmarkEnd w:id="63"/>
+      <w:bookmarkEnd w:id="64"/>
+      <w:bookmarkEnd w:id="65"/>
+      <w:bookmarkEnd w:id="66"/>
+      <w:bookmarkEnd w:id="67"/>
+      <w:bookmarkEnd w:id="68"/>
+      <w:bookmarkEnd w:id="69"/>
       <w:r>
         <w:rPr>
           <w:rFonts w:ascii="Arial" w:hAnsi="Arial" w:cs="Arial"/>
@@ -12321,9 +12875,9 @@
         </w:rPr>
         <w:t>Participants</w:t>
       </w:r>
-      <w:bookmarkEnd w:id="33"/>
-    </w:p>
-    <w:bookmarkStart w:id="34" w:name="_Hlk202455930"/>
+      <w:bookmarkEnd w:id="70"/>
+    </w:p>
+    <w:bookmarkStart w:id="71" w:name="_Hlk202455930"/>
     <w:p>
       <w:pPr>
         <w:pStyle w:val="List"/>
@@ -12439,7 +12993,7 @@
         <w:t xml:space="preserve">, or the study is limited to the analysis of pre-existing data. </w:t>
       </w:r>
     </w:p>
-    <w:bookmarkEnd w:id="34"/>
+    <w:bookmarkEnd w:id="71"/>
     <w:p>
       <w:pPr>
         <w:pStyle w:val="BlockText"/>
@@ -12639,7 +13193,16 @@
           <w:color w:val="auto"/>
           <w:sz w:val="22"/>
         </w:rPr>
-        <w:t>If legally authorized representatives are consenting on behalf of the Participants (e.g., Participants are minors), describe how the Participants themselves may indicate the desire to withdraw from the study.</w:t>
+        <w:t xml:space="preserve">If legally authorized representatives are consenting on behalf of the Participants (e.g., </w:t>
+      </w:r>
+      <w:r>
+        <w:rPr>
+          <w:rFonts w:ascii="Arial" w:hAnsi="Arial" w:cs="Arial"/>
+          <w:color w:val="auto"/>
+          <w:sz w:val="22"/>
+        </w:rPr>
+        <w:lastRenderedPageBreak/>
+        <w:t>Participants are minors), describe how the Participants themselves may indicate the desire to withdraw from the study.</w:t>
       </w:r>
     </w:p>
     <w:sdt>
@@ -12720,12 +13283,11 @@
           <w:rFonts w:ascii="Arial" w:hAnsi="Arial" w:cs="Arial"/>
         </w:rPr>
       </w:pPr>
-      <w:bookmarkStart w:id="35" w:name="_Toc226630103"/>
-      <w:r>
-        <w:rPr>
-          <w:rFonts w:ascii="Arial" w:hAnsi="Arial" w:cs="Arial"/>
-        </w:rPr>
-        <w:lastRenderedPageBreak/>
+      <w:bookmarkStart w:id="72" w:name="_Toc226630103"/>
+      <w:r>
+        <w:rPr>
+          <w:rFonts w:ascii="Arial" w:hAnsi="Arial" w:cs="Arial"/>
+        </w:rPr>
         <w:t xml:space="preserve">Risks to </w:t>
       </w:r>
       <w:r>
@@ -12740,7 +13302,7 @@
         </w:rPr>
         <w:t xml:space="preserve"> and Procedures to Minimize Risk</w:t>
       </w:r>
-      <w:bookmarkEnd w:id="35"/>
+      <w:bookmarkEnd w:id="72"/>
     </w:p>
     <w:p>
       <w:pPr>
@@ -13812,6 +14374,7 @@
           <w:rFonts w:ascii="Arial" w:hAnsi="Arial" w:cs="Arial"/>
           <w:sz w:val="22"/>
         </w:rPr>
+        <w:lastRenderedPageBreak/>
         <w:t>What data are reviewed, including safety data, untoward events, and efficacy data.</w:t>
       </w:r>
     </w:p>
@@ -13884,7 +14447,6 @@
           <w:rFonts w:ascii="Arial" w:hAnsi="Arial" w:cs="Arial"/>
           <w:sz w:val="22"/>
         </w:rPr>
-        <w:lastRenderedPageBreak/>
         <w:t>Who will review the data.</w:t>
       </w:r>
     </w:p>
@@ -14025,14 +14587,14 @@
           <w:rFonts w:ascii="Arial" w:hAnsi="Arial" w:cs="Arial"/>
         </w:rPr>
       </w:pPr>
-      <w:bookmarkStart w:id="36" w:name="_Toc226630104"/>
+      <w:bookmarkStart w:id="73" w:name="_Toc226630104"/>
       <w:r>
         <w:rPr>
           <w:rFonts w:ascii="Arial" w:hAnsi="Arial" w:cs="Arial"/>
         </w:rPr>
         <w:t>Provisions to Protect the Privacy Interests of Participants</w:t>
       </w:r>
-      <w:bookmarkEnd w:id="36"/>
+      <w:bookmarkEnd w:id="73"/>
     </w:p>
     <w:p>
       <w:pPr>
@@ -14541,7 +15103,7 @@
           <w:rFonts w:ascii="Arial" w:hAnsi="Arial" w:cs="Arial"/>
         </w:rPr>
       </w:pPr>
-      <w:bookmarkStart w:id="37" w:name="_Toc226630105"/>
+      <w:bookmarkStart w:id="74" w:name="_Toc226630105"/>
       <w:r>
         <w:rPr>
           <w:rFonts w:ascii="Arial" w:hAnsi="Arial" w:cs="Arial"/>
@@ -14554,7 +15116,7 @@
         </w:rPr>
         <w:t>Participants</w:t>
       </w:r>
-      <w:bookmarkEnd w:id="37"/>
+      <w:bookmarkEnd w:id="74"/>
     </w:p>
     <w:p>
       <w:pPr>
@@ -14730,20 +15292,20 @@
           <w:rFonts w:ascii="Arial" w:hAnsi="Arial" w:cs="Arial"/>
         </w:rPr>
       </w:pPr>
-      <w:bookmarkStart w:id="38" w:name="_Toc202779696"/>
-      <w:bookmarkStart w:id="39" w:name="_Toc202780046"/>
-      <w:bookmarkStart w:id="40" w:name="_Toc202780110"/>
-      <w:bookmarkStart w:id="41" w:name="_Toc226630106"/>
-      <w:bookmarkEnd w:id="38"/>
-      <w:bookmarkEnd w:id="39"/>
-      <w:bookmarkEnd w:id="40"/>
+      <w:bookmarkStart w:id="75" w:name="_Toc202779696"/>
+      <w:bookmarkStart w:id="76" w:name="_Toc202780046"/>
+      <w:bookmarkStart w:id="77" w:name="_Toc202780110"/>
+      <w:bookmarkStart w:id="78" w:name="_Toc226630106"/>
+      <w:bookmarkEnd w:id="75"/>
+      <w:bookmarkEnd w:id="76"/>
+      <w:bookmarkEnd w:id="77"/>
       <w:r>
         <w:rPr>
           <w:rFonts w:ascii="Arial" w:hAnsi="Arial" w:cs="Arial"/>
         </w:rPr>
         <w:t>Data Management and Confidentiality</w:t>
       </w:r>
-      <w:bookmarkEnd w:id="41"/>
+      <w:bookmarkEnd w:id="78"/>
     </w:p>
     <w:p>
       <w:pPr>
@@ -14864,7 +15426,6 @@
           <w:color w:val="auto"/>
           <w:sz w:val="22"/>
         </w:rPr>
-        <w:lastRenderedPageBreak/>
         <w:t>Describe the steps that will be taken to secure the data (e.g., training, authorization of access, password protection, encryption, physical controls, certificates of confidentiality, and separation of identifiers and data) during storage, use, and transmission.</w:t>
       </w:r>
       <w:r>
@@ -15882,14 +16443,14 @@
           <w:rFonts w:ascii="Arial" w:hAnsi="Arial" w:cs="Arial"/>
         </w:rPr>
       </w:pPr>
-      <w:bookmarkStart w:id="42" w:name="_Toc226630107"/>
+      <w:bookmarkStart w:id="79" w:name="_Toc226630107"/>
       <w:r>
         <w:rPr>
           <w:rFonts w:ascii="Arial" w:hAnsi="Arial" w:cs="Arial"/>
         </w:rPr>
         <w:t>Compensation for Research-Related Injury</w:t>
       </w:r>
-      <w:bookmarkEnd w:id="42"/>
+      <w:bookmarkEnd w:id="79"/>
     </w:p>
     <w:p>
       <w:pPr>
@@ -16016,7 +16577,6 @@
           <w:color w:val="auto"/>
           <w:sz w:val="22"/>
         </w:rPr>
-        <w:lastRenderedPageBreak/>
         <w:t xml:space="preserve">If the research involves more than </w:t>
       </w:r>
       <w:r>
@@ -16220,7 +16780,7 @@
           <w:rFonts w:ascii="Arial" w:hAnsi="Arial" w:cs="Arial"/>
         </w:rPr>
       </w:pPr>
-      <w:bookmarkStart w:id="43" w:name="_Toc226630108"/>
+      <w:bookmarkStart w:id="80" w:name="_Toc226630108"/>
       <w:r>
         <w:rPr>
           <w:rFonts w:ascii="Arial" w:hAnsi="Arial" w:cs="Arial"/>
@@ -16233,7 +16793,7 @@
         </w:rPr>
         <w:t>Participants</w:t>
       </w:r>
-      <w:bookmarkEnd w:id="43"/>
+      <w:bookmarkEnd w:id="80"/>
     </w:p>
     <w:p>
       <w:pPr>
@@ -16440,7 +17000,7 @@
           <w:rFonts w:ascii="Arial" w:hAnsi="Arial" w:cs="Arial"/>
         </w:rPr>
       </w:pPr>
-      <w:bookmarkStart w:id="44" w:name="_Toc226630109"/>
+      <w:bookmarkStart w:id="81" w:name="_Toc226630109"/>
       <w:r>
         <w:rPr>
           <w:rFonts w:ascii="Arial" w:hAnsi="Arial" w:cs="Arial"/>
@@ -16482,7 +17042,7 @@
         </w:rPr>
         <w:t>)</w:t>
       </w:r>
-      <w:bookmarkEnd w:id="44"/>
+      <w:bookmarkEnd w:id="81"/>
     </w:p>
     <w:p>
       <w:pPr>
@@ -17041,7 +17601,29 @@
           <w:sz w:val="28"/>
           <w:szCs w:val="28"/>
         </w:rPr>
-        <w:t xml:space="preserve">Non-English Speaking </w:t>
+        <w:t>Non-</w:t>
+      </w:r>
+      <w:proofErr w:type="gramStart"/>
+      <w:r>
+        <w:rPr>
+          <w:rFonts w:ascii="Arial" w:hAnsi="Arial" w:cs="Arial"/>
+          <w:b/>
+          <w:bCs/>
+          <w:sz w:val="28"/>
+          <w:szCs w:val="28"/>
+        </w:rPr>
+        <w:t>English Speaking</w:t>
+      </w:r>
+      <w:proofErr w:type="gramEnd"/>
+      <w:r>
+        <w:rPr>
+          <w:rFonts w:ascii="Arial" w:hAnsi="Arial" w:cs="Arial"/>
+          <w:b/>
+          <w:bCs/>
+          <w:sz w:val="28"/>
+          <w:szCs w:val="28"/>
+        </w:rPr>
+        <w:t xml:space="preserve"> </w:t>
       </w:r>
       <w:r>
         <w:rPr>
@@ -17622,15 +18204,8 @@
           <w:rFonts w:ascii="Arial" w:hAnsi="Arial" w:cs="Arial"/>
           <w:sz w:val="22"/>
         </w:rPr>
-        <w:t xml:space="preserve">For research conducted outside of the state, provide information that describes which persons have not attained the legal age for consent to treatments or procedures involved the research, under the applicable law of the jurisdiction in which research will be conducted. One method of obtaining this information is to </w:t>
-      </w:r>
-      <w:r>
-        <w:rPr>
-          <w:rFonts w:ascii="Arial" w:hAnsi="Arial" w:cs="Arial"/>
-          <w:sz w:val="22"/>
-        </w:rPr>
         <w:lastRenderedPageBreak/>
-        <w:t xml:space="preserve">have a legal counsel or authority review your protocol along the definition of “children” in </w:t>
+        <w:t xml:space="preserve">For research conducted outside of the state, provide information that describes which persons have not attained the legal age for consent to treatments or procedures involved the research, under the applicable law of the jurisdiction in which research will be conducted. One method of obtaining this information is to have a legal counsel or authority review your protocol along the definition of “children” in </w:t>
       </w:r>
       <w:hyperlink r:id="rId39" w:history="1">
         <w:r>
@@ -18136,7 +18711,15 @@
           <w:rFonts w:ascii="Arial" w:hAnsi="Arial" w:cs="Arial"/>
           <w:sz w:val="22"/>
         </w:rPr>
-        <w:t xml:space="preserve"> to be aware of which individuals in the state meet the definition of</w:t>
+        <w:t xml:space="preserve"> to be aware of which individuals </w:t>
+      </w:r>
+      <w:r>
+        <w:rPr>
+          <w:rFonts w:ascii="Arial" w:hAnsi="Arial" w:cs="Arial"/>
+          <w:sz w:val="22"/>
+        </w:rPr>
+        <w:lastRenderedPageBreak/>
+        <w:t>in the state meet the definition of</w:t>
       </w:r>
       <w:r>
         <w:rPr>
@@ -18188,15 +18771,7 @@
           <w:rFonts w:ascii="Arial" w:hAnsi="Arial" w:cs="Arial"/>
           <w:sz w:val="22"/>
         </w:rPr>
-        <w:t xml:space="preserve"> to their </w:t>
-      </w:r>
-      <w:r>
-        <w:rPr>
-          <w:rFonts w:ascii="Arial" w:hAnsi="Arial" w:cs="Arial"/>
-          <w:sz w:val="22"/>
-        </w:rPr>
-        <w:lastRenderedPageBreak/>
-        <w:t xml:space="preserve">participation in the procedure(s) involved in this research. One method of obtaining this information is to have a legal counsel or authority review your protocol along </w:t>
+        <w:t xml:space="preserve"> to their participation in the procedure(s) involved in this research. One method of obtaining this information is to have a legal counsel or authority review your protocol along </w:t>
       </w:r>
       <w:r>
         <w:rPr>
@@ -18310,7 +18885,23 @@
           <w:rFonts w:ascii="Arial" w:hAnsi="Arial" w:cs="Arial"/>
           <w:sz w:val="22"/>
         </w:rPr>
-        <w:t xml:space="preserve"> will be required to assent and which will not.</w:t>
+        <w:t xml:space="preserve"> will be required to </w:t>
+      </w:r>
+      <w:proofErr w:type="gramStart"/>
+      <w:r>
+        <w:rPr>
+          <w:rFonts w:ascii="Arial" w:hAnsi="Arial" w:cs="Arial"/>
+          <w:sz w:val="22"/>
+        </w:rPr>
+        <w:t>assent</w:t>
+      </w:r>
+      <w:proofErr w:type="gramEnd"/>
+      <w:r>
+        <w:rPr>
+          <w:rFonts w:ascii="Arial" w:hAnsi="Arial" w:cs="Arial"/>
+          <w:sz w:val="22"/>
+        </w:rPr>
+        <w:t xml:space="preserve"> and which will not.</w:t>
       </w:r>
     </w:p>
     <w:p>
@@ -18514,14 +19105,14 @@
           <w:rFonts w:ascii="Arial" w:hAnsi="Arial" w:cs="Arial"/>
         </w:rPr>
       </w:pPr>
-      <w:bookmarkStart w:id="45" w:name="_Toc226630110"/>
+      <w:bookmarkStart w:id="82" w:name="_Toc226630110"/>
       <w:r>
         <w:rPr>
           <w:rFonts w:ascii="Arial" w:hAnsi="Arial" w:cs="Arial"/>
         </w:rPr>
         <w:t>Process to Document Consent in Writing</w:t>
       </w:r>
-      <w:bookmarkEnd w:id="45"/>
+      <w:bookmarkEnd w:id="82"/>
     </w:p>
     <w:p>
       <w:pPr>
@@ -18894,14 +19485,14 @@
           <w:rFonts w:ascii="Arial" w:hAnsi="Arial" w:cs="Arial"/>
         </w:rPr>
       </w:pPr>
-      <w:bookmarkStart w:id="46" w:name="_Toc226630111"/>
+      <w:bookmarkStart w:id="83" w:name="_Toc226630111"/>
       <w:r>
         <w:rPr>
           <w:rFonts w:ascii="Arial" w:hAnsi="Arial" w:cs="Arial"/>
         </w:rPr>
         <w:t>Multi-Site Research</w:t>
       </w:r>
-      <w:bookmarkEnd w:id="46"/>
+      <w:bookmarkEnd w:id="83"/>
       <w:r>
         <w:rPr>
           <w:rFonts w:ascii="Arial" w:hAnsi="Arial" w:cs="Arial"/>
@@ -18990,8 +19581,25 @@
           <w:i/>
           <w:sz w:val="22"/>
         </w:rPr>
-        <w:lastRenderedPageBreak/>
-        <w:t xml:space="preserve">If collaborators are affiliated with an institution that has a Federalwide Assurance and/or an IRB, the study is considered multi-site research. Please contact the IRB office to determine whether AU’s IRB can serve as the IRB of record for this project. </w:t>
+        <w:t xml:space="preserve">If collaborators are affiliated with an institution that has a </w:t>
+      </w:r>
+      <w:proofErr w:type="spellStart"/>
+      <w:r>
+        <w:rPr>
+          <w:rFonts w:cs="Arial"/>
+          <w:i/>
+          <w:sz w:val="22"/>
+        </w:rPr>
+        <w:t>Federalwide</w:t>
+      </w:r>
+      <w:proofErr w:type="spellEnd"/>
+      <w:r>
+        <w:rPr>
+          <w:rFonts w:cs="Arial"/>
+          <w:i/>
+          <w:sz w:val="22"/>
+        </w:rPr>
+        <w:t xml:space="preserve"> Assurance and/or an IRB, the study is considered multi-site research. Please contact the IRB office to determine whether AU’s IRB can serve as the IRB of record for this project. </w:t>
       </w:r>
     </w:p>
     <w:p>
@@ -19166,8 +19774,18 @@
             <w:rFonts w:ascii="Arial" w:hAnsi="Arial" w:cs="Arial"/>
             <w:sz w:val="22"/>
           </w:rPr>
-          <w:t>HRP-833 - WORKSHEET - Considerations for Serving as the sIRB</w:t>
-        </w:r>
+          <w:t xml:space="preserve">HRP-833 - WORKSHEET - Considerations for Serving as the </w:t>
+        </w:r>
+        <w:proofErr w:type="spellStart"/>
+        <w:r>
+          <w:rPr>
+            <w:rStyle w:val="Hyperlink"/>
+            <w:rFonts w:ascii="Arial" w:hAnsi="Arial" w:cs="Arial"/>
+            <w:sz w:val="22"/>
+          </w:rPr>
+          <w:t>sIRB</w:t>
+        </w:r>
+        <w:proofErr w:type="spellEnd"/>
       </w:hyperlink>
       <w:r>
         <w:rPr>
@@ -19478,6 +20096,7 @@
           <w:rFonts w:ascii="Arial" w:hAnsi="Arial" w:cs="Arial"/>
           <w:sz w:val="22"/>
         </w:rPr>
+        <w:lastRenderedPageBreak/>
         <w:t>All engaged participating sites will safeguard data, including secure transmission of data, as required by local information security policies.</w:t>
       </w:r>
     </w:p>
@@ -19551,7 +20170,6 @@
           <w:rFonts w:ascii="Arial" w:hAnsi="Arial" w:cs="Arial"/>
           <w:sz w:val="22"/>
         </w:rPr>
-        <w:lastRenderedPageBreak/>
         <w:t>Problems (inclusive of reportable events)</w:t>
       </w:r>
       <w:r>
@@ -19681,24 +20299,44 @@
       </w:r>
     </w:p>
   </w:comment>
+  <w:comment w:id="1" w:author="Kelsey McCune" w:date="2026-06-19T07:11:00Z" w:initials="KBM">
+    <w:p>
+      <w:r>
+        <w:rPr>
+          <w:rStyle w:val="CommentReference"/>
+        </w:rPr>
+        <w:annotationRef/>
+      </w:r>
+      <w:r>
+        <w:rPr>
+          <w:sz w:val="20"/>
+          <w:szCs w:val="20"/>
+        </w:rPr>
+        <w:t>Probably Allie, if she was still okay with submitting this for you. But I am happy to do it too.</w:t>
+      </w:r>
+    </w:p>
+  </w:comment>
 </w:comments>
 </file>
 
 <file path=word/commentsExtended.xml><?xml version="1.0" encoding="utf-8"?>
 <w15:commentsEx xmlns:wpc="http://schemas.microsoft.com/office/word/2010/wordprocessingCanvas" xmlns:cx="http://schemas.microsoft.com/office/drawing/2014/chartex" xmlns:cx1="http://schemas.microsoft.com/office/drawing/2015/9/8/chartex" xmlns:cx2="http://schemas.microsoft.com/office/drawing/2015/10/21/chartex" xmlns:cx3="http://schemas.microsoft.com/office/drawing/2016/5/9/chartex" xmlns:cx4="http://schemas.microsoft.com/office/drawing/2016/5/10/chartex" xmlns:cx5="http://schemas.microsoft.com/office/drawing/2016/5/11/chartex" xmlns:cx6="http://schemas.microsoft.com/office/drawing/2016/5/12/chartex" xmlns:cx7="http://schemas.microsoft.com/office/drawing/2016/5/13/chartex" xmlns:cx8="http://schemas.microsoft.com/office/drawing/2016/5/14/chartex" xmlns:mc="http://schemas.openxmlformats.org/markup-compatibility/2006" xmlns:aink="http://schemas.microsoft.com/office/drawing/2016/ink" xmlns:am3d="http://schemas.microsoft.com/office/drawing/2017/model3d" xmlns:o="urn:schemas-microsoft-com:office:office" xmlns:oel="http://schemas.microsoft.com/office/2019/extlst" xmlns:r="http://schemas.openxmlformats.org/officeDocument/2006/relationships" xmlns:m="http://schemas.openxmlformats.org/officeDocument/2006/math" xmlns:v="urn:schemas-microsoft-com:vml" xmlns:wp14="http://schemas.microsoft.com/office/word/2010/wordprocessingDrawing" xmlns:wp="http://schemas.openxmlformats.org/drawingml/2006/wordprocessingDrawing" xmlns:w10="urn:schemas-microsoft-com:office:word" xmlns:w="http://schemas.openxmlformats.org/wordprocessingml/2006/main" xmlns:w14="http://schemas.microsoft.com/office/word/2010/wordml" xmlns:w15="http://schemas.microsoft.com/office/word/2012/wordml" xmlns:w16cex="http://schemas.microsoft.com/office/word/2018/wordml/cex" xmlns:w16cid="http://schemas.microsoft.com/office/word/2016/wordml/cid" xmlns:w16="http://schemas.microsoft.com/office/word/2018/wordml" xmlns:w16du="http://schemas.microsoft.com/office/word/2023/wordml/word16du" xmlns:w16sdtdh="http://schemas.microsoft.com/office/word/2020/wordml/sdtdatahash" xmlns:w16sdtfl="http://schemas.microsoft.com/office/word/2024/wordml/sdtformatlock" xmlns:w16se="http://schemas.microsoft.com/office/word/2015/wordml/symex" xmlns:wpg="http://schemas.microsoft.com/office/word/2010/wordprocessingGroup" xmlns:wpi="http://schemas.microsoft.com/office/word/2010/wordprocessingInk" xmlns:wne="http://schemas.microsoft.com/office/word/2006/wordml" xmlns:wps="http://schemas.microsoft.com/office/word/2010/wordprocessingShape" mc:Ignorable="w14 w15 w16se w16cid w16 w16cex w16sdtdh w16sdtfl w16du wp14">
   <w15:commentEx w15:paraId="3A114F62" w15:done="0"/>
+  <w15:commentEx w15:paraId="6EF2028C" w15:paraIdParent="3A114F62" w15:done="0"/>
 </w15:commentsEx>
 </file>
 
 <file path=word/commentsExtensible.xml><?xml version="1.0" encoding="utf-8"?>
 <w16cex:commentsExtensible xmlns:wpc="http://schemas.microsoft.com/office/word/2010/wordprocessingCanvas" xmlns:cx="http://schemas.microsoft.com/office/drawing/2014/chartex" xmlns:cx1="http://schemas.microsoft.com/office/drawing/2015/9/8/chartex" xmlns:cx2="http://schemas.microsoft.com/office/drawing/2015/10/21/chartex" xmlns:cx3="http://schemas.microsoft.com/office/drawing/2016/5/9/chartex" xmlns:cx4="http://schemas.microsoft.com/office/drawing/2016/5/10/chartex" xmlns:cx5="http://schemas.microsoft.com/office/drawing/2016/5/11/chartex" xmlns:cx6="http://schemas.microsoft.com/office/drawing/2016/5/12/chartex" xmlns:cx7="http://schemas.microsoft.com/office/drawing/2016/5/13/chartex" xmlns:cx8="http://schemas.microsoft.com/office/drawing/2016/5/14/chartex" xmlns:cr="http://schemas.microsoft.com/office/comments/2020/reactions" xmlns:mc="http://schemas.openxmlformats.org/markup-compatibility/2006" xmlns:aink="http://schemas.microsoft.com/office/drawing/2016/ink" xmlns:am3d="http://schemas.microsoft.com/office/drawing/2017/model3d" xmlns:o="urn:schemas-microsoft-com:office:office" xmlns:oel="http://schemas.microsoft.com/office/2019/extlst" xmlns:r="http://schemas.openxmlformats.org/officeDocument/2006/relationships" xmlns:m="http://schemas.openxmlformats.org/officeDocument/2006/math" xmlns:v="urn:schemas-microsoft-com:vml" xmlns:wp14="http://schemas.microsoft.com/office/word/2010/wordprocessingDrawing" xmlns:wp="http://schemas.openxmlformats.org/drawingml/2006/wordprocessingDrawing" xmlns:w10="urn:schemas-microsoft-com:office:word" xmlns:w="http://schemas.openxmlformats.org/wordprocessingml/2006/main" xmlns:w14="http://schemas.microsoft.com/office/word/2010/wordml" xmlns:w15="http://schemas.microsoft.com/office/word/2012/wordml" xmlns:w16cex="http://schemas.microsoft.com/office/word/2018/wordml/cex" xmlns:w16cid="http://schemas.microsoft.com/office/word/2016/wordml/cid" xmlns:w16="http://schemas.microsoft.com/office/word/2018/wordml" xmlns:w16du="http://schemas.microsoft.com/office/word/2023/wordml/word16du" xmlns:w16sdtdh="http://schemas.microsoft.com/office/word/2020/wordml/sdtdatahash" xmlns:w16sdtfl="http://schemas.microsoft.com/office/word/2024/wordml/sdtformatlock" xmlns:w16se="http://schemas.microsoft.com/office/word/2015/wordml/symex" xmlns:wpg="http://schemas.microsoft.com/office/word/2010/wordprocessingGroup" xmlns:wpi="http://schemas.microsoft.com/office/word/2010/wordprocessingInk" xmlns:wne="http://schemas.microsoft.com/office/word/2006/wordml" xmlns:wps="http://schemas.microsoft.com/office/word/2010/wordprocessingShape" mc:Ignorable="w14 w15 w16se w16cid w16 w16cex w16sdtdh w16sdtfl cr w16du wp14">
   <w16cex:commentExtensible w16cex:durableId="5081449F" w16cex:dateUtc="2026-06-18T19:08:00Z"/>
+  <w16cex:commentExtensible w16cex:durableId="17CB01BE" w16cex:dateUtc="2026-06-19T12:11:00Z"/>
 </w16cex:commentsExtensible>
 </file>
 
 <file path=word/commentsIds.xml><?xml version="1.0" encoding="utf-8"?>
 <w16cid:commentsIds xmlns:wpc="http://schemas.microsoft.com/office/word/2010/wordprocessingCanvas" xmlns:cx="http://schemas.microsoft.com/office/drawing/2014/chartex" xmlns:cx1="http://schemas.microsoft.com/office/drawing/2015/9/8/chartex" xmlns:cx2="http://schemas.microsoft.com/office/drawing/2015/10/21/chartex" xmlns:cx3="http://schemas.microsoft.com/office/drawing/2016/5/9/chartex" xmlns:cx4="http://schemas.microsoft.com/office/drawing/2016/5/10/chartex" xmlns:cx5="http://schemas.microsoft.com/office/drawing/2016/5/11/chartex" xmlns:cx6="http://schemas.microsoft.com/office/drawing/2016/5/12/chartex" xmlns:cx7="http://schemas.microsoft.com/office/drawing/2016/5/13/chartex" xmlns:cx8="http://schemas.microsoft.com/office/drawing/2016/5/14/chartex" xmlns:mc="http://schemas.openxmlformats.org/markup-compatibility/2006" xmlns:aink="http://schemas.microsoft.com/office/drawing/2016/ink" xmlns:am3d="http://schemas.microsoft.com/office/drawing/2017/model3d" xmlns:o="urn:schemas-microsoft-com:office:office" xmlns:oel="http://schemas.microsoft.com/office/2019/extlst" xmlns:r="http://schemas.openxmlformats.org/officeDocument/2006/relationships" xmlns:m="http://schemas.openxmlformats.org/officeDocument/2006/math" xmlns:v="urn:schemas-microsoft-com:vml" xmlns:wp14="http://schemas.microsoft.com/office/word/2010/wordprocessingDrawing" xmlns:wp="http://schemas.openxmlformats.org/drawingml/2006/wordprocessingDrawing" xmlns:w10="urn:schemas-microsoft-com:office:word" xmlns:w="http://schemas.openxmlformats.org/wordprocessingml/2006/main" xmlns:w14="http://schemas.microsoft.com/office/word/2010/wordml" xmlns:w15="http://schemas.microsoft.com/office/word/2012/wordml" xmlns:w16cex="http://schemas.microsoft.com/office/word/2018/wordml/cex" xmlns:w16cid="http://schemas.microsoft.com/office/word/2016/wordml/cid" xmlns:w16="http://schemas.microsoft.com/office/word/2018/wordml" xmlns:w16du="http://schemas.microsoft.com/office/word/2023/wordml/word16du" xmlns:w16sdtdh="http://schemas.microsoft.com/office/word/2020/wordml/sdtdatahash" xmlns:w16sdtfl="http://schemas.microsoft.com/office/word/2024/wordml/sdtformatlock" xmlns:w16se="http://schemas.microsoft.com/office/word/2015/wordml/symex" xmlns:wpg="http://schemas.microsoft.com/office/word/2010/wordprocessingGroup" xmlns:wpi="http://schemas.microsoft.com/office/word/2010/wordprocessingInk" xmlns:wne="http://schemas.microsoft.com/office/word/2006/wordml" xmlns:wps="http://schemas.microsoft.com/office/word/2010/wordprocessingShape" mc:Ignorable="w14 w15 w16se w16cid w16 w16cex w16sdtdh w16sdtfl w16du wp14">
   <w16cid:commentId w16cid:paraId="3A114F62" w16cid:durableId="5081449F"/>
+  <w16cid:commentId w16cid:paraId="6EF2028C" w16cid:durableId="17CB01BE"/>
 </w16cid:commentsIds>
 </file>
 
@@ -20458,6 +21096,9 @@
 <w15:people xmlns:wpc="http://schemas.microsoft.com/office/word/2010/wordprocessingCanvas" xmlns:cx="http://schemas.microsoft.com/office/drawing/2014/chartex" xmlns:cx1="http://schemas.microsoft.com/office/drawing/2015/9/8/chartex" xmlns:cx2="http://schemas.microsoft.com/office/drawing/2015/10/21/chartex" xmlns:cx3="http://schemas.microsoft.com/office/drawing/2016/5/9/chartex" xmlns:cx4="http://schemas.microsoft.com/office/drawing/2016/5/10/chartex" xmlns:cx5="http://schemas.microsoft.com/office/drawing/2016/5/11/chartex" xmlns:cx6="http://schemas.microsoft.com/office/drawing/2016/5/12/chartex" xmlns:cx7="http://schemas.microsoft.com/office/drawing/2016/5/13/chartex" xmlns:cx8="http://schemas.microsoft.com/office/drawing/2016/5/14/chartex" xmlns:mc="http://schemas.openxmlformats.org/markup-compatibility/2006" xmlns:aink="http://schemas.microsoft.com/office/drawing/2016/ink" xmlns:am3d="http://schemas.microsoft.com/office/drawing/2017/model3d" xmlns:o="urn:schemas-microsoft-com:office:office" xmlns:oel="http://schemas.microsoft.com/office/2019/extlst" xmlns:r="http://schemas.openxmlformats.org/officeDocument/2006/relationships" xmlns:m="http://schemas.openxmlformats.org/officeDocument/2006/math" xmlns:v="urn:schemas-microsoft-com:vml" xmlns:wp14="http://schemas.microsoft.com/office/word/2010/wordprocessingDrawing" xmlns:wp="http://schemas.openxmlformats.org/drawingml/2006/wordprocessingDrawing" xmlns:w10="urn:schemas-microsoft-com:office:word" xmlns:w="http://schemas.openxmlformats.org/wordprocessingml/2006/main" xmlns:w14="http://schemas.microsoft.com/office/word/2010/wordml" xmlns:w15="http://schemas.microsoft.com/office/word/2012/wordml" xmlns:w16cex="http://schemas.microsoft.com/office/word/2018/wordml/cex" xmlns:w16cid="http://schemas.microsoft.com/office/word/2016/wordml/cid" xmlns:w16="http://schemas.microsoft.com/office/word/2018/wordml" xmlns:w16du="http://schemas.microsoft.com/office/word/2023/wordml/word16du" xmlns:w16sdtdh="http://schemas.microsoft.com/office/word/2020/wordml/sdtdatahash" xmlns:w16sdtfl="http://schemas.microsoft.com/office/word/2024/wordml/sdtformatlock" xmlns:w16se="http://schemas.microsoft.com/office/word/2015/wordml/symex" xmlns:wpg="http://schemas.microsoft.com/office/word/2010/wordprocessingGroup" xmlns:wpi="http://schemas.microsoft.com/office/word/2010/wordprocessingInk" xmlns:wne="http://schemas.microsoft.com/office/word/2006/wordml" xmlns:wps="http://schemas.microsoft.com/office/word/2010/wordprocessingShape" mc:Ignorable="w14 w15 w16se w16cid w16 w16cex w16sdtdh w16sdtfl w16du wp14">
   <w15:person w15:author="Alex Fisher">
     <w15:presenceInfo w15:providerId="AD" w15:userId="S::amf0080@auburn.edu::18480bde-8768-4851-bd71-24a6dd2d4725"/>
+  </w15:person>
+  <w15:person w15:author="Kelsey McCune">
+    <w15:presenceInfo w15:providerId="None" w15:userId="Kelsey McCune"/>
   </w15:person>
 </w15:people>
 </file>
@@ -20891,6 +21532,7 @@
   <w:style w:type="character" w:default="1" w:styleId="DefaultParagraphFont">
     <w:name w:val="Default Paragraph Font"/>
     <w:uiPriority w:val="1"/>
+    <w:semiHidden/>
     <w:unhideWhenUsed/>
   </w:style>
   <w:style w:type="table" w:default="1" w:styleId="TableNormal">
@@ -21937,14 +22579,14 @@
     <w:charset w:val="00"/>
     <w:family w:val="swiss"/>
     <w:pitch w:val="variable"/>
-    <w:sig w:usb0="E4002EFF" w:usb1="C000247B" w:usb2="00000009" w:usb3="00000000" w:csb0="000001FF" w:csb1="00000000"/>
+    <w:sig w:usb0="E4002EFF" w:usb1="C200247B" w:usb2="00000009" w:usb3="00000000" w:csb0="000001FF" w:csb1="00000000"/>
   </w:font>
   <w:font w:name="Cambria">
     <w:panose1 w:val="02040503050406030204"/>
     <w:charset w:val="00"/>
     <w:family w:val="roman"/>
     <w:pitch w:val="variable"/>
-    <w:sig w:usb0="E00006FF" w:usb1="420024FF" w:usb2="02000000" w:usb3="00000000" w:csb0="0000019F" w:csb1="00000000"/>
+    <w:sig w:usb0="E00002FF" w:usb1="400004FF" w:usb2="00000000" w:usb3="00000000" w:csb0="0000019F" w:csb1="00000000"/>
   </w:font>
   <w:font w:name="MS Gothic">
     <w:altName w:val="ＭＳ ゴシック"/>
@@ -22061,8 +22703,10 @@
     <w:rsid w:val="007604D4"/>
     <w:rsid w:val="00776CF9"/>
     <w:rsid w:val="007807A4"/>
+    <w:rsid w:val="007C1992"/>
     <w:rsid w:val="007C3837"/>
     <w:rsid w:val="007D54EA"/>
+    <w:rsid w:val="007F2697"/>
     <w:rsid w:val="00841044"/>
     <w:rsid w:val="00845013"/>
     <w:rsid w:val="008A5A4E"/>
@@ -22071,6 +22715,7 @@
     <w:rsid w:val="008D6715"/>
     <w:rsid w:val="0094332C"/>
     <w:rsid w:val="00987E92"/>
+    <w:rsid w:val="009B42F9"/>
     <w:rsid w:val="009C2914"/>
     <w:rsid w:val="00A77C5E"/>
     <w:rsid w:val="00AB7E98"/>
@@ -22916,10 +23561,6 @@
 </file>
 
 <file path=customXml/item1.xml><?xml version="1.0" encoding="utf-8"?>
-<b:Sources xmlns:b="http://schemas.openxmlformats.org/officeDocument/2006/bibliography" xmlns="http://schemas.openxmlformats.org/officeDocument/2006/bibliography" SelectedStyle="\APASixthEditionOfficeOnline.xsl" StyleName="APA" Version="6"/>
-</file>
-
-<file path=customXml/item2.xml><?xml version="1.0" encoding="utf-8"?>
 <ct:contentTypeSchema xmlns:ct="http://schemas.microsoft.com/office/2006/metadata/contentType" xmlns:ma="http://schemas.microsoft.com/office/2006/metadata/properties/metaAttributes" ct:_="" ma:_="" ma:contentTypeName="Document" ma:contentTypeID="0x01010071543618D710814CB7A5D363A31D1B96" ma:contentTypeVersion="4" ma:contentTypeDescription="Create a new document." ma:contentTypeScope="" ma:versionID="56f6942f173b961896c388446d456582">
   <xsd:schema xmlns:xsd="http://www.w3.org/2001/XMLSchema" xmlns:xs="http://www.w3.org/2001/XMLSchema" xmlns:p="http://schemas.microsoft.com/office/2006/metadata/properties" xmlns:ns2="880a7bf2-c82d-49e4-b898-1932dfa2e071" targetNamespace="http://schemas.microsoft.com/office/2006/metadata/properties" ma:root="true" ma:fieldsID="a0ff5c3bf694fef035fbd678bebf06c6" ns2:_="">
     <xsd:import namespace="880a7bf2-c82d-49e4-b898-1932dfa2e071"/>
@@ -23063,13 +23704,7 @@
 </ct:contentTypeSchema>
 </file>
 
-<file path=customXml/item3.xml><?xml version="1.0" encoding="utf-8"?>
-<p:properties xmlns:p="http://schemas.microsoft.com/office/2006/metadata/properties" xmlns:xsi="http://www.w3.org/2001/XMLSchema-instance" xmlns:pc="http://schemas.microsoft.com/office/infopath/2007/PartnerControls">
-  <documentManagement/>
-</p:properties>
-</file>
-
-<file path=customXml/item4.xml><?xml version="1.0" encoding="utf-8"?>
+<file path=customXml/item2.xml><?xml version="1.0" encoding="utf-8"?>
 <?mso-contentType ?>
 <FormTemplates xmlns="http://schemas.microsoft.com/sharepoint/v3/contenttype/forms">
   <Display>DocumentLibraryForm</Display>
@@ -23078,15 +23713,17 @@
 </FormTemplates>
 </file>
 
-<file path=customXml/itemProps1.xml><?xml version="1.0" encoding="utf-8"?>
-<ds:datastoreItem xmlns:ds="http://schemas.openxmlformats.org/officeDocument/2006/customXml" ds:itemID="{C7DBFB5B-A178-7D45-BBE9-88A65BCF52B8}">
-  <ds:schemaRefs>
-    <ds:schemaRef ds:uri="http://schemas.openxmlformats.org/officeDocument/2006/bibliography"/>
-  </ds:schemaRefs>
-</ds:datastoreItem>
+<file path=customXml/item3.xml><?xml version="1.0" encoding="utf-8"?>
+<p:properties xmlns:p="http://schemas.microsoft.com/office/2006/metadata/properties" xmlns:xsi="http://www.w3.org/2001/XMLSchema-instance" xmlns:pc="http://schemas.microsoft.com/office/infopath/2007/PartnerControls">
+  <documentManagement/>
+</p:properties>
 </file>
 
-<file path=customXml/itemProps2.xml><?xml version="1.0" encoding="utf-8"?>
+<file path=customXml/item4.xml><?xml version="1.0" encoding="utf-8"?>
+<b:Sources xmlns:b="http://schemas.openxmlformats.org/officeDocument/2006/bibliography" xmlns="http://schemas.openxmlformats.org/officeDocument/2006/bibliography" SelectedStyle="\APASixthEditionOfficeOnline.xsl" StyleName="APA" Version="6"/>
+</file>
+
+<file path=customXml/itemProps1.xml><?xml version="1.0" encoding="utf-8"?>
 <ds:datastoreItem xmlns:ds="http://schemas.openxmlformats.org/officeDocument/2006/customXml" ds:itemID="{C41636AD-22E5-42B9-BEC5-875C4017A51E}">
   <ds:schemaRefs>
     <ds:schemaRef ds:uri="http://schemas.microsoft.com/office/2006/metadata/contentType"/>
@@ -23104,6 +23741,14 @@
 </ds:datastoreItem>
 </file>
 
+<file path=customXml/itemProps2.xml><?xml version="1.0" encoding="utf-8"?>
+<ds:datastoreItem xmlns:ds="http://schemas.openxmlformats.org/officeDocument/2006/customXml" ds:itemID="{1DBB1093-F880-422D-86C1-617F7DAEF962}">
+  <ds:schemaRefs>
+    <ds:schemaRef ds:uri="http://schemas.microsoft.com/sharepoint/v3/contenttype/forms"/>
+  </ds:schemaRefs>
+</ds:datastoreItem>
+</file>
+
 <file path=customXml/itemProps3.xml><?xml version="1.0" encoding="utf-8"?>
 <ds:datastoreItem xmlns:ds="http://schemas.openxmlformats.org/officeDocument/2006/customXml" ds:itemID="{4583F2B3-037C-44DB-B08D-E6F378EEF829}">
   <ds:schemaRefs>
@@ -23114,9 +23759,9 @@
 </file>
 
 <file path=customXml/itemProps4.xml><?xml version="1.0" encoding="utf-8"?>
-<ds:datastoreItem xmlns:ds="http://schemas.openxmlformats.org/officeDocument/2006/customXml" ds:itemID="{1DBB1093-F880-422D-86C1-617F7DAEF962}">
+<ds:datastoreItem xmlns:ds="http://schemas.openxmlformats.org/officeDocument/2006/customXml" ds:itemID="{C7DBFB5B-A178-7D45-BBE9-88A65BCF52B8}">
   <ds:schemaRefs>
-    <ds:schemaRef ds:uri="http://schemas.microsoft.com/sharepoint/v3/contenttype/forms"/>
+    <ds:schemaRef ds:uri="http://schemas.openxmlformats.org/officeDocument/2006/bibliography"/>
   </ds:schemaRefs>
 </ds:datastoreItem>
 </file>
</xml_diff>

<commit_message>
edited thesis proposal, added methods, added section 3.0 to survey protocol doc
</commit_message>
<xml_diff>
--- a/Documents /HRP-503 - TEMPLATE PROTOCOL .docx
+++ b/Documents /HRP-503 - TEMPLATE PROTOCOL .docx
@@ -1,6 +1,6 @@
 
 <file path=word/document.xml><?xml version="1.0" encoding="utf-8"?>
-<w:document xmlns:wpc="http://schemas.microsoft.com/office/word/2010/wordprocessingCanvas" xmlns:cx="http://schemas.microsoft.com/office/drawing/2014/chartex" xmlns:cx1="http://schemas.microsoft.com/office/drawing/2015/9/8/chartex" xmlns:cx2="http://schemas.microsoft.com/office/drawing/2015/10/21/chartex" xmlns:cx3="http://schemas.microsoft.com/office/drawing/2016/5/9/chartex" xmlns:cx4="http://schemas.microsoft.com/office/drawing/2016/5/10/chartex" xmlns:cx5="http://schemas.microsoft.com/office/drawing/2016/5/11/chartex" xmlns:cx6="http://schemas.microsoft.com/office/drawing/2016/5/12/chartex" xmlns:cx7="http://schemas.microsoft.com/office/drawing/2016/5/13/chartex" xmlns:cx8="http://schemas.microsoft.com/office/drawing/2016/5/14/chartex" xmlns:mc="http://schemas.openxmlformats.org/markup-compatibility/2006" xmlns:aink="http://schemas.microsoft.com/office/drawing/2016/ink" xmlns:am3d="http://schemas.microsoft.com/office/drawing/2017/model3d" xmlns:o="urn:schemas-microsoft-com:office:office" xmlns:oel="http://schemas.microsoft.com/office/2019/extlst" xmlns:r="http://schemas.openxmlformats.org/officeDocument/2006/relationships" xmlns:m="http://schemas.openxmlformats.org/officeDocument/2006/math" xmlns:v="urn:schemas-microsoft-com:vml" xmlns:wp14="http://schemas.microsoft.com/office/word/2010/wordprocessingDrawing" xmlns:wp="http://schemas.openxmlformats.org/drawingml/2006/wordprocessingDrawing" xmlns:w10="urn:schemas-microsoft-com:office:word" xmlns:w="http://schemas.openxmlformats.org/wordprocessingml/2006/main" xmlns:w14="http://schemas.microsoft.com/office/word/2010/wordml" xmlns:w15="http://schemas.microsoft.com/office/word/2012/wordml" xmlns:w16cex="http://schemas.microsoft.com/office/word/2018/wordml/cex" xmlns:w16cid="http://schemas.microsoft.com/office/word/2016/wordml/cid" xmlns:w16="http://schemas.microsoft.com/office/word/2018/wordml" xmlns:w16du="http://schemas.microsoft.com/office/word/2023/wordml/word16du" xmlns:w16sdtdh="http://schemas.microsoft.com/office/word/2020/wordml/sdtdatahash" xmlns:w16sdtfl="http://schemas.microsoft.com/office/word/2024/wordml/sdtformatlock" xmlns:w16se="http://schemas.microsoft.com/office/word/2015/wordml/symex" xmlns:wpg="http://schemas.microsoft.com/office/word/2010/wordprocessingGroup" xmlns:wpi="http://schemas.microsoft.com/office/word/2010/wordprocessingInk" xmlns:wne="http://schemas.microsoft.com/office/word/2006/wordml" xmlns:wps="http://schemas.microsoft.com/office/word/2010/wordprocessingShape" mc:Ignorable="w14 w15 w16se w16cid w16 w16cex w16sdtdh w16sdtfl w16du wp14">
+<w:document xmlns:wpc="http://schemas.microsoft.com/office/word/2010/wordprocessingCanvas" xmlns:cx="http://schemas.microsoft.com/office/drawing/2014/chartex" xmlns:cx1="http://schemas.microsoft.com/office/drawing/2015/9/8/chartex" xmlns:cx2="http://schemas.microsoft.com/office/drawing/2015/10/21/chartex" xmlns:cx3="http://schemas.microsoft.com/office/drawing/2016/5/9/chartex" xmlns:cx4="http://schemas.microsoft.com/office/drawing/2016/5/10/chartex" xmlns:cx5="http://schemas.microsoft.com/office/drawing/2016/5/11/chartex" xmlns:cx6="http://schemas.microsoft.com/office/drawing/2016/5/12/chartex" xmlns:cx7="http://schemas.microsoft.com/office/drawing/2016/5/13/chartex" xmlns:cx8="http://schemas.microsoft.com/office/drawing/2016/5/14/chartex" xmlns:mc="http://schemas.openxmlformats.org/markup-compatibility/2006" xmlns:m="http://schemas.openxmlformats.org/officeDocument/2006/math" xmlns:aink="http://schemas.microsoft.com/office/drawing/2016/ink" xmlns:am3d="http://schemas.microsoft.com/office/drawing/2017/model3d" xmlns:oel="http://schemas.microsoft.com/office/2019/extlst" xmlns:r="http://schemas.openxmlformats.org/officeDocument/2006/relationships" xmlns:wp14="http://schemas.microsoft.com/office/word/2010/wordprocessingDrawing" xmlns:wp="http://schemas.openxmlformats.org/drawingml/2006/wordprocessingDrawing" xmlns:wpg="http://schemas.microsoft.com/office/word/2010/wordprocessingGroup" xmlns:wpi="http://schemas.microsoft.com/office/word/2010/wordprocessingInk" xmlns:wps="http://schemas.microsoft.com/office/word/2010/wordprocessingShape" xmlns:o="urn:schemas-microsoft-com:office:office" xmlns:v="urn:schemas-microsoft-com:vml" xmlns:w10="urn:schemas-microsoft-com:office:word" xmlns:w="http://schemas.openxmlformats.org/wordprocessingml/2006/main" xmlns:w14="http://schemas.microsoft.com/office/word/2010/wordml" xmlns:w15="http://schemas.microsoft.com/office/word/2012/wordml" xmlns:w16cex="http://schemas.microsoft.com/office/word/2018/wordml/cex" xmlns:w16cid="http://schemas.microsoft.com/office/word/2016/wordml/cid" xmlns:w16="http://schemas.microsoft.com/office/word/2018/wordml" xmlns:w16sdtdh="http://schemas.microsoft.com/office/word/2020/wordml/sdtdatahash" xmlns:w16sdtfl="http://schemas.microsoft.com/office/word/2024/wordml/sdtformatlock" xmlns:w16se="http://schemas.microsoft.com/office/word/2015/wordml/symex" xmlns:w16du="http://schemas.microsoft.com/office/word/2023/wordml/word16du" xmlns:wne="http://schemas.microsoft.com/office/word/2006/wordml" mc:Ignorable="w14 w15 w16se w16cid w16 w16cex w16sdtdh w16sdtfl w16du wp14">
   <w:body>
     <w:p>
       <w:pPr>
@@ -654,8 +654,11 @@
           <w:r>
             <w:rPr>
               <w:rStyle w:val="CommentReference"/>
-              <w:rFonts w:ascii="Arial" w:eastAsiaTheme="minorHAnsi" w:hAnsi="Arial" w:cstheme="minorBidi"/>
+              <w:rFonts w:ascii="Arial" w:hAnsi="Arial" w:cs="Arial"/>
+              <w:iCs/>
               <w:color w:val="auto"/>
+              <w:sz w:val="22"/>
+              <w:szCs w:val="22"/>
             </w:rPr>
             <w:commentReference w:id="1"/>
           </w:r>
@@ -1217,15 +1220,13 @@
           </w:placeholder>
         </w:sdtPr>
         <w:sdtContent>
-          <w:ins w:id="4" w:author="Kelsey McCune" w:date="2026-06-19T07:11:00Z" w16du:dateUtc="2026-06-19T12:11:00Z">
-            <w:r>
-              <w:rPr>
-                <w:rFonts w:eastAsia="Times New Roman" w:cs="Arial"/>
-                <w:szCs w:val="24"/>
-              </w:rPr>
-              <w:t>Dr. Latif Kalin</w:t>
-            </w:r>
-          </w:ins>
+          <w:r>
+            <w:rPr>
+              <w:rFonts w:eastAsia="Times New Roman" w:cs="Arial"/>
+              <w:szCs w:val="24"/>
+            </w:rPr>
+            <w:t>Dr. Latif Kalin</w:t>
+          </w:r>
         </w:sdtContent>
       </w:sdt>
     </w:p>
@@ -3857,7 +3858,7 @@
         </w:rPr>
         <w:br w:type="page"/>
       </w:r>
-      <w:bookmarkStart w:id="5" w:name="_Toc226630088"/>
+      <w:bookmarkStart w:id="4" w:name="_Toc226630088"/>
       <w:r>
         <w:rPr>
           <w:rFonts w:ascii="Arial" w:hAnsi="Arial" w:cs="Arial"/>
@@ -3865,7 +3866,7 @@
         <w:lastRenderedPageBreak/>
         <w:t>Objectives</w:t>
       </w:r>
-      <w:bookmarkEnd w:id="5"/>
+      <w:bookmarkEnd w:id="4"/>
     </w:p>
     <w:p>
       <w:pPr>
@@ -3979,36 +3980,16 @@
                       <w:color w:val="auto"/>
                       <w:sz w:val="22"/>
                     </w:rPr>
-                    <w:t>Zoonotic diseases that spill over between wildlife, domestic animals, and humans represent a growing risk to public health, and the majority of emerging infectious diseases originate at small-scale interfaces where these groups interact. Backyard bird feeding and small-scale poultry keeping are widespread and growing activities that combine</w:t>
+                    <w:t>Zoonotic diseases that spill over between wildlife, domestic animals, and humans represent a growing risk to public health, and the majority of emerging infectious diseases originate at small-scale interfaces where these groups interact. Backyard bird feeding and small-scale poultry keeping are widespread and growing activities that combine interactions</w:t>
                   </w:r>
-                  <w:del w:id="6" w:author="Kelsey McCune" w:date="2026-06-19T07:12:00Z" w16du:dateUtc="2026-06-19T12:12:00Z">
-                    <w:r>
-                      <w:rPr>
-                        <w:rFonts w:ascii="Arial" w:hAnsi="Arial" w:cs="Arial"/>
-                        <w:color w:val="auto"/>
-                        <w:sz w:val="22"/>
-                      </w:rPr>
-                      <w:delText xml:space="preserve"> these</w:delText>
-                    </w:r>
-                  </w:del>
                   <w:r>
                     <w:rPr>
                       <w:rFonts w:ascii="Arial" w:hAnsi="Arial" w:cs="Arial"/>
                       <w:color w:val="auto"/>
                       <w:sz w:val="22"/>
                     </w:rPr>
-                    <w:t xml:space="preserve"> interactions</w:t>
+                    <w:t xml:space="preserve"> among wildlife, domestic animals and humans</w:t>
                   </w:r>
-                  <w:ins w:id="7" w:author="Kelsey McCune" w:date="2026-06-19T07:12:00Z" w16du:dateUtc="2026-06-19T12:12:00Z">
-                    <w:r>
-                      <w:rPr>
-                        <w:rFonts w:ascii="Arial" w:hAnsi="Arial" w:cs="Arial"/>
-                        <w:color w:val="auto"/>
-                        <w:sz w:val="22"/>
-                      </w:rPr>
-                      <w:t xml:space="preserve"> among wildlife, domestic animals and humans</w:t>
-                    </w:r>
-                  </w:ins>
                   <w:r>
                     <w:rPr>
                       <w:rFonts w:ascii="Arial" w:hAnsi="Arial" w:cs="Arial"/>
@@ -4017,46 +3998,22 @@
                     </w:rPr>
                     <w:t xml:space="preserve"> in residential settings</w:t>
                   </w:r>
-                  <w:ins w:id="8" w:author="Kelsey McCune" w:date="2026-06-19T07:20:00Z" w16du:dateUtc="2026-06-19T12:20:00Z">
-                    <w:r>
-                      <w:rPr>
-                        <w:rFonts w:ascii="Arial" w:hAnsi="Arial" w:cs="Arial"/>
-                        <w:color w:val="auto"/>
-                        <w:sz w:val="22"/>
-                      </w:rPr>
-                      <w:t>.</w:t>
-                    </w:r>
-                  </w:ins>
-                  <w:ins w:id="9" w:author="Kelsey McCune" w:date="2026-06-19T07:26:00Z" w16du:dateUtc="2026-06-19T12:26:00Z">
-                    <w:r>
-                      <w:rPr>
-                        <w:rFonts w:ascii="Arial" w:hAnsi="Arial" w:cs="Arial"/>
-                        <w:color w:val="auto"/>
-                        <w:sz w:val="22"/>
-                      </w:rPr>
-                      <w:t xml:space="preserve"> Despite the risk, these activities can benefit human wellbeing and feelings of connec</w:t>
-                    </w:r>
-                  </w:ins>
-                  <w:ins w:id="10" w:author="Kelsey McCune" w:date="2026-06-19T07:27:00Z" w16du:dateUtc="2026-06-19T12:27:00Z">
-                    <w:r>
-                      <w:rPr>
-                        <w:rFonts w:ascii="Arial" w:hAnsi="Arial" w:cs="Arial"/>
-                        <w:color w:val="auto"/>
-                        <w:sz w:val="22"/>
-                      </w:rPr>
-                      <w:t>tion to nature.</w:t>
-                    </w:r>
-                  </w:ins>
-                  <w:del w:id="11" w:author="Kelsey McCune" w:date="2026-06-19T07:26:00Z" w16du:dateUtc="2026-06-19T12:26:00Z">
-                    <w:r>
-                      <w:rPr>
-                        <w:rFonts w:ascii="Arial" w:hAnsi="Arial" w:cs="Arial"/>
-                        <w:color w:val="auto"/>
-                        <w:sz w:val="22"/>
-                      </w:rPr>
-                      <w:delText>,</w:delText>
-                    </w:r>
-                  </w:del>
+                  <w:r>
+                    <w:rPr>
+                      <w:rFonts w:ascii="Arial" w:hAnsi="Arial" w:cs="Arial"/>
+                      <w:color w:val="auto"/>
+                      <w:sz w:val="22"/>
+                    </w:rPr>
+                    <w:t>.</w:t>
+                  </w:r>
+                  <w:r>
+                    <w:rPr>
+                      <w:rFonts w:ascii="Arial" w:hAnsi="Arial" w:cs="Arial"/>
+                      <w:color w:val="auto"/>
+                      <w:sz w:val="22"/>
+                    </w:rPr>
+                    <w:t xml:space="preserve"> Despite the risk, these activities can benefit human wellbeing and feelings of connection to nature.</w:t>
+                  </w:r>
                   <w:r>
                     <w:rPr>
                       <w:rFonts w:ascii="Arial" w:hAnsi="Arial" w:cs="Arial"/>
@@ -4065,26 +4022,14 @@
                     </w:rPr>
                     <w:t xml:space="preserve"> </w:t>
                   </w:r>
-                  <w:ins w:id="12" w:author="Kelsey McCune" w:date="2026-06-19T07:26:00Z" w16du:dateUtc="2026-06-19T12:26:00Z">
-                    <w:r>
-                      <w:rPr>
-                        <w:rFonts w:ascii="Arial" w:hAnsi="Arial" w:cs="Arial"/>
-                        <w:color w:val="auto"/>
-                        <w:sz w:val="22"/>
-                      </w:rPr>
-                      <w:t>Y</w:t>
-                    </w:r>
-                  </w:ins>
-                  <w:del w:id="13" w:author="Kelsey McCune" w:date="2026-06-19T07:26:00Z" w16du:dateUtc="2026-06-19T12:26:00Z">
-                    <w:r>
-                      <w:rPr>
-                        <w:rFonts w:ascii="Arial" w:hAnsi="Arial" w:cs="Arial"/>
-                        <w:color w:val="auto"/>
-                        <w:sz w:val="22"/>
-                      </w:rPr>
-                      <w:delText>y</w:delText>
-                    </w:r>
-                  </w:del>
+                  <w:r>
+                    <w:rPr>
+                      <w:rFonts w:ascii="Arial" w:hAnsi="Arial" w:cs="Arial"/>
+                      <w:color w:val="auto"/>
+                      <w:sz w:val="22"/>
+                    </w:rPr>
+                    <w:t>Y</w:t>
+                  </w:r>
                   <w:r>
                     <w:rPr>
                       <w:rFonts w:ascii="Arial" w:hAnsi="Arial" w:cs="Arial"/>
@@ -4093,16 +4038,14 @@
                     </w:rPr>
                     <w:t>et</w:t>
                   </w:r>
-                  <w:ins w:id="14" w:author="Kelsey McCune" w:date="2026-06-19T07:26:00Z" w16du:dateUtc="2026-06-19T12:26:00Z">
-                    <w:r>
-                      <w:rPr>
-                        <w:rFonts w:ascii="Arial" w:hAnsi="Arial" w:cs="Arial"/>
-                        <w:color w:val="auto"/>
-                        <w:sz w:val="22"/>
-                      </w:rPr>
-                      <w:t>,</w:t>
-                    </w:r>
-                  </w:ins>
+                  <w:r>
+                    <w:rPr>
+                      <w:rFonts w:ascii="Arial" w:hAnsi="Arial" w:cs="Arial"/>
+                      <w:color w:val="auto"/>
+                      <w:sz w:val="22"/>
+                    </w:rPr>
+                    <w:t>,</w:t>
+                  </w:r>
                   <w:r>
                     <w:rPr>
                       <w:rFonts w:ascii="Arial" w:hAnsi="Arial" w:cs="Arial"/>
@@ -4111,62 +4054,30 @@
                     </w:rPr>
                     <w:t xml:space="preserve"> the </w:t>
                   </w:r>
-                  <w:ins w:id="15" w:author="Kelsey McCune" w:date="2026-06-19T07:27:00Z" w16du:dateUtc="2026-06-19T12:27:00Z">
-                    <w:r>
-                      <w:rPr>
-                        <w:rFonts w:ascii="Arial" w:hAnsi="Arial" w:cs="Arial"/>
-                        <w:color w:val="auto"/>
-                        <w:sz w:val="22"/>
-                      </w:rPr>
-                      <w:t xml:space="preserve">homeowner perceptions of the tradeoff between risk and benefit from these activities and the </w:t>
-                    </w:r>
-                  </w:ins>
                   <w:r>
                     <w:rPr>
                       <w:rFonts w:ascii="Arial" w:hAnsi="Arial" w:cs="Arial"/>
                       <w:color w:val="auto"/>
                       <w:sz w:val="22"/>
                     </w:rPr>
-                    <w:t>impact</w:t>
+                    <w:t xml:space="preserve">homeowner perceptions of the tradeoff between risk and benefit from these activities and the </w:t>
                   </w:r>
-                  <w:del w:id="16" w:author="Kelsey McCune" w:date="2026-06-19T07:27:00Z" w16du:dateUtc="2026-06-19T12:27:00Z">
-                    <w:r>
-                      <w:rPr>
-                        <w:rFonts w:ascii="Arial" w:hAnsi="Arial" w:cs="Arial"/>
-                        <w:color w:val="auto"/>
-                        <w:sz w:val="22"/>
-                      </w:rPr>
-                      <w:delText>s</w:delText>
-                    </w:r>
-                  </w:del>
                   <w:r>
                     <w:rPr>
                       <w:rFonts w:ascii="Arial" w:hAnsi="Arial" w:cs="Arial"/>
                       <w:color w:val="auto"/>
                       <w:sz w:val="22"/>
                     </w:rPr>
-                    <w:t xml:space="preserve"> </w:t>
+                    <w:t xml:space="preserve">impact </w:t>
                   </w:r>
-                  <w:del w:id="17" w:author="Kelsey McCune" w:date="2026-06-19T07:27:00Z" w16du:dateUtc="2026-06-19T12:27:00Z">
-                    <w:r>
-                      <w:rPr>
-                        <w:rFonts w:ascii="Arial" w:hAnsi="Arial" w:cs="Arial"/>
-                        <w:color w:val="auto"/>
-                        <w:sz w:val="22"/>
-                      </w:rPr>
-                      <w:delText>of these practices and the human dimensions that influence</w:delText>
-                    </w:r>
-                  </w:del>
-                  <w:ins w:id="18" w:author="Kelsey McCune" w:date="2026-06-19T07:27:00Z" w16du:dateUtc="2026-06-19T12:27:00Z">
-                    <w:r>
-                      <w:rPr>
-                        <w:rFonts w:ascii="Arial" w:hAnsi="Arial" w:cs="Arial"/>
-                        <w:color w:val="auto"/>
-                        <w:sz w:val="22"/>
-                      </w:rPr>
-                      <w:t>it has on</w:t>
-                    </w:r>
-                  </w:ins>
+                  <w:r>
+                    <w:rPr>
+                      <w:rFonts w:ascii="Arial" w:hAnsi="Arial" w:cs="Arial"/>
+                      <w:color w:val="auto"/>
+                      <w:sz w:val="22"/>
+                    </w:rPr>
+                    <w:t>it has on</w:t>
+                  </w:r>
                   <w:r>
                     <w:rPr>
                       <w:rFonts w:ascii="Arial" w:hAnsi="Arial" w:cs="Arial"/>
@@ -4236,16 +4147,14 @@
                     </w:rPr>
                     <w:t xml:space="preserve">This study comprises three specific aims. Aims 1 and 2 concern pathogen prevalence in wild birds and the backyard environment; these are addressed through field and laboratory </w:t>
                   </w:r>
-                  <w:ins w:id="19" w:author="Kelsey McCune" w:date="2026-06-19T07:28:00Z" w16du:dateUtc="2026-06-19T12:28:00Z">
-                    <w:r>
-                      <w:rPr>
-                        <w:rFonts w:ascii="Arial" w:hAnsi="Arial" w:cs="Arial"/>
-                        <w:color w:val="auto"/>
-                        <w:sz w:val="22"/>
-                      </w:rPr>
-                      <w:t xml:space="preserve">methods </w:t>
-                    </w:r>
-                  </w:ins>
+                  <w:r>
+                    <w:rPr>
+                      <w:rFonts w:ascii="Arial" w:hAnsi="Arial" w:cs="Arial"/>
+                      <w:color w:val="auto"/>
+                      <w:sz w:val="22"/>
+                    </w:rPr>
+                    <w:t xml:space="preserve">methods </w:t>
+                  </w:r>
                   <w:r>
                     <w:rPr>
                       <w:rFonts w:ascii="Arial" w:hAnsi="Arial" w:cs="Arial"/>
@@ -4254,26 +4163,14 @@
                     </w:rPr>
                     <w:t xml:space="preserve">that </w:t>
                   </w:r>
-                  <w:ins w:id="20" w:author="Kelsey McCune" w:date="2026-06-19T07:28:00Z" w16du:dateUtc="2026-06-19T12:28:00Z">
-                    <w:r>
-                      <w:rPr>
-                        <w:rFonts w:ascii="Arial" w:hAnsi="Arial" w:cs="Arial"/>
-                        <w:color w:val="auto"/>
-                        <w:sz w:val="22"/>
-                      </w:rPr>
-                      <w:t>we</w:t>
-                    </w:r>
-                  </w:ins>
-                  <w:del w:id="21" w:author="Kelsey McCune" w:date="2026-06-19T07:28:00Z" w16du:dateUtc="2026-06-19T12:28:00Z">
-                    <w:r>
-                      <w:rPr>
-                        <w:rFonts w:ascii="Arial" w:hAnsi="Arial" w:cs="Arial"/>
-                        <w:color w:val="auto"/>
-                        <w:sz w:val="22"/>
-                      </w:rPr>
-                      <w:delText>a</w:delText>
-                    </w:r>
-                  </w:del>
+                  <w:r>
+                    <w:rPr>
+                      <w:rFonts w:ascii="Arial" w:hAnsi="Arial" w:cs="Arial"/>
+                      <w:color w:val="auto"/>
+                      <w:sz w:val="22"/>
+                    </w:rPr>
+                    <w:t>we</w:t>
+                  </w:r>
                   <w:r>
                     <w:rPr>
                       <w:rFonts w:ascii="Arial" w:hAnsi="Arial" w:cs="Arial"/>
@@ -4388,16 +4285,14 @@
                     </w:rPr>
                     <w:t xml:space="preserve"> bird feeder only, backyard poultry only, both</w:t>
                   </w:r>
-                  <w:ins w:id="22" w:author="Kelsey McCune" w:date="2026-06-19T07:29:00Z" w16du:dateUtc="2026-06-19T12:29:00Z">
-                    <w:r>
-                      <w:rPr>
-                        <w:rFonts w:ascii="Arial" w:hAnsi="Arial" w:cs="Arial"/>
-                        <w:color w:val="000000" w:themeColor="text1"/>
-                        <w:sz w:val="22"/>
-                      </w:rPr>
-                      <w:t xml:space="preserve"> feeders and poultry</w:t>
-                    </w:r>
-                  </w:ins>
+                  <w:r>
+                    <w:rPr>
+                      <w:rFonts w:ascii="Arial" w:hAnsi="Arial" w:cs="Arial"/>
+                      <w:color w:val="000000" w:themeColor="text1"/>
+                      <w:sz w:val="22"/>
+                    </w:rPr>
+                    <w:t xml:space="preserve"> feeders and poultry</w:t>
+                  </w:r>
                   <w:r>
                     <w:rPr>
                       <w:rFonts w:ascii="Arial" w:hAnsi="Arial" w:cs="Arial"/>
@@ -4406,34 +4301,14 @@
                     </w:rPr>
                     <w:t>, and control sites with neither</w:t>
                   </w:r>
-                  <w:ins w:id="23" w:author="Kelsey McCune" w:date="2026-06-19T07:30:00Z" w16du:dateUtc="2026-06-19T12:30:00Z">
-                    <w:r>
-                      <w:rPr>
-                        <w:rFonts w:ascii="Arial" w:hAnsi="Arial" w:cs="Arial"/>
-                        <w:color w:val="000000" w:themeColor="text1"/>
-                        <w:sz w:val="22"/>
-                      </w:rPr>
-                      <w:t>. From this we will</w:t>
-                    </w:r>
-                  </w:ins>
-                  <w:del w:id="24" w:author="Kelsey McCune" w:date="2026-06-19T07:30:00Z" w16du:dateUtc="2026-06-19T12:30:00Z">
-                    <w:r>
-                      <w:rPr>
-                        <w:rFonts w:ascii="Arial" w:hAnsi="Arial" w:cs="Arial"/>
-                        <w:color w:val="000000" w:themeColor="text1"/>
-                        <w:sz w:val="22"/>
-                      </w:rPr>
-                      <w:delText xml:space="preserve">; </w:delText>
-                    </w:r>
-                    <w:r>
-                      <w:rPr>
-                        <w:rFonts w:ascii="Arial" w:hAnsi="Arial" w:cs="Arial"/>
-                        <w:color w:val="000000" w:themeColor="text1"/>
-                        <w:sz w:val="22"/>
-                      </w:rPr>
-                      <w:delText>to</w:delText>
-                    </w:r>
-                  </w:del>
+                  <w:r>
+                    <w:rPr>
+                      <w:rFonts w:ascii="Arial" w:hAnsi="Arial" w:cs="Arial"/>
+                      <w:color w:val="000000" w:themeColor="text1"/>
+                      <w:sz w:val="22"/>
+                    </w:rPr>
+                    <w:t>. From this we will</w:t>
+                  </w:r>
                   <w:r>
                     <w:rPr>
                       <w:rFonts w:ascii="Arial" w:hAnsi="Arial" w:cs="Arial"/>
@@ -4442,34 +4317,22 @@
                     </w:rPr>
                     <w:t xml:space="preserve"> determine which backyard </w:t>
                   </w:r>
-                  <w:del w:id="25" w:author="Kelsey McCune" w:date="2026-06-19T07:30:00Z" w16du:dateUtc="2026-06-19T12:30:00Z">
-                    <w:r>
-                      <w:rPr>
-                        <w:rFonts w:ascii="Arial" w:hAnsi="Arial" w:cs="Arial"/>
-                        <w:color w:val="000000" w:themeColor="text1"/>
-                        <w:sz w:val="22"/>
-                      </w:rPr>
-                      <w:delText xml:space="preserve">components </w:delText>
-                    </w:r>
-                  </w:del>
-                  <w:ins w:id="26" w:author="Kelsey McCune" w:date="2026-06-19T07:30:00Z" w16du:dateUtc="2026-06-19T12:30:00Z">
-                    <w:r>
-                      <w:rPr>
-                        <w:rFonts w:ascii="Arial" w:hAnsi="Arial" w:cs="Arial"/>
-                        <w:color w:val="000000" w:themeColor="text1"/>
-                        <w:sz w:val="22"/>
-                      </w:rPr>
-                      <w:t>activitie</w:t>
-                    </w:r>
-                    <w:r>
-                      <w:rPr>
-                        <w:rFonts w:ascii="Arial" w:hAnsi="Arial" w:cs="Arial"/>
-                        <w:color w:val="000000" w:themeColor="text1"/>
-                        <w:sz w:val="22"/>
-                      </w:rPr>
-                      <w:t xml:space="preserve">s </w:t>
-                    </w:r>
-                  </w:ins>
+                  <w:r>
+                    <w:rPr>
+                      <w:rFonts w:ascii="Arial" w:hAnsi="Arial" w:cs="Arial"/>
+                      <w:color w:val="000000" w:themeColor="text1"/>
+                      <w:sz w:val="22"/>
+                    </w:rPr>
+                    <w:t>activitie</w:t>
+                  </w:r>
+                  <w:r>
+                    <w:rPr>
+                      <w:rFonts w:ascii="Arial" w:hAnsi="Arial" w:cs="Arial"/>
+                      <w:color w:val="000000" w:themeColor="text1"/>
+                      <w:sz w:val="22"/>
+                    </w:rPr>
+                    <w:t xml:space="preserve">s </w:t>
+                  </w:r>
                   <w:r>
                     <w:rPr>
                       <w:rFonts w:ascii="Arial" w:hAnsi="Arial" w:cs="Arial"/>
@@ -4773,14 +4636,14 @@
           <w:rFonts w:ascii="Arial" w:hAnsi="Arial" w:cs="Arial"/>
         </w:rPr>
       </w:pPr>
-      <w:bookmarkStart w:id="27" w:name="_Toc226630089"/>
+      <w:bookmarkStart w:id="5" w:name="_Toc226630089"/>
       <w:r>
         <w:rPr>
           <w:rFonts w:ascii="Arial" w:hAnsi="Arial" w:cs="Arial"/>
         </w:rPr>
         <w:t>Background</w:t>
       </w:r>
-      <w:bookmarkEnd w:id="27"/>
+      <w:bookmarkEnd w:id="5"/>
     </w:p>
     <w:p>
       <w:pPr>
@@ -4938,51 +4801,21 @@
         </w:rPr>
         <w:t xml:space="preserve">, </w:t>
       </w:r>
-      <w:del w:id="28" w:author="Kelsey McCune" w:date="2026-06-19T07:34:00Z" w16du:dateUtc="2026-06-19T12:34:00Z">
-        <w:r>
-          <w:rPr>
-            <w:rFonts w:ascii="Arial" w:hAnsi="Arial" w:cs="Arial"/>
-            <w:color w:val="000000" w:themeColor="text1"/>
-            <w:sz w:val="22"/>
-          </w:rPr>
-          <w:delText>focusing on</w:delText>
-        </w:r>
-      </w:del>
-      <w:ins w:id="29" w:author="Kelsey McCune" w:date="2026-06-19T07:34:00Z" w16du:dateUtc="2026-06-19T12:34:00Z">
-        <w:r>
-          <w:rPr>
-            <w:rFonts w:ascii="Arial" w:hAnsi="Arial" w:cs="Arial"/>
-            <w:color w:val="000000" w:themeColor="text1"/>
-            <w:sz w:val="22"/>
-          </w:rPr>
-          <w:t>where it is possible to</w:t>
-        </w:r>
-      </w:ins>
       <w:r>
         <w:rPr>
           <w:rFonts w:ascii="Arial" w:hAnsi="Arial" w:cs="Arial"/>
           <w:color w:val="000000" w:themeColor="text1"/>
           <w:sz w:val="22"/>
         </w:rPr>
-        <w:t xml:space="preserve"> pinpoint</w:t>
-      </w:r>
-      <w:del w:id="30" w:author="Kelsey McCune" w:date="2026-06-19T07:34:00Z" w16du:dateUtc="2026-06-19T12:34:00Z">
-        <w:r>
-          <w:rPr>
-            <w:rFonts w:ascii="Arial" w:hAnsi="Arial" w:cs="Arial"/>
-            <w:color w:val="000000" w:themeColor="text1"/>
-            <w:sz w:val="22"/>
-          </w:rPr>
-          <w:delText>ing</w:delText>
-        </w:r>
-      </w:del>
+        <w:t>where it is possible to</w:t>
+      </w:r>
       <w:r>
         <w:rPr>
           <w:rFonts w:ascii="Arial" w:hAnsi="Arial" w:cs="Arial"/>
           <w:color w:val="000000" w:themeColor="text1"/>
           <w:sz w:val="22"/>
         </w:rPr>
-        <w:t xml:space="preserve"> the outbreak cause</w:t>
+        <w:t xml:space="preserve"> pinpoint the outbreak cause</w:t>
       </w:r>
       <w:r>
         <w:rPr>
@@ -5012,16 +4845,14 @@
         </w:rPr>
         <w:t xml:space="preserve">Backyard bird feeding and small-scale poultry keeping are two widespread and growing activities that concentrate these interactions in residential settings. Backyard bird feeding is well established in the United States, with federal surveys estimating that over 50 million Americans feed wild birds and hundreds of millions of dollars </w:t>
       </w:r>
-      <w:ins w:id="31" w:author="Kelsey McCune" w:date="2026-06-19T07:35:00Z" w16du:dateUtc="2026-06-19T12:35:00Z">
-        <w:r>
-          <w:rPr>
-            <w:rFonts w:ascii="Arial" w:hAnsi="Arial" w:cs="Arial"/>
-            <w:color w:val="000000" w:themeColor="text1"/>
-            <w:sz w:val="22"/>
-          </w:rPr>
-          <w:t xml:space="preserve">are </w:t>
-        </w:r>
-      </w:ins>
+      <w:r>
+        <w:rPr>
+          <w:rFonts w:ascii="Arial" w:hAnsi="Arial" w:cs="Arial"/>
+          <w:color w:val="000000" w:themeColor="text1"/>
+          <w:sz w:val="22"/>
+        </w:rPr>
+        <w:t xml:space="preserve">are </w:t>
+      </w:r>
       <w:r>
         <w:rPr>
           <w:rFonts w:ascii="Arial" w:hAnsi="Arial" w:cs="Arial"/>
@@ -5082,98 +4913,78 @@
         </w:rPr>
         <w:t xml:space="preserve">Despite the scale of these activities and their documented disease risks, the </w:t>
       </w:r>
-      <w:del w:id="32" w:author="Kelsey McCune" w:date="2026-06-19T07:37:00Z" w16du:dateUtc="2026-06-19T12:37:00Z">
-        <w:r>
-          <w:rPr>
-            <w:rFonts w:ascii="Arial" w:hAnsi="Arial" w:cs="Arial"/>
-            <w:color w:val="000000" w:themeColor="text1"/>
-            <w:sz w:val="22"/>
-          </w:rPr>
-          <w:delText>human dimensions</w:delText>
-        </w:r>
-      </w:del>
-      <w:ins w:id="33" w:author="Kelsey McCune" w:date="2026-06-19T07:37:00Z" w16du:dateUtc="2026-06-19T12:37:00Z">
-        <w:r>
-          <w:rPr>
-            <w:rFonts w:ascii="Arial" w:hAnsi="Arial" w:cs="Arial"/>
-            <w:color w:val="000000" w:themeColor="text1"/>
-            <w:sz w:val="22"/>
-          </w:rPr>
-          <w:t>perceptions and knowledge</w:t>
-        </w:r>
-      </w:ins>
       <w:r>
         <w:rPr>
           <w:rFonts w:ascii="Arial" w:hAnsi="Arial" w:cs="Arial"/>
           <w:color w:val="000000" w:themeColor="text1"/>
           <w:sz w:val="22"/>
         </w:rPr>
+        <w:t>perceptions and knowledge</w:t>
+      </w:r>
+      <w:r>
+        <w:rPr>
+          <w:rFonts w:ascii="Arial" w:hAnsi="Arial" w:cs="Arial"/>
+          <w:color w:val="000000" w:themeColor="text1"/>
+          <w:sz w:val="22"/>
+        </w:rPr>
         <w:t xml:space="preserve"> that shape participant behavior at this interface remain poorly understood. Effective </w:t>
       </w:r>
-      <w:ins w:id="34" w:author="Kelsey McCune" w:date="2026-06-19T07:38:00Z" w16du:dateUtc="2026-06-19T12:38:00Z">
-        <w:r>
-          <w:rPr>
-            <w:rFonts w:ascii="Arial" w:hAnsi="Arial" w:cs="Arial"/>
-            <w:color w:val="000000" w:themeColor="text1"/>
-            <w:sz w:val="22"/>
-          </w:rPr>
-          <w:t xml:space="preserve">public health </w:t>
-        </w:r>
-      </w:ins>
       <w:r>
         <w:rPr>
           <w:rFonts w:ascii="Arial" w:hAnsi="Arial" w:cs="Arial"/>
           <w:color w:val="000000" w:themeColor="text1"/>
           <w:sz w:val="22"/>
         </w:rPr>
+        <w:t xml:space="preserve">public health </w:t>
+      </w:r>
+      <w:r>
+        <w:rPr>
+          <w:rFonts w:ascii="Arial" w:hAnsi="Arial" w:cs="Arial"/>
+          <w:color w:val="000000" w:themeColor="text1"/>
+          <w:sz w:val="22"/>
+        </w:rPr>
         <w:t>biosecurity</w:t>
       </w:r>
-      <w:ins w:id="35" w:author="Kelsey McCune" w:date="2026-06-19T07:38:00Z" w16du:dateUtc="2026-06-19T12:38:00Z">
-        <w:r>
-          <w:rPr>
-            <w:rFonts w:ascii="Arial" w:hAnsi="Arial" w:cs="Arial"/>
-            <w:color w:val="000000" w:themeColor="text1"/>
-            <w:sz w:val="22"/>
-          </w:rPr>
-          <w:t xml:space="preserve"> recommendations</w:t>
-        </w:r>
-      </w:ins>
       <w:r>
         <w:rPr>
           <w:rFonts w:ascii="Arial" w:hAnsi="Arial" w:cs="Arial"/>
           <w:color w:val="000000" w:themeColor="text1"/>
           <w:sz w:val="22"/>
         </w:rPr>
+        <w:t xml:space="preserve"> recommendations</w:t>
+      </w:r>
+      <w:r>
+        <w:rPr>
+          <w:rFonts w:ascii="Arial" w:hAnsi="Arial" w:cs="Arial"/>
+          <w:color w:val="000000" w:themeColor="text1"/>
+          <w:sz w:val="22"/>
+        </w:rPr>
         <w:t xml:space="preserve"> and</w:t>
       </w:r>
-      <w:ins w:id="36" w:author="Kelsey McCune" w:date="2026-06-19T07:38:00Z" w16du:dateUtc="2026-06-19T12:38:00Z">
-        <w:r>
-          <w:rPr>
-            <w:rFonts w:ascii="Arial" w:hAnsi="Arial" w:cs="Arial"/>
-            <w:color w:val="000000" w:themeColor="text1"/>
-            <w:sz w:val="22"/>
-          </w:rPr>
-          <w:t xml:space="preserve"> nature</w:t>
-        </w:r>
-      </w:ins>
       <w:r>
         <w:rPr>
           <w:rFonts w:ascii="Arial" w:hAnsi="Arial" w:cs="Arial"/>
           <w:color w:val="000000" w:themeColor="text1"/>
           <w:sz w:val="22"/>
         </w:rPr>
+        <w:t xml:space="preserve"> nature</w:t>
+      </w:r>
+      <w:r>
+        <w:rPr>
+          <w:rFonts w:ascii="Arial" w:hAnsi="Arial" w:cs="Arial"/>
+          <w:color w:val="000000" w:themeColor="text1"/>
+          <w:sz w:val="22"/>
+        </w:rPr>
         <w:t xml:space="preserve"> conservation outreach depends not only on quantifying pathogen risk but on understanding how participants perceive that risk, what motivates their engagement</w:t>
       </w:r>
-      <w:ins w:id="37" w:author="Kelsey McCune" w:date="2026-06-19T07:39:00Z" w16du:dateUtc="2026-06-19T12:39:00Z">
-        <w:r>
-          <w:rPr>
-            <w:rFonts w:ascii="Arial" w:hAnsi="Arial" w:cs="Arial"/>
-            <w:color w:val="000000" w:themeColor="text1"/>
-            <w:sz w:val="22"/>
-          </w:rPr>
-          <w:t xml:space="preserve"> in the activity</w:t>
-        </w:r>
-      </w:ins>
+      <w:r>
+        <w:rPr>
+          <w:rFonts w:ascii="Arial" w:hAnsi="Arial" w:cs="Arial"/>
+          <w:color w:val="000000" w:themeColor="text1"/>
+          <w:sz w:val="22"/>
+        </w:rPr>
+        <w:t xml:space="preserve"> in the activity</w:t>
+      </w:r>
       <w:r>
         <w:rPr>
           <w:rFonts w:ascii="Arial" w:hAnsi="Arial" w:cs="Arial"/>
@@ -5211,69 +5022,37 @@
         </w:rPr>
         <w:t xml:space="preserve">This study addresses that gap. It is part of a larger project examining </w:t>
       </w:r>
-      <w:ins w:id="38" w:author="Kelsey McCune" w:date="2026-06-19T07:40:00Z" w16du:dateUtc="2026-06-19T12:40:00Z">
-        <w:r>
-          <w:rPr>
-            <w:rFonts w:ascii="Arial" w:hAnsi="Arial" w:cs="Arial"/>
-            <w:color w:val="000000" w:themeColor="text1"/>
-            <w:sz w:val="22"/>
-          </w:rPr>
-          <w:t xml:space="preserve">zoonotic </w:t>
-        </w:r>
-      </w:ins>
       <w:r>
         <w:rPr>
           <w:rFonts w:ascii="Arial" w:hAnsi="Arial" w:cs="Arial"/>
           <w:color w:val="000000" w:themeColor="text1"/>
           <w:sz w:val="22"/>
         </w:rPr>
+        <w:t xml:space="preserve">zoonotic </w:t>
+      </w:r>
+      <w:r>
+        <w:rPr>
+          <w:rFonts w:ascii="Arial" w:hAnsi="Arial" w:cs="Arial"/>
+          <w:color w:val="000000" w:themeColor="text1"/>
+          <w:sz w:val="22"/>
+        </w:rPr>
         <w:t xml:space="preserve">disease dynamics at the backyard human-wildlife interface; the </w:t>
       </w:r>
-      <w:del w:id="39" w:author="Kelsey McCune" w:date="2026-06-19T07:41:00Z" w16du:dateUtc="2026-06-19T12:41:00Z">
-        <w:r>
-          <w:rPr>
-            <w:rFonts w:ascii="Arial" w:hAnsi="Arial" w:cs="Arial"/>
-            <w:color w:val="000000" w:themeColor="text1"/>
-            <w:sz w:val="22"/>
-          </w:rPr>
-          <w:delText>biological components</w:delText>
-        </w:r>
-      </w:del>
-      <w:ins w:id="40" w:author="Kelsey McCune" w:date="2026-06-19T07:41:00Z" w16du:dateUtc="2026-06-19T12:41:00Z">
-        <w:r>
-          <w:rPr>
-            <w:rFonts w:ascii="Arial" w:hAnsi="Arial" w:cs="Arial"/>
-            <w:color w:val="000000" w:themeColor="text1"/>
-            <w:sz w:val="22"/>
-          </w:rPr>
-          <w:t>methods</w:t>
-        </w:r>
-      </w:ins>
       <w:r>
         <w:rPr>
           <w:rFonts w:ascii="Arial" w:hAnsi="Arial" w:cs="Arial"/>
           <w:color w:val="000000" w:themeColor="text1"/>
           <w:sz w:val="22"/>
         </w:rPr>
-        <w:t xml:space="preserve"> quantifying pathogen prevalence in wild birds </w:t>
-      </w:r>
-      <w:del w:id="41" w:author="Kelsey McCune" w:date="2026-06-19T07:41:00Z" w16du:dateUtc="2026-06-19T12:41:00Z">
-        <w:r>
-          <w:rPr>
-            <w:rFonts w:ascii="Arial" w:hAnsi="Arial" w:cs="Arial"/>
-            <w:color w:val="000000" w:themeColor="text1"/>
-            <w:sz w:val="22"/>
-          </w:rPr>
-          <w:delText xml:space="preserve">and the environment </w:delText>
-        </w:r>
-      </w:del>
+        <w:t>methods</w:t>
+      </w:r>
       <w:r>
         <w:rPr>
           <w:rFonts w:ascii="Arial" w:hAnsi="Arial" w:cs="Arial"/>
           <w:color w:val="000000" w:themeColor="text1"/>
           <w:sz w:val="22"/>
         </w:rPr>
-        <w:t>are reviewed separately under IACUC protocol IPROTO202500000090. The present protocol concerns the human-subjects component (Aim 3), which uses an anonymous online survey to characterize disease-risk perception, biosecurity practice engagement, willingness to modify backyard behaviors, place attachment, and pro-conservation attitudes and behaviors among adults who feed backyard birds and/or keep backyard poultry. Understanding these human dimensions is essential for developing accessible, effective biosecurity guidance that reduces disease risk while preserving the well-being and conservation benefits these activities provide.</w:t>
+        <w:t xml:space="preserve"> quantifying pathogen prevalence in wild birds are reviewed separately under IACUC protocol IPROTO202500000090. The present protocol concerns the human-subjects component (Aim 3), which uses an anonymous online survey to characterize disease-risk perception, biosecurity practice engagement, willingness to modify backyard behaviors, place attachment, and pro-conservation attitudes and behaviors among adults who feed backyard birds and/or keep backyard poultry. Understanding these human dimensions is essential for developing accessible, effective biosecurity guidance that reduces disease risk while preserving the well-being and conservation benefits these activities provide.</w:t>
       </w:r>
     </w:p>
     <w:p>
@@ -5306,7 +5085,7 @@
           <w:rFonts w:ascii="Arial" w:hAnsi="Arial" w:cs="Arial"/>
         </w:rPr>
       </w:pPr>
-      <w:bookmarkStart w:id="42" w:name="_Toc226630090"/>
+      <w:bookmarkStart w:id="6" w:name="_Toc226630090"/>
       <w:r>
         <w:rPr>
           <w:rFonts w:ascii="Arial" w:hAnsi="Arial" w:cs="Arial"/>
@@ -5319,7 +5098,7 @@
         </w:rPr>
         <w:t>Outcomes</w:t>
       </w:r>
-      <w:bookmarkEnd w:id="42"/>
+      <w:bookmarkEnd w:id="6"/>
     </w:p>
     <w:p>
       <w:pPr>
@@ -5437,7 +5216,6 @@
         <w:placeholder>
           <w:docPart w:val="DefaultPlaceholder_-1854013440"/>
         </w:placeholder>
-        <w:showingPlcHdr/>
       </w:sdtPr>
       <w:sdtContent>
         <w:p>
@@ -5462,14 +5240,332 @@
           </w:pPr>
           <w:r>
             <w:rPr>
-              <w:rStyle w:val="PlaceholderText"/>
               <w:rFonts w:ascii="Arial" w:hAnsi="Arial" w:cs="Arial"/>
-              <w:i w:val="0"/>
-              <w:iCs w:val="0"/>
-              <w:color w:val="000000" w:themeColor="text1"/>
-              <w:bdr w:val="single" w:sz="4" w:space="0" w:color="auto"/>
+              <w:color w:val="auto"/>
+              <w:sz w:val="22"/>
             </w:rPr>
-            <w:t>Click or tap here to enter text.</w:t>
+            <w:t xml:space="preserve">This study will produce </w:t>
+          </w:r>
+          <w:r>
+            <w:rPr>
+              <w:rFonts w:ascii="Arial" w:hAnsi="Arial" w:cs="Arial"/>
+              <w:color w:val="auto"/>
+              <w:sz w:val="22"/>
+            </w:rPr>
+            <w:t>groundbreaking</w:t>
+          </w:r>
+          <w:r>
+            <w:rPr>
+              <w:rFonts w:ascii="Arial" w:hAnsi="Arial" w:cs="Arial"/>
+              <w:color w:val="auto"/>
+              <w:sz w:val="22"/>
+            </w:rPr>
+            <w:t xml:space="preserve"> characterization of disease-risk perception, biosecurity practice engagement, place attachment, and pro-conservation attitudes and behaviors among </w:t>
+          </w:r>
+          <w:r>
+            <w:rPr>
+              <w:rFonts w:ascii="Arial" w:hAnsi="Arial" w:cs="Arial"/>
+              <w:color w:val="auto"/>
+              <w:sz w:val="22"/>
+            </w:rPr>
+            <w:t>individuals</w:t>
+          </w:r>
+          <w:r>
+            <w:rPr>
+              <w:rFonts w:ascii="Arial" w:hAnsi="Arial" w:cs="Arial"/>
+              <w:color w:val="auto"/>
+              <w:sz w:val="22"/>
+            </w:rPr>
+            <w:t xml:space="preserve"> who feed backyard birds and/or keep backyard poultry in the Southeastern United States. Anticipated outcomes include:</w:t>
+          </w:r>
+        </w:p>
+        <w:p>
+          <w:pPr>
+            <w:pStyle w:val="BlockText"/>
+            <w:numPr>
+              <w:ilvl w:val="0"/>
+              <w:numId w:val="11"/>
+            </w:numPr>
+            <w:pBdr>
+              <w:top w:val="none" w:sz="0" w:space="0" w:color="auto"/>
+              <w:left w:val="none" w:sz="0" w:space="0" w:color="auto"/>
+              <w:bottom w:val="none" w:sz="0" w:space="0" w:color="auto"/>
+              <w:right w:val="none" w:sz="0" w:space="0" w:color="auto"/>
+            </w:pBdr>
+            <w:autoSpaceDE/>
+            <w:autoSpaceDN/>
+            <w:adjustRightInd/>
+            <w:spacing w:before="120" w:after="120"/>
+            <w:ind w:right="720"/>
+            <w:rPr>
+              <w:rFonts w:ascii="Arial" w:hAnsi="Arial" w:cs="Arial"/>
+              <w:color w:val="auto"/>
+              <w:sz w:val="22"/>
+            </w:rPr>
+          </w:pPr>
+          <w:r>
+            <w:rPr>
+              <w:rFonts w:ascii="Arial" w:hAnsi="Arial" w:cs="Arial"/>
+              <w:color w:val="auto"/>
+              <w:sz w:val="22"/>
+            </w:rPr>
+            <w:t>A description of participants' motivations for feeding birds and keeping poultry, their knowledge of zoonotic disease, and how they perceive the risk of disease events occurring in their own backyards</w:t>
+          </w:r>
+          <w:r>
+            <w:rPr>
+              <w:rFonts w:ascii="Arial" w:hAnsi="Arial" w:cs="Arial"/>
+              <w:color w:val="auto"/>
+              <w:sz w:val="22"/>
+            </w:rPr>
+            <w:t>.</w:t>
+          </w:r>
+        </w:p>
+        <w:p>
+          <w:pPr>
+            <w:pStyle w:val="BlockText"/>
+            <w:numPr>
+              <w:ilvl w:val="0"/>
+              <w:numId w:val="11"/>
+            </w:numPr>
+            <w:pBdr>
+              <w:top w:val="none" w:sz="0" w:space="0" w:color="auto"/>
+              <w:left w:val="none" w:sz="0" w:space="0" w:color="auto"/>
+              <w:bottom w:val="none" w:sz="0" w:space="0" w:color="auto"/>
+              <w:right w:val="none" w:sz="0" w:space="0" w:color="auto"/>
+            </w:pBdr>
+            <w:autoSpaceDE/>
+            <w:autoSpaceDN/>
+            <w:adjustRightInd/>
+            <w:spacing w:before="120" w:after="120"/>
+            <w:ind w:right="720"/>
+            <w:rPr>
+              <w:rFonts w:ascii="Arial" w:hAnsi="Arial" w:cs="Arial"/>
+              <w:color w:val="auto"/>
+              <w:sz w:val="22"/>
+            </w:rPr>
+          </w:pPr>
+          <w:r>
+            <w:rPr>
+              <w:rFonts w:ascii="Arial" w:hAnsi="Arial" w:cs="Arial"/>
+              <w:color w:val="auto"/>
+              <w:sz w:val="22"/>
+            </w:rPr>
+            <w:t xml:space="preserve">Whether people who </w:t>
+          </w:r>
+          <w:r>
+            <w:rPr>
+              <w:rFonts w:ascii="Arial" w:hAnsi="Arial" w:cs="Arial"/>
+              <w:color w:val="auto"/>
+              <w:sz w:val="22"/>
+            </w:rPr>
+            <w:t>perceive higher</w:t>
+          </w:r>
+          <w:r>
+            <w:rPr>
+              <w:rFonts w:ascii="Arial" w:hAnsi="Arial" w:cs="Arial"/>
+              <w:color w:val="auto"/>
+              <w:sz w:val="22"/>
+            </w:rPr>
+            <w:t xml:space="preserve"> disease risk also do more to prevent it and are more willing to change their </w:t>
+          </w:r>
+          <w:r>
+            <w:rPr>
+              <w:rFonts w:ascii="Arial" w:hAnsi="Arial" w:cs="Arial"/>
+              <w:color w:val="auto"/>
+              <w:sz w:val="22"/>
+            </w:rPr>
+            <w:t>behavior/implement new biosecurity guidelines</w:t>
+          </w:r>
+          <w:r>
+            <w:rPr>
+              <w:rFonts w:ascii="Arial" w:hAnsi="Arial" w:cs="Arial"/>
+              <w:color w:val="auto"/>
+              <w:sz w:val="22"/>
+            </w:rPr>
+            <w:t xml:space="preserve"> (H1)</w:t>
+          </w:r>
+          <w:r>
+            <w:rPr>
+              <w:rFonts w:ascii="Arial" w:hAnsi="Arial" w:cs="Arial"/>
+              <w:color w:val="auto"/>
+              <w:sz w:val="22"/>
+            </w:rPr>
+            <w:t>.</w:t>
+          </w:r>
+        </w:p>
+        <w:p>
+          <w:pPr>
+            <w:pStyle w:val="BlockText"/>
+            <w:numPr>
+              <w:ilvl w:val="0"/>
+              <w:numId w:val="11"/>
+            </w:numPr>
+            <w:pBdr>
+              <w:top w:val="none" w:sz="0" w:space="0" w:color="auto"/>
+              <w:left w:val="none" w:sz="0" w:space="0" w:color="auto"/>
+              <w:bottom w:val="none" w:sz="0" w:space="0" w:color="auto"/>
+              <w:right w:val="none" w:sz="0" w:space="0" w:color="auto"/>
+            </w:pBdr>
+            <w:autoSpaceDE/>
+            <w:autoSpaceDN/>
+            <w:adjustRightInd/>
+            <w:spacing w:before="120" w:after="120"/>
+            <w:ind w:right="720"/>
+            <w:rPr>
+              <w:rFonts w:ascii="Arial" w:hAnsi="Arial" w:cs="Arial"/>
+              <w:color w:val="auto"/>
+              <w:sz w:val="22"/>
+            </w:rPr>
+          </w:pPr>
+          <w:r>
+            <w:rPr>
+              <w:rFonts w:ascii="Arial" w:hAnsi="Arial" w:cs="Arial"/>
+              <w:color w:val="auto"/>
+              <w:sz w:val="22"/>
+            </w:rPr>
+            <w:t xml:space="preserve">Whether people who know more about zoonotic disease respond more proactively to disease risk, </w:t>
+          </w:r>
+          <w:r>
+            <w:rPr>
+              <w:rFonts w:ascii="Arial" w:hAnsi="Arial" w:cs="Arial"/>
+              <w:color w:val="auto"/>
+              <w:sz w:val="22"/>
+            </w:rPr>
+            <w:t>implementing additional</w:t>
+          </w:r>
+          <w:r>
+            <w:rPr>
+              <w:rFonts w:ascii="Arial" w:hAnsi="Arial" w:cs="Arial"/>
+              <w:color w:val="auto"/>
+              <w:sz w:val="22"/>
+            </w:rPr>
+            <w:t xml:space="preserve"> biosecurity </w:t>
+          </w:r>
+          <w:r>
+            <w:rPr>
+              <w:rFonts w:ascii="Arial" w:hAnsi="Arial" w:cs="Arial"/>
+              <w:color w:val="auto"/>
+              <w:sz w:val="22"/>
+            </w:rPr>
+            <w:t>guidelines</w:t>
+          </w:r>
+          <w:r>
+            <w:rPr>
+              <w:rFonts w:ascii="Arial" w:hAnsi="Arial" w:cs="Arial"/>
+              <w:color w:val="auto"/>
+              <w:sz w:val="22"/>
+            </w:rPr>
+            <w:t xml:space="preserve"> </w:t>
+          </w:r>
+          <w:r>
+            <w:rPr>
+              <w:rFonts w:ascii="Arial" w:hAnsi="Arial" w:cs="Arial"/>
+              <w:color w:val="auto"/>
+              <w:sz w:val="22"/>
+            </w:rPr>
+            <w:t>(H2).</w:t>
+          </w:r>
+        </w:p>
+        <w:p>
+          <w:pPr>
+            <w:pStyle w:val="BlockText"/>
+            <w:numPr>
+              <w:ilvl w:val="0"/>
+              <w:numId w:val="11"/>
+            </w:numPr>
+            <w:pBdr>
+              <w:top w:val="none" w:sz="0" w:space="0" w:color="auto"/>
+              <w:left w:val="none" w:sz="0" w:space="0" w:color="auto"/>
+              <w:bottom w:val="none" w:sz="0" w:space="0" w:color="auto"/>
+              <w:right w:val="none" w:sz="0" w:space="0" w:color="auto"/>
+            </w:pBdr>
+            <w:autoSpaceDE/>
+            <w:autoSpaceDN/>
+            <w:adjustRightInd/>
+            <w:spacing w:before="120" w:after="120"/>
+            <w:ind w:right="720"/>
+            <w:rPr>
+              <w:rFonts w:ascii="Arial" w:hAnsi="Arial" w:cs="Arial"/>
+              <w:color w:val="auto"/>
+              <w:sz w:val="22"/>
+            </w:rPr>
+          </w:pPr>
+          <w:r>
+            <w:rPr>
+              <w:rFonts w:ascii="Arial" w:hAnsi="Arial" w:cs="Arial"/>
+              <w:color w:val="auto"/>
+              <w:sz w:val="22"/>
+            </w:rPr>
+            <w:t>Whether people who are more involved in backyard wildlife activities have stronger conservation attitudes and behaviors, including willingness to donat</w:t>
+          </w:r>
+          <w:r>
+            <w:rPr>
+              <w:rFonts w:ascii="Arial" w:hAnsi="Arial" w:cs="Arial"/>
+              <w:color w:val="auto"/>
+              <w:sz w:val="22"/>
+            </w:rPr>
+            <w:t>e/act upon it</w:t>
+          </w:r>
+          <w:r>
+            <w:rPr>
+              <w:rFonts w:ascii="Arial" w:hAnsi="Arial" w:cs="Arial"/>
+              <w:color w:val="auto"/>
+              <w:sz w:val="22"/>
+            </w:rPr>
+            <w:t>(H3).</w:t>
+          </w:r>
+        </w:p>
+        <w:p>
+          <w:pPr>
+            <w:pStyle w:val="BlockText"/>
+            <w:pBdr>
+              <w:top w:val="none" w:sz="0" w:space="0" w:color="auto"/>
+              <w:left w:val="none" w:sz="0" w:space="0" w:color="auto"/>
+              <w:bottom w:val="none" w:sz="0" w:space="0" w:color="auto"/>
+              <w:right w:val="none" w:sz="0" w:space="0" w:color="auto"/>
+            </w:pBdr>
+            <w:autoSpaceDE/>
+            <w:autoSpaceDN/>
+            <w:adjustRightInd/>
+            <w:spacing w:before="120" w:after="120"/>
+            <w:ind w:left="720" w:right="720"/>
+            <w:rPr>
+              <w:rFonts w:ascii="Arial" w:hAnsi="Arial" w:cs="Arial"/>
+              <w:color w:val="auto"/>
+              <w:sz w:val="22"/>
+            </w:rPr>
+          </w:pPr>
+          <w:r>
+            <w:rPr>
+              <w:rFonts w:ascii="Arial" w:hAnsi="Arial" w:cs="Arial"/>
+              <w:color w:val="auto"/>
+              <w:sz w:val="22"/>
+            </w:rPr>
+            <w:t>T</w:t>
+          </w:r>
+          <w:r>
+            <w:rPr>
+              <w:rFonts w:ascii="Arial" w:hAnsi="Arial" w:cs="Arial"/>
+              <w:color w:val="auto"/>
+              <w:sz w:val="22"/>
+            </w:rPr>
+            <w:t xml:space="preserve">hese outcomes should help inform </w:t>
+          </w:r>
+          <w:r>
+            <w:rPr>
+              <w:rFonts w:ascii="Arial" w:hAnsi="Arial" w:cs="Arial"/>
+              <w:color w:val="auto"/>
+              <w:sz w:val="22"/>
+            </w:rPr>
+            <w:t>evidence-based,</w:t>
+          </w:r>
+          <w:r>
+            <w:rPr>
+              <w:rFonts w:ascii="Arial" w:hAnsi="Arial" w:cs="Arial"/>
+              <w:color w:val="auto"/>
+              <w:sz w:val="22"/>
+            </w:rPr>
+            <w:t xml:space="preserve"> practical biosecurity and conservation guidance that lowers disease risk while keeping the benefits people get from these activities.</w:t>
           </w:r>
         </w:p>
       </w:sdtContent>
@@ -5504,7 +5600,7 @@
           <w:rFonts w:ascii="Arial" w:hAnsi="Arial" w:cs="Arial"/>
         </w:rPr>
       </w:pPr>
-      <w:bookmarkStart w:id="43" w:name="_Toc226630091"/>
+      <w:bookmarkStart w:id="7" w:name="_Toc226630091"/>
       <w:r>
         <w:rPr>
           <w:rFonts w:ascii="Arial" w:hAnsi="Arial" w:cs="Arial"/>
@@ -5531,7 +5627,7 @@
         </w:rPr>
         <w:t>Interaction</w:t>
       </w:r>
-      <w:bookmarkEnd w:id="43"/>
+      <w:bookmarkEnd w:id="7"/>
     </w:p>
     <w:p>
       <w:pPr>
@@ -5585,7 +5681,7 @@
         </w:rPr>
         <w:t xml:space="preserve"> </w:t>
       </w:r>
-      <w:bookmarkStart w:id="44" w:name="_Hlk203555646"/>
+      <w:bookmarkStart w:id="8" w:name="_Hlk203555646"/>
       <w:r>
         <w:rPr>
           <w:rFonts w:ascii="Arial" w:hAnsi="Arial" w:cs="Arial"/>
@@ -5613,7 +5709,7 @@
         </w:rPr>
         <w:t xml:space="preserve"> is not applicable to your research project</w:t>
       </w:r>
-      <w:bookmarkEnd w:id="44"/>
+      <w:bookmarkEnd w:id="8"/>
     </w:p>
     <w:p>
       <w:pPr>
@@ -5769,14 +5865,14 @@
           <w:rFonts w:ascii="Arial" w:hAnsi="Arial" w:cs="Arial"/>
         </w:rPr>
       </w:pPr>
-      <w:bookmarkStart w:id="45" w:name="_Toc226630092"/>
+      <w:bookmarkStart w:id="9" w:name="_Toc226630092"/>
       <w:r>
         <w:rPr>
           <w:rFonts w:ascii="Arial" w:hAnsi="Arial" w:cs="Arial"/>
         </w:rPr>
         <w:t>Procedures Involved</w:t>
       </w:r>
-      <w:bookmarkEnd w:id="45"/>
+      <w:bookmarkEnd w:id="9"/>
     </w:p>
     <w:p>
       <w:pPr>
@@ -6404,7 +6500,6 @@
           <w:rFonts w:ascii="Arial" w:hAnsi="Arial" w:cs="Arial"/>
           <w:sz w:val="22"/>
         </w:rPr>
-        <w:lastRenderedPageBreak/>
         <w:t>Describe all</w:t>
       </w:r>
       <w:r>
@@ -7016,6 +7111,7 @@
           <w:rFonts w:ascii="Arial" w:hAnsi="Arial" w:cs="Arial"/>
           <w:sz w:val="22"/>
         </w:rPr>
+        <w:lastRenderedPageBreak/>
         <w:t>Any risk of re-identification, and measures to reduce such risks.</w:t>
       </w:r>
     </w:p>
@@ -7363,15 +7459,7 @@
           <w:rFonts w:ascii="Arial" w:hAnsi="Arial" w:cs="Arial"/>
           <w:sz w:val="22"/>
         </w:rPr>
-        <w:t xml:space="preserve">If your research involves AU students’ </w:t>
-      </w:r>
-      <w:r>
-        <w:rPr>
-          <w:rFonts w:ascii="Arial" w:hAnsi="Arial" w:cs="Arial"/>
-          <w:sz w:val="22"/>
-        </w:rPr>
-        <w:lastRenderedPageBreak/>
-        <w:t xml:space="preserve">records, the AU Registrar must </w:t>
+        <w:t xml:space="preserve">If your research involves AU students’ records, the AU Registrar must </w:t>
       </w:r>
       <w:r>
         <w:rPr>
@@ -7535,7 +7623,7 @@
           <w:sz w:val="22"/>
         </w:rPr>
       </w:pPr>
-      <w:bookmarkStart w:id="46" w:name="OLE_LINK1"/>
+      <w:bookmarkStart w:id="10" w:name="OLE_LINK1"/>
       <w:r>
         <w:rPr>
           <w:rFonts w:ascii="Segoe UI Symbol" w:hAnsi="Segoe UI Symbol" w:cs="Segoe UI Symbol"/>
@@ -7645,7 +7733,7 @@
         <w:t xml:space="preserve"> research project</w:t>
       </w:r>
     </w:p>
-    <w:bookmarkEnd w:id="46"/>
+    <w:bookmarkEnd w:id="10"/>
     <w:p>
       <w:pPr>
         <w:ind w:left="1267"/>
@@ -7835,7 +7923,7 @@
           <w:rFonts w:ascii="Arial" w:hAnsi="Arial" w:cs="Arial"/>
         </w:rPr>
       </w:pPr>
-      <w:bookmarkStart w:id="47" w:name="_Toc226630093"/>
+      <w:bookmarkStart w:id="11" w:name="_Toc226630093"/>
       <w:r>
         <w:rPr>
           <w:rFonts w:ascii="Arial" w:hAnsi="Arial" w:cs="Arial"/>
@@ -7872,7 +7960,7 @@
         </w:rPr>
         <w:t>s</w:t>
       </w:r>
-      <w:bookmarkEnd w:id="47"/>
+      <w:bookmarkEnd w:id="11"/>
       <w:r>
         <w:rPr>
           <w:rFonts w:ascii="Arial" w:hAnsi="Arial" w:cs="Arial"/>
@@ -8150,6 +8238,7 @@
           <w:color w:val="auto"/>
           <w:sz w:val="22"/>
         </w:rPr>
+        <w:lastRenderedPageBreak/>
         <w:t>Describe the procedures to release data or specimens, including: the process to request a release, approvals required for release, who can obtain data or specimens</w:t>
       </w:r>
       <w:r>
@@ -8328,14 +8417,14 @@
           <w:rFonts w:ascii="Arial" w:hAnsi="Arial" w:cs="Arial"/>
         </w:rPr>
       </w:pPr>
-      <w:bookmarkStart w:id="48" w:name="_Toc226630094"/>
+      <w:bookmarkStart w:id="12" w:name="_Toc226630094"/>
       <w:r>
         <w:rPr>
           <w:rFonts w:ascii="Arial" w:hAnsi="Arial" w:cs="Arial"/>
         </w:rPr>
         <w:t>Setting</w:t>
       </w:r>
-      <w:bookmarkEnd w:id="48"/>
+      <w:bookmarkEnd w:id="12"/>
     </w:p>
     <w:p>
       <w:pPr>
@@ -8536,7 +8625,6 @@
           <w:rFonts w:ascii="Arial" w:hAnsi="Arial" w:cs="Arial"/>
           <w:sz w:val="22"/>
         </w:rPr>
-        <w:lastRenderedPageBreak/>
         <w:t>Site-specific regulations or customs affecting the research</w:t>
       </w:r>
       <w:r>
@@ -8703,14 +8791,14 @@
           <w:rFonts w:ascii="Arial" w:hAnsi="Arial" w:cs="Arial"/>
         </w:rPr>
       </w:pPr>
-      <w:bookmarkStart w:id="49" w:name="_Toc226630095"/>
+      <w:bookmarkStart w:id="13" w:name="_Toc226630095"/>
       <w:r>
         <w:rPr>
           <w:rFonts w:ascii="Arial" w:hAnsi="Arial" w:cs="Arial"/>
         </w:rPr>
         <w:t>Resources Available</w:t>
       </w:r>
-      <w:bookmarkEnd w:id="49"/>
+      <w:bookmarkEnd w:id="13"/>
     </w:p>
     <w:p>
       <w:pPr>
@@ -9125,7 +9213,7 @@
           <w:rFonts w:ascii="Arial" w:hAnsi="Arial" w:cs="Arial"/>
         </w:rPr>
       </w:pPr>
-      <w:bookmarkStart w:id="50" w:name="_Toc226630096"/>
+      <w:bookmarkStart w:id="14" w:name="_Toc226630096"/>
       <w:r>
         <w:rPr>
           <w:rFonts w:ascii="Arial" w:hAnsi="Arial" w:cs="Arial"/>
@@ -9138,7 +9226,7 @@
         </w:rPr>
         <w:t>Participants</w:t>
       </w:r>
-      <w:bookmarkEnd w:id="50"/>
+      <w:bookmarkEnd w:id="14"/>
     </w:p>
     <w:p>
       <w:pPr>
@@ -9410,14 +9498,14 @@
           <w:rFonts w:ascii="Arial" w:hAnsi="Arial" w:cs="Arial"/>
         </w:rPr>
       </w:pPr>
-      <w:bookmarkStart w:id="51" w:name="_Toc226630097"/>
+      <w:bookmarkStart w:id="15" w:name="_Toc226630097"/>
       <w:r>
         <w:rPr>
           <w:rFonts w:ascii="Arial" w:hAnsi="Arial" w:cs="Arial"/>
         </w:rPr>
         <w:t>Study Timelines</w:t>
       </w:r>
-      <w:bookmarkEnd w:id="51"/>
+      <w:bookmarkEnd w:id="15"/>
     </w:p>
     <w:p>
       <w:pPr>
@@ -9563,7 +9651,6 @@
           <w:color w:val="auto"/>
           <w:sz w:val="22"/>
         </w:rPr>
-        <w:lastRenderedPageBreak/>
         <w:t>Describe</w:t>
       </w:r>
       <w:r>
@@ -9751,15 +9838,15 @@
           <w:bCs/>
         </w:rPr>
       </w:pPr>
-      <w:bookmarkStart w:id="52" w:name="_Toc201314637"/>
-      <w:bookmarkStart w:id="53" w:name="_Toc202779688"/>
-      <w:bookmarkStart w:id="54" w:name="_Toc202780038"/>
-      <w:bookmarkStart w:id="55" w:name="_Toc202780102"/>
-      <w:bookmarkStart w:id="56" w:name="_Toc226630098"/>
-      <w:bookmarkEnd w:id="52"/>
-      <w:bookmarkEnd w:id="53"/>
-      <w:bookmarkEnd w:id="54"/>
-      <w:bookmarkEnd w:id="55"/>
+      <w:bookmarkStart w:id="16" w:name="_Toc201314637"/>
+      <w:bookmarkStart w:id="17" w:name="_Toc202779688"/>
+      <w:bookmarkStart w:id="18" w:name="_Toc202780038"/>
+      <w:bookmarkStart w:id="19" w:name="_Toc202780102"/>
+      <w:bookmarkStart w:id="20" w:name="_Toc226630098"/>
+      <w:bookmarkEnd w:id="16"/>
+      <w:bookmarkEnd w:id="17"/>
+      <w:bookmarkEnd w:id="18"/>
+      <w:bookmarkEnd w:id="19"/>
       <w:r>
         <w:rPr>
           <w:rFonts w:ascii="Arial" w:hAnsi="Arial" w:cs="Arial"/>
@@ -9772,7 +9859,7 @@
         </w:rPr>
         <w:t xml:space="preserve"> Population</w:t>
       </w:r>
-      <w:bookmarkEnd w:id="56"/>
+      <w:bookmarkEnd w:id="20"/>
     </w:p>
     <w:p>
       <w:pPr>
@@ -10277,11 +10364,12 @@
           <w:rFonts w:ascii="Arial" w:hAnsi="Arial" w:cs="Arial"/>
         </w:rPr>
       </w:pPr>
-      <w:bookmarkStart w:id="57" w:name="_Toc226630099"/>
-      <w:r>
-        <w:rPr>
-          <w:rFonts w:ascii="Arial" w:hAnsi="Arial" w:cs="Arial"/>
-        </w:rPr>
+      <w:bookmarkStart w:id="21" w:name="_Toc226630099"/>
+      <w:r>
+        <w:rPr>
+          <w:rFonts w:ascii="Arial" w:hAnsi="Arial" w:cs="Arial"/>
+        </w:rPr>
+        <w:lastRenderedPageBreak/>
         <w:t>Vulnerable Populations</w:t>
       </w:r>
       <w:r>
@@ -10312,7 +10400,7 @@
         </w:rPr>
         <w:t xml:space="preserve"> within Endeavor)</w:t>
       </w:r>
-      <w:bookmarkEnd w:id="57"/>
+      <w:bookmarkEnd w:id="21"/>
     </w:p>
     <w:p>
       <w:pPr>
@@ -10338,7 +10426,7 @@
           <w:sz w:val="22"/>
         </w:rPr>
       </w:pPr>
-      <w:bookmarkStart w:id="58" w:name="_Hlk202455741"/>
+      <w:bookmarkStart w:id="22" w:name="_Hlk202455741"/>
       <w:r>
         <w:rPr>
           <w:rFonts w:ascii="Arial" w:hAnsi="Arial" w:cs="Arial"/>
@@ -10839,7 +10927,7 @@
         <w:t xml:space="preserve"> Excluded</w:t>
       </w:r>
     </w:p>
-    <w:bookmarkEnd w:id="58"/>
+    <w:bookmarkEnd w:id="22"/>
     <w:p>
       <w:pPr>
         <w:pStyle w:val="BlockText"/>
@@ -10931,7 +11019,6 @@
           <w:color w:val="auto"/>
           <w:sz w:val="22"/>
         </w:rPr>
-        <w:lastRenderedPageBreak/>
         <w:t xml:space="preserve">If the research involves </w:t>
       </w:r>
       <w:r>
@@ -11436,7 +11523,7 @@
           <w:bCs/>
         </w:rPr>
       </w:pPr>
-      <w:bookmarkStart w:id="59" w:name="_Toc226630100"/>
+      <w:bookmarkStart w:id="23" w:name="_Toc226630100"/>
       <w:r>
         <w:rPr>
           <w:rFonts w:ascii="Arial" w:hAnsi="Arial" w:cs="Arial"/>
@@ -11449,7 +11536,7 @@
         </w:rPr>
         <w:t>Participants</w:t>
       </w:r>
-      <w:bookmarkEnd w:id="59"/>
+      <w:bookmarkEnd w:id="23"/>
     </w:p>
     <w:p>
       <w:pPr>
@@ -11481,6 +11568,7 @@
           <w:color w:val="auto"/>
           <w:sz w:val="22"/>
         </w:rPr>
+        <w:lastRenderedPageBreak/>
         <w:t xml:space="preserve">Indicate the total number of </w:t>
       </w:r>
       <w:r>
@@ -11602,7 +11690,7 @@
           <w:rFonts w:ascii="Arial" w:hAnsi="Arial" w:cs="Arial"/>
         </w:rPr>
       </w:pPr>
-      <w:bookmarkStart w:id="60" w:name="_Toc226630101"/>
+      <w:bookmarkStart w:id="24" w:name="_Toc226630101"/>
       <w:r>
         <w:rPr>
           <w:rFonts w:ascii="Arial" w:hAnsi="Arial" w:cs="Arial"/>
@@ -11636,7 +11724,7 @@
         </w:rPr>
         <w:t xml:space="preserve"> within Endeavor)</w:t>
       </w:r>
-      <w:bookmarkEnd w:id="60"/>
+      <w:bookmarkEnd w:id="24"/>
     </w:p>
     <w:p>
       <w:pPr>
@@ -11964,7 +12052,6 @@
           <w:color w:val="auto"/>
           <w:sz w:val="22"/>
         </w:rPr>
-        <w:lastRenderedPageBreak/>
         <w:t xml:space="preserve">Describe materials that will be used to recruit </w:t>
       </w:r>
       <w:r>
@@ -12677,7 +12764,16 @@
           <w:color w:val="auto"/>
           <w:sz w:val="22"/>
         </w:rPr>
-        <w:t xml:space="preserve">research participants will receive compensation, BEFORE you submit your application for IRB review, become familiar with AU Procurement and Business Services (PBS) </w:t>
+        <w:t xml:space="preserve">research participants will receive compensation, BEFORE you submit your application for IRB review, become familiar with AU </w:t>
+      </w:r>
+      <w:r>
+        <w:rPr>
+          <w:rFonts w:ascii="Arial" w:hAnsi="Arial" w:cs="Arial"/>
+          <w:color w:val="auto"/>
+          <w:sz w:val="22"/>
+        </w:rPr>
+        <w:lastRenderedPageBreak/>
+        <w:t xml:space="preserve">Procurement and Business Services (PBS) </w:t>
       </w:r>
       <w:hyperlink r:id="rId32" w:history="1">
         <w:r>
@@ -12844,25 +12940,25 @@
           <w:rFonts w:ascii="Arial" w:hAnsi="Arial" w:cs="Arial"/>
         </w:rPr>
       </w:pPr>
-      <w:bookmarkStart w:id="61" w:name="_Toc492992334"/>
-      <w:bookmarkStart w:id="62" w:name="_Toc492992602"/>
-      <w:bookmarkStart w:id="63" w:name="_Toc493022872"/>
-      <w:bookmarkStart w:id="64" w:name="_Toc492992335"/>
-      <w:bookmarkStart w:id="65" w:name="_Toc492992603"/>
-      <w:bookmarkStart w:id="66" w:name="_Toc493022873"/>
-      <w:bookmarkStart w:id="67" w:name="_Toc492992336"/>
-      <w:bookmarkStart w:id="68" w:name="_Toc492992604"/>
-      <w:bookmarkStart w:id="69" w:name="_Toc493022874"/>
-      <w:bookmarkStart w:id="70" w:name="_Toc226630102"/>
-      <w:bookmarkEnd w:id="61"/>
-      <w:bookmarkEnd w:id="62"/>
-      <w:bookmarkEnd w:id="63"/>
-      <w:bookmarkEnd w:id="64"/>
-      <w:bookmarkEnd w:id="65"/>
-      <w:bookmarkEnd w:id="66"/>
-      <w:bookmarkEnd w:id="67"/>
-      <w:bookmarkEnd w:id="68"/>
-      <w:bookmarkEnd w:id="69"/>
+      <w:bookmarkStart w:id="25" w:name="_Toc492992334"/>
+      <w:bookmarkStart w:id="26" w:name="_Toc492992602"/>
+      <w:bookmarkStart w:id="27" w:name="_Toc493022872"/>
+      <w:bookmarkStart w:id="28" w:name="_Toc492992335"/>
+      <w:bookmarkStart w:id="29" w:name="_Toc492992603"/>
+      <w:bookmarkStart w:id="30" w:name="_Toc493022873"/>
+      <w:bookmarkStart w:id="31" w:name="_Toc492992336"/>
+      <w:bookmarkStart w:id="32" w:name="_Toc492992604"/>
+      <w:bookmarkStart w:id="33" w:name="_Toc493022874"/>
+      <w:bookmarkStart w:id="34" w:name="_Toc226630102"/>
+      <w:bookmarkEnd w:id="25"/>
+      <w:bookmarkEnd w:id="26"/>
+      <w:bookmarkEnd w:id="27"/>
+      <w:bookmarkEnd w:id="28"/>
+      <w:bookmarkEnd w:id="29"/>
+      <w:bookmarkEnd w:id="30"/>
+      <w:bookmarkEnd w:id="31"/>
+      <w:bookmarkEnd w:id="32"/>
+      <w:bookmarkEnd w:id="33"/>
       <w:r>
         <w:rPr>
           <w:rFonts w:ascii="Arial" w:hAnsi="Arial" w:cs="Arial"/>
@@ -12875,9 +12971,9 @@
         </w:rPr>
         <w:t>Participants</w:t>
       </w:r>
-      <w:bookmarkEnd w:id="70"/>
-    </w:p>
-    <w:bookmarkStart w:id="71" w:name="_Hlk202455930"/>
+      <w:bookmarkEnd w:id="34"/>
+    </w:p>
+    <w:bookmarkStart w:id="35" w:name="_Hlk202455930"/>
     <w:p>
       <w:pPr>
         <w:pStyle w:val="List"/>
@@ -12993,7 +13089,7 @@
         <w:t xml:space="preserve">, or the study is limited to the analysis of pre-existing data. </w:t>
       </w:r>
     </w:p>
-    <w:bookmarkEnd w:id="71"/>
+    <w:bookmarkEnd w:id="35"/>
     <w:p>
       <w:pPr>
         <w:pStyle w:val="BlockText"/>
@@ -13193,16 +13289,7 @@
           <w:color w:val="auto"/>
           <w:sz w:val="22"/>
         </w:rPr>
-        <w:t xml:space="preserve">If legally authorized representatives are consenting on behalf of the Participants (e.g., </w:t>
-      </w:r>
-      <w:r>
-        <w:rPr>
-          <w:rFonts w:ascii="Arial" w:hAnsi="Arial" w:cs="Arial"/>
-          <w:color w:val="auto"/>
-          <w:sz w:val="22"/>
-        </w:rPr>
-        <w:lastRenderedPageBreak/>
-        <w:t>Participants are minors), describe how the Participants themselves may indicate the desire to withdraw from the study.</w:t>
+        <w:t>If legally authorized representatives are consenting on behalf of the Participants (e.g., Participants are minors), describe how the Participants themselves may indicate the desire to withdraw from the study.</w:t>
       </w:r>
     </w:p>
     <w:sdt>
@@ -13283,7 +13370,7 @@
           <w:rFonts w:ascii="Arial" w:hAnsi="Arial" w:cs="Arial"/>
         </w:rPr>
       </w:pPr>
-      <w:bookmarkStart w:id="72" w:name="_Toc226630103"/>
+      <w:bookmarkStart w:id="36" w:name="_Toc226630103"/>
       <w:r>
         <w:rPr>
           <w:rFonts w:ascii="Arial" w:hAnsi="Arial" w:cs="Arial"/>
@@ -13302,7 +13389,7 @@
         </w:rPr>
         <w:t xml:space="preserve"> and Procedures to Minimize Risk</w:t>
       </w:r>
-      <w:bookmarkEnd w:id="72"/>
+      <w:bookmarkEnd w:id="36"/>
     </w:p>
     <w:p>
       <w:pPr>
@@ -13885,6 +13972,7 @@
           <w:color w:val="auto"/>
           <w:sz w:val="22"/>
         </w:rPr>
+        <w:lastRenderedPageBreak/>
         <w:t xml:space="preserve">If applicable, describe risks to others who are not </w:t>
       </w:r>
       <w:r>
@@ -14374,7 +14462,6 @@
           <w:rFonts w:ascii="Arial" w:hAnsi="Arial" w:cs="Arial"/>
           <w:sz w:val="22"/>
         </w:rPr>
-        <w:lastRenderedPageBreak/>
         <w:t>What data are reviewed, including safety data, untoward events, and efficacy data.</w:t>
       </w:r>
     </w:p>
@@ -14587,14 +14674,14 @@
           <w:rFonts w:ascii="Arial" w:hAnsi="Arial" w:cs="Arial"/>
         </w:rPr>
       </w:pPr>
-      <w:bookmarkStart w:id="73" w:name="_Toc226630104"/>
+      <w:bookmarkStart w:id="37" w:name="_Toc226630104"/>
       <w:r>
         <w:rPr>
           <w:rFonts w:ascii="Arial" w:hAnsi="Arial" w:cs="Arial"/>
         </w:rPr>
         <w:t>Provisions to Protect the Privacy Interests of Participants</w:t>
       </w:r>
-      <w:bookmarkEnd w:id="73"/>
+      <w:bookmarkEnd w:id="37"/>
     </w:p>
     <w:p>
       <w:pPr>
@@ -15103,7 +15190,7 @@
           <w:rFonts w:ascii="Arial" w:hAnsi="Arial" w:cs="Arial"/>
         </w:rPr>
       </w:pPr>
-      <w:bookmarkStart w:id="74" w:name="_Toc226630105"/>
+      <w:bookmarkStart w:id="38" w:name="_Toc226630105"/>
       <w:r>
         <w:rPr>
           <w:rFonts w:ascii="Arial" w:hAnsi="Arial" w:cs="Arial"/>
@@ -15116,7 +15203,7 @@
         </w:rPr>
         <w:t>Participants</w:t>
       </w:r>
-      <w:bookmarkEnd w:id="74"/>
+      <w:bookmarkEnd w:id="38"/>
     </w:p>
     <w:p>
       <w:pPr>
@@ -15292,20 +15379,20 @@
           <w:rFonts w:ascii="Arial" w:hAnsi="Arial" w:cs="Arial"/>
         </w:rPr>
       </w:pPr>
-      <w:bookmarkStart w:id="75" w:name="_Toc202779696"/>
-      <w:bookmarkStart w:id="76" w:name="_Toc202780046"/>
-      <w:bookmarkStart w:id="77" w:name="_Toc202780110"/>
-      <w:bookmarkStart w:id="78" w:name="_Toc226630106"/>
-      <w:bookmarkEnd w:id="75"/>
-      <w:bookmarkEnd w:id="76"/>
-      <w:bookmarkEnd w:id="77"/>
+      <w:bookmarkStart w:id="39" w:name="_Toc202779696"/>
+      <w:bookmarkStart w:id="40" w:name="_Toc202780046"/>
+      <w:bookmarkStart w:id="41" w:name="_Toc202780110"/>
+      <w:bookmarkStart w:id="42" w:name="_Toc226630106"/>
+      <w:bookmarkEnd w:id="39"/>
+      <w:bookmarkEnd w:id="40"/>
+      <w:bookmarkEnd w:id="41"/>
       <w:r>
         <w:rPr>
           <w:rFonts w:ascii="Arial" w:hAnsi="Arial" w:cs="Arial"/>
         </w:rPr>
         <w:t>Data Management and Confidentiality</w:t>
       </w:r>
-      <w:bookmarkEnd w:id="78"/>
+      <w:bookmarkEnd w:id="42"/>
     </w:p>
     <w:p>
       <w:pPr>
@@ -15972,6 +16059,7 @@
           <w:rFonts w:ascii="Arial" w:hAnsi="Arial" w:cs="Arial"/>
           <w:sz w:val="22"/>
         </w:rPr>
+        <w:lastRenderedPageBreak/>
         <w:t>What information will be included in that data or associated with the specimens?</w:t>
       </w:r>
     </w:p>
@@ -16443,14 +16531,14 @@
           <w:rFonts w:ascii="Arial" w:hAnsi="Arial" w:cs="Arial"/>
         </w:rPr>
       </w:pPr>
-      <w:bookmarkStart w:id="79" w:name="_Toc226630107"/>
+      <w:bookmarkStart w:id="43" w:name="_Toc226630107"/>
       <w:r>
         <w:rPr>
           <w:rFonts w:ascii="Arial" w:hAnsi="Arial" w:cs="Arial"/>
         </w:rPr>
         <w:t>Compensation for Research-Related Injury</w:t>
       </w:r>
-      <w:bookmarkEnd w:id="79"/>
+      <w:bookmarkEnd w:id="43"/>
     </w:p>
     <w:p>
       <w:pPr>
@@ -16780,7 +16868,7 @@
           <w:rFonts w:ascii="Arial" w:hAnsi="Arial" w:cs="Arial"/>
         </w:rPr>
       </w:pPr>
-      <w:bookmarkStart w:id="80" w:name="_Toc226630108"/>
+      <w:bookmarkStart w:id="44" w:name="_Toc226630108"/>
       <w:r>
         <w:rPr>
           <w:rFonts w:ascii="Arial" w:hAnsi="Arial" w:cs="Arial"/>
@@ -16793,7 +16881,7 @@
         </w:rPr>
         <w:t>Participants</w:t>
       </w:r>
-      <w:bookmarkEnd w:id="80"/>
+      <w:bookmarkEnd w:id="44"/>
     </w:p>
     <w:p>
       <w:pPr>
@@ -17000,7 +17088,7 @@
           <w:rFonts w:ascii="Arial" w:hAnsi="Arial" w:cs="Arial"/>
         </w:rPr>
       </w:pPr>
-      <w:bookmarkStart w:id="81" w:name="_Toc226630109"/>
+      <w:bookmarkStart w:id="45" w:name="_Toc226630109"/>
       <w:r>
         <w:rPr>
           <w:rFonts w:ascii="Arial" w:hAnsi="Arial" w:cs="Arial"/>
@@ -17042,7 +17130,7 @@
         </w:rPr>
         <w:t>)</w:t>
       </w:r>
-      <w:bookmarkEnd w:id="81"/>
+      <w:bookmarkEnd w:id="45"/>
     </w:p>
     <w:p>
       <w:pPr>
@@ -17074,6 +17162,7 @@
           <w:color w:val="auto"/>
           <w:sz w:val="22"/>
         </w:rPr>
+        <w:lastRenderedPageBreak/>
         <w:t>Indicate whether you will be obtaining consent, and if so describe:</w:t>
       </w:r>
     </w:p>
@@ -17601,29 +17690,7 @@
           <w:sz w:val="28"/>
           <w:szCs w:val="28"/>
         </w:rPr>
-        <w:t>Non-</w:t>
-      </w:r>
-      <w:proofErr w:type="gramStart"/>
-      <w:r>
-        <w:rPr>
-          <w:rFonts w:ascii="Arial" w:hAnsi="Arial" w:cs="Arial"/>
-          <w:b/>
-          <w:bCs/>
-          <w:sz w:val="28"/>
-          <w:szCs w:val="28"/>
-        </w:rPr>
-        <w:t>English Speaking</w:t>
-      </w:r>
-      <w:proofErr w:type="gramEnd"/>
-      <w:r>
-        <w:rPr>
-          <w:rFonts w:ascii="Arial" w:hAnsi="Arial" w:cs="Arial"/>
-          <w:b/>
-          <w:bCs/>
-          <w:sz w:val="28"/>
-          <w:szCs w:val="28"/>
-        </w:rPr>
-        <w:t xml:space="preserve"> </w:t>
+        <w:t xml:space="preserve">Non-English Speaking </w:t>
       </w:r>
       <w:r>
         <w:rPr>
@@ -17869,6 +17936,7 @@
           <w:rFonts w:ascii="Arial" w:hAnsi="Arial" w:cs="Arial"/>
           <w:sz w:val="22"/>
         </w:rPr>
+        <w:lastRenderedPageBreak/>
         <w:t xml:space="preserve">Review the </w:t>
       </w:r>
       <w:hyperlink r:id="rId37" w:history="1">
@@ -18204,7 +18272,6 @@
           <w:rFonts w:ascii="Arial" w:hAnsi="Arial" w:cs="Arial"/>
           <w:sz w:val="22"/>
         </w:rPr>
-        <w:lastRenderedPageBreak/>
         <w:t xml:space="preserve">For research conducted outside of the state, provide information that describes which persons have not attained the legal age for consent to treatments or procedures involved the research, under the applicable law of the jurisdiction in which research will be conducted. One method of obtaining this information is to have a legal counsel or authority review your protocol along the definition of “children” in </w:t>
       </w:r>
       <w:hyperlink r:id="rId39" w:history="1">
@@ -18711,15 +18778,7 @@
           <w:rFonts w:ascii="Arial" w:hAnsi="Arial" w:cs="Arial"/>
           <w:sz w:val="22"/>
         </w:rPr>
-        <w:t xml:space="preserve"> to be aware of which individuals </w:t>
-      </w:r>
-      <w:r>
-        <w:rPr>
-          <w:rFonts w:ascii="Arial" w:hAnsi="Arial" w:cs="Arial"/>
-          <w:sz w:val="22"/>
-        </w:rPr>
-        <w:lastRenderedPageBreak/>
-        <w:t>in the state meet the definition of</w:t>
+        <w:t xml:space="preserve"> to be aware of which individuals in the state meet the definition of</w:t>
       </w:r>
       <w:r>
         <w:rPr>
@@ -18885,23 +18944,7 @@
           <w:rFonts w:ascii="Arial" w:hAnsi="Arial" w:cs="Arial"/>
           <w:sz w:val="22"/>
         </w:rPr>
-        <w:t xml:space="preserve"> will be required to </w:t>
-      </w:r>
-      <w:proofErr w:type="gramStart"/>
-      <w:r>
-        <w:rPr>
-          <w:rFonts w:ascii="Arial" w:hAnsi="Arial" w:cs="Arial"/>
-          <w:sz w:val="22"/>
-        </w:rPr>
-        <w:t>assent</w:t>
-      </w:r>
-      <w:proofErr w:type="gramEnd"/>
-      <w:r>
-        <w:rPr>
-          <w:rFonts w:ascii="Arial" w:hAnsi="Arial" w:cs="Arial"/>
-          <w:sz w:val="22"/>
-        </w:rPr>
-        <w:t xml:space="preserve"> and which will not.</w:t>
+        <w:t xml:space="preserve"> will be required to assent and which will not.</w:t>
       </w:r>
     </w:p>
     <w:p>
@@ -19105,14 +19148,14 @@
           <w:rFonts w:ascii="Arial" w:hAnsi="Arial" w:cs="Arial"/>
         </w:rPr>
       </w:pPr>
-      <w:bookmarkStart w:id="82" w:name="_Toc226630110"/>
+      <w:bookmarkStart w:id="46" w:name="_Toc226630110"/>
       <w:r>
         <w:rPr>
           <w:rFonts w:ascii="Arial" w:hAnsi="Arial" w:cs="Arial"/>
         </w:rPr>
         <w:t>Process to Document Consent in Writing</w:t>
       </w:r>
-      <w:bookmarkEnd w:id="82"/>
+      <w:bookmarkEnd w:id="46"/>
     </w:p>
     <w:p>
       <w:pPr>
@@ -19485,14 +19528,14 @@
           <w:rFonts w:ascii="Arial" w:hAnsi="Arial" w:cs="Arial"/>
         </w:rPr>
       </w:pPr>
-      <w:bookmarkStart w:id="83" w:name="_Toc226630111"/>
+      <w:bookmarkStart w:id="47" w:name="_Toc226630111"/>
       <w:r>
         <w:rPr>
           <w:rFonts w:ascii="Arial" w:hAnsi="Arial" w:cs="Arial"/>
         </w:rPr>
         <w:t>Multi-Site Research</w:t>
       </w:r>
-      <w:bookmarkEnd w:id="83"/>
+      <w:bookmarkEnd w:id="47"/>
       <w:r>
         <w:rPr>
           <w:rFonts w:ascii="Arial" w:hAnsi="Arial" w:cs="Arial"/>
@@ -19581,25 +19624,7 @@
           <w:i/>
           <w:sz w:val="22"/>
         </w:rPr>
-        <w:t xml:space="preserve">If collaborators are affiliated with an institution that has a </w:t>
-      </w:r>
-      <w:proofErr w:type="spellStart"/>
-      <w:r>
-        <w:rPr>
-          <w:rFonts w:cs="Arial"/>
-          <w:i/>
-          <w:sz w:val="22"/>
-        </w:rPr>
-        <w:t>Federalwide</w:t>
-      </w:r>
-      <w:proofErr w:type="spellEnd"/>
-      <w:r>
-        <w:rPr>
-          <w:rFonts w:cs="Arial"/>
-          <w:i/>
-          <w:sz w:val="22"/>
-        </w:rPr>
-        <w:t xml:space="preserve"> Assurance and/or an IRB, the study is considered multi-site research. Please contact the IRB office to determine whether AU’s IRB can serve as the IRB of record for this project. </w:t>
+        <w:t xml:space="preserve">If collaborators are affiliated with an institution that has a Federalwide Assurance and/or an IRB, the study is considered multi-site research. Please contact the IRB office to determine whether AU’s IRB can serve as the IRB of record for this project. </w:t>
       </w:r>
     </w:p>
     <w:p>
@@ -19774,18 +19799,8 @@
             <w:rFonts w:ascii="Arial" w:hAnsi="Arial" w:cs="Arial"/>
             <w:sz w:val="22"/>
           </w:rPr>
-          <w:t xml:space="preserve">HRP-833 - WORKSHEET - Considerations for Serving as the </w:t>
-        </w:r>
-        <w:proofErr w:type="spellStart"/>
-        <w:r>
-          <w:rPr>
-            <w:rStyle w:val="Hyperlink"/>
-            <w:rFonts w:ascii="Arial" w:hAnsi="Arial" w:cs="Arial"/>
-            <w:sz w:val="22"/>
-          </w:rPr>
-          <w:t>sIRB</w:t>
-        </w:r>
-        <w:proofErr w:type="spellEnd"/>
+          <w:t>HRP-833 - WORKSHEET - Considerations for Serving as the sIRB</w:t>
+        </w:r>
       </w:hyperlink>
       <w:r>
         <w:rPr>
@@ -19927,6 +19942,7 @@
           <w:rFonts w:ascii="Arial" w:hAnsi="Arial" w:cs="Arial"/>
           <w:sz w:val="22"/>
         </w:rPr>
+        <w:lastRenderedPageBreak/>
         <w:t xml:space="preserve">Describe materials that will be used to recruit </w:t>
       </w:r>
       <w:r>
@@ -20096,7 +20112,6 @@
           <w:rFonts w:ascii="Arial" w:hAnsi="Arial" w:cs="Arial"/>
           <w:sz w:val="22"/>
         </w:rPr>
-        <w:lastRenderedPageBreak/>
         <w:t>All engaged participating sites will safeguard data, including secure transmission of data, as required by local information security policies.</w:t>
       </w:r>
     </w:p>
@@ -20281,7 +20296,7 @@
 </file>
 
 <file path=word/comments.xml><?xml version="1.0" encoding="utf-8"?>
-<w:comments xmlns:wpc="http://schemas.microsoft.com/office/word/2010/wordprocessingCanvas" xmlns:cx="http://schemas.microsoft.com/office/drawing/2014/chartex" xmlns:cx1="http://schemas.microsoft.com/office/drawing/2015/9/8/chartex" xmlns:cx2="http://schemas.microsoft.com/office/drawing/2015/10/21/chartex" xmlns:cx3="http://schemas.microsoft.com/office/drawing/2016/5/9/chartex" xmlns:cx4="http://schemas.microsoft.com/office/drawing/2016/5/10/chartex" xmlns:cx5="http://schemas.microsoft.com/office/drawing/2016/5/11/chartex" xmlns:cx6="http://schemas.microsoft.com/office/drawing/2016/5/12/chartex" xmlns:cx7="http://schemas.microsoft.com/office/drawing/2016/5/13/chartex" xmlns:cx8="http://schemas.microsoft.com/office/drawing/2016/5/14/chartex" xmlns:mc="http://schemas.openxmlformats.org/markup-compatibility/2006" xmlns:aink="http://schemas.microsoft.com/office/drawing/2016/ink" xmlns:am3d="http://schemas.microsoft.com/office/drawing/2017/model3d" xmlns:o="urn:schemas-microsoft-com:office:office" xmlns:oel="http://schemas.microsoft.com/office/2019/extlst" xmlns:r="http://schemas.openxmlformats.org/officeDocument/2006/relationships" xmlns:m="http://schemas.openxmlformats.org/officeDocument/2006/math" xmlns:v="urn:schemas-microsoft-com:vml" xmlns:wp14="http://schemas.microsoft.com/office/word/2010/wordprocessingDrawing" xmlns:wp="http://schemas.openxmlformats.org/drawingml/2006/wordprocessingDrawing" xmlns:w10="urn:schemas-microsoft-com:office:word" xmlns:w="http://schemas.openxmlformats.org/wordprocessingml/2006/main" xmlns:w14="http://schemas.microsoft.com/office/word/2010/wordml" xmlns:w15="http://schemas.microsoft.com/office/word/2012/wordml" xmlns:w16cex="http://schemas.microsoft.com/office/word/2018/wordml/cex" xmlns:w16cid="http://schemas.microsoft.com/office/word/2016/wordml/cid" xmlns:w16="http://schemas.microsoft.com/office/word/2018/wordml" xmlns:w16du="http://schemas.microsoft.com/office/word/2023/wordml/word16du" xmlns:w16sdtdh="http://schemas.microsoft.com/office/word/2020/wordml/sdtdatahash" xmlns:w16sdtfl="http://schemas.microsoft.com/office/word/2024/wordml/sdtformatlock" xmlns:w16se="http://schemas.microsoft.com/office/word/2015/wordml/symex" xmlns:wpg="http://schemas.microsoft.com/office/word/2010/wordprocessingGroup" xmlns:wpi="http://schemas.microsoft.com/office/word/2010/wordprocessingInk" xmlns:wne="http://schemas.microsoft.com/office/word/2006/wordml" xmlns:wps="http://schemas.microsoft.com/office/word/2010/wordprocessingShape" mc:Ignorable="w14 w15 w16se w16cid w16 w16cex w16sdtdh w16sdtfl w16du wp14">
+<w:comments xmlns:wpc="http://schemas.microsoft.com/office/word/2010/wordprocessingCanvas" xmlns:cx="http://schemas.microsoft.com/office/drawing/2014/chartex" xmlns:cx1="http://schemas.microsoft.com/office/drawing/2015/9/8/chartex" xmlns:cx2="http://schemas.microsoft.com/office/drawing/2015/10/21/chartex" xmlns:cx3="http://schemas.microsoft.com/office/drawing/2016/5/9/chartex" xmlns:cx4="http://schemas.microsoft.com/office/drawing/2016/5/10/chartex" xmlns:cx5="http://schemas.microsoft.com/office/drawing/2016/5/11/chartex" xmlns:cx6="http://schemas.microsoft.com/office/drawing/2016/5/12/chartex" xmlns:cx7="http://schemas.microsoft.com/office/drawing/2016/5/13/chartex" xmlns:cx8="http://schemas.microsoft.com/office/drawing/2016/5/14/chartex" xmlns:mc="http://schemas.openxmlformats.org/markup-compatibility/2006" xmlns:m="http://schemas.openxmlformats.org/officeDocument/2006/math" xmlns:aink="http://schemas.microsoft.com/office/drawing/2016/ink" xmlns:am3d="http://schemas.microsoft.com/office/drawing/2017/model3d" xmlns:oel="http://schemas.microsoft.com/office/2019/extlst" xmlns:r="http://schemas.openxmlformats.org/officeDocument/2006/relationships" xmlns:wp14="http://schemas.microsoft.com/office/word/2010/wordprocessingDrawing" xmlns:wp="http://schemas.openxmlformats.org/drawingml/2006/wordprocessingDrawing" xmlns:wpg="http://schemas.microsoft.com/office/word/2010/wordprocessingGroup" xmlns:wpi="http://schemas.microsoft.com/office/word/2010/wordprocessingInk" xmlns:wps="http://schemas.microsoft.com/office/word/2010/wordprocessingShape" xmlns:o="urn:schemas-microsoft-com:office:office" xmlns:v="urn:schemas-microsoft-com:vml" xmlns:w10="urn:schemas-microsoft-com:office:word" xmlns:w="http://schemas.openxmlformats.org/wordprocessingml/2006/main" xmlns:w14="http://schemas.microsoft.com/office/word/2010/wordml" xmlns:w15="http://schemas.microsoft.com/office/word/2012/wordml" xmlns:w16cex="http://schemas.microsoft.com/office/word/2018/wordml/cex" xmlns:w16cid="http://schemas.microsoft.com/office/word/2016/wordml/cid" xmlns:w16="http://schemas.microsoft.com/office/word/2018/wordml" xmlns:w16sdtdh="http://schemas.microsoft.com/office/word/2020/wordml/sdtdatahash" xmlns:w16sdtfl="http://schemas.microsoft.com/office/word/2024/wordml/sdtformatlock" xmlns:w16se="http://schemas.microsoft.com/office/word/2015/wordml/symex" xmlns:w16du="http://schemas.microsoft.com/office/word/2023/wordml/word16du" xmlns:wne="http://schemas.microsoft.com/office/word/2006/wordml" mc:Ignorable="w14 w15 w16se w16cid w16 w16cex w16sdtdh w16sdtfl w16du wp14">
   <w:comment w:id="0" w:author="Alex Fisher" w:date="2026-06-18T14:08:00Z" w:initials="AF">
     <w:p>
       <w:r>
@@ -20320,28 +20335,28 @@
 </file>
 
 <file path=word/commentsExtended.xml><?xml version="1.0" encoding="utf-8"?>
-<w15:commentsEx xmlns:wpc="http://schemas.microsoft.com/office/word/2010/wordprocessingCanvas" xmlns:cx="http://schemas.microsoft.com/office/drawing/2014/chartex" xmlns:cx1="http://schemas.microsoft.com/office/drawing/2015/9/8/chartex" xmlns:cx2="http://schemas.microsoft.com/office/drawing/2015/10/21/chartex" xmlns:cx3="http://schemas.microsoft.com/office/drawing/2016/5/9/chartex" xmlns:cx4="http://schemas.microsoft.com/office/drawing/2016/5/10/chartex" xmlns:cx5="http://schemas.microsoft.com/office/drawing/2016/5/11/chartex" xmlns:cx6="http://schemas.microsoft.com/office/drawing/2016/5/12/chartex" xmlns:cx7="http://schemas.microsoft.com/office/drawing/2016/5/13/chartex" xmlns:cx8="http://schemas.microsoft.com/office/drawing/2016/5/14/chartex" xmlns:mc="http://schemas.openxmlformats.org/markup-compatibility/2006" xmlns:aink="http://schemas.microsoft.com/office/drawing/2016/ink" xmlns:am3d="http://schemas.microsoft.com/office/drawing/2017/model3d" xmlns:o="urn:schemas-microsoft-com:office:office" xmlns:oel="http://schemas.microsoft.com/office/2019/extlst" xmlns:r="http://schemas.openxmlformats.org/officeDocument/2006/relationships" xmlns:m="http://schemas.openxmlformats.org/officeDocument/2006/math" xmlns:v="urn:schemas-microsoft-com:vml" xmlns:wp14="http://schemas.microsoft.com/office/word/2010/wordprocessingDrawing" xmlns:wp="http://schemas.openxmlformats.org/drawingml/2006/wordprocessingDrawing" xmlns:w10="urn:schemas-microsoft-com:office:word" xmlns:w="http://schemas.openxmlformats.org/wordprocessingml/2006/main" xmlns:w14="http://schemas.microsoft.com/office/word/2010/wordml" xmlns:w15="http://schemas.microsoft.com/office/word/2012/wordml" xmlns:w16cex="http://schemas.microsoft.com/office/word/2018/wordml/cex" xmlns:w16cid="http://schemas.microsoft.com/office/word/2016/wordml/cid" xmlns:w16="http://schemas.microsoft.com/office/word/2018/wordml" xmlns:w16du="http://schemas.microsoft.com/office/word/2023/wordml/word16du" xmlns:w16sdtdh="http://schemas.microsoft.com/office/word/2020/wordml/sdtdatahash" xmlns:w16sdtfl="http://schemas.microsoft.com/office/word/2024/wordml/sdtformatlock" xmlns:w16se="http://schemas.microsoft.com/office/word/2015/wordml/symex" xmlns:wpg="http://schemas.microsoft.com/office/word/2010/wordprocessingGroup" xmlns:wpi="http://schemas.microsoft.com/office/word/2010/wordprocessingInk" xmlns:wne="http://schemas.microsoft.com/office/word/2006/wordml" xmlns:wps="http://schemas.microsoft.com/office/word/2010/wordprocessingShape" mc:Ignorable="w14 w15 w16se w16cid w16 w16cex w16sdtdh w16sdtfl w16du wp14">
+<w15:commentsEx xmlns:wpc="http://schemas.microsoft.com/office/word/2010/wordprocessingCanvas" xmlns:cx="http://schemas.microsoft.com/office/drawing/2014/chartex" xmlns:cx1="http://schemas.microsoft.com/office/drawing/2015/9/8/chartex" xmlns:cx2="http://schemas.microsoft.com/office/drawing/2015/10/21/chartex" xmlns:cx3="http://schemas.microsoft.com/office/drawing/2016/5/9/chartex" xmlns:cx4="http://schemas.microsoft.com/office/drawing/2016/5/10/chartex" xmlns:cx5="http://schemas.microsoft.com/office/drawing/2016/5/11/chartex" xmlns:cx6="http://schemas.microsoft.com/office/drawing/2016/5/12/chartex" xmlns:cx7="http://schemas.microsoft.com/office/drawing/2016/5/13/chartex" xmlns:cx8="http://schemas.microsoft.com/office/drawing/2016/5/14/chartex" xmlns:mc="http://schemas.openxmlformats.org/markup-compatibility/2006" xmlns:m="http://schemas.openxmlformats.org/officeDocument/2006/math" xmlns:aink="http://schemas.microsoft.com/office/drawing/2016/ink" xmlns:am3d="http://schemas.microsoft.com/office/drawing/2017/model3d" xmlns:oel="http://schemas.microsoft.com/office/2019/extlst" xmlns:r="http://schemas.openxmlformats.org/officeDocument/2006/relationships" xmlns:wp14="http://schemas.microsoft.com/office/word/2010/wordprocessingDrawing" xmlns:wp="http://schemas.openxmlformats.org/drawingml/2006/wordprocessingDrawing" xmlns:wpg="http://schemas.microsoft.com/office/word/2010/wordprocessingGroup" xmlns:wpi="http://schemas.microsoft.com/office/word/2010/wordprocessingInk" xmlns:wps="http://schemas.microsoft.com/office/word/2010/wordprocessingShape" xmlns:o="urn:schemas-microsoft-com:office:office" xmlns:v="urn:schemas-microsoft-com:vml" xmlns:w10="urn:schemas-microsoft-com:office:word" xmlns:w="http://schemas.openxmlformats.org/wordprocessingml/2006/main" xmlns:w14="http://schemas.microsoft.com/office/word/2010/wordml" xmlns:w15="http://schemas.microsoft.com/office/word/2012/wordml" xmlns:w16cex="http://schemas.microsoft.com/office/word/2018/wordml/cex" xmlns:w16cid="http://schemas.microsoft.com/office/word/2016/wordml/cid" xmlns:w16="http://schemas.microsoft.com/office/word/2018/wordml" xmlns:w16sdtdh="http://schemas.microsoft.com/office/word/2020/wordml/sdtdatahash" xmlns:w16sdtfl="http://schemas.microsoft.com/office/word/2024/wordml/sdtformatlock" xmlns:w16se="http://schemas.microsoft.com/office/word/2015/wordml/symex" xmlns:w16du="http://schemas.microsoft.com/office/word/2023/wordml/word16du" xmlns:wne="http://schemas.microsoft.com/office/word/2006/wordml" mc:Ignorable="w14 w15 w16se w16cid w16 w16cex w16sdtdh w16sdtfl w16du wp14">
   <w15:commentEx w15:paraId="3A114F62" w15:done="0"/>
   <w15:commentEx w15:paraId="6EF2028C" w15:paraIdParent="3A114F62" w15:done="0"/>
 </w15:commentsEx>
 </file>
 
 <file path=word/commentsExtensible.xml><?xml version="1.0" encoding="utf-8"?>
-<w16cex:commentsExtensible xmlns:wpc="http://schemas.microsoft.com/office/word/2010/wordprocessingCanvas" xmlns:cx="http://schemas.microsoft.com/office/drawing/2014/chartex" xmlns:cx1="http://schemas.microsoft.com/office/drawing/2015/9/8/chartex" xmlns:cx2="http://schemas.microsoft.com/office/drawing/2015/10/21/chartex" xmlns:cx3="http://schemas.microsoft.com/office/drawing/2016/5/9/chartex" xmlns:cx4="http://schemas.microsoft.com/office/drawing/2016/5/10/chartex" xmlns:cx5="http://schemas.microsoft.com/office/drawing/2016/5/11/chartex" xmlns:cx6="http://schemas.microsoft.com/office/drawing/2016/5/12/chartex" xmlns:cx7="http://schemas.microsoft.com/office/drawing/2016/5/13/chartex" xmlns:cx8="http://schemas.microsoft.com/office/drawing/2016/5/14/chartex" xmlns:cr="http://schemas.microsoft.com/office/comments/2020/reactions" xmlns:mc="http://schemas.openxmlformats.org/markup-compatibility/2006" xmlns:aink="http://schemas.microsoft.com/office/drawing/2016/ink" xmlns:am3d="http://schemas.microsoft.com/office/drawing/2017/model3d" xmlns:o="urn:schemas-microsoft-com:office:office" xmlns:oel="http://schemas.microsoft.com/office/2019/extlst" xmlns:r="http://schemas.openxmlformats.org/officeDocument/2006/relationships" xmlns:m="http://schemas.openxmlformats.org/officeDocument/2006/math" xmlns:v="urn:schemas-microsoft-com:vml" xmlns:wp14="http://schemas.microsoft.com/office/word/2010/wordprocessingDrawing" xmlns:wp="http://schemas.openxmlformats.org/drawingml/2006/wordprocessingDrawing" xmlns:w10="urn:schemas-microsoft-com:office:word" xmlns:w="http://schemas.openxmlformats.org/wordprocessingml/2006/main" xmlns:w14="http://schemas.microsoft.com/office/word/2010/wordml" xmlns:w15="http://schemas.microsoft.com/office/word/2012/wordml" xmlns:w16cex="http://schemas.microsoft.com/office/word/2018/wordml/cex" xmlns:w16cid="http://schemas.microsoft.com/office/word/2016/wordml/cid" xmlns:w16="http://schemas.microsoft.com/office/word/2018/wordml" xmlns:w16du="http://schemas.microsoft.com/office/word/2023/wordml/word16du" xmlns:w16sdtdh="http://schemas.microsoft.com/office/word/2020/wordml/sdtdatahash" xmlns:w16sdtfl="http://schemas.microsoft.com/office/word/2024/wordml/sdtformatlock" xmlns:w16se="http://schemas.microsoft.com/office/word/2015/wordml/symex" xmlns:wpg="http://schemas.microsoft.com/office/word/2010/wordprocessingGroup" xmlns:wpi="http://schemas.microsoft.com/office/word/2010/wordprocessingInk" xmlns:wne="http://schemas.microsoft.com/office/word/2006/wordml" xmlns:wps="http://schemas.microsoft.com/office/word/2010/wordprocessingShape" mc:Ignorable="w14 w15 w16se w16cid w16 w16cex w16sdtdh w16sdtfl cr w16du wp14">
+<w16cex:commentsExtensible xmlns:wpc="http://schemas.microsoft.com/office/word/2010/wordprocessingCanvas" xmlns:cx="http://schemas.microsoft.com/office/drawing/2014/chartex" xmlns:cx1="http://schemas.microsoft.com/office/drawing/2015/9/8/chartex" xmlns:cx2="http://schemas.microsoft.com/office/drawing/2015/10/21/chartex" xmlns:cx3="http://schemas.microsoft.com/office/drawing/2016/5/9/chartex" xmlns:cx4="http://schemas.microsoft.com/office/drawing/2016/5/10/chartex" xmlns:cx5="http://schemas.microsoft.com/office/drawing/2016/5/11/chartex" xmlns:cx6="http://schemas.microsoft.com/office/drawing/2016/5/12/chartex" xmlns:cx7="http://schemas.microsoft.com/office/drawing/2016/5/13/chartex" xmlns:cx8="http://schemas.microsoft.com/office/drawing/2016/5/14/chartex" xmlns:cr="http://schemas.microsoft.com/office/comments/2020/reactions" xmlns:mc="http://schemas.openxmlformats.org/markup-compatibility/2006" xmlns:m="http://schemas.openxmlformats.org/officeDocument/2006/math" xmlns:aink="http://schemas.microsoft.com/office/drawing/2016/ink" xmlns:am3d="http://schemas.microsoft.com/office/drawing/2017/model3d" xmlns:oel="http://schemas.microsoft.com/office/2019/extlst" xmlns:r="http://schemas.openxmlformats.org/officeDocument/2006/relationships" xmlns:wp14="http://schemas.microsoft.com/office/word/2010/wordprocessingDrawing" xmlns:wp="http://schemas.openxmlformats.org/drawingml/2006/wordprocessingDrawing" xmlns:wpg="http://schemas.microsoft.com/office/word/2010/wordprocessingGroup" xmlns:wpi="http://schemas.microsoft.com/office/word/2010/wordprocessingInk" xmlns:wps="http://schemas.microsoft.com/office/word/2010/wordprocessingShape" xmlns:o="urn:schemas-microsoft-com:office:office" xmlns:v="urn:schemas-microsoft-com:vml" xmlns:w10="urn:schemas-microsoft-com:office:word" xmlns:w="http://schemas.openxmlformats.org/wordprocessingml/2006/main" xmlns:w14="http://schemas.microsoft.com/office/word/2010/wordml" xmlns:w15="http://schemas.microsoft.com/office/word/2012/wordml" xmlns:w16cex="http://schemas.microsoft.com/office/word/2018/wordml/cex" xmlns:w16cid="http://schemas.microsoft.com/office/word/2016/wordml/cid" xmlns:w16="http://schemas.microsoft.com/office/word/2018/wordml" xmlns:w16sdtdh="http://schemas.microsoft.com/office/word/2020/wordml/sdtdatahash" xmlns:w16sdtfl="http://schemas.microsoft.com/office/word/2024/wordml/sdtformatlock" xmlns:w16se="http://schemas.microsoft.com/office/word/2015/wordml/symex" xmlns:w16du="http://schemas.microsoft.com/office/word/2023/wordml/word16du" xmlns:wne="http://schemas.microsoft.com/office/word/2006/wordml" mc:Ignorable="w14 w15 w16se w16cid w16 w16cex w16sdtdh w16sdtfl cr w16du wp14">
   <w16cex:commentExtensible w16cex:durableId="5081449F" w16cex:dateUtc="2026-06-18T19:08:00Z"/>
   <w16cex:commentExtensible w16cex:durableId="17CB01BE" w16cex:dateUtc="2026-06-19T12:11:00Z"/>
 </w16cex:commentsExtensible>
 </file>
 
 <file path=word/commentsIds.xml><?xml version="1.0" encoding="utf-8"?>
-<w16cid:commentsIds xmlns:wpc="http://schemas.microsoft.com/office/word/2010/wordprocessingCanvas" xmlns:cx="http://schemas.microsoft.com/office/drawing/2014/chartex" xmlns:cx1="http://schemas.microsoft.com/office/drawing/2015/9/8/chartex" xmlns:cx2="http://schemas.microsoft.com/office/drawing/2015/10/21/chartex" xmlns:cx3="http://schemas.microsoft.com/office/drawing/2016/5/9/chartex" xmlns:cx4="http://schemas.microsoft.com/office/drawing/2016/5/10/chartex" xmlns:cx5="http://schemas.microsoft.com/office/drawing/2016/5/11/chartex" xmlns:cx6="http://schemas.microsoft.com/office/drawing/2016/5/12/chartex" xmlns:cx7="http://schemas.microsoft.com/office/drawing/2016/5/13/chartex" xmlns:cx8="http://schemas.microsoft.com/office/drawing/2016/5/14/chartex" xmlns:mc="http://schemas.openxmlformats.org/markup-compatibility/2006" xmlns:aink="http://schemas.microsoft.com/office/drawing/2016/ink" xmlns:am3d="http://schemas.microsoft.com/office/drawing/2017/model3d" xmlns:o="urn:schemas-microsoft-com:office:office" xmlns:oel="http://schemas.microsoft.com/office/2019/extlst" xmlns:r="http://schemas.openxmlformats.org/officeDocument/2006/relationships" xmlns:m="http://schemas.openxmlformats.org/officeDocument/2006/math" xmlns:v="urn:schemas-microsoft-com:vml" xmlns:wp14="http://schemas.microsoft.com/office/word/2010/wordprocessingDrawing" xmlns:wp="http://schemas.openxmlformats.org/drawingml/2006/wordprocessingDrawing" xmlns:w10="urn:schemas-microsoft-com:office:word" xmlns:w="http://schemas.openxmlformats.org/wordprocessingml/2006/main" xmlns:w14="http://schemas.microsoft.com/office/word/2010/wordml" xmlns:w15="http://schemas.microsoft.com/office/word/2012/wordml" xmlns:w16cex="http://schemas.microsoft.com/office/word/2018/wordml/cex" xmlns:w16cid="http://schemas.microsoft.com/office/word/2016/wordml/cid" xmlns:w16="http://schemas.microsoft.com/office/word/2018/wordml" xmlns:w16du="http://schemas.microsoft.com/office/word/2023/wordml/word16du" xmlns:w16sdtdh="http://schemas.microsoft.com/office/word/2020/wordml/sdtdatahash" xmlns:w16sdtfl="http://schemas.microsoft.com/office/word/2024/wordml/sdtformatlock" xmlns:w16se="http://schemas.microsoft.com/office/word/2015/wordml/symex" xmlns:wpg="http://schemas.microsoft.com/office/word/2010/wordprocessingGroup" xmlns:wpi="http://schemas.microsoft.com/office/word/2010/wordprocessingInk" xmlns:wne="http://schemas.microsoft.com/office/word/2006/wordml" xmlns:wps="http://schemas.microsoft.com/office/word/2010/wordprocessingShape" mc:Ignorable="w14 w15 w16se w16cid w16 w16cex w16sdtdh w16sdtfl w16du wp14">
+<w16cid:commentsIds xmlns:wpc="http://schemas.microsoft.com/office/word/2010/wordprocessingCanvas" xmlns:cx="http://schemas.microsoft.com/office/drawing/2014/chartex" xmlns:cx1="http://schemas.microsoft.com/office/drawing/2015/9/8/chartex" xmlns:cx2="http://schemas.microsoft.com/office/drawing/2015/10/21/chartex" xmlns:cx3="http://schemas.microsoft.com/office/drawing/2016/5/9/chartex" xmlns:cx4="http://schemas.microsoft.com/office/drawing/2016/5/10/chartex" xmlns:cx5="http://schemas.microsoft.com/office/drawing/2016/5/11/chartex" xmlns:cx6="http://schemas.microsoft.com/office/drawing/2016/5/12/chartex" xmlns:cx7="http://schemas.microsoft.com/office/drawing/2016/5/13/chartex" xmlns:cx8="http://schemas.microsoft.com/office/drawing/2016/5/14/chartex" xmlns:mc="http://schemas.openxmlformats.org/markup-compatibility/2006" xmlns:m="http://schemas.openxmlformats.org/officeDocument/2006/math" xmlns:aink="http://schemas.microsoft.com/office/drawing/2016/ink" xmlns:am3d="http://schemas.microsoft.com/office/drawing/2017/model3d" xmlns:oel="http://schemas.microsoft.com/office/2019/extlst" xmlns:r="http://schemas.openxmlformats.org/officeDocument/2006/relationships" xmlns:wp14="http://schemas.microsoft.com/office/word/2010/wordprocessingDrawing" xmlns:wp="http://schemas.openxmlformats.org/drawingml/2006/wordprocessingDrawing" xmlns:wpg="http://schemas.microsoft.com/office/word/2010/wordprocessingGroup" xmlns:wpi="http://schemas.microsoft.com/office/word/2010/wordprocessingInk" xmlns:wps="http://schemas.microsoft.com/office/word/2010/wordprocessingShape" xmlns:o="urn:schemas-microsoft-com:office:office" xmlns:v="urn:schemas-microsoft-com:vml" xmlns:w10="urn:schemas-microsoft-com:office:word" xmlns:w="http://schemas.openxmlformats.org/wordprocessingml/2006/main" xmlns:w14="http://schemas.microsoft.com/office/word/2010/wordml" xmlns:w15="http://schemas.microsoft.com/office/word/2012/wordml" xmlns:w16cex="http://schemas.microsoft.com/office/word/2018/wordml/cex" xmlns:w16cid="http://schemas.microsoft.com/office/word/2016/wordml/cid" xmlns:w16="http://schemas.microsoft.com/office/word/2018/wordml" xmlns:w16sdtdh="http://schemas.microsoft.com/office/word/2020/wordml/sdtdatahash" xmlns:w16sdtfl="http://schemas.microsoft.com/office/word/2024/wordml/sdtformatlock" xmlns:w16se="http://schemas.microsoft.com/office/word/2015/wordml/symex" xmlns:w16du="http://schemas.microsoft.com/office/word/2023/wordml/word16du" xmlns:wne="http://schemas.microsoft.com/office/word/2006/wordml" mc:Ignorable="w14 w15 w16se w16cid w16 w16cex w16sdtdh w16sdtfl w16du wp14">
   <w16cid:commentId w16cid:paraId="3A114F62" w16cid:durableId="5081449F"/>
   <w16cid:commentId w16cid:paraId="6EF2028C" w16cid:durableId="17CB01BE"/>
 </w16cid:commentsIds>
 </file>
 
 <file path=word/endnotes.xml><?xml version="1.0" encoding="utf-8"?>
-<w:endnotes xmlns:wpc="http://schemas.microsoft.com/office/word/2010/wordprocessingCanvas" xmlns:cx="http://schemas.microsoft.com/office/drawing/2014/chartex" xmlns:cx1="http://schemas.microsoft.com/office/drawing/2015/9/8/chartex" xmlns:cx2="http://schemas.microsoft.com/office/drawing/2015/10/21/chartex" xmlns:cx3="http://schemas.microsoft.com/office/drawing/2016/5/9/chartex" xmlns:cx4="http://schemas.microsoft.com/office/drawing/2016/5/10/chartex" xmlns:cx5="http://schemas.microsoft.com/office/drawing/2016/5/11/chartex" xmlns:cx6="http://schemas.microsoft.com/office/drawing/2016/5/12/chartex" xmlns:cx7="http://schemas.microsoft.com/office/drawing/2016/5/13/chartex" xmlns:cx8="http://schemas.microsoft.com/office/drawing/2016/5/14/chartex" xmlns:mc="http://schemas.openxmlformats.org/markup-compatibility/2006" xmlns:aink="http://schemas.microsoft.com/office/drawing/2016/ink" xmlns:am3d="http://schemas.microsoft.com/office/drawing/2017/model3d" xmlns:o="urn:schemas-microsoft-com:office:office" xmlns:oel="http://schemas.microsoft.com/office/2019/extlst" xmlns:r="http://schemas.openxmlformats.org/officeDocument/2006/relationships" xmlns:m="http://schemas.openxmlformats.org/officeDocument/2006/math" xmlns:v="urn:schemas-microsoft-com:vml" xmlns:wp14="http://schemas.microsoft.com/office/word/2010/wordprocessingDrawing" xmlns:wp="http://schemas.openxmlformats.org/drawingml/2006/wordprocessingDrawing" xmlns:w10="urn:schemas-microsoft-com:office:word" xmlns:w="http://schemas.openxmlformats.org/wordprocessingml/2006/main" xmlns:w14="http://schemas.microsoft.com/office/word/2010/wordml" xmlns:w15="http://schemas.microsoft.com/office/word/2012/wordml" xmlns:w16cex="http://schemas.microsoft.com/office/word/2018/wordml/cex" xmlns:w16cid="http://schemas.microsoft.com/office/word/2016/wordml/cid" xmlns:w16="http://schemas.microsoft.com/office/word/2018/wordml" xmlns:w16du="http://schemas.microsoft.com/office/word/2023/wordml/word16du" xmlns:w16sdtdh="http://schemas.microsoft.com/office/word/2020/wordml/sdtdatahash" xmlns:w16sdtfl="http://schemas.microsoft.com/office/word/2024/wordml/sdtformatlock" xmlns:w16se="http://schemas.microsoft.com/office/word/2015/wordml/symex" xmlns:wpg="http://schemas.microsoft.com/office/word/2010/wordprocessingGroup" xmlns:wpi="http://schemas.microsoft.com/office/word/2010/wordprocessingInk" xmlns:wne="http://schemas.microsoft.com/office/word/2006/wordml" xmlns:wps="http://schemas.microsoft.com/office/word/2010/wordprocessingShape" mc:Ignorable="w14 w15 w16se w16cid w16 w16cex w16sdtdh w16sdtfl w16du wp14">
+<w:endnotes xmlns:wpc="http://schemas.microsoft.com/office/word/2010/wordprocessingCanvas" xmlns:cx="http://schemas.microsoft.com/office/drawing/2014/chartex" xmlns:cx1="http://schemas.microsoft.com/office/drawing/2015/9/8/chartex" xmlns:cx2="http://schemas.microsoft.com/office/drawing/2015/10/21/chartex" xmlns:cx3="http://schemas.microsoft.com/office/drawing/2016/5/9/chartex" xmlns:cx4="http://schemas.microsoft.com/office/drawing/2016/5/10/chartex" xmlns:cx5="http://schemas.microsoft.com/office/drawing/2016/5/11/chartex" xmlns:cx6="http://schemas.microsoft.com/office/drawing/2016/5/12/chartex" xmlns:cx7="http://schemas.microsoft.com/office/drawing/2016/5/13/chartex" xmlns:cx8="http://schemas.microsoft.com/office/drawing/2016/5/14/chartex" xmlns:mc="http://schemas.openxmlformats.org/markup-compatibility/2006" xmlns:m="http://schemas.openxmlformats.org/officeDocument/2006/math" xmlns:aink="http://schemas.microsoft.com/office/drawing/2016/ink" xmlns:am3d="http://schemas.microsoft.com/office/drawing/2017/model3d" xmlns:oel="http://schemas.microsoft.com/office/2019/extlst" xmlns:r="http://schemas.openxmlformats.org/officeDocument/2006/relationships" xmlns:wp14="http://schemas.microsoft.com/office/word/2010/wordprocessingDrawing" xmlns:wp="http://schemas.openxmlformats.org/drawingml/2006/wordprocessingDrawing" xmlns:wpg="http://schemas.microsoft.com/office/word/2010/wordprocessingGroup" xmlns:wpi="http://schemas.microsoft.com/office/word/2010/wordprocessingInk" xmlns:wps="http://schemas.microsoft.com/office/word/2010/wordprocessingShape" xmlns:o="urn:schemas-microsoft-com:office:office" xmlns:v="urn:schemas-microsoft-com:vml" xmlns:w10="urn:schemas-microsoft-com:office:word" xmlns:w="http://schemas.openxmlformats.org/wordprocessingml/2006/main" xmlns:w14="http://schemas.microsoft.com/office/word/2010/wordml" xmlns:w15="http://schemas.microsoft.com/office/word/2012/wordml" xmlns:w16cex="http://schemas.microsoft.com/office/word/2018/wordml/cex" xmlns:w16cid="http://schemas.microsoft.com/office/word/2016/wordml/cid" xmlns:w16="http://schemas.microsoft.com/office/word/2018/wordml" xmlns:w16sdtdh="http://schemas.microsoft.com/office/word/2020/wordml/sdtdatahash" xmlns:w16sdtfl="http://schemas.microsoft.com/office/word/2024/wordml/sdtformatlock" xmlns:w16se="http://schemas.microsoft.com/office/word/2015/wordml/symex" xmlns:w16du="http://schemas.microsoft.com/office/word/2023/wordml/word16du" xmlns:wne="http://schemas.microsoft.com/office/word/2006/wordml" mc:Ignorable="w14 w15 w16se w16cid w16 w16cex w16sdtdh w16sdtfl w16du wp14">
   <w:endnote w:type="separator" w:id="-1">
     <w:p>
       <w:r>
@@ -20415,7 +20430,7 @@
 </file>
 
 <file path=word/footer1.xml><?xml version="1.0" encoding="utf-8"?>
-<w:ftr xmlns:wpc="http://schemas.microsoft.com/office/word/2010/wordprocessingCanvas" xmlns:cx="http://schemas.microsoft.com/office/drawing/2014/chartex" xmlns:cx1="http://schemas.microsoft.com/office/drawing/2015/9/8/chartex" xmlns:cx2="http://schemas.microsoft.com/office/drawing/2015/10/21/chartex" xmlns:cx3="http://schemas.microsoft.com/office/drawing/2016/5/9/chartex" xmlns:cx4="http://schemas.microsoft.com/office/drawing/2016/5/10/chartex" xmlns:cx5="http://schemas.microsoft.com/office/drawing/2016/5/11/chartex" xmlns:cx6="http://schemas.microsoft.com/office/drawing/2016/5/12/chartex" xmlns:cx7="http://schemas.microsoft.com/office/drawing/2016/5/13/chartex" xmlns:cx8="http://schemas.microsoft.com/office/drawing/2016/5/14/chartex" xmlns:mc="http://schemas.openxmlformats.org/markup-compatibility/2006" xmlns:aink="http://schemas.microsoft.com/office/drawing/2016/ink" xmlns:am3d="http://schemas.microsoft.com/office/drawing/2017/model3d" xmlns:o="urn:schemas-microsoft-com:office:office" xmlns:oel="http://schemas.microsoft.com/office/2019/extlst" xmlns:r="http://schemas.openxmlformats.org/officeDocument/2006/relationships" xmlns:m="http://schemas.openxmlformats.org/officeDocument/2006/math" xmlns:v="urn:schemas-microsoft-com:vml" xmlns:wp14="http://schemas.microsoft.com/office/word/2010/wordprocessingDrawing" xmlns:wp="http://schemas.openxmlformats.org/drawingml/2006/wordprocessingDrawing" xmlns:w10="urn:schemas-microsoft-com:office:word" xmlns:w="http://schemas.openxmlformats.org/wordprocessingml/2006/main" xmlns:w14="http://schemas.microsoft.com/office/word/2010/wordml" xmlns:w15="http://schemas.microsoft.com/office/word/2012/wordml" xmlns:w16cex="http://schemas.microsoft.com/office/word/2018/wordml/cex" xmlns:w16cid="http://schemas.microsoft.com/office/word/2016/wordml/cid" xmlns:w16="http://schemas.microsoft.com/office/word/2018/wordml" xmlns:w16du="http://schemas.microsoft.com/office/word/2023/wordml/word16du" xmlns:w16sdtdh="http://schemas.microsoft.com/office/word/2020/wordml/sdtdatahash" xmlns:w16sdtfl="http://schemas.microsoft.com/office/word/2024/wordml/sdtformatlock" xmlns:w16se="http://schemas.microsoft.com/office/word/2015/wordml/symex" xmlns:wpg="http://schemas.microsoft.com/office/word/2010/wordprocessingGroup" xmlns:wpi="http://schemas.microsoft.com/office/word/2010/wordprocessingInk" xmlns:wne="http://schemas.microsoft.com/office/word/2006/wordml" xmlns:wps="http://schemas.microsoft.com/office/word/2010/wordprocessingShape" mc:Ignorable="w14 w15 w16se w16cid w16 w16cex w16sdtdh w16sdtfl w16du wp14">
+<w:ftr xmlns:wpc="http://schemas.microsoft.com/office/word/2010/wordprocessingCanvas" xmlns:cx="http://schemas.microsoft.com/office/drawing/2014/chartex" xmlns:cx1="http://schemas.microsoft.com/office/drawing/2015/9/8/chartex" xmlns:cx2="http://schemas.microsoft.com/office/drawing/2015/10/21/chartex" xmlns:cx3="http://schemas.microsoft.com/office/drawing/2016/5/9/chartex" xmlns:cx4="http://schemas.microsoft.com/office/drawing/2016/5/10/chartex" xmlns:cx5="http://schemas.microsoft.com/office/drawing/2016/5/11/chartex" xmlns:cx6="http://schemas.microsoft.com/office/drawing/2016/5/12/chartex" xmlns:cx7="http://schemas.microsoft.com/office/drawing/2016/5/13/chartex" xmlns:cx8="http://schemas.microsoft.com/office/drawing/2016/5/14/chartex" xmlns:mc="http://schemas.openxmlformats.org/markup-compatibility/2006" xmlns:m="http://schemas.openxmlformats.org/officeDocument/2006/math" xmlns:aink="http://schemas.microsoft.com/office/drawing/2016/ink" xmlns:am3d="http://schemas.microsoft.com/office/drawing/2017/model3d" xmlns:oel="http://schemas.microsoft.com/office/2019/extlst" xmlns:r="http://schemas.openxmlformats.org/officeDocument/2006/relationships" xmlns:wp14="http://schemas.microsoft.com/office/word/2010/wordprocessingDrawing" xmlns:wp="http://schemas.openxmlformats.org/drawingml/2006/wordprocessingDrawing" xmlns:wpg="http://schemas.microsoft.com/office/word/2010/wordprocessingGroup" xmlns:wpi="http://schemas.microsoft.com/office/word/2010/wordprocessingInk" xmlns:wps="http://schemas.microsoft.com/office/word/2010/wordprocessingShape" xmlns:o="urn:schemas-microsoft-com:office:office" xmlns:v="urn:schemas-microsoft-com:vml" xmlns:w10="urn:schemas-microsoft-com:office:word" xmlns:w="http://schemas.openxmlformats.org/wordprocessingml/2006/main" xmlns:w14="http://schemas.microsoft.com/office/word/2010/wordml" xmlns:w15="http://schemas.microsoft.com/office/word/2012/wordml" xmlns:w16cex="http://schemas.microsoft.com/office/word/2018/wordml/cex" xmlns:w16cid="http://schemas.microsoft.com/office/word/2016/wordml/cid" xmlns:w16="http://schemas.microsoft.com/office/word/2018/wordml" xmlns:w16sdtdh="http://schemas.microsoft.com/office/word/2020/wordml/sdtdatahash" xmlns:w16sdtfl="http://schemas.microsoft.com/office/word/2024/wordml/sdtformatlock" xmlns:w16se="http://schemas.microsoft.com/office/word/2015/wordml/symex" xmlns:w16du="http://schemas.microsoft.com/office/word/2023/wordml/word16du" xmlns:wne="http://schemas.microsoft.com/office/word/2006/wordml" mc:Ignorable="w14 w15 w16se w16cid w16 w16cex w16sdtdh w16sdtfl w16du wp14">
   <w:p>
     <w:pPr>
       <w:pStyle w:val="LetterText-HCG"/>
@@ -20571,7 +20586,7 @@
 </file>
 
 <file path=word/footnotes.xml><?xml version="1.0" encoding="utf-8"?>
-<w:footnotes xmlns:wpc="http://schemas.microsoft.com/office/word/2010/wordprocessingCanvas" xmlns:cx="http://schemas.microsoft.com/office/drawing/2014/chartex" xmlns:cx1="http://schemas.microsoft.com/office/drawing/2015/9/8/chartex" xmlns:cx2="http://schemas.microsoft.com/office/drawing/2015/10/21/chartex" xmlns:cx3="http://schemas.microsoft.com/office/drawing/2016/5/9/chartex" xmlns:cx4="http://schemas.microsoft.com/office/drawing/2016/5/10/chartex" xmlns:cx5="http://schemas.microsoft.com/office/drawing/2016/5/11/chartex" xmlns:cx6="http://schemas.microsoft.com/office/drawing/2016/5/12/chartex" xmlns:cx7="http://schemas.microsoft.com/office/drawing/2016/5/13/chartex" xmlns:cx8="http://schemas.microsoft.com/office/drawing/2016/5/14/chartex" xmlns:mc="http://schemas.openxmlformats.org/markup-compatibility/2006" xmlns:aink="http://schemas.microsoft.com/office/drawing/2016/ink" xmlns:am3d="http://schemas.microsoft.com/office/drawing/2017/model3d" xmlns:o="urn:schemas-microsoft-com:office:office" xmlns:oel="http://schemas.microsoft.com/office/2019/extlst" xmlns:r="http://schemas.openxmlformats.org/officeDocument/2006/relationships" xmlns:m="http://schemas.openxmlformats.org/officeDocument/2006/math" xmlns:v="urn:schemas-microsoft-com:vml" xmlns:wp14="http://schemas.microsoft.com/office/word/2010/wordprocessingDrawing" xmlns:wp="http://schemas.openxmlformats.org/drawingml/2006/wordprocessingDrawing" xmlns:w10="urn:schemas-microsoft-com:office:word" xmlns:w="http://schemas.openxmlformats.org/wordprocessingml/2006/main" xmlns:w14="http://schemas.microsoft.com/office/word/2010/wordml" xmlns:w15="http://schemas.microsoft.com/office/word/2012/wordml" xmlns:w16cex="http://schemas.microsoft.com/office/word/2018/wordml/cex" xmlns:w16cid="http://schemas.microsoft.com/office/word/2016/wordml/cid" xmlns:w16="http://schemas.microsoft.com/office/word/2018/wordml" xmlns:w16du="http://schemas.microsoft.com/office/word/2023/wordml/word16du" xmlns:w16sdtdh="http://schemas.microsoft.com/office/word/2020/wordml/sdtdatahash" xmlns:w16sdtfl="http://schemas.microsoft.com/office/word/2024/wordml/sdtformatlock" xmlns:w16se="http://schemas.microsoft.com/office/word/2015/wordml/symex" xmlns:wpg="http://schemas.microsoft.com/office/word/2010/wordprocessingGroup" xmlns:wpi="http://schemas.microsoft.com/office/word/2010/wordprocessingInk" xmlns:wne="http://schemas.microsoft.com/office/word/2006/wordml" xmlns:wps="http://schemas.microsoft.com/office/word/2010/wordprocessingShape" mc:Ignorable="w14 w15 w16se w16cid w16 w16cex w16sdtdh w16sdtfl w16du wp14">
+<w:footnotes xmlns:wpc="http://schemas.microsoft.com/office/word/2010/wordprocessingCanvas" xmlns:cx="http://schemas.microsoft.com/office/drawing/2014/chartex" xmlns:cx1="http://schemas.microsoft.com/office/drawing/2015/9/8/chartex" xmlns:cx2="http://schemas.microsoft.com/office/drawing/2015/10/21/chartex" xmlns:cx3="http://schemas.microsoft.com/office/drawing/2016/5/9/chartex" xmlns:cx4="http://schemas.microsoft.com/office/drawing/2016/5/10/chartex" xmlns:cx5="http://schemas.microsoft.com/office/drawing/2016/5/11/chartex" xmlns:cx6="http://schemas.microsoft.com/office/drawing/2016/5/12/chartex" xmlns:cx7="http://schemas.microsoft.com/office/drawing/2016/5/13/chartex" xmlns:cx8="http://schemas.microsoft.com/office/drawing/2016/5/14/chartex" xmlns:mc="http://schemas.openxmlformats.org/markup-compatibility/2006" xmlns:m="http://schemas.openxmlformats.org/officeDocument/2006/math" xmlns:aink="http://schemas.microsoft.com/office/drawing/2016/ink" xmlns:am3d="http://schemas.microsoft.com/office/drawing/2017/model3d" xmlns:oel="http://schemas.microsoft.com/office/2019/extlst" xmlns:r="http://schemas.openxmlformats.org/officeDocument/2006/relationships" xmlns:wp14="http://schemas.microsoft.com/office/word/2010/wordprocessingDrawing" xmlns:wp="http://schemas.openxmlformats.org/drawingml/2006/wordprocessingDrawing" xmlns:wpg="http://schemas.microsoft.com/office/word/2010/wordprocessingGroup" xmlns:wpi="http://schemas.microsoft.com/office/word/2010/wordprocessingInk" xmlns:wps="http://schemas.microsoft.com/office/word/2010/wordprocessingShape" xmlns:o="urn:schemas-microsoft-com:office:office" xmlns:v="urn:schemas-microsoft-com:vml" xmlns:w10="urn:schemas-microsoft-com:office:word" xmlns:w="http://schemas.openxmlformats.org/wordprocessingml/2006/main" xmlns:w14="http://schemas.microsoft.com/office/word/2010/wordml" xmlns:w15="http://schemas.microsoft.com/office/word/2012/wordml" xmlns:w16cex="http://schemas.microsoft.com/office/word/2018/wordml/cex" xmlns:w16cid="http://schemas.microsoft.com/office/word/2016/wordml/cid" xmlns:w16="http://schemas.microsoft.com/office/word/2018/wordml" xmlns:w16sdtdh="http://schemas.microsoft.com/office/word/2020/wordml/sdtdatahash" xmlns:w16sdtfl="http://schemas.microsoft.com/office/word/2024/wordml/sdtformatlock" xmlns:w16se="http://schemas.microsoft.com/office/word/2015/wordml/symex" xmlns:w16du="http://schemas.microsoft.com/office/word/2023/wordml/word16du" xmlns:wne="http://schemas.microsoft.com/office/word/2006/wordml" mc:Ignorable="w14 w15 w16se w16cid w16 w16cex w16sdtdh w16sdtfl w16du wp14">
   <w:footnote w:type="separator" w:id="-1">
     <w:p>
       <w:r>
@@ -20590,7 +20605,7 @@
 </file>
 
 <file path=word/numbering.xml><?xml version="1.0" encoding="utf-8"?>
-<w:numbering xmlns:wpc="http://schemas.microsoft.com/office/word/2010/wordprocessingCanvas" xmlns:cx="http://schemas.microsoft.com/office/drawing/2014/chartex" xmlns:cx1="http://schemas.microsoft.com/office/drawing/2015/9/8/chartex" xmlns:cx2="http://schemas.microsoft.com/office/drawing/2015/10/21/chartex" xmlns:cx3="http://schemas.microsoft.com/office/drawing/2016/5/9/chartex" xmlns:cx4="http://schemas.microsoft.com/office/drawing/2016/5/10/chartex" xmlns:cx5="http://schemas.microsoft.com/office/drawing/2016/5/11/chartex" xmlns:cx6="http://schemas.microsoft.com/office/drawing/2016/5/12/chartex" xmlns:cx7="http://schemas.microsoft.com/office/drawing/2016/5/13/chartex" xmlns:cx8="http://schemas.microsoft.com/office/drawing/2016/5/14/chartex" xmlns:mc="http://schemas.openxmlformats.org/markup-compatibility/2006" xmlns:aink="http://schemas.microsoft.com/office/drawing/2016/ink" xmlns:am3d="http://schemas.microsoft.com/office/drawing/2017/model3d" xmlns:o="urn:schemas-microsoft-com:office:office" xmlns:oel="http://schemas.microsoft.com/office/2019/extlst" xmlns:r="http://schemas.openxmlformats.org/officeDocument/2006/relationships" xmlns:m="http://schemas.openxmlformats.org/officeDocument/2006/math" xmlns:v="urn:schemas-microsoft-com:vml" xmlns:wp14="http://schemas.microsoft.com/office/word/2010/wordprocessingDrawing" xmlns:wp="http://schemas.openxmlformats.org/drawingml/2006/wordprocessingDrawing" xmlns:w10="urn:schemas-microsoft-com:office:word" xmlns:w="http://schemas.openxmlformats.org/wordprocessingml/2006/main" xmlns:w14="http://schemas.microsoft.com/office/word/2010/wordml" xmlns:w15="http://schemas.microsoft.com/office/word/2012/wordml" xmlns:w16cex="http://schemas.microsoft.com/office/word/2018/wordml/cex" xmlns:w16cid="http://schemas.microsoft.com/office/word/2016/wordml/cid" xmlns:w16="http://schemas.microsoft.com/office/word/2018/wordml" xmlns:w16du="http://schemas.microsoft.com/office/word/2023/wordml/word16du" xmlns:w16sdtdh="http://schemas.microsoft.com/office/word/2020/wordml/sdtdatahash" xmlns:w16sdtfl="http://schemas.microsoft.com/office/word/2024/wordml/sdtformatlock" xmlns:w16se="http://schemas.microsoft.com/office/word/2015/wordml/symex" xmlns:wpg="http://schemas.microsoft.com/office/word/2010/wordprocessingGroup" xmlns:wpi="http://schemas.microsoft.com/office/word/2010/wordprocessingInk" xmlns:wne="http://schemas.microsoft.com/office/word/2006/wordml" xmlns:wps="http://schemas.microsoft.com/office/word/2010/wordprocessingShape" mc:Ignorable="w14 w15 w16se w16cid w16 w16cex w16sdtdh w16sdtfl w16du wp14">
+<w:numbering xmlns:wpc="http://schemas.microsoft.com/office/word/2010/wordprocessingCanvas" xmlns:cx="http://schemas.microsoft.com/office/drawing/2014/chartex" xmlns:cx1="http://schemas.microsoft.com/office/drawing/2015/9/8/chartex" xmlns:cx2="http://schemas.microsoft.com/office/drawing/2015/10/21/chartex" xmlns:cx3="http://schemas.microsoft.com/office/drawing/2016/5/9/chartex" xmlns:cx4="http://schemas.microsoft.com/office/drawing/2016/5/10/chartex" xmlns:cx5="http://schemas.microsoft.com/office/drawing/2016/5/11/chartex" xmlns:cx6="http://schemas.microsoft.com/office/drawing/2016/5/12/chartex" xmlns:cx7="http://schemas.microsoft.com/office/drawing/2016/5/13/chartex" xmlns:cx8="http://schemas.microsoft.com/office/drawing/2016/5/14/chartex" xmlns:mc="http://schemas.openxmlformats.org/markup-compatibility/2006" xmlns:m="http://schemas.openxmlformats.org/officeDocument/2006/math" xmlns:aink="http://schemas.microsoft.com/office/drawing/2016/ink" xmlns:am3d="http://schemas.microsoft.com/office/drawing/2017/model3d" xmlns:oel="http://schemas.microsoft.com/office/2019/extlst" xmlns:r="http://schemas.openxmlformats.org/officeDocument/2006/relationships" xmlns:wp14="http://schemas.microsoft.com/office/word/2010/wordprocessingDrawing" xmlns:wp="http://schemas.openxmlformats.org/drawingml/2006/wordprocessingDrawing" xmlns:wpg="http://schemas.microsoft.com/office/word/2010/wordprocessingGroup" xmlns:wpi="http://schemas.microsoft.com/office/word/2010/wordprocessingInk" xmlns:wps="http://schemas.microsoft.com/office/word/2010/wordprocessingShape" xmlns:o="urn:schemas-microsoft-com:office:office" xmlns:v="urn:schemas-microsoft-com:vml" xmlns:w10="urn:schemas-microsoft-com:office:word" xmlns:w="http://schemas.openxmlformats.org/wordprocessingml/2006/main" xmlns:w14="http://schemas.microsoft.com/office/word/2010/wordml" xmlns:w15="http://schemas.microsoft.com/office/word/2012/wordml" xmlns:w16cex="http://schemas.microsoft.com/office/word/2018/wordml/cex" xmlns:w16cid="http://schemas.microsoft.com/office/word/2016/wordml/cid" xmlns:w16="http://schemas.microsoft.com/office/word/2018/wordml" xmlns:w16sdtdh="http://schemas.microsoft.com/office/word/2020/wordml/sdtdatahash" xmlns:w16sdtfl="http://schemas.microsoft.com/office/word/2024/wordml/sdtformatlock" xmlns:w16se="http://schemas.microsoft.com/office/word/2015/wordml/symex" xmlns:w16du="http://schemas.microsoft.com/office/word/2023/wordml/word16du" xmlns:wne="http://schemas.microsoft.com/office/word/2006/wordml" mc:Ignorable="w14 w15 w16se w16cid w16 w16cex w16sdtdh w16sdtfl w16du wp14">
   <w:abstractNum w:abstractNumId="0" w15:restartNumberingAfterBreak="0">
     <w:nsid w:val="232046CF"/>
     <w:multiLevelType w:val="hybridMultilevel"/>
@@ -20943,6 +20958,118 @@
     </w:lvl>
   </w:abstractNum>
   <w:abstractNum w:abstractNumId="3" w15:restartNumberingAfterBreak="0">
+    <w:nsid w:val="73457018"/>
+    <w:multiLevelType w:val="hybridMultilevel"/>
+    <w:tmpl w:val="AA32BDA4"/>
+    <w:lvl w:ilvl="0" w:tplc="BB58D772">
+      <w:numFmt w:val="bullet"/>
+      <w:lvlText w:val="-"/>
+      <w:lvlJc w:val="left"/>
+      <w:pPr>
+        <w:ind w:left="1080" w:hanging="360"/>
+      </w:pPr>
+      <w:rPr>
+        <w:rFonts w:ascii="Arial" w:eastAsiaTheme="minorEastAsia" w:hAnsi="Arial" w:cs="Arial" w:hint="default"/>
+      </w:rPr>
+    </w:lvl>
+    <w:lvl w:ilvl="1" w:tplc="04090003" w:tentative="1">
+      <w:start w:val="1"/>
+      <w:numFmt w:val="bullet"/>
+      <w:lvlText w:val="o"/>
+      <w:lvlJc w:val="left"/>
+      <w:pPr>
+        <w:ind w:left="1800" w:hanging="360"/>
+      </w:pPr>
+      <w:rPr>
+        <w:rFonts w:ascii="Courier New" w:hAnsi="Courier New" w:cs="Courier New" w:hint="default"/>
+      </w:rPr>
+    </w:lvl>
+    <w:lvl w:ilvl="2" w:tplc="04090005" w:tentative="1">
+      <w:start w:val="1"/>
+      <w:numFmt w:val="bullet"/>
+      <w:lvlText w:val=""/>
+      <w:lvlJc w:val="left"/>
+      <w:pPr>
+        <w:ind w:left="2520" w:hanging="360"/>
+      </w:pPr>
+      <w:rPr>
+        <w:rFonts w:ascii="Wingdings" w:hAnsi="Wingdings" w:hint="default"/>
+      </w:rPr>
+    </w:lvl>
+    <w:lvl w:ilvl="3" w:tplc="04090001" w:tentative="1">
+      <w:start w:val="1"/>
+      <w:numFmt w:val="bullet"/>
+      <w:lvlText w:val=""/>
+      <w:lvlJc w:val="left"/>
+      <w:pPr>
+        <w:ind w:left="3240" w:hanging="360"/>
+      </w:pPr>
+      <w:rPr>
+        <w:rFonts w:ascii="Symbol" w:hAnsi="Symbol" w:hint="default"/>
+      </w:rPr>
+    </w:lvl>
+    <w:lvl w:ilvl="4" w:tplc="04090003" w:tentative="1">
+      <w:start w:val="1"/>
+      <w:numFmt w:val="bullet"/>
+      <w:lvlText w:val="o"/>
+      <w:lvlJc w:val="left"/>
+      <w:pPr>
+        <w:ind w:left="3960" w:hanging="360"/>
+      </w:pPr>
+      <w:rPr>
+        <w:rFonts w:ascii="Courier New" w:hAnsi="Courier New" w:cs="Courier New" w:hint="default"/>
+      </w:rPr>
+    </w:lvl>
+    <w:lvl w:ilvl="5" w:tplc="04090005" w:tentative="1">
+      <w:start w:val="1"/>
+      <w:numFmt w:val="bullet"/>
+      <w:lvlText w:val=""/>
+      <w:lvlJc w:val="left"/>
+      <w:pPr>
+        <w:ind w:left="4680" w:hanging="360"/>
+      </w:pPr>
+      <w:rPr>
+        <w:rFonts w:ascii="Wingdings" w:hAnsi="Wingdings" w:hint="default"/>
+      </w:rPr>
+    </w:lvl>
+    <w:lvl w:ilvl="6" w:tplc="04090001" w:tentative="1">
+      <w:start w:val="1"/>
+      <w:numFmt w:val="bullet"/>
+      <w:lvlText w:val=""/>
+      <w:lvlJc w:val="left"/>
+      <w:pPr>
+        <w:ind w:left="5400" w:hanging="360"/>
+      </w:pPr>
+      <w:rPr>
+        <w:rFonts w:ascii="Symbol" w:hAnsi="Symbol" w:hint="default"/>
+      </w:rPr>
+    </w:lvl>
+    <w:lvl w:ilvl="7" w:tplc="04090003" w:tentative="1">
+      <w:start w:val="1"/>
+      <w:numFmt w:val="bullet"/>
+      <w:lvlText w:val="o"/>
+      <w:lvlJc w:val="left"/>
+      <w:pPr>
+        <w:ind w:left="6120" w:hanging="360"/>
+      </w:pPr>
+      <w:rPr>
+        <w:rFonts w:ascii="Courier New" w:hAnsi="Courier New" w:cs="Courier New" w:hint="default"/>
+      </w:rPr>
+    </w:lvl>
+    <w:lvl w:ilvl="8" w:tplc="04090005" w:tentative="1">
+      <w:start w:val="1"/>
+      <w:numFmt w:val="bullet"/>
+      <w:lvlText w:val=""/>
+      <w:lvlJc w:val="left"/>
+      <w:pPr>
+        <w:ind w:left="6840" w:hanging="360"/>
+      </w:pPr>
+      <w:rPr>
+        <w:rFonts w:ascii="Wingdings" w:hAnsi="Wingdings" w:hint="default"/>
+      </w:rPr>
+    </w:lvl>
+  </w:abstractNum>
+  <w:abstractNum w:abstractNumId="4" w15:restartNumberingAfterBreak="0">
     <w:nsid w:val="75C71CDC"/>
     <w:multiLevelType w:val="multilevel"/>
     <w:tmpl w:val="A3BE38A4"/>
@@ -21075,7 +21202,7 @@
     <w:abstractNumId w:val="2"/>
   </w:num>
   <w:num w:numId="6" w16cid:durableId="1134635881">
-    <w:abstractNumId w:val="3"/>
+    <w:abstractNumId w:val="4"/>
   </w:num>
   <w:num w:numId="7" w16cid:durableId="728455146">
     <w:abstractNumId w:val="1"/>
@@ -21089,11 +21216,14 @@
   <w:num w:numId="10" w16cid:durableId="1909227167">
     <w:abstractNumId w:val="1"/>
   </w:num>
+  <w:num w:numId="11" w16cid:durableId="774399038">
+    <w:abstractNumId w:val="3"/>
+  </w:num>
 </w:numbering>
 </file>
 
 <file path=word/people.xml><?xml version="1.0" encoding="utf-8"?>
-<w15:people xmlns:wpc="http://schemas.microsoft.com/office/word/2010/wordprocessingCanvas" xmlns:cx="http://schemas.microsoft.com/office/drawing/2014/chartex" xmlns:cx1="http://schemas.microsoft.com/office/drawing/2015/9/8/chartex" xmlns:cx2="http://schemas.microsoft.com/office/drawing/2015/10/21/chartex" xmlns:cx3="http://schemas.microsoft.com/office/drawing/2016/5/9/chartex" xmlns:cx4="http://schemas.microsoft.com/office/drawing/2016/5/10/chartex" xmlns:cx5="http://schemas.microsoft.com/office/drawing/2016/5/11/chartex" xmlns:cx6="http://schemas.microsoft.com/office/drawing/2016/5/12/chartex" xmlns:cx7="http://schemas.microsoft.com/office/drawing/2016/5/13/chartex" xmlns:cx8="http://schemas.microsoft.com/office/drawing/2016/5/14/chartex" xmlns:mc="http://schemas.openxmlformats.org/markup-compatibility/2006" xmlns:aink="http://schemas.microsoft.com/office/drawing/2016/ink" xmlns:am3d="http://schemas.microsoft.com/office/drawing/2017/model3d" xmlns:o="urn:schemas-microsoft-com:office:office" xmlns:oel="http://schemas.microsoft.com/office/2019/extlst" xmlns:r="http://schemas.openxmlformats.org/officeDocument/2006/relationships" xmlns:m="http://schemas.openxmlformats.org/officeDocument/2006/math" xmlns:v="urn:schemas-microsoft-com:vml" xmlns:wp14="http://schemas.microsoft.com/office/word/2010/wordprocessingDrawing" xmlns:wp="http://schemas.openxmlformats.org/drawingml/2006/wordprocessingDrawing" xmlns:w10="urn:schemas-microsoft-com:office:word" xmlns:w="http://schemas.openxmlformats.org/wordprocessingml/2006/main" xmlns:w14="http://schemas.microsoft.com/office/word/2010/wordml" xmlns:w15="http://schemas.microsoft.com/office/word/2012/wordml" xmlns:w16cex="http://schemas.microsoft.com/office/word/2018/wordml/cex" xmlns:w16cid="http://schemas.microsoft.com/office/word/2016/wordml/cid" xmlns:w16="http://schemas.microsoft.com/office/word/2018/wordml" xmlns:w16du="http://schemas.microsoft.com/office/word/2023/wordml/word16du" xmlns:w16sdtdh="http://schemas.microsoft.com/office/word/2020/wordml/sdtdatahash" xmlns:w16sdtfl="http://schemas.microsoft.com/office/word/2024/wordml/sdtformatlock" xmlns:w16se="http://schemas.microsoft.com/office/word/2015/wordml/symex" xmlns:wpg="http://schemas.microsoft.com/office/word/2010/wordprocessingGroup" xmlns:wpi="http://schemas.microsoft.com/office/word/2010/wordprocessingInk" xmlns:wne="http://schemas.microsoft.com/office/word/2006/wordml" xmlns:wps="http://schemas.microsoft.com/office/word/2010/wordprocessingShape" mc:Ignorable="w14 w15 w16se w16cid w16 w16cex w16sdtdh w16sdtfl w16du wp14">
+<w15:people xmlns:wpc="http://schemas.microsoft.com/office/word/2010/wordprocessingCanvas" xmlns:cx="http://schemas.microsoft.com/office/drawing/2014/chartex" xmlns:cx1="http://schemas.microsoft.com/office/drawing/2015/9/8/chartex" xmlns:cx2="http://schemas.microsoft.com/office/drawing/2015/10/21/chartex" xmlns:cx3="http://schemas.microsoft.com/office/drawing/2016/5/9/chartex" xmlns:cx4="http://schemas.microsoft.com/office/drawing/2016/5/10/chartex" xmlns:cx5="http://schemas.microsoft.com/office/drawing/2016/5/11/chartex" xmlns:cx6="http://schemas.microsoft.com/office/drawing/2016/5/12/chartex" xmlns:cx7="http://schemas.microsoft.com/office/drawing/2016/5/13/chartex" xmlns:cx8="http://schemas.microsoft.com/office/drawing/2016/5/14/chartex" xmlns:mc="http://schemas.openxmlformats.org/markup-compatibility/2006" xmlns:m="http://schemas.openxmlformats.org/officeDocument/2006/math" xmlns:aink="http://schemas.microsoft.com/office/drawing/2016/ink" xmlns:am3d="http://schemas.microsoft.com/office/drawing/2017/model3d" xmlns:oel="http://schemas.microsoft.com/office/2019/extlst" xmlns:r="http://schemas.openxmlformats.org/officeDocument/2006/relationships" xmlns:wp14="http://schemas.microsoft.com/office/word/2010/wordprocessingDrawing" xmlns:wp="http://schemas.openxmlformats.org/drawingml/2006/wordprocessingDrawing" xmlns:wpg="http://schemas.microsoft.com/office/word/2010/wordprocessingGroup" xmlns:wpi="http://schemas.microsoft.com/office/word/2010/wordprocessingInk" xmlns:wps="http://schemas.microsoft.com/office/word/2010/wordprocessingShape" xmlns:o="urn:schemas-microsoft-com:office:office" xmlns:v="urn:schemas-microsoft-com:vml" xmlns:w10="urn:schemas-microsoft-com:office:word" xmlns:w="http://schemas.openxmlformats.org/wordprocessingml/2006/main" xmlns:w14="http://schemas.microsoft.com/office/word/2010/wordml" xmlns:w15="http://schemas.microsoft.com/office/word/2012/wordml" xmlns:w16cex="http://schemas.microsoft.com/office/word/2018/wordml/cex" xmlns:w16cid="http://schemas.microsoft.com/office/word/2016/wordml/cid" xmlns:w16="http://schemas.microsoft.com/office/word/2018/wordml" xmlns:w16sdtdh="http://schemas.microsoft.com/office/word/2020/wordml/sdtdatahash" xmlns:w16sdtfl="http://schemas.microsoft.com/office/word/2024/wordml/sdtformatlock" xmlns:w16se="http://schemas.microsoft.com/office/word/2015/wordml/symex" xmlns:w16du="http://schemas.microsoft.com/office/word/2023/wordml/word16du" xmlns:wne="http://schemas.microsoft.com/office/word/2006/wordml" mc:Ignorable="w14 w15 w16se w16cid w16 w16cex w16sdtdh w16sdtfl w16du wp14">
   <w15:person w15:author="Alex Fisher">
     <w15:presenceInfo w15:providerId="AD" w15:userId="S::amf0080@auburn.edu::18480bde-8768-4851-bd71-24a6dd2d4725"/>
   </w15:person>
@@ -21104,7 +21234,7 @@
 </file>
 
 <file path=word/styles.xml><?xml version="1.0" encoding="utf-8"?>
-<w:styles xmlns:mc="http://schemas.openxmlformats.org/markup-compatibility/2006" xmlns:r="http://schemas.openxmlformats.org/officeDocument/2006/relationships" xmlns:w="http://schemas.openxmlformats.org/wordprocessingml/2006/main" xmlns:w14="http://schemas.microsoft.com/office/word/2010/wordml" xmlns:w15="http://schemas.microsoft.com/office/word/2012/wordml" xmlns:w16cex="http://schemas.microsoft.com/office/word/2018/wordml/cex" xmlns:w16cid="http://schemas.microsoft.com/office/word/2016/wordml/cid" xmlns:w16="http://schemas.microsoft.com/office/word/2018/wordml" xmlns:w16du="http://schemas.microsoft.com/office/word/2023/wordml/word16du" xmlns:w16sdtdh="http://schemas.microsoft.com/office/word/2020/wordml/sdtdatahash" xmlns:w16sdtfl="http://schemas.microsoft.com/office/word/2024/wordml/sdtformatlock" xmlns:w16se="http://schemas.microsoft.com/office/word/2015/wordml/symex" mc:Ignorable="w14 w15 w16se w16cid w16 w16cex w16sdtdh w16sdtfl w16du">
+<w:styles xmlns:mc="http://schemas.openxmlformats.org/markup-compatibility/2006" xmlns:r="http://schemas.openxmlformats.org/officeDocument/2006/relationships" xmlns:w="http://schemas.openxmlformats.org/wordprocessingml/2006/main" xmlns:w14="http://schemas.microsoft.com/office/word/2010/wordml" xmlns:w15="http://schemas.microsoft.com/office/word/2012/wordml" xmlns:w16cex="http://schemas.microsoft.com/office/word/2018/wordml/cex" xmlns:w16cid="http://schemas.microsoft.com/office/word/2016/wordml/cid" xmlns:w16="http://schemas.microsoft.com/office/word/2018/wordml" xmlns:w16sdtdh="http://schemas.microsoft.com/office/word/2020/wordml/sdtdatahash" xmlns:w16sdtfl="http://schemas.microsoft.com/office/word/2024/wordml/sdtformatlock" xmlns:w16se="http://schemas.microsoft.com/office/word/2015/wordml/symex" xmlns:w16du="http://schemas.microsoft.com/office/word/2023/wordml/word16du" mc:Ignorable="w14 w15 w16se w16cid w16 w16cex w16sdtdh w16sdtfl w16du">
   <w:docDefaults>
     <w:rPrDefault>
       <w:rPr>
@@ -21532,7 +21662,6 @@
   <w:style w:type="character" w:default="1" w:styleId="DefaultParagraphFont">
     <w:name w:val="Default Paragraph Font"/>
     <w:uiPriority w:val="1"/>
-    <w:semiHidden/>
     <w:unhideWhenUsed/>
   </w:style>
   <w:style w:type="table" w:default="1" w:styleId="TableNormal">
@@ -22099,7 +22228,7 @@
 </file>
 
 <file path=word/glossary/document.xml><?xml version="1.0" encoding="utf-8"?>
-<w:glossaryDocument xmlns:wpc="http://schemas.microsoft.com/office/word/2010/wordprocessingCanvas" xmlns:cx="http://schemas.microsoft.com/office/drawing/2014/chartex" xmlns:cx1="http://schemas.microsoft.com/office/drawing/2015/9/8/chartex" xmlns:cx2="http://schemas.microsoft.com/office/drawing/2015/10/21/chartex" xmlns:cx3="http://schemas.microsoft.com/office/drawing/2016/5/9/chartex" xmlns:cx4="http://schemas.microsoft.com/office/drawing/2016/5/10/chartex" xmlns:cx5="http://schemas.microsoft.com/office/drawing/2016/5/11/chartex" xmlns:cx6="http://schemas.microsoft.com/office/drawing/2016/5/12/chartex" xmlns:cx7="http://schemas.microsoft.com/office/drawing/2016/5/13/chartex" xmlns:cx8="http://schemas.microsoft.com/office/drawing/2016/5/14/chartex" xmlns:mc="http://schemas.openxmlformats.org/markup-compatibility/2006" xmlns:aink="http://schemas.microsoft.com/office/drawing/2016/ink" xmlns:am3d="http://schemas.microsoft.com/office/drawing/2017/model3d" xmlns:o="urn:schemas-microsoft-com:office:office" xmlns:oel="http://schemas.microsoft.com/office/2019/extlst" xmlns:r="http://schemas.openxmlformats.org/officeDocument/2006/relationships" xmlns:m="http://schemas.openxmlformats.org/officeDocument/2006/math" xmlns:v="urn:schemas-microsoft-com:vml" xmlns:wp14="http://schemas.microsoft.com/office/word/2010/wordprocessingDrawing" xmlns:wp="http://schemas.openxmlformats.org/drawingml/2006/wordprocessingDrawing" xmlns:w10="urn:schemas-microsoft-com:office:word" xmlns:w="http://schemas.openxmlformats.org/wordprocessingml/2006/main" xmlns:w14="http://schemas.microsoft.com/office/word/2010/wordml" xmlns:w15="http://schemas.microsoft.com/office/word/2012/wordml" xmlns:w16cex="http://schemas.microsoft.com/office/word/2018/wordml/cex" xmlns:w16cid="http://schemas.microsoft.com/office/word/2016/wordml/cid" xmlns:w16="http://schemas.microsoft.com/office/word/2018/wordml" xmlns:w16du="http://schemas.microsoft.com/office/word/2023/wordml/word16du" xmlns:w16sdtdh="http://schemas.microsoft.com/office/word/2020/wordml/sdtdatahash" xmlns:w16sdtfl="http://schemas.microsoft.com/office/word/2024/wordml/sdtformatlock" xmlns:w16se="http://schemas.microsoft.com/office/word/2015/wordml/symex" xmlns:wpg="http://schemas.microsoft.com/office/word/2010/wordprocessingGroup" xmlns:wpi="http://schemas.microsoft.com/office/word/2010/wordprocessingInk" xmlns:wne="http://schemas.microsoft.com/office/word/2006/wordml" xmlns:wps="http://schemas.microsoft.com/office/word/2010/wordprocessingShape" mc:Ignorable="w14 w15 w16se w16cid w16 w16cex w16sdtdh w16sdtfl w16du wp14">
+<w:glossaryDocument xmlns:wpc="http://schemas.microsoft.com/office/word/2010/wordprocessingCanvas" xmlns:cx="http://schemas.microsoft.com/office/drawing/2014/chartex" xmlns:cx1="http://schemas.microsoft.com/office/drawing/2015/9/8/chartex" xmlns:cx2="http://schemas.microsoft.com/office/drawing/2015/10/21/chartex" xmlns:cx3="http://schemas.microsoft.com/office/drawing/2016/5/9/chartex" xmlns:cx4="http://schemas.microsoft.com/office/drawing/2016/5/10/chartex" xmlns:cx5="http://schemas.microsoft.com/office/drawing/2016/5/11/chartex" xmlns:cx6="http://schemas.microsoft.com/office/drawing/2016/5/12/chartex" xmlns:cx7="http://schemas.microsoft.com/office/drawing/2016/5/13/chartex" xmlns:cx8="http://schemas.microsoft.com/office/drawing/2016/5/14/chartex" xmlns:mc="http://schemas.openxmlformats.org/markup-compatibility/2006" xmlns:m="http://schemas.openxmlformats.org/officeDocument/2006/math" xmlns:aink="http://schemas.microsoft.com/office/drawing/2016/ink" xmlns:am3d="http://schemas.microsoft.com/office/drawing/2017/model3d" xmlns:oel="http://schemas.microsoft.com/office/2019/extlst" xmlns:r="http://schemas.openxmlformats.org/officeDocument/2006/relationships" xmlns:wp14="http://schemas.microsoft.com/office/word/2010/wordprocessingDrawing" xmlns:wp="http://schemas.openxmlformats.org/drawingml/2006/wordprocessingDrawing" xmlns:wpg="http://schemas.microsoft.com/office/word/2010/wordprocessingGroup" xmlns:wpi="http://schemas.microsoft.com/office/word/2010/wordprocessingInk" xmlns:wps="http://schemas.microsoft.com/office/word/2010/wordprocessingShape" xmlns:o="urn:schemas-microsoft-com:office:office" xmlns:v="urn:schemas-microsoft-com:vml" xmlns:w10="urn:schemas-microsoft-com:office:word" xmlns:w="http://schemas.openxmlformats.org/wordprocessingml/2006/main" xmlns:w14="http://schemas.microsoft.com/office/word/2010/wordml" xmlns:w15="http://schemas.microsoft.com/office/word/2012/wordml" xmlns:w16cex="http://schemas.microsoft.com/office/word/2018/wordml/cex" xmlns:w16cid="http://schemas.microsoft.com/office/word/2016/wordml/cid" xmlns:w16="http://schemas.microsoft.com/office/word/2018/wordml" xmlns:w16sdtdh="http://schemas.microsoft.com/office/word/2020/wordml/sdtdatahash" xmlns:w16sdtfl="http://schemas.microsoft.com/office/word/2024/wordml/sdtformatlock" xmlns:w16se="http://schemas.microsoft.com/office/word/2015/wordml/symex" xmlns:w16du="http://schemas.microsoft.com/office/word/2023/wordml/word16du" xmlns:wne="http://schemas.microsoft.com/office/word/2006/wordml" mc:Ignorable="w14 w15 w16se w16cid w16 w16cex w16sdtdh w16sdtfl w16du wp14">
   <w:docParts>
     <w:docPart>
       <w:docPartPr>
@@ -22538,7 +22667,7 @@
 </file>
 
 <file path=word/glossary/fontTable.xml><?xml version="1.0" encoding="utf-8"?>
-<w:fonts xmlns:mc="http://schemas.openxmlformats.org/markup-compatibility/2006" xmlns:r="http://schemas.openxmlformats.org/officeDocument/2006/relationships" xmlns:w="http://schemas.openxmlformats.org/wordprocessingml/2006/main" xmlns:w14="http://schemas.microsoft.com/office/word/2010/wordml" xmlns:w15="http://schemas.microsoft.com/office/word/2012/wordml" xmlns:w16cex="http://schemas.microsoft.com/office/word/2018/wordml/cex" xmlns:w16cid="http://schemas.microsoft.com/office/word/2016/wordml/cid" xmlns:w16="http://schemas.microsoft.com/office/word/2018/wordml" xmlns:w16du="http://schemas.microsoft.com/office/word/2023/wordml/word16du" xmlns:w16sdtdh="http://schemas.microsoft.com/office/word/2020/wordml/sdtdatahash" xmlns:w16sdtfl="http://schemas.microsoft.com/office/word/2024/wordml/sdtformatlock" xmlns:w16se="http://schemas.microsoft.com/office/word/2015/wordml/symex" mc:Ignorable="w14 w15 w16se w16cid w16 w16cex w16sdtdh w16sdtfl w16du">
+<w:fonts xmlns:mc="http://schemas.openxmlformats.org/markup-compatibility/2006" xmlns:r="http://schemas.openxmlformats.org/officeDocument/2006/relationships" xmlns:w="http://schemas.openxmlformats.org/wordprocessingml/2006/main" xmlns:w14="http://schemas.microsoft.com/office/word/2010/wordml" xmlns:w15="http://schemas.microsoft.com/office/word/2012/wordml" xmlns:w16cex="http://schemas.microsoft.com/office/word/2018/wordml/cex" xmlns:w16cid="http://schemas.microsoft.com/office/word/2016/wordml/cid" xmlns:w16="http://schemas.microsoft.com/office/word/2018/wordml" xmlns:w16sdtdh="http://schemas.microsoft.com/office/word/2020/wordml/sdtdatahash" xmlns:w16sdtfl="http://schemas.microsoft.com/office/word/2024/wordml/sdtformatlock" xmlns:w16se="http://schemas.microsoft.com/office/word/2015/wordml/symex" xmlns:w16du="http://schemas.microsoft.com/office/word/2023/wordml/word16du" mc:Ignorable="w14 w15 w16se w16cid w16 w16cex w16sdtdh w16sdtfl w16du">
   <w:font w:name="Symbol">
     <w:panose1 w:val="05050102010706020507"/>
     <w:charset w:val="02"/>
@@ -22644,7 +22773,7 @@
 </file>
 
 <file path=word/glossary/settings.xml><?xml version="1.0" encoding="utf-8"?>
-<w:settings xmlns:mc="http://schemas.openxmlformats.org/markup-compatibility/2006" xmlns:o="urn:schemas-microsoft-com:office:office" xmlns:r="http://schemas.openxmlformats.org/officeDocument/2006/relationships" xmlns:m="http://schemas.openxmlformats.org/officeDocument/2006/math" xmlns:v="urn:schemas-microsoft-com:vml" xmlns:w10="urn:schemas-microsoft-com:office:word" xmlns:w="http://schemas.openxmlformats.org/wordprocessingml/2006/main" xmlns:w14="http://schemas.microsoft.com/office/word/2010/wordml" xmlns:w15="http://schemas.microsoft.com/office/word/2012/wordml" xmlns:w16cex="http://schemas.microsoft.com/office/word/2018/wordml/cex" xmlns:w16cid="http://schemas.microsoft.com/office/word/2016/wordml/cid" xmlns:w16="http://schemas.microsoft.com/office/word/2018/wordml" xmlns:w16du="http://schemas.microsoft.com/office/word/2023/wordml/word16du" xmlns:w16sdtdh="http://schemas.microsoft.com/office/word/2020/wordml/sdtdatahash" xmlns:w16sdtfl="http://schemas.microsoft.com/office/word/2024/wordml/sdtformatlock" xmlns:w16se="http://schemas.microsoft.com/office/word/2015/wordml/symex" xmlns:sl="http://schemas.openxmlformats.org/schemaLibrary/2006/main" mc:Ignorable="w14 w15 w16se w16cid w16 w16cex w16sdtdh w16sdtfl w16du">
+<w:settings xmlns:mc="http://schemas.openxmlformats.org/markup-compatibility/2006" xmlns:m="http://schemas.openxmlformats.org/officeDocument/2006/math" xmlns:r="http://schemas.openxmlformats.org/officeDocument/2006/relationships" xmlns:sl="http://schemas.openxmlformats.org/schemaLibrary/2006/main" xmlns:o="urn:schemas-microsoft-com:office:office" xmlns:v="urn:schemas-microsoft-com:vml" xmlns:w10="urn:schemas-microsoft-com:office:word" xmlns:w="http://schemas.openxmlformats.org/wordprocessingml/2006/main" xmlns:w14="http://schemas.microsoft.com/office/word/2010/wordml" xmlns:w15="http://schemas.microsoft.com/office/word/2012/wordml" xmlns:w16cex="http://schemas.microsoft.com/office/word/2018/wordml/cex" xmlns:w16cid="http://schemas.microsoft.com/office/word/2016/wordml/cid" xmlns:w16="http://schemas.microsoft.com/office/word/2018/wordml" xmlns:w16sdtdh="http://schemas.microsoft.com/office/word/2020/wordml/sdtdatahash" xmlns:w16sdtfl="http://schemas.microsoft.com/office/word/2024/wordml/sdtformatlock" xmlns:w16se="http://schemas.microsoft.com/office/word/2015/wordml/symex" xmlns:w16du="http://schemas.microsoft.com/office/word/2023/wordml/word16du" mc:Ignorable="w14 w15 w16se w16cid w16 w16cex w16sdtdh w16sdtfl w16du">
   <w:view w:val="normal"/>
   <w:revisionView w:formatting="0"/>
   <w:defaultTabStop w:val="720"/>
@@ -22685,6 +22814,7 @@
     <w:rsid w:val="00425646"/>
     <w:rsid w:val="004547A8"/>
     <w:rsid w:val="00464955"/>
+    <w:rsid w:val="00480F4A"/>
     <w:rsid w:val="004E0815"/>
     <w:rsid w:val="00506BE4"/>
     <w:rsid w:val="005250F7"/>
@@ -22710,6 +22840,7 @@
     <w:rsid w:val="00841044"/>
     <w:rsid w:val="00845013"/>
     <w:rsid w:val="008A5A4E"/>
+    <w:rsid w:val="008B4C3E"/>
     <w:rsid w:val="008C6B84"/>
     <w:rsid w:val="008D1264"/>
     <w:rsid w:val="008D6715"/>
@@ -22762,7 +22893,7 @@
 </file>
 
 <file path=word/glossary/styles.xml><?xml version="1.0" encoding="utf-8"?>
-<w:styles xmlns:mc="http://schemas.openxmlformats.org/markup-compatibility/2006" xmlns:r="http://schemas.openxmlformats.org/officeDocument/2006/relationships" xmlns:w="http://schemas.openxmlformats.org/wordprocessingml/2006/main" xmlns:w14="http://schemas.microsoft.com/office/word/2010/wordml" xmlns:w15="http://schemas.microsoft.com/office/word/2012/wordml" xmlns:w16cex="http://schemas.microsoft.com/office/word/2018/wordml/cex" xmlns:w16cid="http://schemas.microsoft.com/office/word/2016/wordml/cid" xmlns:w16="http://schemas.microsoft.com/office/word/2018/wordml" xmlns:w16du="http://schemas.microsoft.com/office/word/2023/wordml/word16du" xmlns:w16sdtdh="http://schemas.microsoft.com/office/word/2020/wordml/sdtdatahash" xmlns:w16sdtfl="http://schemas.microsoft.com/office/word/2024/wordml/sdtformatlock" xmlns:w16se="http://schemas.microsoft.com/office/word/2015/wordml/symex" mc:Ignorable="w14 w15 w16se w16cid w16 w16cex w16sdtdh w16sdtfl w16du">
+<w:styles xmlns:mc="http://schemas.openxmlformats.org/markup-compatibility/2006" xmlns:r="http://schemas.openxmlformats.org/officeDocument/2006/relationships" xmlns:w="http://schemas.openxmlformats.org/wordprocessingml/2006/main" xmlns:w14="http://schemas.microsoft.com/office/word/2010/wordml" xmlns:w15="http://schemas.microsoft.com/office/word/2012/wordml" xmlns:w16cex="http://schemas.microsoft.com/office/word/2018/wordml/cex" xmlns:w16cid="http://schemas.microsoft.com/office/word/2016/wordml/cid" xmlns:w16="http://schemas.microsoft.com/office/word/2018/wordml" xmlns:w16sdtdh="http://schemas.microsoft.com/office/word/2020/wordml/sdtdatahash" xmlns:w16sdtfl="http://schemas.microsoft.com/office/word/2024/wordml/sdtformatlock" xmlns:w16se="http://schemas.microsoft.com/office/word/2015/wordml/symex" xmlns:w16du="http://schemas.microsoft.com/office/word/2023/wordml/word16du" mc:Ignorable="w14 w15 w16se w16cid w16 w16cex w16sdtdh w16sdtfl w16du">
   <w:docDefaults>
     <w:rPrDefault>
       <w:rPr>
@@ -23259,7 +23390,7 @@
 </file>
 
 <file path=word/glossary/webSettings.xml><?xml version="1.0" encoding="utf-8"?>
-<w:webSettings xmlns:mc="http://schemas.openxmlformats.org/markup-compatibility/2006" xmlns:r="http://schemas.openxmlformats.org/officeDocument/2006/relationships" xmlns:w="http://schemas.openxmlformats.org/wordprocessingml/2006/main" xmlns:w14="http://schemas.microsoft.com/office/word/2010/wordml" xmlns:w15="http://schemas.microsoft.com/office/word/2012/wordml" xmlns:w16cex="http://schemas.microsoft.com/office/word/2018/wordml/cex" xmlns:w16cid="http://schemas.microsoft.com/office/word/2016/wordml/cid" xmlns:w16="http://schemas.microsoft.com/office/word/2018/wordml" xmlns:w16du="http://schemas.microsoft.com/office/word/2023/wordml/word16du" xmlns:w16sdtdh="http://schemas.microsoft.com/office/word/2020/wordml/sdtdatahash" xmlns:w16sdtfl="http://schemas.microsoft.com/office/word/2024/wordml/sdtformatlock" xmlns:w16se="http://schemas.microsoft.com/office/word/2015/wordml/symex" mc:Ignorable="w14 w15 w16se w16cid w16 w16cex w16sdtdh w16sdtfl w16du">
+<w:webSettings xmlns:mc="http://schemas.openxmlformats.org/markup-compatibility/2006" xmlns:r="http://schemas.openxmlformats.org/officeDocument/2006/relationships" xmlns:w="http://schemas.openxmlformats.org/wordprocessingml/2006/main" xmlns:w14="http://schemas.microsoft.com/office/word/2010/wordml" xmlns:w15="http://schemas.microsoft.com/office/word/2012/wordml" xmlns:w16cex="http://schemas.microsoft.com/office/word/2018/wordml/cex" xmlns:w16cid="http://schemas.microsoft.com/office/word/2016/wordml/cid" xmlns:w16="http://schemas.microsoft.com/office/word/2018/wordml" xmlns:w16sdtdh="http://schemas.microsoft.com/office/word/2020/wordml/sdtdatahash" xmlns:w16sdtfl="http://schemas.microsoft.com/office/word/2024/wordml/sdtformatlock" xmlns:w16se="http://schemas.microsoft.com/office/word/2015/wordml/symex" xmlns:w16du="http://schemas.microsoft.com/office/word/2023/wordml/word16du" mc:Ignorable="w14 w15 w16se w16cid w16 w16cex w16sdtdh w16sdtfl w16du">
   <w:optimizeForBrowser/>
   <w:allowPNG/>
 </w:webSettings>
@@ -23561,6 +23692,25 @@
 </file>
 
 <file path=customXml/item1.xml><?xml version="1.0" encoding="utf-8"?>
+<?mso-contentType ?>
+<FormTemplates xmlns="http://schemas.microsoft.com/sharepoint/v3/contenttype/forms">
+  <Display>DocumentLibraryForm</Display>
+  <Edit>DocumentLibraryForm</Edit>
+  <New>DocumentLibraryForm</New>
+</FormTemplates>
+</file>
+
+<file path=customXml/item2.xml><?xml version="1.0" encoding="utf-8"?>
+<b:Sources xmlns:b="http://schemas.openxmlformats.org/officeDocument/2006/bibliography" xmlns="http://schemas.openxmlformats.org/officeDocument/2006/bibliography" SelectedStyle="\APASixthEditionOfficeOnline.xsl" StyleName="APA" Version="6"/>
+</file>
+
+<file path=customXml/item3.xml><?xml version="1.0" encoding="utf-8"?>
+<p:properties xmlns:p="http://schemas.microsoft.com/office/2006/metadata/properties" xmlns:xsi="http://www.w3.org/2001/XMLSchema-instance" xmlns:pc="http://schemas.microsoft.com/office/infopath/2007/PartnerControls">
+  <documentManagement/>
+</p:properties>
+</file>
+
+<file path=customXml/item4.xml><?xml version="1.0" encoding="utf-8"?>
 <ct:contentTypeSchema xmlns:ct="http://schemas.microsoft.com/office/2006/metadata/contentType" xmlns:ma="http://schemas.microsoft.com/office/2006/metadata/properties/metaAttributes" ct:_="" ma:_="" ma:contentTypeName="Document" ma:contentTypeID="0x01010071543618D710814CB7A5D363A31D1B96" ma:contentTypeVersion="4" ma:contentTypeDescription="Create a new document." ma:contentTypeScope="" ma:versionID="56f6942f173b961896c388446d456582">
   <xsd:schema xmlns:xsd="http://www.w3.org/2001/XMLSchema" xmlns:xs="http://www.w3.org/2001/XMLSchema" xmlns:p="http://schemas.microsoft.com/office/2006/metadata/properties" xmlns:ns2="880a7bf2-c82d-49e4-b898-1932dfa2e071" targetNamespace="http://schemas.microsoft.com/office/2006/metadata/properties" ma:root="true" ma:fieldsID="a0ff5c3bf694fef035fbd678bebf06c6" ns2:_="">
     <xsd:import namespace="880a7bf2-c82d-49e4-b898-1932dfa2e071"/>
@@ -23704,26 +23854,32 @@
 </ct:contentTypeSchema>
 </file>
 
-<file path=customXml/item2.xml><?xml version="1.0" encoding="utf-8"?>
-<?mso-contentType ?>
-<FormTemplates xmlns="http://schemas.microsoft.com/sharepoint/v3/contenttype/forms">
-  <Display>DocumentLibraryForm</Display>
-  <Edit>DocumentLibraryForm</Edit>
-  <New>DocumentLibraryForm</New>
-</FormTemplates>
+<file path=customXml/itemProps1.xml><?xml version="1.0" encoding="utf-8"?>
+<ds:datastoreItem xmlns:ds="http://schemas.openxmlformats.org/officeDocument/2006/customXml" ds:itemID="{1DBB1093-F880-422D-86C1-617F7DAEF962}">
+  <ds:schemaRefs>
+    <ds:schemaRef ds:uri="http://schemas.microsoft.com/sharepoint/v3/contenttype/forms"/>
+  </ds:schemaRefs>
+</ds:datastoreItem>
 </file>
 
-<file path=customXml/item3.xml><?xml version="1.0" encoding="utf-8"?>
-<p:properties xmlns:p="http://schemas.microsoft.com/office/2006/metadata/properties" xmlns:xsi="http://www.w3.org/2001/XMLSchema-instance" xmlns:pc="http://schemas.microsoft.com/office/infopath/2007/PartnerControls">
-  <documentManagement/>
-</p:properties>
+<file path=customXml/itemProps2.xml><?xml version="1.0" encoding="utf-8"?>
+<ds:datastoreItem xmlns:ds="http://schemas.openxmlformats.org/officeDocument/2006/customXml" ds:itemID="{C7DBFB5B-A178-7D45-BBE9-88A65BCF52B8}">
+  <ds:schemaRefs>
+    <ds:schemaRef ds:uri="http://schemas.openxmlformats.org/officeDocument/2006/bibliography"/>
+  </ds:schemaRefs>
+</ds:datastoreItem>
 </file>
 
-<file path=customXml/item4.xml><?xml version="1.0" encoding="utf-8"?>
-<b:Sources xmlns:b="http://schemas.openxmlformats.org/officeDocument/2006/bibliography" xmlns="http://schemas.openxmlformats.org/officeDocument/2006/bibliography" SelectedStyle="\APASixthEditionOfficeOnline.xsl" StyleName="APA" Version="6"/>
+<file path=customXml/itemProps3.xml><?xml version="1.0" encoding="utf-8"?>
+<ds:datastoreItem xmlns:ds="http://schemas.openxmlformats.org/officeDocument/2006/customXml" ds:itemID="{4583F2B3-037C-44DB-B08D-E6F378EEF829}">
+  <ds:schemaRefs>
+    <ds:schemaRef ds:uri="http://schemas.microsoft.com/office/2006/metadata/properties"/>
+    <ds:schemaRef ds:uri="http://schemas.microsoft.com/office/infopath/2007/PartnerControls"/>
+  </ds:schemaRefs>
+</ds:datastoreItem>
 </file>
 
-<file path=customXml/itemProps1.xml><?xml version="1.0" encoding="utf-8"?>
+<file path=customXml/itemProps4.xml><?xml version="1.0" encoding="utf-8"?>
 <ds:datastoreItem xmlns:ds="http://schemas.openxmlformats.org/officeDocument/2006/customXml" ds:itemID="{C41636AD-22E5-42B9-BEC5-875C4017A51E}">
   <ds:schemaRefs>
     <ds:schemaRef ds:uri="http://schemas.microsoft.com/office/2006/metadata/contentType"/>
@@ -23739,29 +23895,4 @@
     <ds:schemaRef ds:uri="http://schemas.microsoft.com/internal/obd"/>
   </ds:schemaRefs>
 </ds:datastoreItem>
-</file>
-
-<file path=customXml/itemProps2.xml><?xml version="1.0" encoding="utf-8"?>
-<ds:datastoreItem xmlns:ds="http://schemas.openxmlformats.org/officeDocument/2006/customXml" ds:itemID="{1DBB1093-F880-422D-86C1-617F7DAEF962}">
-  <ds:schemaRefs>
-    <ds:schemaRef ds:uri="http://schemas.microsoft.com/sharepoint/v3/contenttype/forms"/>
-  </ds:schemaRefs>
-</ds:datastoreItem>
-</file>
-
-<file path=customXml/itemProps3.xml><?xml version="1.0" encoding="utf-8"?>
-<ds:datastoreItem xmlns:ds="http://schemas.openxmlformats.org/officeDocument/2006/customXml" ds:itemID="{4583F2B3-037C-44DB-B08D-E6F378EEF829}">
-  <ds:schemaRefs>
-    <ds:schemaRef ds:uri="http://schemas.microsoft.com/office/2006/metadata/properties"/>
-    <ds:schemaRef ds:uri="http://schemas.microsoft.com/office/infopath/2007/PartnerControls"/>
-  </ds:schemaRefs>
-</ds:datastoreItem>
-</file>
-
-<file path=customXml/itemProps4.xml><?xml version="1.0" encoding="utf-8"?>
-<ds:datastoreItem xmlns:ds="http://schemas.openxmlformats.org/officeDocument/2006/customXml" ds:itemID="{C7DBFB5B-A178-7D45-BBE9-88A65BCF52B8}">
-  <ds:schemaRefs>
-    <ds:schemaRef ds:uri="http://schemas.openxmlformats.org/officeDocument/2006/bibliography"/>
-  </ds:schemaRefs>
-</ds:datastoreItem>
 </file>
</xml_diff>

<commit_message>
updated survey protocol and letter
</commit_message>
<xml_diff>
--- a/Documents /HRP-503 - TEMPLATE PROTOCOL .docx
+++ b/Documents /HRP-503 - TEMPLATE PROTOCOL .docx
@@ -4775,7 +4775,7 @@
           <w:color w:val="000000" w:themeColor="text1"/>
           <w:sz w:val="22"/>
         </w:rPr>
-        <w:t xml:space="preserve">Zoonotic diseases that spill over between wildlife, domestic animals, and humans represent a growing risk to public health, with over 60% of emerging human infectious diseases originating in wildlife (Jones et al. 2008). These spillover events begin at small-scale interfaces where humans, wildlife, and domestic animals come into close contact, yet most research on emerging infectious disease characterizes prevalence and risk at broad spatial scales rather than at the </w:t>
+        <w:t xml:space="preserve">Zoonotic diseases that </w:t>
       </w:r>
       <w:r>
         <w:rPr>
@@ -4783,6 +4783,22 @@
           <w:color w:val="000000" w:themeColor="text1"/>
           <w:sz w:val="22"/>
         </w:rPr>
+        <w:t>infect</w:t>
+      </w:r>
+      <w:r>
+        <w:rPr>
+          <w:rFonts w:ascii="Arial" w:hAnsi="Arial" w:cs="Arial"/>
+          <w:color w:val="000000" w:themeColor="text1"/>
+          <w:sz w:val="22"/>
+        </w:rPr>
+        <w:t xml:space="preserve"> wildlife, domestic animals, and humans represent a growing risk to public health, with over 60% of emerging human infectious diseases originating in wildlife (Jones et al. 2008). These spillover events begin at small-scale interfaces where humans, wildlife, and domestic animals come into close contact, yet most research on emerging infectious disease characterizes prevalence and risk at broad spatial scales rather than at the </w:t>
+      </w:r>
+      <w:r>
+        <w:rPr>
+          <w:rFonts w:ascii="Arial" w:hAnsi="Arial" w:cs="Arial"/>
+          <w:color w:val="000000" w:themeColor="text1"/>
+          <w:sz w:val="22"/>
+        </w:rPr>
         <w:t>fine, local</w:t>
       </w:r>
       <w:r>
@@ -4799,7 +4815,23 @@
           <w:color w:val="000000" w:themeColor="text1"/>
           <w:sz w:val="22"/>
         </w:rPr>
+        <w:t>s</w:t>
+      </w:r>
+      <w:r>
+        <w:rPr>
+          <w:rFonts w:ascii="Arial" w:hAnsi="Arial" w:cs="Arial"/>
+          <w:color w:val="000000" w:themeColor="text1"/>
+          <w:sz w:val="22"/>
+        </w:rPr>
         <w:t xml:space="preserve">, </w:t>
+      </w:r>
+      <w:r>
+        <w:rPr>
+          <w:rFonts w:ascii="Arial" w:hAnsi="Arial" w:cs="Arial"/>
+          <w:color w:val="000000" w:themeColor="text1"/>
+          <w:sz w:val="22"/>
+        </w:rPr>
+        <w:t xml:space="preserve">like backyards, </w:t>
       </w:r>
       <w:r>
         <w:rPr>
@@ -4891,7 +4923,23 @@
           <w:color w:val="000000" w:themeColor="text1"/>
           <w:sz w:val="22"/>
         </w:rPr>
-        <w:t xml:space="preserve"> are documented: a 2021 multi-state Salmonella Typhimurium outbreak linked to wild songbirds at residential feeders resulted in human hospitalizations across multiple states (CDC 2021; Patel et al. 2023), and backyard poultry contact has been identified as a growing source of human salmonellosis (CDC 2025).</w:t>
+        <w:t xml:space="preserve"> </w:t>
+      </w:r>
+      <w:r>
+        <w:rPr>
+          <w:rFonts w:ascii="Arial" w:hAnsi="Arial" w:cs="Arial"/>
+          <w:color w:val="000000" w:themeColor="text1"/>
+          <w:sz w:val="22"/>
+        </w:rPr>
+        <w:t>include</w:t>
+      </w:r>
+      <w:r>
+        <w:rPr>
+          <w:rFonts w:ascii="Arial" w:hAnsi="Arial" w:cs="Arial"/>
+          <w:color w:val="000000" w:themeColor="text1"/>
+          <w:sz w:val="22"/>
+        </w:rPr>
+        <w:t xml:space="preserve"> a 2021 multi-state Salmonella Typhimurium outbreak linked to wild songbirds at residential feeders resulted in human hospitalizations across multiple states (CDC 2021; Patel et al. 2023), and backyard poultry contact has been identified as a growing source of human salmonellosis (CDC 2025).</w:t>
       </w:r>
     </w:p>
     <w:p>
@@ -4927,7 +4975,7 @@
           <w:color w:val="000000" w:themeColor="text1"/>
           <w:sz w:val="22"/>
         </w:rPr>
-        <w:t xml:space="preserve"> that shape participant behavior at this interface remain poorly understood. Effective </w:t>
+        <w:t xml:space="preserve"> that shape </w:t>
       </w:r>
       <w:r>
         <w:rPr>
@@ -4935,7 +4983,7 @@
           <w:color w:val="000000" w:themeColor="text1"/>
           <w:sz w:val="22"/>
         </w:rPr>
-        <w:t xml:space="preserve">public health </w:t>
+        <w:t>individual</w:t>
       </w:r>
       <w:r>
         <w:rPr>
@@ -4943,7 +4991,7 @@
           <w:color w:val="000000" w:themeColor="text1"/>
           <w:sz w:val="22"/>
         </w:rPr>
-        <w:t>biosecurity</w:t>
+        <w:t xml:space="preserve"> behavior at this interface remain poorly understood. Effective </w:t>
       </w:r>
       <w:r>
         <w:rPr>
@@ -4951,7 +4999,7 @@
           <w:color w:val="000000" w:themeColor="text1"/>
           <w:sz w:val="22"/>
         </w:rPr>
-        <w:t xml:space="preserve"> recommendations</w:t>
+        <w:t>public health recommendations</w:t>
       </w:r>
       <w:r>
         <w:rPr>
@@ -4967,7 +5015,7 @@
           <w:color w:val="000000" w:themeColor="text1"/>
           <w:sz w:val="22"/>
         </w:rPr>
-        <w:t xml:space="preserve"> nature</w:t>
+        <w:t xml:space="preserve"> </w:t>
       </w:r>
       <w:r>
         <w:rPr>
@@ -4975,7 +5023,7 @@
           <w:color w:val="000000" w:themeColor="text1"/>
           <w:sz w:val="22"/>
         </w:rPr>
-        <w:t xml:space="preserve"> conservation outreach depends not only on quantifying pathogen risk but on understanding how participants perceive that risk, what motivates their engagement</w:t>
+        <w:t xml:space="preserve">conservation outreach depend not only on pathogen risk but on understanding how </w:t>
       </w:r>
       <w:r>
         <w:rPr>
@@ -4983,6 +5031,22 @@
           <w:color w:val="000000" w:themeColor="text1"/>
           <w:sz w:val="22"/>
         </w:rPr>
+        <w:t>people</w:t>
+      </w:r>
+      <w:r>
+        <w:rPr>
+          <w:rFonts w:ascii="Arial" w:hAnsi="Arial" w:cs="Arial"/>
+          <w:color w:val="000000" w:themeColor="text1"/>
+          <w:sz w:val="22"/>
+        </w:rPr>
+        <w:t xml:space="preserve"> perceive that risk, what motivates their engagement</w:t>
+      </w:r>
+      <w:r>
+        <w:rPr>
+          <w:rFonts w:ascii="Arial" w:hAnsi="Arial" w:cs="Arial"/>
+          <w:color w:val="000000" w:themeColor="text1"/>
+          <w:sz w:val="22"/>
+        </w:rPr>
         <w:t xml:space="preserve"> in the activity</w:t>
       </w:r>
       <w:r>
@@ -4991,7 +5055,7 @@
           <w:color w:val="000000" w:themeColor="text1"/>
           <w:sz w:val="22"/>
         </w:rPr>
-        <w:t xml:space="preserve">, how knowledgeable they are about zoonotic disease, and how willing they are to adopt practices that reduce transmission. Prior surveys of backyard poultry and wildlife-feeding populations have examined zoonotic disease awareness and biosecurity knowledge (e.g., Nicholson et al. 2020; Kyle and Sutherland 2016), and research on backyard bird feeding has linked the activity to well-being, nature connectedness, and pro-conservation behavior (Cox and Gaston 2016; Dayer et al. 2019). However, these human dimensions—disease-risk perception, biosecurity engagement, place attachment, and conservation attitudes—have not been examined together in the populations </w:t>
+        <w:t>, how knowledgeable they are about zoonotic disease, and how willing they are to adopt practices that reduce</w:t>
       </w:r>
       <w:r>
         <w:rPr>
@@ -4999,8 +5063,39 @@
           <w:color w:val="000000" w:themeColor="text1"/>
           <w:sz w:val="22"/>
         </w:rPr>
-        <w:lastRenderedPageBreak/>
-        <w:t>who feed backyard birds and keep backyard poultry, particularly in the Southeastern United States.</w:t>
+        <w:t xml:space="preserve"> infection events</w:t>
+      </w:r>
+      <w:r>
+        <w:rPr>
+          <w:rFonts w:ascii="Arial" w:hAnsi="Arial" w:cs="Arial"/>
+          <w:color w:val="000000" w:themeColor="text1"/>
+          <w:sz w:val="22"/>
+        </w:rPr>
+        <w:t xml:space="preserve">. Prior surveys of backyard poultry and wildlife-feeding populations have examined zoonotic disease awareness and biosecurity knowledge (e.g., Nicholson et al. 2020; Kyle and Sutherland 2016), and research on backyard bird feeding has linked the activity to well-being, nature connectedness, and pro-conservation behavior </w:t>
+      </w:r>
+      <w:r>
+        <w:rPr>
+          <w:rFonts w:ascii="Arial" w:hAnsi="Arial" w:cs="Arial"/>
+          <w:color w:val="000000" w:themeColor="text1"/>
+          <w:sz w:val="22"/>
+        </w:rPr>
+        <w:t>of the participant</w:t>
+      </w:r>
+      <w:r>
+        <w:rPr>
+          <w:rFonts w:ascii="Arial" w:hAnsi="Arial" w:cs="Arial"/>
+          <w:color w:val="000000" w:themeColor="text1"/>
+          <w:sz w:val="22"/>
+        </w:rPr>
+        <w:t xml:space="preserve"> (</w:t>
+      </w:r>
+      <w:r>
+        <w:rPr>
+          <w:rFonts w:ascii="Arial" w:hAnsi="Arial" w:cs="Arial"/>
+          <w:color w:val="000000" w:themeColor="text1"/>
+          <w:sz w:val="22"/>
+        </w:rPr>
+        <w:t>Cox and Gaston 2016; Dayer et al. 2019). have not been examined together in the populations who feed backyard birds and keep backyard poultry, particularly in the Southeastern United States.</w:t>
       </w:r>
     </w:p>
     <w:p>
@@ -5020,7 +5115,8 @@
           <w:color w:val="000000" w:themeColor="text1"/>
           <w:sz w:val="22"/>
         </w:rPr>
-        <w:t xml:space="preserve">This study addresses that gap. It is part of a larger project examining </w:t>
+        <w:lastRenderedPageBreak/>
+        <w:t>This study will address such gaps in current knowledge, while also</w:t>
       </w:r>
       <w:r>
         <w:rPr>
@@ -5028,6 +5124,14 @@
           <w:color w:val="000000" w:themeColor="text1"/>
           <w:sz w:val="22"/>
         </w:rPr>
+        <w:t xml:space="preserve"> examining </w:t>
+      </w:r>
+      <w:r>
+        <w:rPr>
+          <w:rFonts w:ascii="Arial" w:hAnsi="Arial" w:cs="Arial"/>
+          <w:color w:val="000000" w:themeColor="text1"/>
+          <w:sz w:val="22"/>
+        </w:rPr>
         <w:t xml:space="preserve">zoonotic </w:t>
       </w:r>
       <w:r>
@@ -5052,7 +5156,23 @@
           <w:color w:val="000000" w:themeColor="text1"/>
           <w:sz w:val="22"/>
         </w:rPr>
-        <w:t xml:space="preserve"> quantifying pathogen prevalence in wild birds are reviewed separately under IACUC protocol IPROTO202500000090. The present protocol concerns the human-subjects component (Aim 3), which uses an anonymous online survey to characterize disease-risk perception, biosecurity practice engagement, willingness to modify backyard behaviors, place attachment, and pro-conservation attitudes and behaviors among adults who feed backyard birds and/or keep backyard poultry. Understanding these human dimensions is essential for developing accessible, effective biosecurity guidance that reduces disease risk while preserving the well-being and conservation benefits these activities provide.</w:t>
+        <w:t xml:space="preserve"> quantifying pathogen prevalence in wild birds are reviewed separately under IACUC protocol IPROTO202500000090. The present protocol concerns the human-subjects component (Aim 3), which uses an anonymous online survey to characterize disease-risk perception, biosecurity practice engagement, willingness to modify backyard behaviors, place attachment, and pro-conservation attitudes and behaviors among adults who feed backyard birds and/or keep backyard poultry. Understanding the</w:t>
+      </w:r>
+      <w:r>
+        <w:rPr>
+          <w:rFonts w:ascii="Arial" w:hAnsi="Arial" w:cs="Arial"/>
+          <w:color w:val="000000" w:themeColor="text1"/>
+          <w:sz w:val="22"/>
+        </w:rPr>
+        <w:t xml:space="preserve"> human psychology surrounding zoonotic disease and conservation </w:t>
+      </w:r>
+      <w:r>
+        <w:rPr>
+          <w:rFonts w:ascii="Arial" w:hAnsi="Arial" w:cs="Arial"/>
+          <w:color w:val="000000" w:themeColor="text1"/>
+          <w:sz w:val="22"/>
+        </w:rPr>
+        <w:t>is essential for developing accessible, effective biosecurity guidance that reduces disease risk while preserving the well-being and conservation benefits these activities provide.</w:t>
       </w:r>
     </w:p>
     <w:p>
@@ -5252,7 +5372,7 @@
               <w:color w:val="auto"/>
               <w:sz w:val="22"/>
             </w:rPr>
-            <w:t>groundbreaking</w:t>
+            <w:t>nuanced</w:t>
           </w:r>
           <w:r>
             <w:rPr>
@@ -5260,7 +5380,7 @@
               <w:color w:val="auto"/>
               <w:sz w:val="22"/>
             </w:rPr>
-            <w:t xml:space="preserve"> characterization of disease-risk perception, biosecurity practice engagement, place attachment, and pro-conservation attitudes and behaviors among </w:t>
+            <w:t xml:space="preserve"> </w:t>
           </w:r>
           <w:r>
             <w:rPr>
@@ -5268,6 +5388,14 @@
               <w:color w:val="auto"/>
               <w:sz w:val="22"/>
             </w:rPr>
+            <w:t xml:space="preserve">characterization of disease-risk perception, biosecurity practice engagement, place attachment, and pro-conservation attitudes and behaviors among </w:t>
+          </w:r>
+          <w:r>
+            <w:rPr>
+              <w:rFonts w:ascii="Arial" w:hAnsi="Arial" w:cs="Arial"/>
+              <w:color w:val="auto"/>
+              <w:sz w:val="22"/>
+            </w:rPr>
             <w:t>individuals</w:t>
           </w:r>
           <w:r>
@@ -5277,6 +5405,35 @@
               <w:sz w:val="22"/>
             </w:rPr>
             <w:t xml:space="preserve"> who feed backyard birds and/or keep backyard poultry in the Southeastern United States. Anticipated outcomes include:</w:t>
+          </w:r>
+        </w:p>
+        <w:p>
+          <w:pPr>
+            <w:pStyle w:val="BlockText"/>
+            <w:pBdr>
+              <w:top w:val="none" w:sz="0" w:space="0" w:color="auto"/>
+              <w:left w:val="none" w:sz="0" w:space="0" w:color="auto"/>
+              <w:bottom w:val="none" w:sz="0" w:space="0" w:color="auto"/>
+              <w:right w:val="none" w:sz="0" w:space="0" w:color="auto"/>
+            </w:pBdr>
+            <w:autoSpaceDE/>
+            <w:autoSpaceDN/>
+            <w:adjustRightInd/>
+            <w:spacing w:before="120" w:after="120"/>
+            <w:ind w:left="1080" w:right="720"/>
+            <w:rPr>
+              <w:rFonts w:ascii="Arial" w:hAnsi="Arial" w:cs="Arial"/>
+              <w:color w:val="auto"/>
+              <w:sz w:val="22"/>
+            </w:rPr>
+          </w:pPr>
+          <w:r>
+            <w:rPr>
+              <w:rFonts w:ascii="Arial" w:hAnsi="Arial" w:cs="Arial"/>
+              <w:color w:val="auto"/>
+              <w:sz w:val="22"/>
+            </w:rPr>
+            <w:t xml:space="preserve">Evaluations or descriptions of… </w:t>
           </w:r>
         </w:p>
         <w:p>
@@ -5309,7 +5466,15 @@
               <w:color w:val="auto"/>
               <w:sz w:val="22"/>
             </w:rPr>
-            <w:t>A description of participants' motivations for feeding birds and keeping poultry, their knowledge of zoonotic disease, and how they perceive the risk of disease events occurring in their own backyards</w:t>
+            <w:t>P</w:t>
+          </w:r>
+          <w:r>
+            <w:rPr>
+              <w:rFonts w:ascii="Arial" w:hAnsi="Arial" w:cs="Arial"/>
+              <w:color w:val="auto"/>
+              <w:sz w:val="22"/>
+            </w:rPr>
+            <w:t>articipants' motivations for feeding birds and keeping poultry, their knowledge of zoonotic disease, and how they perceive the risk of disease events occurring in their own backyards</w:t>
           </w:r>
           <w:r>
             <w:rPr>
@@ -5350,7 +5515,15 @@
               <w:color w:val="auto"/>
               <w:sz w:val="22"/>
             </w:rPr>
-            <w:t xml:space="preserve">Whether people who </w:t>
+            <w:t>W</w:t>
+          </w:r>
+          <w:r>
+            <w:rPr>
+              <w:rFonts w:ascii="Arial" w:hAnsi="Arial" w:cs="Arial"/>
+              <w:color w:val="auto"/>
+              <w:sz w:val="22"/>
+            </w:rPr>
+            <w:t xml:space="preserve">hether people who </w:t>
           </w:r>
           <w:r>
             <w:rPr>
@@ -5455,15 +5628,7 @@
               <w:color w:val="auto"/>
               <w:sz w:val="22"/>
             </w:rPr>
-            <w:t xml:space="preserve"> </w:t>
-          </w:r>
-          <w:r>
-            <w:rPr>
-              <w:rFonts w:ascii="Arial" w:hAnsi="Arial" w:cs="Arial"/>
-              <w:color w:val="auto"/>
-              <w:sz w:val="22"/>
-            </w:rPr>
-            <w:t>(H2).</w:t>
+            <w:t xml:space="preserve"> (H2).</w:t>
           </w:r>
         </w:p>
         <w:p>
@@ -5565,7 +5730,31 @@
               <w:color w:val="auto"/>
               <w:sz w:val="22"/>
             </w:rPr>
-            <w:t xml:space="preserve"> practical biosecurity and conservation guidance that lowers disease risk while keeping the benefits people get from these activities.</w:t>
+            <w:t xml:space="preserve"> practical biosecurity and conservation </w:t>
+          </w:r>
+          <w:r>
+            <w:rPr>
+              <w:rFonts w:ascii="Arial" w:hAnsi="Arial" w:cs="Arial"/>
+              <w:color w:val="auto"/>
+              <w:sz w:val="22"/>
+            </w:rPr>
+            <w:t>recommendations</w:t>
+          </w:r>
+          <w:r>
+            <w:rPr>
+              <w:rFonts w:ascii="Arial" w:hAnsi="Arial" w:cs="Arial"/>
+              <w:color w:val="auto"/>
+              <w:sz w:val="22"/>
+            </w:rPr>
+            <w:t xml:space="preserve"> </w:t>
+          </w:r>
+          <w:r>
+            <w:rPr>
+              <w:rFonts w:ascii="Arial" w:hAnsi="Arial" w:cs="Arial"/>
+              <w:color w:val="auto"/>
+              <w:sz w:val="22"/>
+            </w:rPr>
+            <w:t>that lower disease risk while keeping the benefits people get from these activities.</w:t>
           </w:r>
         </w:p>
       </w:sdtContent>
@@ -5655,7 +5844,7 @@
           </w:rPr>
           <w:id w:val="1030918370"/>
           <w14:checkbox>
-            <w14:checked w14:val="0"/>
+            <w14:checked w14:val="1"/>
             <w14:checkedState w14:val="2612" w14:font="MS Gothic"/>
             <w14:uncheckedState w14:val="2610" w14:font="MS Gothic"/>
           </w14:checkbox>
@@ -5668,7 +5857,7 @@
               <w:iCs/>
               <w:sz w:val="22"/>
             </w:rPr>
-            <w:t>☐</w:t>
+            <w:t>☒</w:t>
           </w:r>
         </w:sdtContent>
       </w:sdt>
@@ -5918,7 +6107,6 @@
         <w:placeholder>
           <w:docPart w:val="DefaultPlaceholder_-1854013440"/>
         </w:placeholder>
-        <w:showingPlcHdr/>
       </w:sdtPr>
       <w:sdtContent>
         <w:p>
@@ -5943,14 +6131,27 @@
           </w:pPr>
           <w:r>
             <w:rPr>
-              <w:rStyle w:val="PlaceholderText"/>
               <w:rFonts w:ascii="Arial" w:hAnsi="Arial" w:cs="Arial"/>
-              <w:i w:val="0"/>
-              <w:iCs w:val="0"/>
-              <w:color w:val="000000" w:themeColor="text1"/>
-              <w:bdr w:val="single" w:sz="4" w:space="0" w:color="auto"/>
-            </w:rPr>
-            <w:t>Click or tap here to enter text.</w:t>
+              <w:color w:val="auto"/>
+              <w:sz w:val="22"/>
+            </w:rPr>
+            <w:t>This is a cross-sectional, anonymous online survey. Adult</w:t>
+          </w:r>
+          <w:r>
+            <w:rPr>
+              <w:rFonts w:ascii="Arial" w:hAnsi="Arial" w:cs="Arial"/>
+              <w:color w:val="auto"/>
+              <w:sz w:val="22"/>
+            </w:rPr>
+            <w:t xml:space="preserve"> participants</w:t>
+          </w:r>
+          <w:r>
+            <w:rPr>
+              <w:rFonts w:ascii="Arial" w:hAnsi="Arial" w:cs="Arial"/>
+              <w:color w:val="auto"/>
+              <w:sz w:val="22"/>
+            </w:rPr>
+            <w:t xml:space="preserve"> in the Southeastern United States who maintain backyard bird feeders and/or keep backyard poultry will be invited to complete a one-time, self-administered survey delivered through Qualtrics. No follow-up or repeated measures are involved. Survey responses will be used to describe participants' motivations, disease knowledge and risk perception, biosecurity practices, place attachment, and pro-conservation attitudes and behaviors, and to test the associations described in Sections 1.0 and 3.0.</w:t>
           </w:r>
         </w:p>
       </w:sdtContent>
@@ -6996,7 +7197,16 @@
             <w:rFonts w:ascii="Arial" w:hAnsi="Arial" w:cs="Arial"/>
             <w:sz w:val="22"/>
           </w:rPr>
-          <w:t>Guidance for Responsible Use of Artificial Intelligence | OACP</w:t>
+          <w:t xml:space="preserve">Guidance for Responsible Use of Artificial Intelligence | </w:t>
+        </w:r>
+        <w:r>
+          <w:rPr>
+            <w:rStyle w:val="Hyperlink"/>
+            <w:rFonts w:ascii="Arial" w:hAnsi="Arial" w:cs="Arial"/>
+            <w:sz w:val="22"/>
+          </w:rPr>
+          <w:lastRenderedPageBreak/>
+          <w:t>OACP</w:t>
         </w:r>
       </w:hyperlink>
       <w:r>
@@ -7111,7 +7321,6 @@
           <w:rFonts w:ascii="Arial" w:hAnsi="Arial" w:cs="Arial"/>
           <w:sz w:val="22"/>
         </w:rPr>
-        <w:lastRenderedPageBreak/>
         <w:t>Any risk of re-identification, and measures to reduce such risks.</w:t>
       </w:r>
     </w:p>
@@ -8238,7 +8447,6 @@
           <w:color w:val="auto"/>
           <w:sz w:val="22"/>
         </w:rPr>
-        <w:lastRenderedPageBreak/>
         <w:t>Describe the procedures to release data or specimens, including: the process to request a release, approvals required for release, who can obtain data or specimens</w:t>
       </w:r>
       <w:r>
@@ -9044,6 +9252,7 @@
           <w:color w:val="000000" w:themeColor="text1"/>
           <w:sz w:val="22"/>
         </w:rPr>
+        <w:lastRenderedPageBreak/>
         <w:t>Describe the availability of medical or psychological resources that Participants might need as a result of an anticipated consequence of the human research.</w:t>
       </w:r>
     </w:p>
@@ -10228,6 +10437,7 @@
           <w:color w:val="auto"/>
           <w:sz w:val="22"/>
         </w:rPr>
+        <w:lastRenderedPageBreak/>
         <w:t>For NIH funded research, include information regarding the inclusion of women and minority populations, or include a justification for the exception to the NIH policy.</w:t>
       </w:r>
     </w:p>
@@ -10369,7 +10579,6 @@
         <w:rPr>
           <w:rFonts w:ascii="Arial" w:hAnsi="Arial" w:cs="Arial"/>
         </w:rPr>
-        <w:lastRenderedPageBreak/>
         <w:t>Vulnerable Populations</w:t>
       </w:r>
       <w:r>
@@ -11351,7 +11560,16 @@
             <w:rFonts w:ascii="Arial" w:hAnsi="Arial" w:cs="Arial"/>
             <w:sz w:val="22"/>
           </w:rPr>
-          <w:t>with Impaired Decision</w:t>
+          <w:t xml:space="preserve">with Impaired </w:t>
+        </w:r>
+        <w:r>
+          <w:rPr>
+            <w:rStyle w:val="Hyperlink"/>
+            <w:rFonts w:ascii="Arial" w:hAnsi="Arial" w:cs="Arial"/>
+            <w:sz w:val="22"/>
+          </w:rPr>
+          <w:lastRenderedPageBreak/>
+          <w:t>Decision</w:t>
         </w:r>
         <w:r>
           <w:rPr>
@@ -11568,7 +11786,6 @@
           <w:color w:val="auto"/>
           <w:sz w:val="22"/>
         </w:rPr>
-        <w:lastRenderedPageBreak/>
         <w:t xml:space="preserve">Indicate the total number of </w:t>
       </w:r>
       <w:r>
@@ -12764,16 +12981,7 @@
           <w:color w:val="auto"/>
           <w:sz w:val="22"/>
         </w:rPr>
-        <w:t xml:space="preserve">research participants will receive compensation, BEFORE you submit your application for IRB review, become familiar with AU </w:t>
-      </w:r>
-      <w:r>
-        <w:rPr>
-          <w:rFonts w:ascii="Arial" w:hAnsi="Arial" w:cs="Arial"/>
-          <w:color w:val="auto"/>
-          <w:sz w:val="22"/>
-        </w:rPr>
-        <w:lastRenderedPageBreak/>
-        <w:t xml:space="preserve">Procurement and Business Services (PBS) </w:t>
+        <w:t xml:space="preserve">research participants will receive compensation, BEFORE you submit your application for IRB review, become familiar with AU Procurement and Business Services (PBS) </w:t>
       </w:r>
       <w:hyperlink r:id="rId32" w:history="1">
         <w:r>
@@ -13606,6 +13814,7 @@
           <w:color w:val="auto"/>
           <w:sz w:val="22"/>
         </w:rPr>
+        <w:lastRenderedPageBreak/>
         <w:t xml:space="preserve">If applicable, indicate which procedures may have risks to the </w:t>
       </w:r>
       <w:r>
@@ -13972,7 +14181,6 @@
           <w:color w:val="auto"/>
           <w:sz w:val="22"/>
         </w:rPr>
-        <w:lastRenderedPageBreak/>
         <w:t xml:space="preserve">If applicable, describe risks to others who are not </w:t>
       </w:r>
       <w:r>
@@ -14713,6 +14921,7 @@
           <w:color w:val="auto"/>
           <w:sz w:val="22"/>
         </w:rPr>
+        <w:lastRenderedPageBreak/>
         <w:t>Describe the steps that will be taken to protect Participants’ privacy interests. “Privacy interest” refers to a person’s desire to place limits on whom they interact or whom they provide personal information.</w:t>
       </w:r>
     </w:p>
@@ -15724,7 +15933,16 @@
           <w:color w:val="auto"/>
           <w:sz w:val="22"/>
         </w:rPr>
-        <w:t>For example, attention check questions, checks for reported values outside of a reasonable range,</w:t>
+        <w:t xml:space="preserve">For example, attention check questions, checks for reported values </w:t>
+      </w:r>
+      <w:r>
+        <w:rPr>
+          <w:rFonts w:ascii="Arial" w:hAnsi="Arial" w:cs="Arial"/>
+          <w:color w:val="auto"/>
+          <w:sz w:val="22"/>
+        </w:rPr>
+        <w:lastRenderedPageBreak/>
+        <w:t>outside of a reasonable range,</w:t>
       </w:r>
       <w:r>
         <w:rPr>
@@ -16059,7 +16277,6 @@
           <w:rFonts w:ascii="Arial" w:hAnsi="Arial" w:cs="Arial"/>
           <w:sz w:val="22"/>
         </w:rPr>
-        <w:lastRenderedPageBreak/>
         <w:t>What information will be included in that data or associated with the specimens?</w:t>
       </w:r>
     </w:p>
@@ -16873,6 +17090,7 @@
         <w:rPr>
           <w:rFonts w:ascii="Arial" w:hAnsi="Arial" w:cs="Arial"/>
         </w:rPr>
+        <w:lastRenderedPageBreak/>
         <w:t xml:space="preserve">Economic Burden to </w:t>
       </w:r>
       <w:r>
@@ -17162,7 +17380,6 @@
           <w:color w:val="auto"/>
           <w:sz w:val="22"/>
         </w:rPr>
-        <w:lastRenderedPageBreak/>
         <w:t>Indicate whether you will be obtaining consent, and if so describe:</w:t>
       </w:r>
     </w:p>
@@ -17776,7 +17993,15 @@
           <w:rFonts w:ascii="Arial" w:hAnsi="Arial" w:cs="Arial"/>
           <w:sz w:val="22"/>
         </w:rPr>
-        <w:t xml:space="preserve"> who do not speak English will be enrolled, describe the process to ensure that the oral and written information provided to those </w:t>
+        <w:t xml:space="preserve"> who do not speak English will be enrolled, describe the process to ensure that the oral and written information provided to </w:t>
+      </w:r>
+      <w:r>
+        <w:rPr>
+          <w:rFonts w:ascii="Arial" w:hAnsi="Arial" w:cs="Arial"/>
+          <w:sz w:val="22"/>
+        </w:rPr>
+        <w:lastRenderedPageBreak/>
+        <w:t xml:space="preserve">those </w:t>
       </w:r>
       <w:r>
         <w:rPr>
@@ -17936,7 +18161,6 @@
           <w:rFonts w:ascii="Arial" w:hAnsi="Arial" w:cs="Arial"/>
           <w:sz w:val="22"/>
         </w:rPr>
-        <w:lastRenderedPageBreak/>
         <w:t xml:space="preserve">Review the </w:t>
       </w:r>
       <w:hyperlink r:id="rId37" w:history="1">
@@ -18354,6 +18578,7 @@
           <w:rFonts w:ascii="Arial" w:hAnsi="Arial" w:cs="Arial"/>
           <w:sz w:val="22"/>
         </w:rPr>
+        <w:lastRenderedPageBreak/>
         <w:t>One parent even if the other parent is alive, known, competent, reasonably available, and shares legal responsibility for the care and custody of the child.</w:t>
       </w:r>
     </w:p>
@@ -18916,6 +19141,7 @@
           <w:rFonts w:ascii="Arial" w:hAnsi="Arial" w:cs="Arial"/>
           <w:sz w:val="22"/>
         </w:rPr>
+        <w:lastRenderedPageBreak/>
         <w:t xml:space="preserve">Assent will be required of all, some, or none of the </w:t>
       </w:r>
       <w:r>
@@ -19682,6 +19908,7 @@
           <w:i/>
           <w:sz w:val="22"/>
         </w:rPr>
+        <w:lastRenderedPageBreak/>
         <w:t xml:space="preserve">If this is a multicenter study, indicate the total number of </w:t>
       </w:r>
       <w:r>
@@ -19942,7 +20169,6 @@
           <w:rFonts w:ascii="Arial" w:hAnsi="Arial" w:cs="Arial"/>
           <w:sz w:val="22"/>
         </w:rPr>
-        <w:lastRenderedPageBreak/>
         <w:t xml:space="preserve">Describe materials that will be used to recruit </w:t>
       </w:r>
       <w:r>
@@ -22753,7 +22979,7 @@
     <w:charset w:val="00"/>
     <w:family w:val="swiss"/>
     <w:pitch w:val="variable"/>
-    <w:sig w:usb0="E4002EFF" w:usb1="C200247B" w:usb2="00000009" w:usb3="00000000" w:csb0="000001FF" w:csb1="00000000"/>
+    <w:sig w:usb0="E0002AFF" w:usb1="C000247B" w:usb2="00000009" w:usb3="00000000" w:csb0="000001FF" w:csb1="00000000"/>
   </w:font>
   <w:font w:name="Aptos">
     <w:panose1 w:val="020B0004020202020204"/>
@@ -22796,12 +23022,15 @@
     <w:rsid w:val="00150782"/>
     <w:rsid w:val="00162995"/>
     <w:rsid w:val="00177BE8"/>
+    <w:rsid w:val="00190900"/>
     <w:rsid w:val="001940F0"/>
+    <w:rsid w:val="001C0445"/>
     <w:rsid w:val="002424B1"/>
     <w:rsid w:val="0025241C"/>
     <w:rsid w:val="00257C1D"/>
     <w:rsid w:val="00283598"/>
     <w:rsid w:val="002A601F"/>
+    <w:rsid w:val="002D6E1C"/>
     <w:rsid w:val="002E1609"/>
     <w:rsid w:val="002E162F"/>
     <w:rsid w:val="00317078"/>
@@ -22809,6 +23038,7 @@
     <w:rsid w:val="0037069E"/>
     <w:rsid w:val="003B69EB"/>
     <w:rsid w:val="003C672A"/>
+    <w:rsid w:val="003D11F3"/>
     <w:rsid w:val="003D1FDF"/>
     <w:rsid w:val="00411864"/>
     <w:rsid w:val="00425646"/>
@@ -23692,12 +23922,9 @@
 </file>
 
 <file path=customXml/item1.xml><?xml version="1.0" encoding="utf-8"?>
-<?mso-contentType ?>
-<FormTemplates xmlns="http://schemas.microsoft.com/sharepoint/v3/contenttype/forms">
-  <Display>DocumentLibraryForm</Display>
-  <Edit>DocumentLibraryForm</Edit>
-  <New>DocumentLibraryForm</New>
-</FormTemplates>
+<p:properties xmlns:p="http://schemas.microsoft.com/office/2006/metadata/properties" xmlns:xsi="http://www.w3.org/2001/XMLSchema-instance" xmlns:pc="http://schemas.microsoft.com/office/infopath/2007/PartnerControls">
+  <documentManagement/>
+</p:properties>
 </file>
 
 <file path=customXml/item2.xml><?xml version="1.0" encoding="utf-8"?>
@@ -23705,9 +23932,12 @@
 </file>
 
 <file path=customXml/item3.xml><?xml version="1.0" encoding="utf-8"?>
-<p:properties xmlns:p="http://schemas.microsoft.com/office/2006/metadata/properties" xmlns:xsi="http://www.w3.org/2001/XMLSchema-instance" xmlns:pc="http://schemas.microsoft.com/office/infopath/2007/PartnerControls">
-  <documentManagement/>
-</p:properties>
+<?mso-contentType ?>
+<FormTemplates xmlns="http://schemas.microsoft.com/sharepoint/v3/contenttype/forms">
+  <Display>DocumentLibraryForm</Display>
+  <Edit>DocumentLibraryForm</Edit>
+  <New>DocumentLibraryForm</New>
+</FormTemplates>
 </file>
 
 <file path=customXml/item4.xml><?xml version="1.0" encoding="utf-8"?>
@@ -23855,9 +24085,10 @@
 </file>
 
 <file path=customXml/itemProps1.xml><?xml version="1.0" encoding="utf-8"?>
-<ds:datastoreItem xmlns:ds="http://schemas.openxmlformats.org/officeDocument/2006/customXml" ds:itemID="{1DBB1093-F880-422D-86C1-617F7DAEF962}">
+<ds:datastoreItem xmlns:ds="http://schemas.openxmlformats.org/officeDocument/2006/customXml" ds:itemID="{4583F2B3-037C-44DB-B08D-E6F378EEF829}">
   <ds:schemaRefs>
-    <ds:schemaRef ds:uri="http://schemas.microsoft.com/sharepoint/v3/contenttype/forms"/>
+    <ds:schemaRef ds:uri="http://schemas.microsoft.com/office/2006/metadata/properties"/>
+    <ds:schemaRef ds:uri="http://schemas.microsoft.com/office/infopath/2007/PartnerControls"/>
   </ds:schemaRefs>
 </ds:datastoreItem>
 </file>
@@ -23871,10 +24102,9 @@
 </file>
 
 <file path=customXml/itemProps3.xml><?xml version="1.0" encoding="utf-8"?>
-<ds:datastoreItem xmlns:ds="http://schemas.openxmlformats.org/officeDocument/2006/customXml" ds:itemID="{4583F2B3-037C-44DB-B08D-E6F378EEF829}">
+<ds:datastoreItem xmlns:ds="http://schemas.openxmlformats.org/officeDocument/2006/customXml" ds:itemID="{1DBB1093-F880-422D-86C1-617F7DAEF962}">
   <ds:schemaRefs>
-    <ds:schemaRef ds:uri="http://schemas.microsoft.com/office/2006/metadata/properties"/>
-    <ds:schemaRef ds:uri="http://schemas.microsoft.com/office/infopath/2007/PartnerControls"/>
+    <ds:schemaRef ds:uri="http://schemas.microsoft.com/sharepoint/v3/contenttype/forms"/>
   </ds:schemaRefs>
 </ds:datastoreItem>
 </file>

</xml_diff>

<commit_message>
edited doc's in meeting
</commit_message>
<xml_diff>
--- a/Documents /HRP-503 - TEMPLATE PROTOCOL .docx
+++ b/Documents /HRP-503 - TEMPLATE PROTOCOL .docx
@@ -6208,9 +6208,136 @@
         <w:placeholder>
           <w:docPart w:val="DefaultPlaceholder_-1854013440"/>
         </w:placeholder>
-        <w:showingPlcHdr/>
       </w:sdtPr>
       <w:sdtContent>
+        <w:p>
+          <w:pPr>
+            <w:pStyle w:val="BlockText"/>
+            <w:pBdr>
+              <w:left w:val="single" w:sz="2" w:space="31" w:color="4472C4" w:themeColor="accent1"/>
+            </w:pBdr>
+            <w:autoSpaceDE/>
+            <w:autoSpaceDN/>
+            <w:adjustRightInd/>
+            <w:spacing w:before="120" w:after="120"/>
+            <w:ind w:left="720" w:right="720"/>
+            <w:rPr>
+              <w:rFonts w:ascii="Arial" w:hAnsi="Arial" w:cs="Arial"/>
+              <w:color w:val="000000" w:themeColor="text1"/>
+              <w:sz w:val="22"/>
+            </w:rPr>
+          </w:pPr>
+          <w:r>
+            <w:rPr>
+              <w:rFonts w:ascii="Arial" w:hAnsi="Arial" w:cs="Arial"/>
+              <w:color w:val="000000" w:themeColor="text1"/>
+              <w:sz w:val="22"/>
+            </w:rPr>
+            <w:t xml:space="preserve">Participation consists of a single </w:t>
+          </w:r>
+          <w:r>
+            <w:rPr>
+              <w:rFonts w:ascii="Arial" w:hAnsi="Arial" w:cs="Arial"/>
+              <w:color w:val="000000" w:themeColor="text1"/>
+              <w:sz w:val="22"/>
+            </w:rPr>
+            <w:t>survey of a possible total of 33 questions not including the screening</w:t>
+          </w:r>
+          <w:r>
+            <w:rPr>
+              <w:rFonts w:ascii="Arial" w:hAnsi="Arial" w:cs="Arial"/>
+              <w:color w:val="000000" w:themeColor="text1"/>
+              <w:sz w:val="22"/>
+            </w:rPr>
+            <w:t>. Potential participants will access the survey through a link distributed via recruitment materials. The first page of the survey presents the Information Letter (HRP-581), which describes the study</w:t>
+          </w:r>
+          <w:r>
+            <w:rPr>
+              <w:rFonts w:ascii="Arial" w:hAnsi="Arial" w:cs="Arial"/>
+              <w:color w:val="000000" w:themeColor="text1"/>
+              <w:sz w:val="22"/>
+            </w:rPr>
+            <w:t>’s nature</w:t>
+          </w:r>
+          <w:r>
+            <w:rPr>
+              <w:rFonts w:ascii="Arial" w:hAnsi="Arial" w:cs="Arial"/>
+              <w:color w:val="000000" w:themeColor="text1"/>
+              <w:sz w:val="22"/>
+            </w:rPr>
+            <w:t xml:space="preserve"> and participants' rights. Participants indicate agreement by continuing to the survey; those who decline exit without providing data</w:t>
+          </w:r>
+          <w:r>
+            <w:rPr>
+              <w:rFonts w:ascii="Arial" w:hAnsi="Arial" w:cs="Arial"/>
+              <w:color w:val="000000" w:themeColor="text1"/>
+              <w:sz w:val="22"/>
+            </w:rPr>
+            <w:t xml:space="preserve"> and survey will be voided. </w:t>
+          </w:r>
+        </w:p>
+        <w:p>
+          <w:pPr>
+            <w:pStyle w:val="BlockText"/>
+            <w:pBdr>
+              <w:left w:val="single" w:sz="2" w:space="31" w:color="4472C4" w:themeColor="accent1"/>
+            </w:pBdr>
+            <w:spacing w:before="120" w:after="120"/>
+            <w:ind w:left="720" w:right="720"/>
+            <w:rPr>
+              <w:rFonts w:ascii="Arial" w:hAnsi="Arial" w:cs="Arial"/>
+              <w:color w:val="000000" w:themeColor="text1"/>
+              <w:sz w:val="22"/>
+            </w:rPr>
+          </w:pPr>
+          <w:r>
+            <w:rPr>
+              <w:rFonts w:ascii="Arial" w:hAnsi="Arial" w:cs="Arial"/>
+              <w:color w:val="000000" w:themeColor="text1"/>
+              <w:sz w:val="22"/>
+            </w:rPr>
+            <w:t>The survey begins with screening questions to confirm the participant is 18 years of age or older and maintains backyard bird feeders and/or backyard poultry in the Southeastern United States. Participants who do not meet these criteria are routed out of the survey.</w:t>
+          </w:r>
+        </w:p>
+        <w:p>
+          <w:pPr>
+            <w:pStyle w:val="BlockText"/>
+            <w:pBdr>
+              <w:left w:val="single" w:sz="2" w:space="31" w:color="4472C4" w:themeColor="accent1"/>
+            </w:pBdr>
+            <w:spacing w:before="120" w:after="120"/>
+            <w:ind w:left="720" w:right="720"/>
+            <w:rPr>
+              <w:rFonts w:ascii="Arial" w:hAnsi="Arial" w:cs="Arial"/>
+              <w:color w:val="000000" w:themeColor="text1"/>
+              <w:sz w:val="22"/>
+            </w:rPr>
+          </w:pPr>
+          <w:r>
+            <w:rPr>
+              <w:rFonts w:ascii="Arial" w:hAnsi="Arial" w:cs="Arial"/>
+              <w:color w:val="000000" w:themeColor="text1"/>
+              <w:sz w:val="22"/>
+            </w:rPr>
+            <w:t>Eligible participants then complete the survey, which includes questions on: motivations for feeding birds and/or keeping poultry; feeder and coop cleaning and maintenance practices; place attachment to their yard or property; knowledge of and familiarity with zoonotic and avian diseases; perceived likelihood and seriousness of disease events; conservation-related behaviors and willingness to donate to conservation efforts; bird seed purchasing preferences; and basic demographic information. Participants may skip any question</w:t>
+          </w:r>
+          <w:r>
+            <w:rPr>
+              <w:rFonts w:ascii="Arial" w:hAnsi="Arial" w:cs="Arial"/>
+              <w:color w:val="000000" w:themeColor="text1"/>
+              <w:sz w:val="22"/>
+            </w:rPr>
+            <w:t>s they please</w:t>
+          </w:r>
+          <w:r>
+            <w:rPr>
+              <w:rFonts w:ascii="Arial" w:hAnsi="Arial" w:cs="Arial"/>
+              <w:color w:val="000000" w:themeColor="text1"/>
+              <w:sz w:val="22"/>
+            </w:rPr>
+            <w:t>. The survey takes approximately 10–15 minutes to complete. No follow-up contact occurs.</w:t>
+          </w:r>
+        </w:p>
         <w:p>
           <w:pPr>
             <w:pStyle w:val="BlockText"/>
@@ -6231,15 +6358,6 @@
               <w:sz w:val="22"/>
             </w:rPr>
           </w:pPr>
-          <w:r>
-            <w:rPr>
-              <w:rStyle w:val="PlaceholderText"/>
-              <w:i w:val="0"/>
-              <w:color w:val="000000" w:themeColor="text1"/>
-              <w:bdr w:val="single" w:sz="4" w:space="0" w:color="auto"/>
-            </w:rPr>
-            <w:t>Click or tap here to enter text.</w:t>
-          </w:r>
         </w:p>
       </w:sdtContent>
     </w:sdt>
@@ -6573,7 +6691,7 @@
           </w:rPr>
           <w:id w:val="1854766192"/>
           <w14:checkbox>
-            <w14:checked w14:val="0"/>
+            <w14:checked w14:val="1"/>
             <w14:checkedState w14:val="2612" w14:font="MS Gothic"/>
             <w14:uncheckedState w14:val="2610" w14:font="MS Gothic"/>
           </w14:checkbox>
@@ -6587,7 +6705,7 @@
               <w:color w:val="auto"/>
               <w:sz w:val="22"/>
             </w:rPr>
-            <w:t>☐</w:t>
+            <w:t>☒</w:t>
           </w:r>
         </w:sdtContent>
       </w:sdt>
@@ -6771,7 +6889,15 @@
           <w:rFonts w:ascii="Arial" w:hAnsi="Arial" w:cs="Arial"/>
           <w:sz w:val="22"/>
         </w:rPr>
-        <w:t xml:space="preserve">research-specific study procedures, (b) </w:t>
+        <w:t>research-</w:t>
+      </w:r>
+      <w:r>
+        <w:rPr>
+          <w:rFonts w:ascii="Arial" w:hAnsi="Arial" w:cs="Arial"/>
+          <w:sz w:val="22"/>
+        </w:rPr>
+        <w:lastRenderedPageBreak/>
+        <w:t xml:space="preserve">specific study procedures, (b) </w:t>
       </w:r>
       <w:r>
         <w:rPr>
@@ -6985,36 +7111,131 @@
         <w:placeholder>
           <w:docPart w:val="DefaultPlaceholder_-1854013440"/>
         </w:placeholder>
-        <w:showingPlcHdr/>
       </w:sdtPr>
       <w:sdtContent>
-        <w:p>
-          <w:pPr>
-            <w:pStyle w:val="List"/>
-            <w:numPr>
-              <w:ilvl w:val="0"/>
-              <w:numId w:val="0"/>
-            </w:numPr>
-            <w:spacing w:before="120" w:beforeAutospacing="0" w:after="120" w:afterAutospacing="0"/>
-            <w:ind w:left="720"/>
+        <w:sdt>
+          <w:sdtPr>
             <w:rPr>
               <w:rFonts w:ascii="Arial" w:hAnsi="Arial" w:cs="Arial"/>
               <w:color w:val="000000" w:themeColor="text1"/>
               <w:sz w:val="22"/>
             </w:rPr>
-          </w:pPr>
-          <w:r>
-            <w:rPr>
-              <w:rStyle w:val="PlaceholderText"/>
-              <w:rFonts w:ascii="Arial" w:hAnsi="Arial" w:cs="Arial"/>
-              <w:i w:val="0"/>
-              <w:iCs/>
-              <w:color w:val="000000" w:themeColor="text1"/>
-              <w:bdr w:val="single" w:sz="4" w:space="0" w:color="auto"/>
-            </w:rPr>
-            <w:t>Click or tap here to enter text.</w:t>
-          </w:r>
-        </w:p>
+            <w:id w:val="1589501173"/>
+            <w:placeholder>
+              <w:docPart w:val="C34093F7EBC25C49B82145A9A733755B"/>
+            </w:placeholder>
+          </w:sdtPr>
+          <w:sdtContent>
+            <w:p>
+              <w:pPr>
+                <w:pStyle w:val="font-claude-response-body"/>
+                <w:rPr>
+                  <w:rFonts w:ascii="Arial" w:hAnsi="Arial" w:cs="Arial"/>
+                  <w:i/>
+                  <w:iCs/>
+                  <w:sz w:val="22"/>
+                  <w:szCs w:val="22"/>
+                </w:rPr>
+              </w:pPr>
+              <w:r>
+                <w:rPr>
+                  <w:rFonts w:ascii="Arial" w:hAnsi="Arial" w:cs="Arial"/>
+                  <w:i/>
+                  <w:iCs/>
+                  <w:sz w:val="22"/>
+                  <w:szCs w:val="22"/>
+                </w:rPr>
+                <w:t>All data are collected through research-specific study procedures. No data are obtained from pre-existing source records, and no observational data from standard operating procedures are collected. All responses are participant-entered directly into Qualtrics.</w:t>
+              </w:r>
+            </w:p>
+            <w:p>
+              <w:pPr>
+                <w:pStyle w:val="font-claude-response-body"/>
+                <w:rPr>
+                  <w:rFonts w:ascii="Arial" w:hAnsi="Arial" w:cs="Arial"/>
+                  <w:i/>
+                  <w:iCs/>
+                  <w:sz w:val="22"/>
+                  <w:szCs w:val="22"/>
+                </w:rPr>
+              </w:pPr>
+              <w:r>
+                <w:rPr>
+                  <w:rFonts w:ascii="Arial" w:hAnsi="Arial" w:cs="Arial"/>
+                  <w:i/>
+                  <w:iCs/>
+                  <w:sz w:val="22"/>
+                  <w:szCs w:val="22"/>
+                </w:rPr>
+                <w:t>Data collected include: self-reported motivations for backyard bird feeding and poultry keeping; cleaning frequency and cleaning agents used for feeders and poultry areas; frequency of observed wild bird contact with poultry areas; place attachment ratings; self-reported knowledge of zoonotic disease and familiarity with specific avian diseases; perceived likelihood and seriousness of disease events; self-reported conservation behaviors over the past 12 months; willingness to donate to conservation initiatives and donation amount ranges; bird seed purchasing preferences; and open-ended responses describing favorite memories related to bird feeding or poultry keeping.</w:t>
+              </w:r>
+            </w:p>
+            <w:p>
+              <w:pPr>
+                <w:pStyle w:val="font-claude-response-body"/>
+                <w:rPr>
+                  <w:rFonts w:ascii="Arial" w:hAnsi="Arial" w:cs="Arial"/>
+                  <w:i/>
+                  <w:iCs/>
+                  <w:sz w:val="22"/>
+                  <w:szCs w:val="22"/>
+                </w:rPr>
+              </w:pPr>
+              <w:r>
+                <w:rPr>
+                  <w:rFonts w:ascii="Arial" w:hAnsi="Arial" w:cs="Arial"/>
+                  <w:i/>
+                  <w:iCs/>
+                  <w:sz w:val="22"/>
+                  <w:szCs w:val="22"/>
+                </w:rPr>
+                <w:t>Demographic data collected include age, gender, income range, education level, number of children in the household, number of pets in the household, length of time at current residence, property acreage, and residential area or postal code.</w:t>
+              </w:r>
+            </w:p>
+            <w:p>
+              <w:pPr>
+                <w:pStyle w:val="font-claude-response-body"/>
+                <w:rPr>
+                  <w:rFonts w:ascii="Arial" w:hAnsi="Arial" w:cs="Arial"/>
+                  <w:i/>
+                  <w:iCs/>
+                  <w:sz w:val="22"/>
+                  <w:szCs w:val="22"/>
+                </w:rPr>
+              </w:pPr>
+              <w:r>
+                <w:rPr>
+                  <w:rFonts w:ascii="Arial" w:hAnsi="Arial" w:cs="Arial"/>
+                  <w:i/>
+                  <w:iCs/>
+                  <w:sz w:val="22"/>
+                  <w:szCs w:val="22"/>
+                </w:rPr>
+                <w:t xml:space="preserve">No genomic data will be collected. No directly identifying information </w:t>
+              </w:r>
+              <w:r>
+                <w:rPr>
+                  <w:rFonts w:ascii="Arial" w:hAnsi="Arial" w:cs="Arial"/>
+                  <w:i/>
+                  <w:iCs/>
+                  <w:sz w:val="22"/>
+                  <w:szCs w:val="22"/>
+                </w:rPr>
+                <w:t xml:space="preserve">such as </w:t>
+              </w:r>
+              <w:r>
+                <w:rPr>
+                  <w:rFonts w:ascii="Arial" w:hAnsi="Arial" w:cs="Arial"/>
+                  <w:i/>
+                  <w:iCs/>
+                  <w:sz w:val="22"/>
+                  <w:szCs w:val="22"/>
+                </w:rPr>
+                <w:t>name, email address, IP address, or precise location will be collected.</w:t>
+              </w:r>
+            </w:p>
+          </w:sdtContent>
+        </w:sdt>
       </w:sdtContent>
     </w:sdt>
     <w:p>
@@ -7197,16 +7418,7 @@
             <w:rFonts w:ascii="Arial" w:hAnsi="Arial" w:cs="Arial"/>
             <w:sz w:val="22"/>
           </w:rPr>
-          <w:t xml:space="preserve">Guidance for Responsible Use of Artificial Intelligence | </w:t>
-        </w:r>
-        <w:r>
-          <w:rPr>
-            <w:rStyle w:val="Hyperlink"/>
-            <w:rFonts w:ascii="Arial" w:hAnsi="Arial" w:cs="Arial"/>
-            <w:sz w:val="22"/>
-          </w:rPr>
-          <w:lastRenderedPageBreak/>
-          <w:t>OACP</w:t>
+          <w:t>Guidance for Responsible Use of Artificial Intelligence | OACP</w:t>
         </w:r>
       </w:hyperlink>
       <w:r>
@@ -7369,6 +7581,7 @@
           <w:rFonts w:ascii="Arial" w:hAnsi="Arial" w:cs="Arial"/>
           <w:sz w:val="22"/>
         </w:rPr>
+        <w:lastRenderedPageBreak/>
         <w:t>Known limitations of the AI technology relevant to the research.</w:t>
       </w:r>
     </w:p>
@@ -7503,7 +7716,7 @@
           </w:rPr>
           <w:id w:val="-80228917"/>
           <w14:checkbox>
-            <w14:checked w14:val="0"/>
+            <w14:checked w14:val="1"/>
             <w14:checkedState w14:val="2612" w14:font="MS Gothic"/>
             <w14:uncheckedState w14:val="2610" w14:font="MS Gothic"/>
           </w14:checkbox>
@@ -7514,7 +7727,7 @@
               <w:rFonts w:ascii="MS Gothic" w:eastAsia="MS Gothic" w:hAnsi="MS Gothic" w:cs="Segoe UI Symbol" w:hint="eastAsia"/>
               <w:sz w:val="22"/>
             </w:rPr>
-            <w:t>☐</w:t>
+            <w:t>☒</w:t>
           </w:r>
         </w:sdtContent>
       </w:sdt>
@@ -7852,7 +8065,7 @@
           </w:rPr>
           <w:id w:val="14665145"/>
           <w14:checkbox>
-            <w14:checked w14:val="0"/>
+            <w14:checked w14:val="1"/>
             <w14:checkedState w14:val="2612" w14:font="MS Gothic"/>
             <w14:uncheckedState w14:val="2610" w14:font="MS Gothic"/>
           </w14:checkbox>
@@ -7865,7 +8078,7 @@
               <w:iCs/>
               <w:sz w:val="22"/>
             </w:rPr>
-            <w:t>☐</w:t>
+            <w:t>☒</w:t>
           </w:r>
         </w:sdtContent>
       </w:sdt>
@@ -8202,7 +8415,7 @@
           </w:rPr>
           <w:id w:val="1818992224"/>
           <w14:checkbox>
-            <w14:checked w14:val="0"/>
+            <w14:checked w14:val="1"/>
             <w14:checkedState w14:val="2612" w14:font="MS Gothic"/>
             <w14:uncheckedState w14:val="2610" w14:font="MS Gothic"/>
           </w14:checkbox>
@@ -8215,7 +8428,7 @@
               <w:iCs/>
               <w:sz w:val="22"/>
             </w:rPr>
-            <w:t>☐</w:t>
+            <w:t>☒</w:t>
           </w:r>
         </w:sdtContent>
       </w:sdt>
@@ -8455,7 +8668,16 @@
           <w:color w:val="auto"/>
           <w:sz w:val="22"/>
         </w:rPr>
-        <w:t xml:space="preserve"> (e.g., other researchers, the participants themselves regarding their own data)</w:t>
+        <w:t xml:space="preserve"> (e.g., other researchers, the participants </w:t>
+      </w:r>
+      <w:r>
+        <w:rPr>
+          <w:rFonts w:ascii="Arial" w:hAnsi="Arial" w:cs="Arial"/>
+          <w:color w:val="auto"/>
+          <w:sz w:val="22"/>
+        </w:rPr>
+        <w:lastRenderedPageBreak/>
+        <w:t>themselves regarding their own data)</w:t>
       </w:r>
       <w:r>
         <w:rPr>
@@ -9252,7 +9474,6 @@
           <w:color w:val="000000" w:themeColor="text1"/>
           <w:sz w:val="22"/>
         </w:rPr>
-        <w:lastRenderedPageBreak/>
         <w:t>Describe the availability of medical or psychological resources that Participants might need as a result of an anticipated consequence of the human research.</w:t>
       </w:r>
     </w:p>
@@ -10437,7 +10658,6 @@
           <w:color w:val="auto"/>
           <w:sz w:val="22"/>
         </w:rPr>
-        <w:lastRenderedPageBreak/>
         <w:t>For NIH funded research, include information regarding the inclusion of women and minority populations, or include a justification for the exception to the NIH policy.</w:t>
       </w:r>
     </w:p>
@@ -10642,6 +10862,7 @@
           <w:color w:val="auto"/>
           <w:sz w:val="22"/>
         </w:rPr>
+        <w:lastRenderedPageBreak/>
         <w:t>Indicate specifically whether you will include or exclude any of the following special populations: (You may not include members of these populations as Participants in your research unless you include them in the description of your Participant population.)</w:t>
       </w:r>
       <w:r>
@@ -11560,16 +11781,7 @@
             <w:rFonts w:ascii="Arial" w:hAnsi="Arial" w:cs="Arial"/>
             <w:sz w:val="22"/>
           </w:rPr>
-          <w:t xml:space="preserve">with Impaired </w:t>
-        </w:r>
-        <w:r>
-          <w:rPr>
-            <w:rStyle w:val="Hyperlink"/>
-            <w:rFonts w:ascii="Arial" w:hAnsi="Arial" w:cs="Arial"/>
-            <w:sz w:val="22"/>
-          </w:rPr>
-          <w:lastRenderedPageBreak/>
-          <w:t>Decision</w:t>
+          <w:t>with Impaired Decision</w:t>
         </w:r>
         <w:r>
           <w:rPr>
@@ -13814,7 +14026,6 @@
           <w:color w:val="auto"/>
           <w:sz w:val="22"/>
         </w:rPr>
-        <w:lastRenderedPageBreak/>
         <w:t xml:space="preserve">If applicable, indicate which procedures may have risks to the </w:t>
       </w:r>
       <w:r>
@@ -14348,6 +14559,7 @@
           <w:color w:val="auto"/>
           <w:sz w:val="22"/>
         </w:rPr>
+        <w:lastRenderedPageBreak/>
         <w:t>If applicable, describe Procedures performed to lessen the probability or magnitude of risks.</w:t>
       </w:r>
     </w:p>
@@ -14921,7 +15133,6 @@
           <w:color w:val="auto"/>
           <w:sz w:val="22"/>
         </w:rPr>
-        <w:lastRenderedPageBreak/>
         <w:t>Describe the steps that will be taken to protect Participants’ privacy interests. “Privacy interest” refers to a person’s desire to place limits on whom they interact or whom they provide personal information.</w:t>
       </w:r>
     </w:p>
@@ -15178,6 +15389,7 @@
           <w:color w:val="auto"/>
           <w:sz w:val="22"/>
         </w:rPr>
+        <w:lastRenderedPageBreak/>
         <w:t xml:space="preserve">Indicate how </w:t>
       </w:r>
       <w:r>
@@ -15933,16 +16145,7 @@
           <w:color w:val="auto"/>
           <w:sz w:val="22"/>
         </w:rPr>
-        <w:t xml:space="preserve">For example, attention check questions, checks for reported values </w:t>
-      </w:r>
-      <w:r>
-        <w:rPr>
-          <w:rFonts w:ascii="Arial" w:hAnsi="Arial" w:cs="Arial"/>
-          <w:color w:val="auto"/>
-          <w:sz w:val="22"/>
-        </w:rPr>
-        <w:lastRenderedPageBreak/>
-        <w:t>outside of a reasonable range,</w:t>
+        <w:t>For example, attention check questions, checks for reported values outside of a reasonable range,</w:t>
       </w:r>
       <w:r>
         <w:rPr>
@@ -16373,6 +16576,7 @@
           <w:rFonts w:ascii="Arial" w:hAnsi="Arial" w:cs="Arial"/>
           <w:sz w:val="22"/>
         </w:rPr>
+        <w:lastRenderedPageBreak/>
         <w:t>Who is responsible for receipt or transmission of the data or specimens?</w:t>
       </w:r>
     </w:p>
@@ -17090,7 +17294,6 @@
         <w:rPr>
           <w:rFonts w:ascii="Arial" w:hAnsi="Arial" w:cs="Arial"/>
         </w:rPr>
-        <w:lastRenderedPageBreak/>
         <w:t xml:space="preserve">Economic Burden to </w:t>
       </w:r>
       <w:r>
@@ -17507,6 +17710,7 @@
           <w:rFonts w:ascii="Arial" w:hAnsi="Arial" w:cs="Arial"/>
           <w:sz w:val="22"/>
         </w:rPr>
+        <w:lastRenderedPageBreak/>
         <w:t>The role of the individuals listed in the application as being involved in the consent process.</w:t>
       </w:r>
     </w:p>
@@ -17993,15 +18197,7 @@
           <w:rFonts w:ascii="Arial" w:hAnsi="Arial" w:cs="Arial"/>
           <w:sz w:val="22"/>
         </w:rPr>
-        <w:t xml:space="preserve"> who do not speak English will be enrolled, describe the process to ensure that the oral and written information provided to </w:t>
-      </w:r>
-      <w:r>
-        <w:rPr>
-          <w:rFonts w:ascii="Arial" w:hAnsi="Arial" w:cs="Arial"/>
-          <w:sz w:val="22"/>
-        </w:rPr>
-        <w:lastRenderedPageBreak/>
-        <w:t xml:space="preserve">those </w:t>
+        <w:t xml:space="preserve"> who do not speak English will be enrolled, describe the process to ensure that the oral and written information provided to those </w:t>
       </w:r>
       <w:r>
         <w:rPr>
@@ -18036,7 +18232,7 @@
           </w:rPr>
           <w:id w:val="270604516"/>
           <w14:checkbox>
-            <w14:checked w14:val="0"/>
+            <w14:checked w14:val="1"/>
             <w14:checkedState w14:val="2612" w14:font="MS Gothic"/>
             <w14:uncheckedState w14:val="2610" w14:font="MS Gothic"/>
           </w14:checkbox>
@@ -18047,7 +18243,7 @@
               <w:rFonts w:ascii="MS Gothic" w:eastAsia="MS Gothic" w:hAnsi="MS Gothic" w:cs="Segoe UI Symbol" w:hint="eastAsia"/>
               <w:sz w:val="22"/>
             </w:rPr>
-            <w:t>☐</w:t>
+            <w:t>☒</w:t>
           </w:r>
         </w:sdtContent>
       </w:sdt>
@@ -18578,7 +18774,6 @@
           <w:rFonts w:ascii="Arial" w:hAnsi="Arial" w:cs="Arial"/>
           <w:sz w:val="22"/>
         </w:rPr>
-        <w:lastRenderedPageBreak/>
         <w:t>One parent even if the other parent is alive, known, competent, reasonably available, and shares legal responsibility for the care and custody of the child.</w:t>
       </w:r>
     </w:p>
@@ -18671,7 +18866,7 @@
           </w:rPr>
           <w:id w:val="157731009"/>
           <w14:checkbox>
-            <w14:checked w14:val="0"/>
+            <w14:checked w14:val="1"/>
             <w14:checkedState w14:val="2612" w14:font="MS Gothic"/>
             <w14:uncheckedState w14:val="2610" w14:font="MS Gothic"/>
           </w14:checkbox>
@@ -18682,7 +18877,7 @@
               <w:rFonts w:ascii="MS Gothic" w:eastAsia="MS Gothic" w:hAnsi="MS Gothic" w:cs="Segoe UI Symbol" w:hint="eastAsia"/>
               <w:sz w:val="22"/>
             </w:rPr>
-            <w:t>☐</w:t>
+            <w:t>☒</w:t>
           </w:r>
         </w:sdtContent>
       </w:sdt>
@@ -18762,6 +18957,7 @@
           <w:sz w:val="28"/>
           <w:szCs w:val="28"/>
         </w:rPr>
+        <w:lastRenderedPageBreak/>
         <w:t>Adults</w:t>
       </w:r>
       <w:r>
@@ -18845,7 +19041,7 @@
           </w:rPr>
           <w:id w:val="-715742993"/>
           <w14:checkbox>
-            <w14:checked w14:val="0"/>
+            <w14:checked w14:val="1"/>
             <w14:checkedState w14:val="2612" w14:font="MS Gothic"/>
             <w14:uncheckedState w14:val="2610" w14:font="MS Gothic"/>
           </w14:checkbox>
@@ -18856,7 +19052,7 @@
               <w:rFonts w:ascii="MS Gothic" w:eastAsia="MS Gothic" w:hAnsi="MS Gothic" w:cs="Segoe UI Symbol" w:hint="eastAsia"/>
               <w:sz w:val="22"/>
             </w:rPr>
-            <w:t>☐</w:t>
+            <w:t>☒</w:t>
           </w:r>
         </w:sdtContent>
       </w:sdt>
@@ -19141,7 +19337,6 @@
           <w:rFonts w:ascii="Arial" w:hAnsi="Arial" w:cs="Arial"/>
           <w:sz w:val="22"/>
         </w:rPr>
-        <w:lastRenderedPageBreak/>
         <w:t xml:space="preserve">Assent will be required of all, some, or none of the </w:t>
       </w:r>
       <w:r>
@@ -19280,7 +19475,7 @@
           </w:rPr>
           <w:id w:val="819088183"/>
           <w14:checkbox>
-            <w14:checked w14:val="0"/>
+            <w14:checked w14:val="1"/>
             <w14:checkedState w14:val="2612" w14:font="MS Gothic"/>
             <w14:uncheckedState w14:val="2610" w14:font="MS Gothic"/>
           </w14:checkbox>
@@ -19291,7 +19486,7 @@
               <w:rFonts w:ascii="MS Gothic" w:eastAsia="MS Gothic" w:hAnsi="MS Gothic" w:cs="Segoe UI Symbol" w:hint="eastAsia"/>
               <w:sz w:val="22"/>
             </w:rPr>
-            <w:t>☐</w:t>
+            <w:t>☒</w:t>
           </w:r>
         </w:sdtContent>
       </w:sdt>
@@ -19413,6 +19608,7 @@
           <w:color w:val="auto"/>
           <w:sz w:val="22"/>
         </w:rPr>
+        <w:lastRenderedPageBreak/>
         <w:t xml:space="preserve">Describe whether you will be following </w:t>
       </w:r>
       <w:hyperlink r:id="rId42" w:history="1">
@@ -19654,7 +19850,7 @@
           </w:rPr>
           <w:id w:val="-158081010"/>
           <w14:checkbox>
-            <w14:checked w14:val="0"/>
+            <w14:checked w14:val="1"/>
             <w14:checkedState w14:val="2612" w14:font="MS Gothic"/>
             <w14:uncheckedState w14:val="2610" w14:font="MS Gothic"/>
           </w14:checkbox>
@@ -19665,7 +19861,7 @@
               <w:rFonts w:ascii="MS Gothic" w:eastAsia="MS Gothic" w:hAnsi="MS Gothic" w:cs="Arial" w:hint="eastAsia"/>
               <w:sz w:val="22"/>
             </w:rPr>
-            <w:t>☐</w:t>
+            <w:t>☒</w:t>
           </w:r>
         </w:sdtContent>
       </w:sdt>
@@ -19784,7 +19980,7 @@
           </w:rPr>
           <w:id w:val="-1664382892"/>
           <w14:checkbox>
-            <w14:checked w14:val="0"/>
+            <w14:checked w14:val="1"/>
             <w14:checkedState w14:val="2612" w14:font="MS Gothic"/>
             <w14:uncheckedState w14:val="2610" w14:font="MS Gothic"/>
           </w14:checkbox>
@@ -19795,7 +19991,7 @@
               <w:rFonts w:ascii="MS Gothic" w:eastAsia="MS Gothic" w:hAnsi="MS Gothic" w:cs="Segoe UI Symbol" w:hint="eastAsia"/>
               <w:sz w:val="22"/>
             </w:rPr>
-            <w:t>☐</w:t>
+            <w:t>☒</w:t>
           </w:r>
         </w:sdtContent>
       </w:sdt>
@@ -19908,7 +20104,6 @@
           <w:i/>
           <w:sz w:val="22"/>
         </w:rPr>
-        <w:lastRenderedPageBreak/>
         <w:t xml:space="preserve">If this is a multicenter study, indicate the total number of </w:t>
       </w:r>
       <w:r>
@@ -20183,7 +20378,15 @@
           <w:rFonts w:ascii="Arial" w:hAnsi="Arial" w:cs="Arial"/>
           <w:sz w:val="22"/>
         </w:rPr>
-        <w:t>. (Attach copies of these documents with the application. For advertisements, attach the final copy of printed advertisements. When advertisements are taped for broadcast, attach the final audio/video tape. You may submit the wording of the advertisement prior to taping to preclude re-taping because of inappropriate wording, provided the IRB reviews the final audio/video tape.)</w:t>
+        <w:t xml:space="preserve">. (Attach copies of these documents with the application. For advertisements, attach the final copy of printed advertisements. When advertisements are taped for </w:t>
+      </w:r>
+      <w:r>
+        <w:rPr>
+          <w:rFonts w:ascii="Arial" w:hAnsi="Arial" w:cs="Arial"/>
+          <w:sz w:val="22"/>
+        </w:rPr>
+        <w:lastRenderedPageBreak/>
+        <w:t>broadcast, attach the final audio/video tape. You may submit the wording of the advertisement prior to taping to preclude re-taping because of inappropriate wording, provided the IRB reviews the final audio/video tape.)</w:t>
       </w:r>
     </w:p>
     <w:p>
@@ -22888,6 +23091,35 @@
         </w:p>
       </w:docPartBody>
     </w:docPart>
+    <w:docPart>
+      <w:docPartPr>
+        <w:name w:val="C34093F7EBC25C49B82145A9A733755B"/>
+        <w:category>
+          <w:name w:val="General"/>
+          <w:gallery w:val="placeholder"/>
+        </w:category>
+        <w:types>
+          <w:type w:val="bbPlcHdr"/>
+        </w:types>
+        <w:behaviors>
+          <w:behavior w:val="content"/>
+        </w:behaviors>
+        <w:guid w:val="{A5131465-B8EC-E249-8B5E-83B3BB005EC1}"/>
+      </w:docPartPr>
+      <w:docPartBody>
+        <w:p>
+          <w:pPr>
+            <w:pStyle w:val="C34093F7EBC25C49B82145A9A733755B"/>
+          </w:pPr>
+          <w:r>
+            <w:rPr>
+              <w:rStyle w:val="PlaceholderText"/>
+            </w:rPr>
+            <w:t>Click or tap here to enter text.</w:t>
+          </w:r>
+        </w:p>
+      </w:docPartBody>
+    </w:docPart>
   </w:docParts>
 </w:glossaryDocument>
 </file>
@@ -23024,7 +23256,6 @@
     <w:rsid w:val="00177BE8"/>
     <w:rsid w:val="00190900"/>
     <w:rsid w:val="001940F0"/>
-    <w:rsid w:val="001C0445"/>
     <w:rsid w:val="002424B1"/>
     <w:rsid w:val="0025241C"/>
     <w:rsid w:val="00257C1D"/>
@@ -23052,6 +23283,7 @@
     <w:rsid w:val="00553104"/>
     <w:rsid w:val="005677EC"/>
     <w:rsid w:val="005A6932"/>
+    <w:rsid w:val="005B0439"/>
     <w:rsid w:val="006145A7"/>
     <w:rsid w:val="0062657C"/>
     <w:rsid w:val="006E0B7F"/>
@@ -23087,6 +23319,7 @@
     <w:rsid w:val="00C37270"/>
     <w:rsid w:val="00C402F1"/>
     <w:rsid w:val="00C417A4"/>
+    <w:rsid w:val="00CD4118"/>
     <w:rsid w:val="00CE14A4"/>
     <w:rsid w:val="00CF240D"/>
     <w:rsid w:val="00DA49E6"/>
@@ -23555,7 +23788,7 @@
     <w:basedOn w:val="DefaultParagraphFont"/>
     <w:uiPriority w:val="99"/>
     <w:semiHidden/>
-    <w:rsid w:val="00841044"/>
+    <w:rsid w:val="00CD4118"/>
     <w:rPr>
       <w:color w:val="666666"/>
     </w:rPr>
@@ -23615,6 +23848,22 @@
   <w:style w:type="paragraph" w:customStyle="1" w:styleId="960A7F7A0A9CB346B385F322A5846874">
     <w:name w:val="960A7F7A0A9CB346B385F322A5846874"/>
     <w:rsid w:val="00841044"/>
+  </w:style>
+  <w:style w:type="paragraph" w:customStyle="1" w:styleId="C34093F7EBC25C49B82145A9A733755B">
+    <w:name w:val="C34093F7EBC25C49B82145A9A733755B"/>
+    <w:rsid w:val="00CD4118"/>
+  </w:style>
+  <w:style w:type="paragraph" w:customStyle="1" w:styleId="6078A112A08E6D4CA01EF97F68A3AAC7">
+    <w:name w:val="6078A112A08E6D4CA01EF97F68A3AAC7"/>
+    <w:rsid w:val="00CD4118"/>
+  </w:style>
+  <w:style w:type="paragraph" w:customStyle="1" w:styleId="1B656E8681DF6E4BA552E990D8BDAD70">
+    <w:name w:val="1B656E8681DF6E4BA552E990D8BDAD70"/>
+    <w:rsid w:val="00CD4118"/>
+  </w:style>
+  <w:style w:type="paragraph" w:customStyle="1" w:styleId="CC073F470F53714CA2C0500BFB9CADAC">
+    <w:name w:val="CC073F470F53714CA2C0500BFB9CADAC"/>
+    <w:rsid w:val="00CD4118"/>
   </w:style>
 </w:styles>
 </file>

</xml_diff>

<commit_message>
Added Thomas Stokes MS images, poster update, and proposal/survey doc updates
</commit_message>
<xml_diff>
--- a/Documents /HRP-503 - TEMPLATE PROTOCOL .docx
+++ b/Documents /HRP-503 - TEMPLATE PROTOCOL .docx
@@ -1,6 +1,6 @@
 
 <file path=word/document.xml><?xml version="1.0" encoding="utf-8"?>
-<w:document xmlns:wpc="http://schemas.microsoft.com/office/word/2010/wordprocessingCanvas" xmlns:cx="http://schemas.microsoft.com/office/drawing/2014/chartex" xmlns:cx1="http://schemas.microsoft.com/office/drawing/2015/9/8/chartex" xmlns:cx2="http://schemas.microsoft.com/office/drawing/2015/10/21/chartex" xmlns:cx3="http://schemas.microsoft.com/office/drawing/2016/5/9/chartex" xmlns:cx4="http://schemas.microsoft.com/office/drawing/2016/5/10/chartex" xmlns:cx5="http://schemas.microsoft.com/office/drawing/2016/5/11/chartex" xmlns:cx6="http://schemas.microsoft.com/office/drawing/2016/5/12/chartex" xmlns:cx7="http://schemas.microsoft.com/office/drawing/2016/5/13/chartex" xmlns:cx8="http://schemas.microsoft.com/office/drawing/2016/5/14/chartex" xmlns:mc="http://schemas.openxmlformats.org/markup-compatibility/2006" xmlns:m="http://schemas.openxmlformats.org/officeDocument/2006/math" xmlns:aink="http://schemas.microsoft.com/office/drawing/2016/ink" xmlns:am3d="http://schemas.microsoft.com/office/drawing/2017/model3d" xmlns:oel="http://schemas.microsoft.com/office/2019/extlst" xmlns:r="http://schemas.openxmlformats.org/officeDocument/2006/relationships" xmlns:wp14="http://schemas.microsoft.com/office/word/2010/wordprocessingDrawing" xmlns:wp="http://schemas.openxmlformats.org/drawingml/2006/wordprocessingDrawing" xmlns:wpg="http://schemas.microsoft.com/office/word/2010/wordprocessingGroup" xmlns:wpi="http://schemas.microsoft.com/office/word/2010/wordprocessingInk" xmlns:wps="http://schemas.microsoft.com/office/word/2010/wordprocessingShape" xmlns:o="urn:schemas-microsoft-com:office:office" xmlns:v="urn:schemas-microsoft-com:vml" xmlns:w10="urn:schemas-microsoft-com:office:word" xmlns:w="http://schemas.openxmlformats.org/wordprocessingml/2006/main" xmlns:w14="http://schemas.microsoft.com/office/word/2010/wordml" xmlns:w15="http://schemas.microsoft.com/office/word/2012/wordml" xmlns:w16cex="http://schemas.microsoft.com/office/word/2018/wordml/cex" xmlns:w16cid="http://schemas.microsoft.com/office/word/2016/wordml/cid" xmlns:w16="http://schemas.microsoft.com/office/word/2018/wordml" xmlns:w16sdtdh="http://schemas.microsoft.com/office/word/2020/wordml/sdtdatahash" xmlns:w16sdtfl="http://schemas.microsoft.com/office/word/2024/wordml/sdtformatlock" xmlns:w16se="http://schemas.microsoft.com/office/word/2015/wordml/symex" xmlns:w16du="http://schemas.microsoft.com/office/word/2023/wordml/word16du" xmlns:wne="http://schemas.microsoft.com/office/word/2006/wordml" mc:Ignorable="w14 w15 w16se w16cid w16 w16cex w16sdtdh w16sdtfl w16du wp14">
+<w:document xmlns:wpc="http://schemas.microsoft.com/office/word/2010/wordprocessingCanvas" xmlns:cx="http://schemas.microsoft.com/office/drawing/2014/chartex" xmlns:cx1="http://schemas.microsoft.com/office/drawing/2015/9/8/chartex" xmlns:cx2="http://schemas.microsoft.com/office/drawing/2015/10/21/chartex" xmlns:cx3="http://schemas.microsoft.com/office/drawing/2016/5/9/chartex" xmlns:cx4="http://schemas.microsoft.com/office/drawing/2016/5/10/chartex" xmlns:cx5="http://schemas.microsoft.com/office/drawing/2016/5/11/chartex" xmlns:cx6="http://schemas.microsoft.com/office/drawing/2016/5/12/chartex" xmlns:cx7="http://schemas.microsoft.com/office/drawing/2016/5/13/chartex" xmlns:cx8="http://schemas.microsoft.com/office/drawing/2016/5/14/chartex" xmlns:mc="http://schemas.openxmlformats.org/markup-compatibility/2006" xmlns:m="http://schemas.openxmlformats.org/officeDocument/2006/math" xmlns:aink="http://schemas.microsoft.com/office/drawing/2016/ink" xmlns:am3d="http://schemas.microsoft.com/office/drawing/2017/model3d" xmlns:oel="http://schemas.microsoft.com/office/2019/extlst" xmlns:r="http://schemas.openxmlformats.org/officeDocument/2006/relationships" xmlns:wp14="http://schemas.microsoft.com/office/word/2010/wordprocessingDrawing" xmlns:wp="http://schemas.openxmlformats.org/drawingml/2006/wordprocessingDrawing" xmlns:wpg="http://schemas.microsoft.com/office/word/2010/wordprocessingGroup" xmlns:wpi="http://schemas.microsoft.com/office/word/2010/wordprocessingInk" xmlns:wps="http://schemas.microsoft.com/office/word/2010/wordprocessingShape" xmlns:o="urn:schemas-microsoft-com:office:office" xmlns:v="urn:schemas-microsoft-com:vml" xmlns:w10="urn:schemas-microsoft-com:office:word" xmlns:w="http://schemas.openxmlformats.org/wordprocessingml/2006/main" xmlns:w14="http://schemas.microsoft.com/office/word/2010/wordml" xmlns:w15="http://schemas.microsoft.com/office/word/2012/wordml" xmlns:w16cei="http://schemas.microsoft.com/office/word/2026/wordml/cei" xmlns:w16cex="http://schemas.microsoft.com/office/word/2018/wordml/cex" xmlns:w16cid="http://schemas.microsoft.com/office/word/2016/wordml/cid" xmlns:w16="http://schemas.microsoft.com/office/word/2018/wordml" xmlns:w16sdtdh="http://schemas.microsoft.com/office/word/2020/wordml/sdtdatahash" xmlns:w16sdtfl="http://schemas.microsoft.com/office/word/2024/wordml/sdtformatlock" xmlns:w16se="http://schemas.microsoft.com/office/word/2015/wordml/symex" xmlns:w16du="http://schemas.microsoft.com/office/word/2023/wordml/word16du" xmlns:wne="http://schemas.microsoft.com/office/word/2006/wordml" mc:Ignorable="w14 w15 w16se w16cid w16 w16cex w16sdtdh w16sdtfl w16du wp14">
   <w:body>
     <w:p>
       <w:pPr>
@@ -5677,6 +5677,14 @@
               <w:color w:val="auto"/>
               <w:sz w:val="22"/>
             </w:rPr>
+            <w:t xml:space="preserve"> </w:t>
+          </w:r>
+          <w:r>
+            <w:rPr>
+              <w:rFonts w:ascii="Arial" w:hAnsi="Arial" w:cs="Arial"/>
+              <w:color w:val="auto"/>
+              <w:sz w:val="22"/>
+            </w:rPr>
             <w:t>(H3).</w:t>
           </w:r>
         </w:p>
@@ -6214,7 +6222,7 @@
           <w:pPr>
             <w:pStyle w:val="BlockText"/>
             <w:pBdr>
-              <w:left w:val="single" w:sz="2" w:space="31" w:color="4472C4" w:themeColor="accent1"/>
+              <w:left w:val="single" w:sz="2" w:space="14" w:color="4472C4" w:themeColor="accent1"/>
             </w:pBdr>
             <w:autoSpaceDE/>
             <w:autoSpaceDN/>
@@ -6280,7 +6288,7 @@
           <w:pPr>
             <w:pStyle w:val="BlockText"/>
             <w:pBdr>
-              <w:left w:val="single" w:sz="2" w:space="31" w:color="4472C4" w:themeColor="accent1"/>
+              <w:left w:val="single" w:sz="2" w:space="14" w:color="4472C4" w:themeColor="accent1"/>
             </w:pBdr>
             <w:spacing w:before="120" w:after="120"/>
             <w:ind w:left="720" w:right="720"/>
@@ -6303,7 +6311,7 @@
           <w:pPr>
             <w:pStyle w:val="BlockText"/>
             <w:pBdr>
-              <w:left w:val="single" w:sz="2" w:space="31" w:color="4472C4" w:themeColor="accent1"/>
+              <w:left w:val="single" w:sz="2" w:space="14" w:color="4472C4" w:themeColor="accent1"/>
             </w:pBdr>
             <w:spacing w:before="120" w:after="120"/>
             <w:ind w:left="720" w:right="720"/>
@@ -20725,7 +20733,7 @@
 </file>
 
 <file path=word/comments.xml><?xml version="1.0" encoding="utf-8"?>
-<w:comments xmlns:wpc="http://schemas.microsoft.com/office/word/2010/wordprocessingCanvas" xmlns:cx="http://schemas.microsoft.com/office/drawing/2014/chartex" xmlns:cx1="http://schemas.microsoft.com/office/drawing/2015/9/8/chartex" xmlns:cx2="http://schemas.microsoft.com/office/drawing/2015/10/21/chartex" xmlns:cx3="http://schemas.microsoft.com/office/drawing/2016/5/9/chartex" xmlns:cx4="http://schemas.microsoft.com/office/drawing/2016/5/10/chartex" xmlns:cx5="http://schemas.microsoft.com/office/drawing/2016/5/11/chartex" xmlns:cx6="http://schemas.microsoft.com/office/drawing/2016/5/12/chartex" xmlns:cx7="http://schemas.microsoft.com/office/drawing/2016/5/13/chartex" xmlns:cx8="http://schemas.microsoft.com/office/drawing/2016/5/14/chartex" xmlns:mc="http://schemas.openxmlformats.org/markup-compatibility/2006" xmlns:m="http://schemas.openxmlformats.org/officeDocument/2006/math" xmlns:aink="http://schemas.microsoft.com/office/drawing/2016/ink" xmlns:am3d="http://schemas.microsoft.com/office/drawing/2017/model3d" xmlns:oel="http://schemas.microsoft.com/office/2019/extlst" xmlns:r="http://schemas.openxmlformats.org/officeDocument/2006/relationships" xmlns:wp14="http://schemas.microsoft.com/office/word/2010/wordprocessingDrawing" xmlns:wp="http://schemas.openxmlformats.org/drawingml/2006/wordprocessingDrawing" xmlns:wpg="http://schemas.microsoft.com/office/word/2010/wordprocessingGroup" xmlns:wpi="http://schemas.microsoft.com/office/word/2010/wordprocessingInk" xmlns:wps="http://schemas.microsoft.com/office/word/2010/wordprocessingShape" xmlns:o="urn:schemas-microsoft-com:office:office" xmlns:v="urn:schemas-microsoft-com:vml" xmlns:w10="urn:schemas-microsoft-com:office:word" xmlns:w="http://schemas.openxmlformats.org/wordprocessingml/2006/main" xmlns:w14="http://schemas.microsoft.com/office/word/2010/wordml" xmlns:w15="http://schemas.microsoft.com/office/word/2012/wordml" xmlns:w16cex="http://schemas.microsoft.com/office/word/2018/wordml/cex" xmlns:w16cid="http://schemas.microsoft.com/office/word/2016/wordml/cid" xmlns:w16="http://schemas.microsoft.com/office/word/2018/wordml" xmlns:w16sdtdh="http://schemas.microsoft.com/office/word/2020/wordml/sdtdatahash" xmlns:w16sdtfl="http://schemas.microsoft.com/office/word/2024/wordml/sdtformatlock" xmlns:w16se="http://schemas.microsoft.com/office/word/2015/wordml/symex" xmlns:w16du="http://schemas.microsoft.com/office/word/2023/wordml/word16du" xmlns:wne="http://schemas.microsoft.com/office/word/2006/wordml" mc:Ignorable="w14 w15 w16se w16cid w16 w16cex w16sdtdh w16sdtfl w16du wp14">
+<w:comments xmlns:wpc="http://schemas.microsoft.com/office/word/2010/wordprocessingCanvas" xmlns:cx="http://schemas.microsoft.com/office/drawing/2014/chartex" xmlns:cx1="http://schemas.microsoft.com/office/drawing/2015/9/8/chartex" xmlns:cx2="http://schemas.microsoft.com/office/drawing/2015/10/21/chartex" xmlns:cx3="http://schemas.microsoft.com/office/drawing/2016/5/9/chartex" xmlns:cx4="http://schemas.microsoft.com/office/drawing/2016/5/10/chartex" xmlns:cx5="http://schemas.microsoft.com/office/drawing/2016/5/11/chartex" xmlns:cx6="http://schemas.microsoft.com/office/drawing/2016/5/12/chartex" xmlns:cx7="http://schemas.microsoft.com/office/drawing/2016/5/13/chartex" xmlns:cx8="http://schemas.microsoft.com/office/drawing/2016/5/14/chartex" xmlns:mc="http://schemas.openxmlformats.org/markup-compatibility/2006" xmlns:m="http://schemas.openxmlformats.org/officeDocument/2006/math" xmlns:aink="http://schemas.microsoft.com/office/drawing/2016/ink" xmlns:am3d="http://schemas.microsoft.com/office/drawing/2017/model3d" xmlns:oel="http://schemas.microsoft.com/office/2019/extlst" xmlns:r="http://schemas.openxmlformats.org/officeDocument/2006/relationships" xmlns:wp14="http://schemas.microsoft.com/office/word/2010/wordprocessingDrawing" xmlns:wp="http://schemas.openxmlformats.org/drawingml/2006/wordprocessingDrawing" xmlns:wpg="http://schemas.microsoft.com/office/word/2010/wordprocessingGroup" xmlns:wpi="http://schemas.microsoft.com/office/word/2010/wordprocessingInk" xmlns:wps="http://schemas.microsoft.com/office/word/2010/wordprocessingShape" xmlns:o="urn:schemas-microsoft-com:office:office" xmlns:v="urn:schemas-microsoft-com:vml" xmlns:w10="urn:schemas-microsoft-com:office:word" xmlns:w="http://schemas.openxmlformats.org/wordprocessingml/2006/main" xmlns:w14="http://schemas.microsoft.com/office/word/2010/wordml" xmlns:w15="http://schemas.microsoft.com/office/word/2012/wordml" xmlns:w16cei="http://schemas.microsoft.com/office/word/2026/wordml/cei" xmlns:w16cex="http://schemas.microsoft.com/office/word/2018/wordml/cex" xmlns:w16cid="http://schemas.microsoft.com/office/word/2016/wordml/cid" xmlns:w16="http://schemas.microsoft.com/office/word/2018/wordml" xmlns:w16sdtdh="http://schemas.microsoft.com/office/word/2020/wordml/sdtdatahash" xmlns:w16sdtfl="http://schemas.microsoft.com/office/word/2024/wordml/sdtformatlock" xmlns:w16se="http://schemas.microsoft.com/office/word/2015/wordml/symex" xmlns:w16du="http://schemas.microsoft.com/office/word/2023/wordml/word16du" xmlns:wne="http://schemas.microsoft.com/office/word/2006/wordml" mc:Ignorable="w14 w15 w16se w16cid w16 w16cex w16sdtdh w16sdtfl w16du wp14">
   <w:comment w:id="0" w:author="Alex Fisher" w:date="2026-06-18T14:08:00Z" w:initials="AF">
     <w:p>
       <w:r>
@@ -20764,28 +20772,28 @@
 </file>
 
 <file path=word/commentsExtended.xml><?xml version="1.0" encoding="utf-8"?>
-<w15:commentsEx xmlns:wpc="http://schemas.microsoft.com/office/word/2010/wordprocessingCanvas" xmlns:cx="http://schemas.microsoft.com/office/drawing/2014/chartex" xmlns:cx1="http://schemas.microsoft.com/office/drawing/2015/9/8/chartex" xmlns:cx2="http://schemas.microsoft.com/office/drawing/2015/10/21/chartex" xmlns:cx3="http://schemas.microsoft.com/office/drawing/2016/5/9/chartex" xmlns:cx4="http://schemas.microsoft.com/office/drawing/2016/5/10/chartex" xmlns:cx5="http://schemas.microsoft.com/office/drawing/2016/5/11/chartex" xmlns:cx6="http://schemas.microsoft.com/office/drawing/2016/5/12/chartex" xmlns:cx7="http://schemas.microsoft.com/office/drawing/2016/5/13/chartex" xmlns:cx8="http://schemas.microsoft.com/office/drawing/2016/5/14/chartex" xmlns:mc="http://schemas.openxmlformats.org/markup-compatibility/2006" xmlns:m="http://schemas.openxmlformats.org/officeDocument/2006/math" xmlns:aink="http://schemas.microsoft.com/office/drawing/2016/ink" xmlns:am3d="http://schemas.microsoft.com/office/drawing/2017/model3d" xmlns:oel="http://schemas.microsoft.com/office/2019/extlst" xmlns:r="http://schemas.openxmlformats.org/officeDocument/2006/relationships" xmlns:wp14="http://schemas.microsoft.com/office/word/2010/wordprocessingDrawing" xmlns:wp="http://schemas.openxmlformats.org/drawingml/2006/wordprocessingDrawing" xmlns:wpg="http://schemas.microsoft.com/office/word/2010/wordprocessingGroup" xmlns:wpi="http://schemas.microsoft.com/office/word/2010/wordprocessingInk" xmlns:wps="http://schemas.microsoft.com/office/word/2010/wordprocessingShape" xmlns:o="urn:schemas-microsoft-com:office:office" xmlns:v="urn:schemas-microsoft-com:vml" xmlns:w10="urn:schemas-microsoft-com:office:word" xmlns:w="http://schemas.openxmlformats.org/wordprocessingml/2006/main" xmlns:w14="http://schemas.microsoft.com/office/word/2010/wordml" xmlns:w15="http://schemas.microsoft.com/office/word/2012/wordml" xmlns:w16cex="http://schemas.microsoft.com/office/word/2018/wordml/cex" xmlns:w16cid="http://schemas.microsoft.com/office/word/2016/wordml/cid" xmlns:w16="http://schemas.microsoft.com/office/word/2018/wordml" xmlns:w16sdtdh="http://schemas.microsoft.com/office/word/2020/wordml/sdtdatahash" xmlns:w16sdtfl="http://schemas.microsoft.com/office/word/2024/wordml/sdtformatlock" xmlns:w16se="http://schemas.microsoft.com/office/word/2015/wordml/symex" xmlns:w16du="http://schemas.microsoft.com/office/word/2023/wordml/word16du" xmlns:wne="http://schemas.microsoft.com/office/word/2006/wordml" mc:Ignorable="w14 w15 w16se w16cid w16 w16cex w16sdtdh w16sdtfl w16du wp14">
+<w15:commentsEx xmlns:wpc="http://schemas.microsoft.com/office/word/2010/wordprocessingCanvas" xmlns:cx="http://schemas.microsoft.com/office/drawing/2014/chartex" xmlns:cx1="http://schemas.microsoft.com/office/drawing/2015/9/8/chartex" xmlns:cx2="http://schemas.microsoft.com/office/drawing/2015/10/21/chartex" xmlns:cx3="http://schemas.microsoft.com/office/drawing/2016/5/9/chartex" xmlns:cx4="http://schemas.microsoft.com/office/drawing/2016/5/10/chartex" xmlns:cx5="http://schemas.microsoft.com/office/drawing/2016/5/11/chartex" xmlns:cx6="http://schemas.microsoft.com/office/drawing/2016/5/12/chartex" xmlns:cx7="http://schemas.microsoft.com/office/drawing/2016/5/13/chartex" xmlns:cx8="http://schemas.microsoft.com/office/drawing/2016/5/14/chartex" xmlns:mc="http://schemas.openxmlformats.org/markup-compatibility/2006" xmlns:m="http://schemas.openxmlformats.org/officeDocument/2006/math" xmlns:aink="http://schemas.microsoft.com/office/drawing/2016/ink" xmlns:am3d="http://schemas.microsoft.com/office/drawing/2017/model3d" xmlns:oel="http://schemas.microsoft.com/office/2019/extlst" xmlns:r="http://schemas.openxmlformats.org/officeDocument/2006/relationships" xmlns:wp14="http://schemas.microsoft.com/office/word/2010/wordprocessingDrawing" xmlns:wp="http://schemas.openxmlformats.org/drawingml/2006/wordprocessingDrawing" xmlns:wpg="http://schemas.microsoft.com/office/word/2010/wordprocessingGroup" xmlns:wpi="http://schemas.microsoft.com/office/word/2010/wordprocessingInk" xmlns:wps="http://schemas.microsoft.com/office/word/2010/wordprocessingShape" xmlns:o="urn:schemas-microsoft-com:office:office" xmlns:v="urn:schemas-microsoft-com:vml" xmlns:w10="urn:schemas-microsoft-com:office:word" xmlns:w="http://schemas.openxmlformats.org/wordprocessingml/2006/main" xmlns:w14="http://schemas.microsoft.com/office/word/2010/wordml" xmlns:w15="http://schemas.microsoft.com/office/word/2012/wordml" xmlns:w16cei="http://schemas.microsoft.com/office/word/2026/wordml/cei" xmlns:w16cex="http://schemas.microsoft.com/office/word/2018/wordml/cex" xmlns:w16cid="http://schemas.microsoft.com/office/word/2016/wordml/cid" xmlns:w16="http://schemas.microsoft.com/office/word/2018/wordml" xmlns:w16sdtdh="http://schemas.microsoft.com/office/word/2020/wordml/sdtdatahash" xmlns:w16sdtfl="http://schemas.microsoft.com/office/word/2024/wordml/sdtformatlock" xmlns:w16se="http://schemas.microsoft.com/office/word/2015/wordml/symex" xmlns:w16du="http://schemas.microsoft.com/office/word/2023/wordml/word16du" xmlns:wne="http://schemas.microsoft.com/office/word/2006/wordml" mc:Ignorable="w14 w15 w16se w16cid w16 w16cex w16sdtdh w16sdtfl w16du wp14">
   <w15:commentEx w15:paraId="3A114F62" w15:done="0"/>
   <w15:commentEx w15:paraId="6EF2028C" w15:paraIdParent="3A114F62" w15:done="0"/>
 </w15:commentsEx>
 </file>
 
 <file path=word/commentsExtensible.xml><?xml version="1.0" encoding="utf-8"?>
-<w16cex:commentsExtensible xmlns:wpc="http://schemas.microsoft.com/office/word/2010/wordprocessingCanvas" xmlns:cx="http://schemas.microsoft.com/office/drawing/2014/chartex" xmlns:cx1="http://schemas.microsoft.com/office/drawing/2015/9/8/chartex" xmlns:cx2="http://schemas.microsoft.com/office/drawing/2015/10/21/chartex" xmlns:cx3="http://schemas.microsoft.com/office/drawing/2016/5/9/chartex" xmlns:cx4="http://schemas.microsoft.com/office/drawing/2016/5/10/chartex" xmlns:cx5="http://schemas.microsoft.com/office/drawing/2016/5/11/chartex" xmlns:cx6="http://schemas.microsoft.com/office/drawing/2016/5/12/chartex" xmlns:cx7="http://schemas.microsoft.com/office/drawing/2016/5/13/chartex" xmlns:cx8="http://schemas.microsoft.com/office/drawing/2016/5/14/chartex" xmlns:cr="http://schemas.microsoft.com/office/comments/2020/reactions" xmlns:mc="http://schemas.openxmlformats.org/markup-compatibility/2006" xmlns:m="http://schemas.openxmlformats.org/officeDocument/2006/math" xmlns:aink="http://schemas.microsoft.com/office/drawing/2016/ink" xmlns:am3d="http://schemas.microsoft.com/office/drawing/2017/model3d" xmlns:oel="http://schemas.microsoft.com/office/2019/extlst" xmlns:r="http://schemas.openxmlformats.org/officeDocument/2006/relationships" xmlns:wp14="http://schemas.microsoft.com/office/word/2010/wordprocessingDrawing" xmlns:wp="http://schemas.openxmlformats.org/drawingml/2006/wordprocessingDrawing" xmlns:wpg="http://schemas.microsoft.com/office/word/2010/wordprocessingGroup" xmlns:wpi="http://schemas.microsoft.com/office/word/2010/wordprocessingInk" xmlns:wps="http://schemas.microsoft.com/office/word/2010/wordprocessingShape" xmlns:o="urn:schemas-microsoft-com:office:office" xmlns:v="urn:schemas-microsoft-com:vml" xmlns:w10="urn:schemas-microsoft-com:office:word" xmlns:w="http://schemas.openxmlformats.org/wordprocessingml/2006/main" xmlns:w14="http://schemas.microsoft.com/office/word/2010/wordml" xmlns:w15="http://schemas.microsoft.com/office/word/2012/wordml" xmlns:w16cex="http://schemas.microsoft.com/office/word/2018/wordml/cex" xmlns:w16cid="http://schemas.microsoft.com/office/word/2016/wordml/cid" xmlns:w16="http://schemas.microsoft.com/office/word/2018/wordml" xmlns:w16sdtdh="http://schemas.microsoft.com/office/word/2020/wordml/sdtdatahash" xmlns:w16sdtfl="http://schemas.microsoft.com/office/word/2024/wordml/sdtformatlock" xmlns:w16se="http://schemas.microsoft.com/office/word/2015/wordml/symex" xmlns:w16du="http://schemas.microsoft.com/office/word/2023/wordml/word16du" xmlns:wne="http://schemas.microsoft.com/office/word/2006/wordml" mc:Ignorable="w14 w15 w16se w16cid w16 w16cex w16sdtdh w16sdtfl cr w16du wp14">
+<w16cex:commentsExtensible xmlns:wpc="http://schemas.microsoft.com/office/word/2010/wordprocessingCanvas" xmlns:cx="http://schemas.microsoft.com/office/drawing/2014/chartex" xmlns:cx1="http://schemas.microsoft.com/office/drawing/2015/9/8/chartex" xmlns:cx2="http://schemas.microsoft.com/office/drawing/2015/10/21/chartex" xmlns:cx3="http://schemas.microsoft.com/office/drawing/2016/5/9/chartex" xmlns:cx4="http://schemas.microsoft.com/office/drawing/2016/5/10/chartex" xmlns:cx5="http://schemas.microsoft.com/office/drawing/2016/5/11/chartex" xmlns:cx6="http://schemas.microsoft.com/office/drawing/2016/5/12/chartex" xmlns:cx7="http://schemas.microsoft.com/office/drawing/2016/5/13/chartex" xmlns:cx8="http://schemas.microsoft.com/office/drawing/2016/5/14/chartex" xmlns:cr="http://schemas.microsoft.com/office/comments/2020/reactions" xmlns:mc="http://schemas.openxmlformats.org/markup-compatibility/2006" xmlns:m="http://schemas.openxmlformats.org/officeDocument/2006/math" xmlns:aink="http://schemas.microsoft.com/office/drawing/2016/ink" xmlns:am3d="http://schemas.microsoft.com/office/drawing/2017/model3d" xmlns:oel="http://schemas.microsoft.com/office/2019/extlst" xmlns:r="http://schemas.openxmlformats.org/officeDocument/2006/relationships" xmlns:wp14="http://schemas.microsoft.com/office/word/2010/wordprocessingDrawing" xmlns:wp="http://schemas.openxmlformats.org/drawingml/2006/wordprocessingDrawing" xmlns:wpg="http://schemas.microsoft.com/office/word/2010/wordprocessingGroup" xmlns:wpi="http://schemas.microsoft.com/office/word/2010/wordprocessingInk" xmlns:wps="http://schemas.microsoft.com/office/word/2010/wordprocessingShape" xmlns:o="urn:schemas-microsoft-com:office:office" xmlns:v="urn:schemas-microsoft-com:vml" xmlns:w10="urn:schemas-microsoft-com:office:word" xmlns:w="http://schemas.openxmlformats.org/wordprocessingml/2006/main" xmlns:w14="http://schemas.microsoft.com/office/word/2010/wordml" xmlns:w15="http://schemas.microsoft.com/office/word/2012/wordml" xmlns:w16cei="http://schemas.microsoft.com/office/word/2026/wordml/cei" xmlns:w16cex="http://schemas.microsoft.com/office/word/2018/wordml/cex" xmlns:w16cid="http://schemas.microsoft.com/office/word/2016/wordml/cid" xmlns:w16="http://schemas.microsoft.com/office/word/2018/wordml" xmlns:w16sdtdh="http://schemas.microsoft.com/office/word/2020/wordml/sdtdatahash" xmlns:w16sdtfl="http://schemas.microsoft.com/office/word/2024/wordml/sdtformatlock" xmlns:w16se="http://schemas.microsoft.com/office/word/2015/wordml/symex" xmlns:w16du="http://schemas.microsoft.com/office/word/2023/wordml/word16du" xmlns:wne="http://schemas.microsoft.com/office/word/2006/wordml" mc:Ignorable="w14 w15 w16se w16cid w16 w16cex w16sdtdh w16sdtfl cr w16du wp14">
   <w16cex:commentExtensible w16cex:durableId="5081449F" w16cex:dateUtc="2026-06-18T19:08:00Z"/>
   <w16cex:commentExtensible w16cex:durableId="17CB01BE" w16cex:dateUtc="2026-06-19T12:11:00Z"/>
 </w16cex:commentsExtensible>
 </file>
 
 <file path=word/commentsIds.xml><?xml version="1.0" encoding="utf-8"?>
-<w16cid:commentsIds xmlns:wpc="http://schemas.microsoft.com/office/word/2010/wordprocessingCanvas" xmlns:cx="http://schemas.microsoft.com/office/drawing/2014/chartex" xmlns:cx1="http://schemas.microsoft.com/office/drawing/2015/9/8/chartex" xmlns:cx2="http://schemas.microsoft.com/office/drawing/2015/10/21/chartex" xmlns:cx3="http://schemas.microsoft.com/office/drawing/2016/5/9/chartex" xmlns:cx4="http://schemas.microsoft.com/office/drawing/2016/5/10/chartex" xmlns:cx5="http://schemas.microsoft.com/office/drawing/2016/5/11/chartex" xmlns:cx6="http://schemas.microsoft.com/office/drawing/2016/5/12/chartex" xmlns:cx7="http://schemas.microsoft.com/office/drawing/2016/5/13/chartex" xmlns:cx8="http://schemas.microsoft.com/office/drawing/2016/5/14/chartex" xmlns:mc="http://schemas.openxmlformats.org/markup-compatibility/2006" xmlns:m="http://schemas.openxmlformats.org/officeDocument/2006/math" xmlns:aink="http://schemas.microsoft.com/office/drawing/2016/ink" xmlns:am3d="http://schemas.microsoft.com/office/drawing/2017/model3d" xmlns:oel="http://schemas.microsoft.com/office/2019/extlst" xmlns:r="http://schemas.openxmlformats.org/officeDocument/2006/relationships" xmlns:wp14="http://schemas.microsoft.com/office/word/2010/wordprocessingDrawing" xmlns:wp="http://schemas.openxmlformats.org/drawingml/2006/wordprocessingDrawing" xmlns:wpg="http://schemas.microsoft.com/office/word/2010/wordprocessingGroup" xmlns:wpi="http://schemas.microsoft.com/office/word/2010/wordprocessingInk" xmlns:wps="http://schemas.microsoft.com/office/word/2010/wordprocessingShape" xmlns:o="urn:schemas-microsoft-com:office:office" xmlns:v="urn:schemas-microsoft-com:vml" xmlns:w10="urn:schemas-microsoft-com:office:word" xmlns:w="http://schemas.openxmlformats.org/wordprocessingml/2006/main" xmlns:w14="http://schemas.microsoft.com/office/word/2010/wordml" xmlns:w15="http://schemas.microsoft.com/office/word/2012/wordml" xmlns:w16cex="http://schemas.microsoft.com/office/word/2018/wordml/cex" xmlns:w16cid="http://schemas.microsoft.com/office/word/2016/wordml/cid" xmlns:w16="http://schemas.microsoft.com/office/word/2018/wordml" xmlns:w16sdtdh="http://schemas.microsoft.com/office/word/2020/wordml/sdtdatahash" xmlns:w16sdtfl="http://schemas.microsoft.com/office/word/2024/wordml/sdtformatlock" xmlns:w16se="http://schemas.microsoft.com/office/word/2015/wordml/symex" xmlns:w16du="http://schemas.microsoft.com/office/word/2023/wordml/word16du" xmlns:wne="http://schemas.microsoft.com/office/word/2006/wordml" mc:Ignorable="w14 w15 w16se w16cid w16 w16cex w16sdtdh w16sdtfl w16du wp14">
+<w16cid:commentsIds xmlns:wpc="http://schemas.microsoft.com/office/word/2010/wordprocessingCanvas" xmlns:cx="http://schemas.microsoft.com/office/drawing/2014/chartex" xmlns:cx1="http://schemas.microsoft.com/office/drawing/2015/9/8/chartex" xmlns:cx2="http://schemas.microsoft.com/office/drawing/2015/10/21/chartex" xmlns:cx3="http://schemas.microsoft.com/office/drawing/2016/5/9/chartex" xmlns:cx4="http://schemas.microsoft.com/office/drawing/2016/5/10/chartex" xmlns:cx5="http://schemas.microsoft.com/office/drawing/2016/5/11/chartex" xmlns:cx6="http://schemas.microsoft.com/office/drawing/2016/5/12/chartex" xmlns:cx7="http://schemas.microsoft.com/office/drawing/2016/5/13/chartex" xmlns:cx8="http://schemas.microsoft.com/office/drawing/2016/5/14/chartex" xmlns:mc="http://schemas.openxmlformats.org/markup-compatibility/2006" xmlns:m="http://schemas.openxmlformats.org/officeDocument/2006/math" xmlns:aink="http://schemas.microsoft.com/office/drawing/2016/ink" xmlns:am3d="http://schemas.microsoft.com/office/drawing/2017/model3d" xmlns:oel="http://schemas.microsoft.com/office/2019/extlst" xmlns:r="http://schemas.openxmlformats.org/officeDocument/2006/relationships" xmlns:wp14="http://schemas.microsoft.com/office/word/2010/wordprocessingDrawing" xmlns:wp="http://schemas.openxmlformats.org/drawingml/2006/wordprocessingDrawing" xmlns:wpg="http://schemas.microsoft.com/office/word/2010/wordprocessingGroup" xmlns:wpi="http://schemas.microsoft.com/office/word/2010/wordprocessingInk" xmlns:wps="http://schemas.microsoft.com/office/word/2010/wordprocessingShape" xmlns:o="urn:schemas-microsoft-com:office:office" xmlns:v="urn:schemas-microsoft-com:vml" xmlns:w10="urn:schemas-microsoft-com:office:word" xmlns:w="http://schemas.openxmlformats.org/wordprocessingml/2006/main" xmlns:w14="http://schemas.microsoft.com/office/word/2010/wordml" xmlns:w15="http://schemas.microsoft.com/office/word/2012/wordml" xmlns:w16cei="http://schemas.microsoft.com/office/word/2026/wordml/cei" xmlns:w16cex="http://schemas.microsoft.com/office/word/2018/wordml/cex" xmlns:w16cid="http://schemas.microsoft.com/office/word/2016/wordml/cid" xmlns:w16="http://schemas.microsoft.com/office/word/2018/wordml" xmlns:w16sdtdh="http://schemas.microsoft.com/office/word/2020/wordml/sdtdatahash" xmlns:w16sdtfl="http://schemas.microsoft.com/office/word/2024/wordml/sdtformatlock" xmlns:w16se="http://schemas.microsoft.com/office/word/2015/wordml/symex" xmlns:w16du="http://schemas.microsoft.com/office/word/2023/wordml/word16du" xmlns:wne="http://schemas.microsoft.com/office/word/2006/wordml" mc:Ignorable="w14 w15 w16se w16cid w16 w16cex w16sdtdh w16sdtfl w16du wp14">
   <w16cid:commentId w16cid:paraId="3A114F62" w16cid:durableId="5081449F"/>
   <w16cid:commentId w16cid:paraId="6EF2028C" w16cid:durableId="17CB01BE"/>
 </w16cid:commentsIds>
 </file>
 
 <file path=word/endnotes.xml><?xml version="1.0" encoding="utf-8"?>
-<w:endnotes xmlns:wpc="http://schemas.microsoft.com/office/word/2010/wordprocessingCanvas" xmlns:cx="http://schemas.microsoft.com/office/drawing/2014/chartex" xmlns:cx1="http://schemas.microsoft.com/office/drawing/2015/9/8/chartex" xmlns:cx2="http://schemas.microsoft.com/office/drawing/2015/10/21/chartex" xmlns:cx3="http://schemas.microsoft.com/office/drawing/2016/5/9/chartex" xmlns:cx4="http://schemas.microsoft.com/office/drawing/2016/5/10/chartex" xmlns:cx5="http://schemas.microsoft.com/office/drawing/2016/5/11/chartex" xmlns:cx6="http://schemas.microsoft.com/office/drawing/2016/5/12/chartex" xmlns:cx7="http://schemas.microsoft.com/office/drawing/2016/5/13/chartex" xmlns:cx8="http://schemas.microsoft.com/office/drawing/2016/5/14/chartex" xmlns:mc="http://schemas.openxmlformats.org/markup-compatibility/2006" xmlns:m="http://schemas.openxmlformats.org/officeDocument/2006/math" xmlns:aink="http://schemas.microsoft.com/office/drawing/2016/ink" xmlns:am3d="http://schemas.microsoft.com/office/drawing/2017/model3d" xmlns:oel="http://schemas.microsoft.com/office/2019/extlst" xmlns:r="http://schemas.openxmlformats.org/officeDocument/2006/relationships" xmlns:wp14="http://schemas.microsoft.com/office/word/2010/wordprocessingDrawing" xmlns:wp="http://schemas.openxmlformats.org/drawingml/2006/wordprocessingDrawing" xmlns:wpg="http://schemas.microsoft.com/office/word/2010/wordprocessingGroup" xmlns:wpi="http://schemas.microsoft.com/office/word/2010/wordprocessingInk" xmlns:wps="http://schemas.microsoft.com/office/word/2010/wordprocessingShape" xmlns:o="urn:schemas-microsoft-com:office:office" xmlns:v="urn:schemas-microsoft-com:vml" xmlns:w10="urn:schemas-microsoft-com:office:word" xmlns:w="http://schemas.openxmlformats.org/wordprocessingml/2006/main" xmlns:w14="http://schemas.microsoft.com/office/word/2010/wordml" xmlns:w15="http://schemas.microsoft.com/office/word/2012/wordml" xmlns:w16cex="http://schemas.microsoft.com/office/word/2018/wordml/cex" xmlns:w16cid="http://schemas.microsoft.com/office/word/2016/wordml/cid" xmlns:w16="http://schemas.microsoft.com/office/word/2018/wordml" xmlns:w16sdtdh="http://schemas.microsoft.com/office/word/2020/wordml/sdtdatahash" xmlns:w16sdtfl="http://schemas.microsoft.com/office/word/2024/wordml/sdtformatlock" xmlns:w16se="http://schemas.microsoft.com/office/word/2015/wordml/symex" xmlns:w16du="http://schemas.microsoft.com/office/word/2023/wordml/word16du" xmlns:wne="http://schemas.microsoft.com/office/word/2006/wordml" mc:Ignorable="w14 w15 w16se w16cid w16 w16cex w16sdtdh w16sdtfl w16du wp14">
+<w:endnotes xmlns:wpc="http://schemas.microsoft.com/office/word/2010/wordprocessingCanvas" xmlns:cx="http://schemas.microsoft.com/office/drawing/2014/chartex" xmlns:cx1="http://schemas.microsoft.com/office/drawing/2015/9/8/chartex" xmlns:cx2="http://schemas.microsoft.com/office/drawing/2015/10/21/chartex" xmlns:cx3="http://schemas.microsoft.com/office/drawing/2016/5/9/chartex" xmlns:cx4="http://schemas.microsoft.com/office/drawing/2016/5/10/chartex" xmlns:cx5="http://schemas.microsoft.com/office/drawing/2016/5/11/chartex" xmlns:cx6="http://schemas.microsoft.com/office/drawing/2016/5/12/chartex" xmlns:cx7="http://schemas.microsoft.com/office/drawing/2016/5/13/chartex" xmlns:cx8="http://schemas.microsoft.com/office/drawing/2016/5/14/chartex" xmlns:mc="http://schemas.openxmlformats.org/markup-compatibility/2006" xmlns:m="http://schemas.openxmlformats.org/officeDocument/2006/math" xmlns:aink="http://schemas.microsoft.com/office/drawing/2016/ink" xmlns:am3d="http://schemas.microsoft.com/office/drawing/2017/model3d" xmlns:oel="http://schemas.microsoft.com/office/2019/extlst" xmlns:r="http://schemas.openxmlformats.org/officeDocument/2006/relationships" xmlns:wp14="http://schemas.microsoft.com/office/word/2010/wordprocessingDrawing" xmlns:wp="http://schemas.openxmlformats.org/drawingml/2006/wordprocessingDrawing" xmlns:wpg="http://schemas.microsoft.com/office/word/2010/wordprocessingGroup" xmlns:wpi="http://schemas.microsoft.com/office/word/2010/wordprocessingInk" xmlns:wps="http://schemas.microsoft.com/office/word/2010/wordprocessingShape" xmlns:o="urn:schemas-microsoft-com:office:office" xmlns:v="urn:schemas-microsoft-com:vml" xmlns:w10="urn:schemas-microsoft-com:office:word" xmlns:w="http://schemas.openxmlformats.org/wordprocessingml/2006/main" xmlns:w14="http://schemas.microsoft.com/office/word/2010/wordml" xmlns:w15="http://schemas.microsoft.com/office/word/2012/wordml" xmlns:w16cei="http://schemas.microsoft.com/office/word/2026/wordml/cei" xmlns:w16cex="http://schemas.microsoft.com/office/word/2018/wordml/cex" xmlns:w16cid="http://schemas.microsoft.com/office/word/2016/wordml/cid" xmlns:w16="http://schemas.microsoft.com/office/word/2018/wordml" xmlns:w16sdtdh="http://schemas.microsoft.com/office/word/2020/wordml/sdtdatahash" xmlns:w16sdtfl="http://schemas.microsoft.com/office/word/2024/wordml/sdtformatlock" xmlns:w16se="http://schemas.microsoft.com/office/word/2015/wordml/symex" xmlns:w16du="http://schemas.microsoft.com/office/word/2023/wordml/word16du" xmlns:wne="http://schemas.microsoft.com/office/word/2006/wordml" mc:Ignorable="w14 w15 w16se w16cid w16 w16cex w16sdtdh w16sdtfl w16du wp14">
   <w:endnote w:type="separator" w:id="-1">
     <w:p>
       <w:r>
@@ -20859,7 +20867,7 @@
 </file>
 
 <file path=word/footer1.xml><?xml version="1.0" encoding="utf-8"?>
-<w:ftr xmlns:wpc="http://schemas.microsoft.com/office/word/2010/wordprocessingCanvas" xmlns:cx="http://schemas.microsoft.com/office/drawing/2014/chartex" xmlns:cx1="http://schemas.microsoft.com/office/drawing/2015/9/8/chartex" xmlns:cx2="http://schemas.microsoft.com/office/drawing/2015/10/21/chartex" xmlns:cx3="http://schemas.microsoft.com/office/drawing/2016/5/9/chartex" xmlns:cx4="http://schemas.microsoft.com/office/drawing/2016/5/10/chartex" xmlns:cx5="http://schemas.microsoft.com/office/drawing/2016/5/11/chartex" xmlns:cx6="http://schemas.microsoft.com/office/drawing/2016/5/12/chartex" xmlns:cx7="http://schemas.microsoft.com/office/drawing/2016/5/13/chartex" xmlns:cx8="http://schemas.microsoft.com/office/drawing/2016/5/14/chartex" xmlns:mc="http://schemas.openxmlformats.org/markup-compatibility/2006" xmlns:m="http://schemas.openxmlformats.org/officeDocument/2006/math" xmlns:aink="http://schemas.microsoft.com/office/drawing/2016/ink" xmlns:am3d="http://schemas.microsoft.com/office/drawing/2017/model3d" xmlns:oel="http://schemas.microsoft.com/office/2019/extlst" xmlns:r="http://schemas.openxmlformats.org/officeDocument/2006/relationships" xmlns:wp14="http://schemas.microsoft.com/office/word/2010/wordprocessingDrawing" xmlns:wp="http://schemas.openxmlformats.org/drawingml/2006/wordprocessingDrawing" xmlns:wpg="http://schemas.microsoft.com/office/word/2010/wordprocessingGroup" xmlns:wpi="http://schemas.microsoft.com/office/word/2010/wordprocessingInk" xmlns:wps="http://schemas.microsoft.com/office/word/2010/wordprocessingShape" xmlns:o="urn:schemas-microsoft-com:office:office" xmlns:v="urn:schemas-microsoft-com:vml" xmlns:w10="urn:schemas-microsoft-com:office:word" xmlns:w="http://schemas.openxmlformats.org/wordprocessingml/2006/main" xmlns:w14="http://schemas.microsoft.com/office/word/2010/wordml" xmlns:w15="http://schemas.microsoft.com/office/word/2012/wordml" xmlns:w16cex="http://schemas.microsoft.com/office/word/2018/wordml/cex" xmlns:w16cid="http://schemas.microsoft.com/office/word/2016/wordml/cid" xmlns:w16="http://schemas.microsoft.com/office/word/2018/wordml" xmlns:w16sdtdh="http://schemas.microsoft.com/office/word/2020/wordml/sdtdatahash" xmlns:w16sdtfl="http://schemas.microsoft.com/office/word/2024/wordml/sdtformatlock" xmlns:w16se="http://schemas.microsoft.com/office/word/2015/wordml/symex" xmlns:w16du="http://schemas.microsoft.com/office/word/2023/wordml/word16du" xmlns:wne="http://schemas.microsoft.com/office/word/2006/wordml" mc:Ignorable="w14 w15 w16se w16cid w16 w16cex w16sdtdh w16sdtfl w16du wp14">
+<w:ftr xmlns:wpc="http://schemas.microsoft.com/office/word/2010/wordprocessingCanvas" xmlns:cx="http://schemas.microsoft.com/office/drawing/2014/chartex" xmlns:cx1="http://schemas.microsoft.com/office/drawing/2015/9/8/chartex" xmlns:cx2="http://schemas.microsoft.com/office/drawing/2015/10/21/chartex" xmlns:cx3="http://schemas.microsoft.com/office/drawing/2016/5/9/chartex" xmlns:cx4="http://schemas.microsoft.com/office/drawing/2016/5/10/chartex" xmlns:cx5="http://schemas.microsoft.com/office/drawing/2016/5/11/chartex" xmlns:cx6="http://schemas.microsoft.com/office/drawing/2016/5/12/chartex" xmlns:cx7="http://schemas.microsoft.com/office/drawing/2016/5/13/chartex" xmlns:cx8="http://schemas.microsoft.com/office/drawing/2016/5/14/chartex" xmlns:mc="http://schemas.openxmlformats.org/markup-compatibility/2006" xmlns:m="http://schemas.openxmlformats.org/officeDocument/2006/math" xmlns:aink="http://schemas.microsoft.com/office/drawing/2016/ink" xmlns:am3d="http://schemas.microsoft.com/office/drawing/2017/model3d" xmlns:oel="http://schemas.microsoft.com/office/2019/extlst" xmlns:r="http://schemas.openxmlformats.org/officeDocument/2006/relationships" xmlns:wp14="http://schemas.microsoft.com/office/word/2010/wordprocessingDrawing" xmlns:wp="http://schemas.openxmlformats.org/drawingml/2006/wordprocessingDrawing" xmlns:wpg="http://schemas.microsoft.com/office/word/2010/wordprocessingGroup" xmlns:wpi="http://schemas.microsoft.com/office/word/2010/wordprocessingInk" xmlns:wps="http://schemas.microsoft.com/office/word/2010/wordprocessingShape" xmlns:o="urn:schemas-microsoft-com:office:office" xmlns:v="urn:schemas-microsoft-com:vml" xmlns:w10="urn:schemas-microsoft-com:office:word" xmlns:w="http://schemas.openxmlformats.org/wordprocessingml/2006/main" xmlns:w14="http://schemas.microsoft.com/office/word/2010/wordml" xmlns:w15="http://schemas.microsoft.com/office/word/2012/wordml" xmlns:w16cei="http://schemas.microsoft.com/office/word/2026/wordml/cei" xmlns:w16cex="http://schemas.microsoft.com/office/word/2018/wordml/cex" xmlns:w16cid="http://schemas.microsoft.com/office/word/2016/wordml/cid" xmlns:w16="http://schemas.microsoft.com/office/word/2018/wordml" xmlns:w16sdtdh="http://schemas.microsoft.com/office/word/2020/wordml/sdtdatahash" xmlns:w16sdtfl="http://schemas.microsoft.com/office/word/2024/wordml/sdtformatlock" xmlns:w16se="http://schemas.microsoft.com/office/word/2015/wordml/symex" xmlns:w16du="http://schemas.microsoft.com/office/word/2023/wordml/word16du" xmlns:wne="http://schemas.microsoft.com/office/word/2006/wordml" mc:Ignorable="w14 w15 w16se w16cid w16 w16cex w16sdtdh w16sdtfl w16du wp14">
   <w:p>
     <w:pPr>
       <w:pStyle w:val="LetterText-HCG"/>
@@ -21015,7 +21023,7 @@
 </file>
 
 <file path=word/footnotes.xml><?xml version="1.0" encoding="utf-8"?>
-<w:footnotes xmlns:wpc="http://schemas.microsoft.com/office/word/2010/wordprocessingCanvas" xmlns:cx="http://schemas.microsoft.com/office/drawing/2014/chartex" xmlns:cx1="http://schemas.microsoft.com/office/drawing/2015/9/8/chartex" xmlns:cx2="http://schemas.microsoft.com/office/drawing/2015/10/21/chartex" xmlns:cx3="http://schemas.microsoft.com/office/drawing/2016/5/9/chartex" xmlns:cx4="http://schemas.microsoft.com/office/drawing/2016/5/10/chartex" xmlns:cx5="http://schemas.microsoft.com/office/drawing/2016/5/11/chartex" xmlns:cx6="http://schemas.microsoft.com/office/drawing/2016/5/12/chartex" xmlns:cx7="http://schemas.microsoft.com/office/drawing/2016/5/13/chartex" xmlns:cx8="http://schemas.microsoft.com/office/drawing/2016/5/14/chartex" xmlns:mc="http://schemas.openxmlformats.org/markup-compatibility/2006" xmlns:m="http://schemas.openxmlformats.org/officeDocument/2006/math" xmlns:aink="http://schemas.microsoft.com/office/drawing/2016/ink" xmlns:am3d="http://schemas.microsoft.com/office/drawing/2017/model3d" xmlns:oel="http://schemas.microsoft.com/office/2019/extlst" xmlns:r="http://schemas.openxmlformats.org/officeDocument/2006/relationships" xmlns:wp14="http://schemas.microsoft.com/office/word/2010/wordprocessingDrawing" xmlns:wp="http://schemas.openxmlformats.org/drawingml/2006/wordprocessingDrawing" xmlns:wpg="http://schemas.microsoft.com/office/word/2010/wordprocessingGroup" xmlns:wpi="http://schemas.microsoft.com/office/word/2010/wordprocessingInk" xmlns:wps="http://schemas.microsoft.com/office/word/2010/wordprocessingShape" xmlns:o="urn:schemas-microsoft-com:office:office" xmlns:v="urn:schemas-microsoft-com:vml" xmlns:w10="urn:schemas-microsoft-com:office:word" xmlns:w="http://schemas.openxmlformats.org/wordprocessingml/2006/main" xmlns:w14="http://schemas.microsoft.com/office/word/2010/wordml" xmlns:w15="http://schemas.microsoft.com/office/word/2012/wordml" xmlns:w16cex="http://schemas.microsoft.com/office/word/2018/wordml/cex" xmlns:w16cid="http://schemas.microsoft.com/office/word/2016/wordml/cid" xmlns:w16="http://schemas.microsoft.com/office/word/2018/wordml" xmlns:w16sdtdh="http://schemas.microsoft.com/office/word/2020/wordml/sdtdatahash" xmlns:w16sdtfl="http://schemas.microsoft.com/office/word/2024/wordml/sdtformatlock" xmlns:w16se="http://schemas.microsoft.com/office/word/2015/wordml/symex" xmlns:w16du="http://schemas.microsoft.com/office/word/2023/wordml/word16du" xmlns:wne="http://schemas.microsoft.com/office/word/2006/wordml" mc:Ignorable="w14 w15 w16se w16cid w16 w16cex w16sdtdh w16sdtfl w16du wp14">
+<w:footnotes xmlns:wpc="http://schemas.microsoft.com/office/word/2010/wordprocessingCanvas" xmlns:cx="http://schemas.microsoft.com/office/drawing/2014/chartex" xmlns:cx1="http://schemas.microsoft.com/office/drawing/2015/9/8/chartex" xmlns:cx2="http://schemas.microsoft.com/office/drawing/2015/10/21/chartex" xmlns:cx3="http://schemas.microsoft.com/office/drawing/2016/5/9/chartex" xmlns:cx4="http://schemas.microsoft.com/office/drawing/2016/5/10/chartex" xmlns:cx5="http://schemas.microsoft.com/office/drawing/2016/5/11/chartex" xmlns:cx6="http://schemas.microsoft.com/office/drawing/2016/5/12/chartex" xmlns:cx7="http://schemas.microsoft.com/office/drawing/2016/5/13/chartex" xmlns:cx8="http://schemas.microsoft.com/office/drawing/2016/5/14/chartex" xmlns:mc="http://schemas.openxmlformats.org/markup-compatibility/2006" xmlns:m="http://schemas.openxmlformats.org/officeDocument/2006/math" xmlns:aink="http://schemas.microsoft.com/office/drawing/2016/ink" xmlns:am3d="http://schemas.microsoft.com/office/drawing/2017/model3d" xmlns:oel="http://schemas.microsoft.com/office/2019/extlst" xmlns:r="http://schemas.openxmlformats.org/officeDocument/2006/relationships" xmlns:wp14="http://schemas.microsoft.com/office/word/2010/wordprocessingDrawing" xmlns:wp="http://schemas.openxmlformats.org/drawingml/2006/wordprocessingDrawing" xmlns:wpg="http://schemas.microsoft.com/office/word/2010/wordprocessingGroup" xmlns:wpi="http://schemas.microsoft.com/office/word/2010/wordprocessingInk" xmlns:wps="http://schemas.microsoft.com/office/word/2010/wordprocessingShape" xmlns:o="urn:schemas-microsoft-com:office:office" xmlns:v="urn:schemas-microsoft-com:vml" xmlns:w10="urn:schemas-microsoft-com:office:word" xmlns:w="http://schemas.openxmlformats.org/wordprocessingml/2006/main" xmlns:w14="http://schemas.microsoft.com/office/word/2010/wordml" xmlns:w15="http://schemas.microsoft.com/office/word/2012/wordml" xmlns:w16cei="http://schemas.microsoft.com/office/word/2026/wordml/cei" xmlns:w16cex="http://schemas.microsoft.com/office/word/2018/wordml/cex" xmlns:w16cid="http://schemas.microsoft.com/office/word/2016/wordml/cid" xmlns:w16="http://schemas.microsoft.com/office/word/2018/wordml" xmlns:w16sdtdh="http://schemas.microsoft.com/office/word/2020/wordml/sdtdatahash" xmlns:w16sdtfl="http://schemas.microsoft.com/office/word/2024/wordml/sdtformatlock" xmlns:w16se="http://schemas.microsoft.com/office/word/2015/wordml/symex" xmlns:w16du="http://schemas.microsoft.com/office/word/2023/wordml/word16du" xmlns:wne="http://schemas.microsoft.com/office/word/2006/wordml" mc:Ignorable="w14 w15 w16se w16cid w16 w16cex w16sdtdh w16sdtfl w16du wp14">
   <w:footnote w:type="separator" w:id="-1">
     <w:p>
       <w:r>
@@ -21034,7 +21042,7 @@
 </file>
 
 <file path=word/numbering.xml><?xml version="1.0" encoding="utf-8"?>
-<w:numbering xmlns:wpc="http://schemas.microsoft.com/office/word/2010/wordprocessingCanvas" xmlns:cx="http://schemas.microsoft.com/office/drawing/2014/chartex" xmlns:cx1="http://schemas.microsoft.com/office/drawing/2015/9/8/chartex" xmlns:cx2="http://schemas.microsoft.com/office/drawing/2015/10/21/chartex" xmlns:cx3="http://schemas.microsoft.com/office/drawing/2016/5/9/chartex" xmlns:cx4="http://schemas.microsoft.com/office/drawing/2016/5/10/chartex" xmlns:cx5="http://schemas.microsoft.com/office/drawing/2016/5/11/chartex" xmlns:cx6="http://schemas.microsoft.com/office/drawing/2016/5/12/chartex" xmlns:cx7="http://schemas.microsoft.com/office/drawing/2016/5/13/chartex" xmlns:cx8="http://schemas.microsoft.com/office/drawing/2016/5/14/chartex" xmlns:mc="http://schemas.openxmlformats.org/markup-compatibility/2006" xmlns:m="http://schemas.openxmlformats.org/officeDocument/2006/math" xmlns:aink="http://schemas.microsoft.com/office/drawing/2016/ink" xmlns:am3d="http://schemas.microsoft.com/office/drawing/2017/model3d" xmlns:oel="http://schemas.microsoft.com/office/2019/extlst" xmlns:r="http://schemas.openxmlformats.org/officeDocument/2006/relationships" xmlns:wp14="http://schemas.microsoft.com/office/word/2010/wordprocessingDrawing" xmlns:wp="http://schemas.openxmlformats.org/drawingml/2006/wordprocessingDrawing" xmlns:wpg="http://schemas.microsoft.com/office/word/2010/wordprocessingGroup" xmlns:wpi="http://schemas.microsoft.com/office/word/2010/wordprocessingInk" xmlns:wps="http://schemas.microsoft.com/office/word/2010/wordprocessingShape" xmlns:o="urn:schemas-microsoft-com:office:office" xmlns:v="urn:schemas-microsoft-com:vml" xmlns:w10="urn:schemas-microsoft-com:office:word" xmlns:w="http://schemas.openxmlformats.org/wordprocessingml/2006/main" xmlns:w14="http://schemas.microsoft.com/office/word/2010/wordml" xmlns:w15="http://schemas.microsoft.com/office/word/2012/wordml" xmlns:w16cex="http://schemas.microsoft.com/office/word/2018/wordml/cex" xmlns:w16cid="http://schemas.microsoft.com/office/word/2016/wordml/cid" xmlns:w16="http://schemas.microsoft.com/office/word/2018/wordml" xmlns:w16sdtdh="http://schemas.microsoft.com/office/word/2020/wordml/sdtdatahash" xmlns:w16sdtfl="http://schemas.microsoft.com/office/word/2024/wordml/sdtformatlock" xmlns:w16se="http://schemas.microsoft.com/office/word/2015/wordml/symex" xmlns:w16du="http://schemas.microsoft.com/office/word/2023/wordml/word16du" xmlns:wne="http://schemas.microsoft.com/office/word/2006/wordml" mc:Ignorable="w14 w15 w16se w16cid w16 w16cex w16sdtdh w16sdtfl w16du wp14">
+<w:numbering xmlns:wpc="http://schemas.microsoft.com/office/word/2010/wordprocessingCanvas" xmlns:cx="http://schemas.microsoft.com/office/drawing/2014/chartex" xmlns:cx1="http://schemas.microsoft.com/office/drawing/2015/9/8/chartex" xmlns:cx2="http://schemas.microsoft.com/office/drawing/2015/10/21/chartex" xmlns:cx3="http://schemas.microsoft.com/office/drawing/2016/5/9/chartex" xmlns:cx4="http://schemas.microsoft.com/office/drawing/2016/5/10/chartex" xmlns:cx5="http://schemas.microsoft.com/office/drawing/2016/5/11/chartex" xmlns:cx6="http://schemas.microsoft.com/office/drawing/2016/5/12/chartex" xmlns:cx7="http://schemas.microsoft.com/office/drawing/2016/5/13/chartex" xmlns:cx8="http://schemas.microsoft.com/office/drawing/2016/5/14/chartex" xmlns:mc="http://schemas.openxmlformats.org/markup-compatibility/2006" xmlns:m="http://schemas.openxmlformats.org/officeDocument/2006/math" xmlns:aink="http://schemas.microsoft.com/office/drawing/2016/ink" xmlns:am3d="http://schemas.microsoft.com/office/drawing/2017/model3d" xmlns:oel="http://schemas.microsoft.com/office/2019/extlst" xmlns:r="http://schemas.openxmlformats.org/officeDocument/2006/relationships" xmlns:wp14="http://schemas.microsoft.com/office/word/2010/wordprocessingDrawing" xmlns:wp="http://schemas.openxmlformats.org/drawingml/2006/wordprocessingDrawing" xmlns:wpg="http://schemas.microsoft.com/office/word/2010/wordprocessingGroup" xmlns:wpi="http://schemas.microsoft.com/office/word/2010/wordprocessingInk" xmlns:wps="http://schemas.microsoft.com/office/word/2010/wordprocessingShape" xmlns:o="urn:schemas-microsoft-com:office:office" xmlns:v="urn:schemas-microsoft-com:vml" xmlns:w10="urn:schemas-microsoft-com:office:word" xmlns:w="http://schemas.openxmlformats.org/wordprocessingml/2006/main" xmlns:w14="http://schemas.microsoft.com/office/word/2010/wordml" xmlns:w15="http://schemas.microsoft.com/office/word/2012/wordml" xmlns:w16cei="http://schemas.microsoft.com/office/word/2026/wordml/cei" xmlns:w16cex="http://schemas.microsoft.com/office/word/2018/wordml/cex" xmlns:w16cid="http://schemas.microsoft.com/office/word/2016/wordml/cid" xmlns:w16="http://schemas.microsoft.com/office/word/2018/wordml" xmlns:w16sdtdh="http://schemas.microsoft.com/office/word/2020/wordml/sdtdatahash" xmlns:w16sdtfl="http://schemas.microsoft.com/office/word/2024/wordml/sdtformatlock" xmlns:w16se="http://schemas.microsoft.com/office/word/2015/wordml/symex" xmlns:w16du="http://schemas.microsoft.com/office/word/2023/wordml/word16du" xmlns:wne="http://schemas.microsoft.com/office/word/2006/wordml" mc:Ignorable="w14 w15 w16se w16cid w16 w16cex w16sdtdh w16sdtfl w16du wp14">
   <w:abstractNum w:abstractNumId="0" w15:restartNumberingAfterBreak="0">
     <w:nsid w:val="232046CF"/>
     <w:multiLevelType w:val="hybridMultilevel"/>
@@ -21652,7 +21660,7 @@
 </file>
 
 <file path=word/people.xml><?xml version="1.0" encoding="utf-8"?>
-<w15:people xmlns:wpc="http://schemas.microsoft.com/office/word/2010/wordprocessingCanvas" xmlns:cx="http://schemas.microsoft.com/office/drawing/2014/chartex" xmlns:cx1="http://schemas.microsoft.com/office/drawing/2015/9/8/chartex" xmlns:cx2="http://schemas.microsoft.com/office/drawing/2015/10/21/chartex" xmlns:cx3="http://schemas.microsoft.com/office/drawing/2016/5/9/chartex" xmlns:cx4="http://schemas.microsoft.com/office/drawing/2016/5/10/chartex" xmlns:cx5="http://schemas.microsoft.com/office/drawing/2016/5/11/chartex" xmlns:cx6="http://schemas.microsoft.com/office/drawing/2016/5/12/chartex" xmlns:cx7="http://schemas.microsoft.com/office/drawing/2016/5/13/chartex" xmlns:cx8="http://schemas.microsoft.com/office/drawing/2016/5/14/chartex" xmlns:mc="http://schemas.openxmlformats.org/markup-compatibility/2006" xmlns:m="http://schemas.openxmlformats.org/officeDocument/2006/math" xmlns:aink="http://schemas.microsoft.com/office/drawing/2016/ink" xmlns:am3d="http://schemas.microsoft.com/office/drawing/2017/model3d" xmlns:oel="http://schemas.microsoft.com/office/2019/extlst" xmlns:r="http://schemas.openxmlformats.org/officeDocument/2006/relationships" xmlns:wp14="http://schemas.microsoft.com/office/word/2010/wordprocessingDrawing" xmlns:wp="http://schemas.openxmlformats.org/drawingml/2006/wordprocessingDrawing" xmlns:wpg="http://schemas.microsoft.com/office/word/2010/wordprocessingGroup" xmlns:wpi="http://schemas.microsoft.com/office/word/2010/wordprocessingInk" xmlns:wps="http://schemas.microsoft.com/office/word/2010/wordprocessingShape" xmlns:o="urn:schemas-microsoft-com:office:office" xmlns:v="urn:schemas-microsoft-com:vml" xmlns:w10="urn:schemas-microsoft-com:office:word" xmlns:w="http://schemas.openxmlformats.org/wordprocessingml/2006/main" xmlns:w14="http://schemas.microsoft.com/office/word/2010/wordml" xmlns:w15="http://schemas.microsoft.com/office/word/2012/wordml" xmlns:w16cex="http://schemas.microsoft.com/office/word/2018/wordml/cex" xmlns:w16cid="http://schemas.microsoft.com/office/word/2016/wordml/cid" xmlns:w16="http://schemas.microsoft.com/office/word/2018/wordml" xmlns:w16sdtdh="http://schemas.microsoft.com/office/word/2020/wordml/sdtdatahash" xmlns:w16sdtfl="http://schemas.microsoft.com/office/word/2024/wordml/sdtformatlock" xmlns:w16se="http://schemas.microsoft.com/office/word/2015/wordml/symex" xmlns:w16du="http://schemas.microsoft.com/office/word/2023/wordml/word16du" xmlns:wne="http://schemas.microsoft.com/office/word/2006/wordml" mc:Ignorable="w14 w15 w16se w16cid w16 w16cex w16sdtdh w16sdtfl w16du wp14">
+<w15:people xmlns:wpc="http://schemas.microsoft.com/office/word/2010/wordprocessingCanvas" xmlns:cx="http://schemas.microsoft.com/office/drawing/2014/chartex" xmlns:cx1="http://schemas.microsoft.com/office/drawing/2015/9/8/chartex" xmlns:cx2="http://schemas.microsoft.com/office/drawing/2015/10/21/chartex" xmlns:cx3="http://schemas.microsoft.com/office/drawing/2016/5/9/chartex" xmlns:cx4="http://schemas.microsoft.com/office/drawing/2016/5/10/chartex" xmlns:cx5="http://schemas.microsoft.com/office/drawing/2016/5/11/chartex" xmlns:cx6="http://schemas.microsoft.com/office/drawing/2016/5/12/chartex" xmlns:cx7="http://schemas.microsoft.com/office/drawing/2016/5/13/chartex" xmlns:cx8="http://schemas.microsoft.com/office/drawing/2016/5/14/chartex" xmlns:mc="http://schemas.openxmlformats.org/markup-compatibility/2006" xmlns:m="http://schemas.openxmlformats.org/officeDocument/2006/math" xmlns:aink="http://schemas.microsoft.com/office/drawing/2016/ink" xmlns:am3d="http://schemas.microsoft.com/office/drawing/2017/model3d" xmlns:oel="http://schemas.microsoft.com/office/2019/extlst" xmlns:r="http://schemas.openxmlformats.org/officeDocument/2006/relationships" xmlns:wp14="http://schemas.microsoft.com/office/word/2010/wordprocessingDrawing" xmlns:wp="http://schemas.openxmlformats.org/drawingml/2006/wordprocessingDrawing" xmlns:wpg="http://schemas.microsoft.com/office/word/2010/wordprocessingGroup" xmlns:wpi="http://schemas.microsoft.com/office/word/2010/wordprocessingInk" xmlns:wps="http://schemas.microsoft.com/office/word/2010/wordprocessingShape" xmlns:o="urn:schemas-microsoft-com:office:office" xmlns:v="urn:schemas-microsoft-com:vml" xmlns:w10="urn:schemas-microsoft-com:office:word" xmlns:w="http://schemas.openxmlformats.org/wordprocessingml/2006/main" xmlns:w14="http://schemas.microsoft.com/office/word/2010/wordml" xmlns:w15="http://schemas.microsoft.com/office/word/2012/wordml" xmlns:w16cei="http://schemas.microsoft.com/office/word/2026/wordml/cei" xmlns:w16cex="http://schemas.microsoft.com/office/word/2018/wordml/cex" xmlns:w16cid="http://schemas.microsoft.com/office/word/2016/wordml/cid" xmlns:w16="http://schemas.microsoft.com/office/word/2018/wordml" xmlns:w16sdtdh="http://schemas.microsoft.com/office/word/2020/wordml/sdtdatahash" xmlns:w16sdtfl="http://schemas.microsoft.com/office/word/2024/wordml/sdtformatlock" xmlns:w16se="http://schemas.microsoft.com/office/word/2015/wordml/symex" xmlns:w16du="http://schemas.microsoft.com/office/word/2023/wordml/word16du" xmlns:wne="http://schemas.microsoft.com/office/word/2006/wordml" mc:Ignorable="w14 w15 w16se w16cid w16 w16cex w16sdtdh w16sdtfl w16du wp14">
   <w15:person w15:author="Alex Fisher">
     <w15:presenceInfo w15:providerId="AD" w15:userId="S::amf0080@auburn.edu::18480bde-8768-4851-bd71-24a6dd2d4725"/>
   </w15:person>
@@ -22091,6 +22099,7 @@
   <w:style w:type="character" w:default="1" w:styleId="DefaultParagraphFont">
     <w:name w:val="Default Paragraph Font"/>
     <w:uiPriority w:val="1"/>
+    <w:semiHidden/>
     <w:unhideWhenUsed/>
   </w:style>
   <w:style w:type="table" w:default="1" w:styleId="TableNormal">
@@ -22657,7 +22666,7 @@
 </file>
 
 <file path=word/glossary/document.xml><?xml version="1.0" encoding="utf-8"?>
-<w:glossaryDocument xmlns:wpc="http://schemas.microsoft.com/office/word/2010/wordprocessingCanvas" xmlns:cx="http://schemas.microsoft.com/office/drawing/2014/chartex" xmlns:cx1="http://schemas.microsoft.com/office/drawing/2015/9/8/chartex" xmlns:cx2="http://schemas.microsoft.com/office/drawing/2015/10/21/chartex" xmlns:cx3="http://schemas.microsoft.com/office/drawing/2016/5/9/chartex" xmlns:cx4="http://schemas.microsoft.com/office/drawing/2016/5/10/chartex" xmlns:cx5="http://schemas.microsoft.com/office/drawing/2016/5/11/chartex" xmlns:cx6="http://schemas.microsoft.com/office/drawing/2016/5/12/chartex" xmlns:cx7="http://schemas.microsoft.com/office/drawing/2016/5/13/chartex" xmlns:cx8="http://schemas.microsoft.com/office/drawing/2016/5/14/chartex" xmlns:mc="http://schemas.openxmlformats.org/markup-compatibility/2006" xmlns:m="http://schemas.openxmlformats.org/officeDocument/2006/math" xmlns:aink="http://schemas.microsoft.com/office/drawing/2016/ink" xmlns:am3d="http://schemas.microsoft.com/office/drawing/2017/model3d" xmlns:oel="http://schemas.microsoft.com/office/2019/extlst" xmlns:r="http://schemas.openxmlformats.org/officeDocument/2006/relationships" xmlns:wp14="http://schemas.microsoft.com/office/word/2010/wordprocessingDrawing" xmlns:wp="http://schemas.openxmlformats.org/drawingml/2006/wordprocessingDrawing" xmlns:wpg="http://schemas.microsoft.com/office/word/2010/wordprocessingGroup" xmlns:wpi="http://schemas.microsoft.com/office/word/2010/wordprocessingInk" xmlns:wps="http://schemas.microsoft.com/office/word/2010/wordprocessingShape" xmlns:o="urn:schemas-microsoft-com:office:office" xmlns:v="urn:schemas-microsoft-com:vml" xmlns:w10="urn:schemas-microsoft-com:office:word" xmlns:w="http://schemas.openxmlformats.org/wordprocessingml/2006/main" xmlns:w14="http://schemas.microsoft.com/office/word/2010/wordml" xmlns:w15="http://schemas.microsoft.com/office/word/2012/wordml" xmlns:w16cex="http://schemas.microsoft.com/office/word/2018/wordml/cex" xmlns:w16cid="http://schemas.microsoft.com/office/word/2016/wordml/cid" xmlns:w16="http://schemas.microsoft.com/office/word/2018/wordml" xmlns:w16sdtdh="http://schemas.microsoft.com/office/word/2020/wordml/sdtdatahash" xmlns:w16sdtfl="http://schemas.microsoft.com/office/word/2024/wordml/sdtformatlock" xmlns:w16se="http://schemas.microsoft.com/office/word/2015/wordml/symex" xmlns:w16du="http://schemas.microsoft.com/office/word/2023/wordml/word16du" xmlns:wne="http://schemas.microsoft.com/office/word/2006/wordml" mc:Ignorable="w14 w15 w16se w16cid w16 w16cex w16sdtdh w16sdtfl w16du wp14">
+<w:glossaryDocument xmlns:wpc="http://schemas.microsoft.com/office/word/2010/wordprocessingCanvas" xmlns:cx="http://schemas.microsoft.com/office/drawing/2014/chartex" xmlns:cx1="http://schemas.microsoft.com/office/drawing/2015/9/8/chartex" xmlns:cx2="http://schemas.microsoft.com/office/drawing/2015/10/21/chartex" xmlns:cx3="http://schemas.microsoft.com/office/drawing/2016/5/9/chartex" xmlns:cx4="http://schemas.microsoft.com/office/drawing/2016/5/10/chartex" xmlns:cx5="http://schemas.microsoft.com/office/drawing/2016/5/11/chartex" xmlns:cx6="http://schemas.microsoft.com/office/drawing/2016/5/12/chartex" xmlns:cx7="http://schemas.microsoft.com/office/drawing/2016/5/13/chartex" xmlns:cx8="http://schemas.microsoft.com/office/drawing/2016/5/14/chartex" xmlns:mc="http://schemas.openxmlformats.org/markup-compatibility/2006" xmlns:m="http://schemas.openxmlformats.org/officeDocument/2006/math" xmlns:aink="http://schemas.microsoft.com/office/drawing/2016/ink" xmlns:am3d="http://schemas.microsoft.com/office/drawing/2017/model3d" xmlns:oel="http://schemas.microsoft.com/office/2019/extlst" xmlns:r="http://schemas.openxmlformats.org/officeDocument/2006/relationships" xmlns:wp14="http://schemas.microsoft.com/office/word/2010/wordprocessingDrawing" xmlns:wp="http://schemas.openxmlformats.org/drawingml/2006/wordprocessingDrawing" xmlns:wpg="http://schemas.microsoft.com/office/word/2010/wordprocessingGroup" xmlns:wpi="http://schemas.microsoft.com/office/word/2010/wordprocessingInk" xmlns:wps="http://schemas.microsoft.com/office/word/2010/wordprocessingShape" xmlns:o="urn:schemas-microsoft-com:office:office" xmlns:v="urn:schemas-microsoft-com:vml" xmlns:w10="urn:schemas-microsoft-com:office:word" xmlns:w="http://schemas.openxmlformats.org/wordprocessingml/2006/main" xmlns:w14="http://schemas.microsoft.com/office/word/2010/wordml" xmlns:w15="http://schemas.microsoft.com/office/word/2012/wordml" xmlns:w16cei="http://schemas.microsoft.com/office/word/2026/wordml/cei" xmlns:w16cex="http://schemas.microsoft.com/office/word/2018/wordml/cex" xmlns:w16cid="http://schemas.microsoft.com/office/word/2016/wordml/cid" xmlns:w16="http://schemas.microsoft.com/office/word/2018/wordml" xmlns:w16sdtdh="http://schemas.microsoft.com/office/word/2020/wordml/sdtdatahash" xmlns:w16sdtfl="http://schemas.microsoft.com/office/word/2024/wordml/sdtformatlock" xmlns:w16se="http://schemas.microsoft.com/office/word/2015/wordml/symex" xmlns:w16du="http://schemas.microsoft.com/office/word/2023/wordml/word16du" xmlns:wne="http://schemas.microsoft.com/office/word/2006/wordml" mc:Ignorable="w14 w15 w16se w16cid w16 w16cex w16sdtdh w16sdtfl w16du wp14">
   <w:docParts>
     <w:docPart>
       <w:docPartPr>
@@ -23273,6 +23282,7 @@
     <w:rsid w:val="003D1FDF"/>
     <w:rsid w:val="00411864"/>
     <w:rsid w:val="00425646"/>
+    <w:rsid w:val="004360F4"/>
     <w:rsid w:val="004547A8"/>
     <w:rsid w:val="00464955"/>
     <w:rsid w:val="00480F4A"/>
@@ -23282,6 +23292,7 @@
     <w:rsid w:val="00535E08"/>
     <w:rsid w:val="00553104"/>
     <w:rsid w:val="005677EC"/>
+    <w:rsid w:val="00580010"/>
     <w:rsid w:val="005A6932"/>
     <w:rsid w:val="005B0439"/>
     <w:rsid w:val="006145A7"/>
@@ -23331,6 +23342,7 @@
     <w:rsid w:val="00E80A47"/>
     <w:rsid w:val="00F27008"/>
     <w:rsid w:val="00F417AC"/>
+    <w:rsid w:val="00F540FE"/>
     <w:rsid w:val="00F708F9"/>
     <w:rsid w:val="00FC6E47"/>
   </w:rsids>
@@ -23853,18 +23865,6 @@
     <w:name w:val="C34093F7EBC25C49B82145A9A733755B"/>
     <w:rsid w:val="00CD4118"/>
   </w:style>
-  <w:style w:type="paragraph" w:customStyle="1" w:styleId="6078A112A08E6D4CA01EF97F68A3AAC7">
-    <w:name w:val="6078A112A08E6D4CA01EF97F68A3AAC7"/>
-    <w:rsid w:val="00CD4118"/>
-  </w:style>
-  <w:style w:type="paragraph" w:customStyle="1" w:styleId="1B656E8681DF6E4BA552E990D8BDAD70">
-    <w:name w:val="1B656E8681DF6E4BA552E990D8BDAD70"/>
-    <w:rsid w:val="00CD4118"/>
-  </w:style>
-  <w:style w:type="paragraph" w:customStyle="1" w:styleId="CC073F470F53714CA2C0500BFB9CADAC">
-    <w:name w:val="CC073F470F53714CA2C0500BFB9CADAC"/>
-    <w:rsid w:val="00CD4118"/>
-  </w:style>
 </w:styles>
 </file>
 
@@ -24171,25 +24171,10 @@
 </file>
 
 <file path=customXml/item1.xml><?xml version="1.0" encoding="utf-8"?>
-<p:properties xmlns:p="http://schemas.microsoft.com/office/2006/metadata/properties" xmlns:xsi="http://www.w3.org/2001/XMLSchema-instance" xmlns:pc="http://schemas.microsoft.com/office/infopath/2007/PartnerControls">
-  <documentManagement/>
-</p:properties>
+<b:Sources xmlns:b="http://schemas.openxmlformats.org/officeDocument/2006/bibliography" xmlns="http://schemas.openxmlformats.org/officeDocument/2006/bibliography" SelectedStyle="\APASixthEditionOfficeOnline.xsl" StyleName="APA" Version="6"/>
 </file>
 
 <file path=customXml/item2.xml><?xml version="1.0" encoding="utf-8"?>
-<b:Sources xmlns:b="http://schemas.openxmlformats.org/officeDocument/2006/bibliography" xmlns="http://schemas.openxmlformats.org/officeDocument/2006/bibliography" SelectedStyle="\APASixthEditionOfficeOnline.xsl" StyleName="APA" Version="6"/>
-</file>
-
-<file path=customXml/item3.xml><?xml version="1.0" encoding="utf-8"?>
-<?mso-contentType ?>
-<FormTemplates xmlns="http://schemas.microsoft.com/sharepoint/v3/contenttype/forms">
-  <Display>DocumentLibraryForm</Display>
-  <Edit>DocumentLibraryForm</Edit>
-  <New>DocumentLibraryForm</New>
-</FormTemplates>
-</file>
-
-<file path=customXml/item4.xml><?xml version="1.0" encoding="utf-8"?>
 <ct:contentTypeSchema xmlns:ct="http://schemas.microsoft.com/office/2006/metadata/contentType" xmlns:ma="http://schemas.microsoft.com/office/2006/metadata/properties/metaAttributes" ct:_="" ma:_="" ma:contentTypeName="Document" ma:contentTypeID="0x01010071543618D710814CB7A5D363A31D1B96" ma:contentTypeVersion="4" ma:contentTypeDescription="Create a new document." ma:contentTypeScope="" ma:versionID="56f6942f173b961896c388446d456582">
   <xsd:schema xmlns:xsd="http://www.w3.org/2001/XMLSchema" xmlns:xs="http://www.w3.org/2001/XMLSchema" xmlns:p="http://schemas.microsoft.com/office/2006/metadata/properties" xmlns:ns2="880a7bf2-c82d-49e4-b898-1932dfa2e071" targetNamespace="http://schemas.microsoft.com/office/2006/metadata/properties" ma:root="true" ma:fieldsID="a0ff5c3bf694fef035fbd678bebf06c6" ns2:_="">
     <xsd:import namespace="880a7bf2-c82d-49e4-b898-1932dfa2e071"/>
@@ -24333,16 +24318,22 @@
 </ct:contentTypeSchema>
 </file>
 
-<file path=customXml/itemProps1.xml><?xml version="1.0" encoding="utf-8"?>
-<ds:datastoreItem xmlns:ds="http://schemas.openxmlformats.org/officeDocument/2006/customXml" ds:itemID="{4583F2B3-037C-44DB-B08D-E6F378EEF829}">
-  <ds:schemaRefs>
-    <ds:schemaRef ds:uri="http://schemas.microsoft.com/office/2006/metadata/properties"/>
-    <ds:schemaRef ds:uri="http://schemas.microsoft.com/office/infopath/2007/PartnerControls"/>
-  </ds:schemaRefs>
-</ds:datastoreItem>
+<file path=customXml/item3.xml><?xml version="1.0" encoding="utf-8"?>
+<?mso-contentType ?>
+<FormTemplates xmlns="http://schemas.microsoft.com/sharepoint/v3/contenttype/forms">
+  <Display>DocumentLibraryForm</Display>
+  <Edit>DocumentLibraryForm</Edit>
+  <New>DocumentLibraryForm</New>
+</FormTemplates>
 </file>
 
-<file path=customXml/itemProps2.xml><?xml version="1.0" encoding="utf-8"?>
+<file path=customXml/item4.xml><?xml version="1.0" encoding="utf-8"?>
+<p:properties xmlns:p="http://schemas.microsoft.com/office/2006/metadata/properties" xmlns:xsi="http://www.w3.org/2001/XMLSchema-instance" xmlns:pc="http://schemas.microsoft.com/office/infopath/2007/PartnerControls">
+  <documentManagement/>
+</p:properties>
+</file>
+
+<file path=customXml/itemProps1.xml><?xml version="1.0" encoding="utf-8"?>
 <ds:datastoreItem xmlns:ds="http://schemas.openxmlformats.org/officeDocument/2006/customXml" ds:itemID="{C7DBFB5B-A178-7D45-BBE9-88A65BCF52B8}">
   <ds:schemaRefs>
     <ds:schemaRef ds:uri="http://schemas.openxmlformats.org/officeDocument/2006/bibliography"/>
@@ -24350,15 +24341,7 @@
 </ds:datastoreItem>
 </file>
 
-<file path=customXml/itemProps3.xml><?xml version="1.0" encoding="utf-8"?>
-<ds:datastoreItem xmlns:ds="http://schemas.openxmlformats.org/officeDocument/2006/customXml" ds:itemID="{1DBB1093-F880-422D-86C1-617F7DAEF962}">
-  <ds:schemaRefs>
-    <ds:schemaRef ds:uri="http://schemas.microsoft.com/sharepoint/v3/contenttype/forms"/>
-  </ds:schemaRefs>
-</ds:datastoreItem>
-</file>
-
-<file path=customXml/itemProps4.xml><?xml version="1.0" encoding="utf-8"?>
+<file path=customXml/itemProps2.xml><?xml version="1.0" encoding="utf-8"?>
 <ds:datastoreItem xmlns:ds="http://schemas.openxmlformats.org/officeDocument/2006/customXml" ds:itemID="{C41636AD-22E5-42B9-BEC5-875C4017A51E}">
   <ds:schemaRefs>
     <ds:schemaRef ds:uri="http://schemas.microsoft.com/office/2006/metadata/contentType"/>
@@ -24374,4 +24357,21 @@
     <ds:schemaRef ds:uri="http://schemas.microsoft.com/internal/obd"/>
   </ds:schemaRefs>
 </ds:datastoreItem>
+</file>
+
+<file path=customXml/itemProps3.xml><?xml version="1.0" encoding="utf-8"?>
+<ds:datastoreItem xmlns:ds="http://schemas.openxmlformats.org/officeDocument/2006/customXml" ds:itemID="{1DBB1093-F880-422D-86C1-617F7DAEF962}">
+  <ds:schemaRefs>
+    <ds:schemaRef ds:uri="http://schemas.microsoft.com/sharepoint/v3/contenttype/forms"/>
+  </ds:schemaRefs>
+</ds:datastoreItem>
+</file>
+
+<file path=customXml/itemProps4.xml><?xml version="1.0" encoding="utf-8"?>
+<ds:datastoreItem xmlns:ds="http://schemas.openxmlformats.org/officeDocument/2006/customXml" ds:itemID="{4583F2B3-037C-44DB-B08D-E6F378EEF829}">
+  <ds:schemaRefs>
+    <ds:schemaRef ds:uri="http://schemas.microsoft.com/office/2006/metadata/properties"/>
+    <ds:schemaRef ds:uri="http://schemas.microsoft.com/office/infopath/2007/PartnerControls"/>
+  </ds:schemaRefs>
+</ds:datastoreItem>
 </file>
</xml_diff>